<commit_message>
Wrote paragraph for analysing frequent words and starting punctuation analysis
</commit_message>
<xml_diff>
--- a/Project Spam Email Detector.docx
+++ b/Project Spam Email Detector.docx
@@ -535,17 +535,41 @@
         </w:tabs>
       </w:pPr>
       <w:r>
-        <w:t xml:space="preserve">It is reported that the most targeted sector in spam emails are professional services (18%) and shortly followed by manufacturing and retail/wholesale with 18% and 9% respectively. Delivery services were the most common subject of spam messages with over 1.1 billion scam texts relating to this topic. This is unsurprising as a vast majority of people uses these delivery services to have the items be delivered so the use of creating identical messages with the same format and structure that these various delivery services use can easily deceive people into entering their personal information and therefore have it taken and be used maliciously. </w:t>
-      </w:r>
-    </w:p>
-    <w:p>
-      <w:pPr>
-        <w:tabs>
-          <w:tab w:val="left" w:pos="1450"/>
-        </w:tabs>
-      </w:pPr>
-      <w:r>
-        <w:t>The demographic that receives the most spam messages/emails/calls are people aged 65 and over, while 18-34 year olds receive the lowest. There is a direct correlation with this as it shows that elderly people are not entirely “internet savvy” and are more prone to being deceived into clicking malicious links and having their personal information seized</w:t>
+        <w:t>It is reported that the most targeted sector in spam emails are professional services (18%) and shortly followed by manufacturing and retail/wholesale with 18% and 9% respectively.</w:t>
+      </w:r>
+      <w:r>
+        <w:t xml:space="preserve"> </w:t>
+      </w:r>
+      <w:r>
+        <w:t>(Ellis, 2023)</w:t>
+      </w:r>
+      <w:r>
+        <w:t>.</w:t>
+      </w:r>
+      <w:r>
+        <w:t xml:space="preserve"> Delivery services were the most common subject of spam messages with over 1.1 billion scam texts relating to this topic. This is unsurprising as a vast majority of people uses these delivery services to have the items be delivered so the use of creating identical messages with the same format and structure that these various delivery services use can easily deceive people into entering their personal information and therefore have it taken and be used maliciously. </w:t>
+      </w:r>
+    </w:p>
+    <w:p>
+      <w:pPr>
+        <w:tabs>
+          <w:tab w:val="left" w:pos="1450"/>
+        </w:tabs>
+      </w:pPr>
+      <w:r>
+        <w:t>The demographic that receives the most spam messages/emails/calls are people aged 65 and over, while 18-34 year olds receive the lowest.</w:t>
+      </w:r>
+      <w:r>
+        <w:t xml:space="preserve"> </w:t>
+      </w:r>
+      <w:r>
+        <w:t>(Ellis, 2023)</w:t>
+      </w:r>
+      <w:r>
+        <w:t xml:space="preserve">. </w:t>
+      </w:r>
+      <w:r>
+        <w:t>There is a direct correlation with this as it shows that elderly people are not entirely “internet savvy” and are more prone to being deceived into clicking malicious links and having their personal information seized</w:t>
       </w:r>
       <w:r>
         <w:t xml:space="preserve">. The reason for this is that they have not be trained and taught extensively in how to prevent this and take action plus the era that they were brought into were not this advanced when it comes to technology, which leaves them to learn about this as they got older. Whereas with younger people, we were taught how to deal with spam emails, and malicious attacks so we would not be deceived when receiving one. </w:t>
@@ -596,7 +620,7 @@
                     <pic:cNvPicPr/>
                   </pic:nvPicPr>
                   <pic:blipFill>
-                    <a:blip r:embed="rId5"/>
+                    <a:blip r:embed="rId7"/>
                     <a:stretch>
                       <a:fillRect/>
                     </a:stretch>
@@ -644,6 +668,18 @@
         </w:rPr>
         <w:t xml:space="preserve"> every day</w:t>
       </w:r>
+      <w:r>
+        <w:rPr>
+          <w:noProof/>
+        </w:rPr>
+        <w:t xml:space="preserve"> </w:t>
+      </w:r>
+      <w:r>
+        <w:rPr>
+          <w:noProof/>
+        </w:rPr>
+        <w:t>(Ellis, 2023)</w:t>
+      </w:r>
     </w:p>
     <w:p/>
     <w:p>
@@ -670,7 +706,7 @@
                     <pic:cNvPicPr/>
                   </pic:nvPicPr>
                   <pic:blipFill>
-                    <a:blip r:embed="rId6"/>
+                    <a:blip r:embed="rId8"/>
                     <a:stretch>
                       <a:fillRect/>
                     </a:stretch>
@@ -709,6 +745,12 @@
       <w:r>
         <w:t xml:space="preserve"> the most common topics people see in spam emails they receive</w:t>
       </w:r>
+      <w:r>
+        <w:t xml:space="preserve"> </w:t>
+      </w:r>
+      <w:r>
+        <w:t>(Ellis, 2023)</w:t>
+      </w:r>
     </w:p>
     <w:p/>
     <w:p>
@@ -735,7 +777,7 @@
                     <pic:cNvPicPr/>
                   </pic:nvPicPr>
                   <pic:blipFill>
-                    <a:blip r:embed="rId7"/>
+                    <a:blip r:embed="rId9"/>
                     <a:stretch>
                       <a:fillRect/>
                     </a:stretch>
@@ -774,6 +816,12 @@
       <w:r>
         <w:t xml:space="preserve"> Average monthly spam call received by age and gender</w:t>
       </w:r>
+      <w:r>
+        <w:t xml:space="preserve"> </w:t>
+      </w:r>
+      <w:r>
+        <w:t>(Ellis, 2023)</w:t>
+      </w:r>
     </w:p>
     <w:p/>
     <w:p/>
@@ -805,7 +853,7 @@
       <w:r>
         <w:t xml:space="preserve">The dataset I used: </w:t>
       </w:r>
-      <w:hyperlink r:id="rId8" w:history="1">
+      <w:hyperlink r:id="rId10" w:history="1">
         <w:r>
           <w:rPr>
             <w:rStyle w:val="Hyperlink"/>
@@ -843,7 +891,7 @@
                     <pic:cNvPicPr/>
                   </pic:nvPicPr>
                   <pic:blipFill>
-                    <a:blip r:embed="rId9"/>
+                    <a:blip r:embed="rId11"/>
                     <a:stretch>
                       <a:fillRect/>
                     </a:stretch>
@@ -997,6 +1045,9 @@
         </mc:AlternateContent>
       </w:r>
       <w:r>
+        <w:rPr>
+          <w:noProof/>
+        </w:rPr>
         <w:drawing>
           <wp:anchor distT="0" distB="0" distL="114300" distR="114300" simplePos="0" relativeHeight="251658240" behindDoc="0" locked="0" layoutInCell="1" allowOverlap="1" wp14:anchorId="5D67C1E6" wp14:editId="1727B7F5">
             <wp:simplePos x="0" y="0"/>
@@ -1021,7 +1072,7 @@
                     <pic:cNvPicPr/>
                   </pic:nvPicPr>
                   <pic:blipFill>
-                    <a:blip r:embed="rId10">
+                    <a:blip r:embed="rId12">
                       <a:extLst>
                         <a:ext uri="{28A0092B-C50C-407E-A947-70E740481C1C}">
                           <a14:useLocalDpi xmlns:a14="http://schemas.microsoft.com/office/drawing/2010/main" val="0"/>
@@ -1054,6 +1105,9 @@
         </w:drawing>
       </w:r>
       <w:r>
+        <w:rPr>
+          <w:noProof/>
+        </w:rPr>
         <w:drawing>
           <wp:inline distT="0" distB="0" distL="0" distR="0" wp14:anchorId="12A9B9AA" wp14:editId="6FD11885">
             <wp:extent cx="3229337" cy="2453833"/>
@@ -1070,7 +1124,7 @@
                     <pic:cNvPicPr/>
                   </pic:nvPicPr>
                   <pic:blipFill rotWithShape="1">
-                    <a:blip r:embed="rId11"/>
+                    <a:blip r:embed="rId13"/>
                     <a:srcRect l="-1" r="706" b="7817"/>
                     <a:stretch>
                       <a:fillRect/>
@@ -1138,6 +1192,9 @@
         <w:keepNext/>
       </w:pPr>
       <w:r>
+        <w:rPr>
+          <w:noProof/>
+        </w:rPr>
         <w:drawing>
           <wp:inline distT="0" distB="0" distL="0" distR="0" wp14:anchorId="5189449C" wp14:editId="0854805A">
             <wp:extent cx="5731510" cy="1642745"/>
@@ -1154,7 +1211,7 @@
                     <pic:cNvPicPr/>
                   </pic:nvPicPr>
                   <pic:blipFill>
-                    <a:blip r:embed="rId12"/>
+                    <a:blip r:embed="rId14"/>
                     <a:stretch>
                       <a:fillRect/>
                     </a:stretch>
@@ -1213,6 +1270,9 @@
         <w:keepNext/>
       </w:pPr>
       <w:r>
+        <w:rPr>
+          <w:noProof/>
+        </w:rPr>
         <w:lastRenderedPageBreak/>
         <w:drawing>
           <wp:inline distT="0" distB="0" distL="0" distR="0" wp14:anchorId="01F62F05" wp14:editId="5C7682C5">
@@ -1230,7 +1290,7 @@
                     <pic:cNvPicPr/>
                   </pic:nvPicPr>
                   <pic:blipFill>
-                    <a:blip r:embed="rId13"/>
+                    <a:blip r:embed="rId15"/>
                     <a:stretch>
                       <a:fillRect/>
                     </a:stretch>
@@ -1355,6 +1415,9 @@
         </mc:AlternateContent>
       </w:r>
       <w:r>
+        <w:rPr>
+          <w:noProof/>
+        </w:rPr>
         <w:drawing>
           <wp:anchor distT="0" distB="0" distL="114300" distR="114300" simplePos="0" relativeHeight="251661312" behindDoc="0" locked="0" layoutInCell="1" allowOverlap="1" wp14:anchorId="7081B531" wp14:editId="21C5620E">
             <wp:simplePos x="0" y="0"/>
@@ -1379,7 +1442,7 @@
                     <pic:cNvPicPr/>
                   </pic:nvPicPr>
                   <pic:blipFill>
-                    <a:blip r:embed="rId14">
+                    <a:blip r:embed="rId16">
                       <a:extLst>
                         <a:ext uri="{28A0092B-C50C-407E-A947-70E740481C1C}">
                           <a14:useLocalDpi xmlns:a14="http://schemas.microsoft.com/office/drawing/2010/main" val="0"/>
@@ -1412,6 +1475,9 @@
         </w:drawing>
       </w:r>
       <w:r>
+        <w:rPr>
+          <w:noProof/>
+        </w:rPr>
         <w:drawing>
           <wp:inline distT="0" distB="0" distL="0" distR="0" wp14:anchorId="2767FE9F" wp14:editId="58F4025F">
             <wp:extent cx="3347686" cy="2598517"/>
@@ -1428,7 +1494,7 @@
                     <pic:cNvPicPr/>
                   </pic:nvPicPr>
                   <pic:blipFill>
-                    <a:blip r:embed="rId15"/>
+                    <a:blip r:embed="rId17"/>
                     <a:stretch>
                       <a:fillRect/>
                     </a:stretch>
@@ -1486,10 +1552,14 @@
         <w:keepNext/>
       </w:pPr>
       <w:r>
+        <w:rPr>
+          <w:noProof/>
+        </w:rPr>
+        <w:lastRenderedPageBreak/>
         <w:drawing>
-          <wp:inline distT="0" distB="0" distL="0" distR="0" wp14:anchorId="6A966F59" wp14:editId="20392E04">
-            <wp:extent cx="4375230" cy="2149806"/>
-            <wp:effectExtent l="0" t="0" r="6350" b="3175"/>
+          <wp:inline distT="0" distB="0" distL="0" distR="0" wp14:anchorId="6A966F59" wp14:editId="3985960B">
+            <wp:extent cx="5712123" cy="2806700"/>
+            <wp:effectExtent l="0" t="0" r="3175" b="0"/>
             <wp:docPr id="1694644437" name="Picture 1"/>
             <wp:cNvGraphicFramePr>
               <a:graphicFrameLocks xmlns:a="http://schemas.openxmlformats.org/drawingml/2006/main" noChangeAspect="1"/>
@@ -1502,7 +1572,7 @@
                     <pic:cNvPicPr/>
                   </pic:nvPicPr>
                   <pic:blipFill>
-                    <a:blip r:embed="rId16"/>
+                    <a:blip r:embed="rId18"/>
                     <a:stretch>
                       <a:fillRect/>
                     </a:stretch>
@@ -1510,7 +1580,7 @@
                   <pic:spPr>
                     <a:xfrm>
                       <a:off x="0" y="0"/>
-                      <a:ext cx="4456073" cy="2189529"/>
+                      <a:ext cx="5847774" cy="2873353"/>
                     </a:xfrm>
                     <a:prstGeom prst="rect">
                       <a:avLst/>
@@ -1533,13 +1603,390 @@
     </w:p>
     <w:p>
       <w:r>
+        <w:t>As you can see, the chart has been dominated by words such as "the”, “to”, “and”, “a” etc..</w:t>
+      </w:r>
+    </w:p>
+    <w:p>
+      <w:r>
+        <w:t>So to fix this, I imported another library called NLTK which is used for building Python programs to work with human language data it provides it users with a variety of tools used to analyse, clean and structure raw human language data. In this specific use case, it is being used to eliminate stop words being involved in the most frequent words chart as it will improve the accuracy and discrepancy of the chart and eventually for the detector being built.</w:t>
+      </w:r>
+    </w:p>
+    <w:p/>
+    <w:p>
+      <w:pPr>
+        <w:keepNext/>
+      </w:pPr>
+      <w:r>
+        <w:drawing>
+          <wp:inline distT="0" distB="0" distL="0" distR="0" wp14:anchorId="4DD9067F" wp14:editId="5E5E1B1C">
+            <wp:extent cx="3016250" cy="1842068"/>
+            <wp:effectExtent l="0" t="0" r="0" b="6350"/>
+            <wp:docPr id="1145402413" name="Picture 1"/>
+            <wp:cNvGraphicFramePr>
+              <a:graphicFrameLocks xmlns:a="http://schemas.openxmlformats.org/drawingml/2006/main" noChangeAspect="1"/>
+            </wp:cNvGraphicFramePr>
+            <a:graphic xmlns:a="http://schemas.openxmlformats.org/drawingml/2006/main">
+              <a:graphicData uri="http://schemas.openxmlformats.org/drawingml/2006/picture">
+                <pic:pic xmlns:pic="http://schemas.openxmlformats.org/drawingml/2006/picture">
+                  <pic:nvPicPr>
+                    <pic:cNvPr id="1145402413" name=""/>
+                    <pic:cNvPicPr/>
+                  </pic:nvPicPr>
+                  <pic:blipFill>
+                    <a:blip r:embed="rId19"/>
+                    <a:stretch>
+                      <a:fillRect/>
+                    </a:stretch>
+                  </pic:blipFill>
+                  <pic:spPr>
+                    <a:xfrm>
+                      <a:off x="0" y="0"/>
+                      <a:ext cx="3050630" cy="1863064"/>
+                    </a:xfrm>
+                    <a:prstGeom prst="rect">
+                      <a:avLst/>
+                    </a:prstGeom>
+                  </pic:spPr>
+                </pic:pic>
+              </a:graphicData>
+            </a:graphic>
+          </wp:inline>
+        </w:drawing>
+      </w:r>
+      <w:r>
+        <w:t xml:space="preserve"> </w:t>
+      </w:r>
+    </w:p>
+    <w:p>
+      <w:pPr>
+        <w:pStyle w:val="Caption"/>
+      </w:pPr>
+      <w:r>
+        <w:rPr>
+          <w:noProof/>
+        </w:rPr>
+        <mc:AlternateContent>
+          <mc:Choice Requires="wps">
+            <w:drawing>
+              <wp:anchor distT="0" distB="0" distL="114300" distR="114300" simplePos="0" relativeHeight="251666432" behindDoc="0" locked="0" layoutInCell="1" allowOverlap="1" wp14:anchorId="564247D8" wp14:editId="0249DEF3">
+                <wp:simplePos x="0" y="0"/>
+                <wp:positionH relativeFrom="column">
+                  <wp:posOffset>-450850</wp:posOffset>
+                </wp:positionH>
+                <wp:positionV relativeFrom="paragraph">
+                  <wp:posOffset>2025015</wp:posOffset>
+                </wp:positionV>
+                <wp:extent cx="4375150" cy="635"/>
+                <wp:effectExtent l="0" t="0" r="0" b="0"/>
+                <wp:wrapNone/>
+                <wp:docPr id="627578886" name="Text Box 1"/>
+                <wp:cNvGraphicFramePr/>
+                <a:graphic xmlns:a="http://schemas.openxmlformats.org/drawingml/2006/main">
+                  <a:graphicData uri="http://schemas.microsoft.com/office/word/2010/wordprocessingShape">
+                    <wps:wsp>
+                      <wps:cNvSpPr txBox="1"/>
+                      <wps:spPr>
+                        <a:xfrm>
+                          <a:off x="0" y="0"/>
+                          <a:ext cx="4375150" cy="635"/>
+                        </a:xfrm>
+                        <a:prstGeom prst="rect">
+                          <a:avLst/>
+                        </a:prstGeom>
+                        <a:solidFill>
+                          <a:prstClr val="white"/>
+                        </a:solidFill>
+                        <a:ln>
+                          <a:noFill/>
+                        </a:ln>
+                      </wps:spPr>
+                      <wps:txbx>
+                        <w:txbxContent>
+                          <w:p>
+                            <w:pPr>
+                              <w:pStyle w:val="Caption"/>
+                            </w:pPr>
+                            <w:r>
+                              <w:t>Figure 14 stop words being implemented in the code</w:t>
+                            </w:r>
+                          </w:p>
+                          <w:p/>
+                        </w:txbxContent>
+                      </wps:txbx>
+                      <wps:bodyPr rot="0" spcFirstLastPara="0" vertOverflow="overflow" horzOverflow="overflow" vert="horz" wrap="square" lIns="0" tIns="0" rIns="0" bIns="0" numCol="1" spcCol="0" rtlCol="0" fromWordArt="0" anchor="t" anchorCtr="0" forceAA="0" compatLnSpc="1">
+                        <a:prstTxWarp prst="textNoShape">
+                          <a:avLst/>
+                        </a:prstTxWarp>
+                        <a:spAutoFit/>
+                      </wps:bodyPr>
+                    </wps:wsp>
+                  </a:graphicData>
+                </a:graphic>
+              </wp:anchor>
+            </w:drawing>
+          </mc:Choice>
+          <mc:Fallback>
+            <w:pict>
+              <v:shapetype w14:anchorId="564247D8" id="_x0000_t202" coordsize="21600,21600" o:spt="202" path="m,l,21600r21600,l21600,xe">
+                <v:stroke joinstyle="miter"/>
+                <v:path gradientshapeok="t" o:connecttype="rect"/>
+              </v:shapetype>
+              <v:shape id="_x0000_s1028" type="#_x0000_t202" style="position:absolute;margin-left:-35.5pt;margin-top:159.45pt;width:344.5pt;height:.05pt;z-index:251666432;visibility:visible;mso-wrap-style:square;mso-wrap-distance-left:9pt;mso-wrap-distance-top:0;mso-wrap-distance-right:9pt;mso-wrap-distance-bottom:0;mso-position-horizontal:absolute;mso-position-horizontal-relative:text;mso-position-vertical:absolute;mso-position-vertical-relative:text;v-text-anchor:top" o:gfxdata="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" stroked="f">
+                <v:textbox style="mso-fit-shape-to-text:t" inset="0,0,0,0">
+                  <w:txbxContent>
+                    <w:p>
+                      <w:pPr>
+                        <w:pStyle w:val="Caption"/>
+                      </w:pPr>
+                      <w:r>
+                        <w:t>Figure 14 stop words being implemented in the code</w:t>
+                      </w:r>
+                    </w:p>
+                    <w:p/>
+                  </w:txbxContent>
+                </v:textbox>
+              </v:shape>
+            </w:pict>
+          </mc:Fallback>
+        </mc:AlternateContent>
+      </w:r>
+      <w:r>
+        <w:drawing>
+          <wp:anchor distT="0" distB="0" distL="114300" distR="114300" simplePos="0" relativeHeight="251664384" behindDoc="0" locked="0" layoutInCell="1" allowOverlap="1" wp14:anchorId="1F86DF3D" wp14:editId="3257D067">
+            <wp:simplePos x="0" y="0"/>
+            <wp:positionH relativeFrom="margin">
+              <wp:posOffset>-450850</wp:posOffset>
+            </wp:positionH>
+            <wp:positionV relativeFrom="paragraph">
+              <wp:posOffset>386715</wp:posOffset>
+            </wp:positionV>
+            <wp:extent cx="4375150" cy="1581150"/>
+            <wp:effectExtent l="0" t="0" r="6350" b="0"/>
+            <wp:wrapNone/>
+            <wp:docPr id="1787687822" name="Picture 1"/>
+            <wp:cNvGraphicFramePr>
+              <a:graphicFrameLocks xmlns:a="http://schemas.openxmlformats.org/drawingml/2006/main" noChangeAspect="1"/>
+            </wp:cNvGraphicFramePr>
+            <a:graphic xmlns:a="http://schemas.openxmlformats.org/drawingml/2006/main">
+              <a:graphicData uri="http://schemas.openxmlformats.org/drawingml/2006/picture">
+                <pic:pic xmlns:pic="http://schemas.openxmlformats.org/drawingml/2006/picture">
+                  <pic:nvPicPr>
+                    <pic:cNvPr id="1787687822" name=""/>
+                    <pic:cNvPicPr/>
+                  </pic:nvPicPr>
+                  <pic:blipFill>
+                    <a:blip r:embed="rId20">
+                      <a:extLst>
+                        <a:ext uri="{28A0092B-C50C-407E-A947-70E740481C1C}">
+                          <a14:useLocalDpi xmlns:a14="http://schemas.microsoft.com/office/drawing/2010/main" val="0"/>
+                        </a:ext>
+                      </a:extLst>
+                    </a:blip>
+                    <a:stretch>
+                      <a:fillRect/>
+                    </a:stretch>
+                  </pic:blipFill>
+                  <pic:spPr>
+                    <a:xfrm>
+                      <a:off x="0" y="0"/>
+                      <a:ext cx="4375150" cy="1581150"/>
+                    </a:xfrm>
+                    <a:prstGeom prst="rect">
+                      <a:avLst/>
+                    </a:prstGeom>
+                  </pic:spPr>
+                </pic:pic>
+              </a:graphicData>
+            </a:graphic>
+            <wp14:sizeRelH relativeFrom="margin">
+              <wp14:pctWidth>0</wp14:pctWidth>
+            </wp14:sizeRelH>
+            <wp14:sizeRelV relativeFrom="margin">
+              <wp14:pctHeight>0</wp14:pctHeight>
+            </wp14:sizeRelV>
+          </wp:anchor>
+        </w:drawing>
+      </w:r>
+      <w:r>
+        <w:t>Figure 13 Importing nltk module for stop words</w:t>
+      </w:r>
+    </w:p>
+    <w:p/>
+    <w:p/>
+    <w:p>
+      <w:r>
+        <w:rPr>
+          <w:noProof/>
+        </w:rPr>
         <w:lastRenderedPageBreak/>
-        <w:t>As you can see, the chart has been dominated by words such as "the”, “to”, “and”, “a” etc..</w:t>
-      </w:r>
-    </w:p>
-    <w:p>
-      <w:r>
-        <w:t>So to fix this, I imported another library called NLTK which is used for building Python programs to work with human language data it provides it users with a variety of tools used to analyse, clean and structure raw human language data. In this specific use case, it is being used to eliminate stop words being involved in the most frequent words chart as it will improve the accuracy and discrepancy of the chart and eventually for the detector being built.</w:t>
+        <mc:AlternateContent>
+          <mc:Choice Requires="wps">
+            <w:drawing>
+              <wp:anchor distT="0" distB="0" distL="114300" distR="114300" simplePos="0" relativeHeight="251669504" behindDoc="0" locked="0" layoutInCell="1" allowOverlap="1" wp14:anchorId="1A8DB78E" wp14:editId="0C04C785">
+                <wp:simplePos x="0" y="0"/>
+                <wp:positionH relativeFrom="column">
+                  <wp:posOffset>0</wp:posOffset>
+                </wp:positionH>
+                <wp:positionV relativeFrom="paragraph">
+                  <wp:posOffset>4635500</wp:posOffset>
+                </wp:positionV>
+                <wp:extent cx="6235065" cy="635"/>
+                <wp:effectExtent l="0" t="0" r="0" b="0"/>
+                <wp:wrapSquare wrapText="bothSides"/>
+                <wp:docPr id="1888039475" name="Text Box 1"/>
+                <wp:cNvGraphicFramePr/>
+                <a:graphic xmlns:a="http://schemas.openxmlformats.org/drawingml/2006/main">
+                  <a:graphicData uri="http://schemas.microsoft.com/office/word/2010/wordprocessingShape">
+                    <wps:wsp>
+                      <wps:cNvSpPr txBox="1"/>
+                      <wps:spPr>
+                        <a:xfrm>
+                          <a:off x="0" y="0"/>
+                          <a:ext cx="6235065" cy="635"/>
+                        </a:xfrm>
+                        <a:prstGeom prst="rect">
+                          <a:avLst/>
+                        </a:prstGeom>
+                        <a:solidFill>
+                          <a:prstClr val="white"/>
+                        </a:solidFill>
+                        <a:ln>
+                          <a:noFill/>
+                        </a:ln>
+                      </wps:spPr>
+                      <wps:txbx>
+                        <w:txbxContent>
+                          <w:p>
+                            <w:pPr>
+                              <w:pStyle w:val="Caption"/>
+                              <w:rPr>
+                                <w:noProof/>
+                                <w:sz w:val="22"/>
+                                <w:szCs w:val="22"/>
+                              </w:rPr>
+                            </w:pPr>
+                            <w:r>
+                              <w:t>Figure 15 chart of most frequent words after removing stop words</w:t>
+                            </w:r>
+                          </w:p>
+                        </w:txbxContent>
+                      </wps:txbx>
+                      <wps:bodyPr rot="0" spcFirstLastPara="0" vertOverflow="overflow" horzOverflow="overflow" vert="horz" wrap="square" lIns="0" tIns="0" rIns="0" bIns="0" numCol="1" spcCol="0" rtlCol="0" fromWordArt="0" anchor="t" anchorCtr="0" forceAA="0" compatLnSpc="1">
+                        <a:prstTxWarp prst="textNoShape">
+                          <a:avLst/>
+                        </a:prstTxWarp>
+                        <a:spAutoFit/>
+                      </wps:bodyPr>
+                    </wps:wsp>
+                  </a:graphicData>
+                </a:graphic>
+              </wp:anchor>
+            </w:drawing>
+          </mc:Choice>
+          <mc:Fallback>
+            <w:pict>
+              <v:shape w14:anchorId="1A8DB78E" id="_x0000_s1029" type="#_x0000_t202" style="position:absolute;margin-left:0;margin-top:365pt;width:490.95pt;height:.05pt;z-index:251669504;visibility:visible;mso-wrap-style:square;mso-wrap-distance-left:9pt;mso-wrap-distance-top:0;mso-wrap-distance-right:9pt;mso-wrap-distance-bottom:0;mso-position-horizontal:absolute;mso-position-horizontal-relative:text;mso-position-vertical:absolute;mso-position-vertical-relative:text;v-text-anchor:top" o:gfxdata="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" stroked="f">
+                <v:textbox style="mso-fit-shape-to-text:t" inset="0,0,0,0">
+                  <w:txbxContent>
+                    <w:p>
+                      <w:pPr>
+                        <w:pStyle w:val="Caption"/>
+                        <w:rPr>
+                          <w:noProof/>
+                          <w:sz w:val="22"/>
+                          <w:szCs w:val="22"/>
+                        </w:rPr>
+                      </w:pPr>
+                      <w:r>
+                        <w:t>Figure 15 chart of most frequent words after removing stop words</w:t>
+                      </w:r>
+                    </w:p>
+                  </w:txbxContent>
+                </v:textbox>
+                <w10:wrap type="square"/>
+              </v:shape>
+            </w:pict>
+          </mc:Fallback>
+        </mc:AlternateContent>
+      </w:r>
+      <w:r>
+        <w:rPr>
+          <w:noProof/>
+        </w:rPr>
+        <w:drawing>
+          <wp:anchor distT="0" distB="0" distL="114300" distR="114300" simplePos="0" relativeHeight="251667456" behindDoc="0" locked="0" layoutInCell="1" allowOverlap="1" wp14:anchorId="466EA3D4" wp14:editId="7148A10C">
+            <wp:simplePos x="0" y="0"/>
+            <wp:positionH relativeFrom="margin">
+              <wp:align>left</wp:align>
+            </wp:positionH>
+            <wp:positionV relativeFrom="paragraph">
+              <wp:posOffset>1568450</wp:posOffset>
+            </wp:positionV>
+            <wp:extent cx="6235336" cy="3009900"/>
+            <wp:effectExtent l="0" t="0" r="0" b="0"/>
+            <wp:wrapSquare wrapText="bothSides"/>
+            <wp:docPr id="785345888" name="Picture 1"/>
+            <wp:cNvGraphicFramePr>
+              <a:graphicFrameLocks xmlns:a="http://schemas.openxmlformats.org/drawingml/2006/main" noChangeAspect="1"/>
+            </wp:cNvGraphicFramePr>
+            <a:graphic xmlns:a="http://schemas.openxmlformats.org/drawingml/2006/main">
+              <a:graphicData uri="http://schemas.openxmlformats.org/drawingml/2006/picture">
+                <pic:pic xmlns:pic="http://schemas.openxmlformats.org/drawingml/2006/picture">
+                  <pic:nvPicPr>
+                    <pic:cNvPr id="785345888" name=""/>
+                    <pic:cNvPicPr/>
+                  </pic:nvPicPr>
+                  <pic:blipFill>
+                    <a:blip r:embed="rId21">
+                      <a:extLst>
+                        <a:ext uri="{28A0092B-C50C-407E-A947-70E740481C1C}">
+                          <a14:useLocalDpi xmlns:a14="http://schemas.microsoft.com/office/drawing/2010/main" val="0"/>
+                        </a:ext>
+                      </a:extLst>
+                    </a:blip>
+                    <a:stretch>
+                      <a:fillRect/>
+                    </a:stretch>
+                  </pic:blipFill>
+                  <pic:spPr>
+                    <a:xfrm>
+                      <a:off x="0" y="0"/>
+                      <a:ext cx="6235336" cy="3009900"/>
+                    </a:xfrm>
+                    <a:prstGeom prst="rect">
+                      <a:avLst/>
+                    </a:prstGeom>
+                  </pic:spPr>
+                </pic:pic>
+              </a:graphicData>
+            </a:graphic>
+          </wp:anchor>
+        </w:drawing>
+      </w:r>
+      <w:r>
+        <w:t>These two figures shown above displays how the nltk module was implemented within my code to remove stop words being counted towards the count of the most frequent words. For example, what the code shown in figure 14 does is that it finds every word being used in both ham and spam and keep said word if it is not a common English word (stop word). To determine what a stop word is so that it is accurate in detecting and removing them, the NLTK stop words module</w:t>
+      </w:r>
+      <w:r>
+        <w:t xml:space="preserve"> has a list which contains a variety of stop words. This helps as if that specific word in the list matches the one in “ham_words” or “spam_words”, it will be removed.</w:t>
+      </w:r>
+    </w:p>
+    <w:p/>
+    <w:p>
+      <w:r>
+        <w:t>As you can see, after the removing the stop words, it makes the count more accurate and can see a clear distinction between the type of words more likely to be featured in a spam and ham email.</w:t>
+      </w:r>
+    </w:p>
+    <w:p>
+      <w:r>
+        <w:t xml:space="preserve">For spam emails, it includes words such as prize, win, and claim which can be interpreted as spam emails that can be classified as fake prize giveaway and lottery emails. With these type of emails, it includes text content that includes false promises of massive wealth to trick the user into giving away their money and data. This backs up figure 2 with the most </w:t>
+      </w:r>
+      <w:r>
+        <w:t>common topics people see in spam emails with prize &amp; giveaways topping the chart.</w:t>
+      </w:r>
+    </w:p>
+    <w:p>
+      <w:r>
+        <w:t>When looking at the frequent words seen in ham emails, the type of language seen is more colloquial and informal with words including “u”, “good”, “like” etc… Words like these are great indicators to tell if an email is legitimate as spam emails are more likely to copy the text content of emails from companies and organisations to make it look as realistic as possible whereas with ham emails, it is most likely the person you are emailing is someone you know personally such as a friend, colleague so there would be no need to use such professional language.</w:t>
       </w:r>
     </w:p>
     <w:sectPr>
@@ -1550,6 +1997,56 @@
     </w:sectPr>
   </w:body>
 </w:document>
+</file>
+
+<file path=word/endnotes.xml><?xml version="1.0" encoding="utf-8"?>
+<w:endnotes xmlns:wpc="http://schemas.microsoft.com/office/word/2010/wordprocessingCanvas" xmlns:cx="http://schemas.microsoft.com/office/drawing/2014/chartex" xmlns:cx1="http://schemas.microsoft.com/office/drawing/2015/9/8/chartex" xmlns:cx2="http://schemas.microsoft.com/office/drawing/2015/10/21/chartex" xmlns:cx3="http://schemas.microsoft.com/office/drawing/2016/5/9/chartex" xmlns:cx4="http://schemas.microsoft.com/office/drawing/2016/5/10/chartex" xmlns:cx5="http://schemas.microsoft.com/office/drawing/2016/5/11/chartex" xmlns:cx6="http://schemas.microsoft.com/office/drawing/2016/5/12/chartex" xmlns:cx7="http://schemas.microsoft.com/office/drawing/2016/5/13/chartex" xmlns:cx8="http://schemas.microsoft.com/office/drawing/2016/5/14/chartex" xmlns:mc="http://schemas.openxmlformats.org/markup-compatibility/2006" xmlns:aink="http://schemas.microsoft.com/office/drawing/2016/ink" xmlns:am3d="http://schemas.microsoft.com/office/drawing/2017/model3d" xmlns:o="urn:schemas-microsoft-com:office:office" xmlns:oel="http://schemas.microsoft.com/office/2019/extlst" xmlns:r="http://schemas.openxmlformats.org/officeDocument/2006/relationships" xmlns:m="http://schemas.openxmlformats.org/officeDocument/2006/math" xmlns:v="urn:schemas-microsoft-com:vml" xmlns:wp14="http://schemas.microsoft.com/office/word/2010/wordprocessingDrawing" xmlns:wp="http://schemas.openxmlformats.org/drawingml/2006/wordprocessingDrawing" xmlns:w10="urn:schemas-microsoft-com:office:word" xmlns:w="http://schemas.openxmlformats.org/wordprocessingml/2006/main" xmlns:w14="http://schemas.microsoft.com/office/word/2010/wordml" xmlns:w15="http://schemas.microsoft.com/office/word/2012/wordml" xmlns:w16cex="http://schemas.microsoft.com/office/word/2018/wordml/cex" xmlns:w16cid="http://schemas.microsoft.com/office/word/2016/wordml/cid" xmlns:w16="http://schemas.microsoft.com/office/word/2018/wordml" xmlns:w16du="http://schemas.microsoft.com/office/word/2023/wordml/word16du" xmlns:w16sdtdh="http://schemas.microsoft.com/office/word/2020/wordml/sdtdatahash" xmlns:w16sdtfl="http://schemas.microsoft.com/office/word/2024/wordml/sdtformatlock" xmlns:w16se="http://schemas.microsoft.com/office/word/2015/wordml/symex" xmlns:wpg="http://schemas.microsoft.com/office/word/2010/wordprocessingGroup" xmlns:wpi="http://schemas.microsoft.com/office/word/2010/wordprocessingInk" xmlns:wne="http://schemas.microsoft.com/office/word/2006/wordml" xmlns:wps="http://schemas.microsoft.com/office/word/2010/wordprocessingShape" mc:Ignorable="w14 w15 w16se w16cid w16 w16cex w16sdtdh w16sdtfl w16du wp14">
+  <w:endnote w:type="separator" w:id="-1">
+    <w:p>
+      <w:pPr>
+        <w:spacing w:after="0" w:line="240" w:lineRule="auto"/>
+      </w:pPr>
+      <w:r>
+        <w:separator/>
+      </w:r>
+    </w:p>
+  </w:endnote>
+  <w:endnote w:type="continuationSeparator" w:id="0">
+    <w:p>
+      <w:pPr>
+        <w:spacing w:after="0" w:line="240" w:lineRule="auto"/>
+      </w:pPr>
+      <w:r>
+        <w:continuationSeparator/>
+      </w:r>
+    </w:p>
+  </w:endnote>
+</w:endnotes>
+</file>
+
+<file path=word/footnotes.xml><?xml version="1.0" encoding="utf-8"?>
+<w:footnotes xmlns:wpc="http://schemas.microsoft.com/office/word/2010/wordprocessingCanvas" xmlns:cx="http://schemas.microsoft.com/office/drawing/2014/chartex" xmlns:cx1="http://schemas.microsoft.com/office/drawing/2015/9/8/chartex" xmlns:cx2="http://schemas.microsoft.com/office/drawing/2015/10/21/chartex" xmlns:cx3="http://schemas.microsoft.com/office/drawing/2016/5/9/chartex" xmlns:cx4="http://schemas.microsoft.com/office/drawing/2016/5/10/chartex" xmlns:cx5="http://schemas.microsoft.com/office/drawing/2016/5/11/chartex" xmlns:cx6="http://schemas.microsoft.com/office/drawing/2016/5/12/chartex" xmlns:cx7="http://schemas.microsoft.com/office/drawing/2016/5/13/chartex" xmlns:cx8="http://schemas.microsoft.com/office/drawing/2016/5/14/chartex" xmlns:mc="http://schemas.openxmlformats.org/markup-compatibility/2006" xmlns:aink="http://schemas.microsoft.com/office/drawing/2016/ink" xmlns:am3d="http://schemas.microsoft.com/office/drawing/2017/model3d" xmlns:o="urn:schemas-microsoft-com:office:office" xmlns:oel="http://schemas.microsoft.com/office/2019/extlst" xmlns:r="http://schemas.openxmlformats.org/officeDocument/2006/relationships" xmlns:m="http://schemas.openxmlformats.org/officeDocument/2006/math" xmlns:v="urn:schemas-microsoft-com:vml" xmlns:wp14="http://schemas.microsoft.com/office/word/2010/wordprocessingDrawing" xmlns:wp="http://schemas.openxmlformats.org/drawingml/2006/wordprocessingDrawing" xmlns:w10="urn:schemas-microsoft-com:office:word" xmlns:w="http://schemas.openxmlformats.org/wordprocessingml/2006/main" xmlns:w14="http://schemas.microsoft.com/office/word/2010/wordml" xmlns:w15="http://schemas.microsoft.com/office/word/2012/wordml" xmlns:w16cex="http://schemas.microsoft.com/office/word/2018/wordml/cex" xmlns:w16cid="http://schemas.microsoft.com/office/word/2016/wordml/cid" xmlns:w16="http://schemas.microsoft.com/office/word/2018/wordml" xmlns:w16du="http://schemas.microsoft.com/office/word/2023/wordml/word16du" xmlns:w16sdtdh="http://schemas.microsoft.com/office/word/2020/wordml/sdtdatahash" xmlns:w16sdtfl="http://schemas.microsoft.com/office/word/2024/wordml/sdtformatlock" xmlns:w16se="http://schemas.microsoft.com/office/word/2015/wordml/symex" xmlns:wpg="http://schemas.microsoft.com/office/word/2010/wordprocessingGroup" xmlns:wpi="http://schemas.microsoft.com/office/word/2010/wordprocessingInk" xmlns:wne="http://schemas.microsoft.com/office/word/2006/wordml" xmlns:wps="http://schemas.microsoft.com/office/word/2010/wordprocessingShape" mc:Ignorable="w14 w15 w16se w16cid w16 w16cex w16sdtdh w16sdtfl w16du wp14">
+  <w:footnote w:type="separator" w:id="-1">
+    <w:p>
+      <w:pPr>
+        <w:spacing w:after="0" w:line="240" w:lineRule="auto"/>
+      </w:pPr>
+      <w:r>
+        <w:separator/>
+      </w:r>
+    </w:p>
+  </w:footnote>
+  <w:footnote w:type="continuationSeparator" w:id="0">
+    <w:p>
+      <w:pPr>
+        <w:spacing w:after="0" w:line="240" w:lineRule="auto"/>
+      </w:pPr>
+      <w:r>
+        <w:continuationSeparator/>
+      </w:r>
+    </w:p>
+  </w:footnote>
+</w:footnotes>
 </file>
 
 <file path=word/numbering.xml><?xml version="1.0" encoding="utf-8"?>
@@ -2392,7 +2889,6 @@
   <w:style w:type="character" w:default="1" w:styleId="DefaultParagraphFont">
     <w:name w:val="Default Paragraph Font"/>
     <w:uiPriority w:val="1"/>
-    <w:semiHidden/>
     <w:unhideWhenUsed/>
   </w:style>
   <w:style w:type="table" w:default="1" w:styleId="TableNormal">
@@ -2747,6 +3243,50 @@
       <w:color w:val="605E5C"/>
       <w:shd w:val="clear" w:color="auto" w:fill="E1DFDD"/>
     </w:rPr>
+  </w:style>
+  <w:style w:type="paragraph" w:styleId="Header">
+    <w:name w:val="header"/>
+    <w:basedOn w:val="Normal"/>
+    <w:link w:val="HeaderChar"/>
+    <w:uiPriority w:val="99"/>
+    <w:unhideWhenUsed/>
+    <w:rsid w:val="00752631"/>
+    <w:pPr>
+      <w:tabs>
+        <w:tab w:val="center" w:pos="4513"/>
+        <w:tab w:val="right" w:pos="9026"/>
+      </w:tabs>
+      <w:spacing w:after="0" w:line="240" w:lineRule="auto"/>
+    </w:pPr>
+  </w:style>
+  <w:style w:type="character" w:customStyle="1" w:styleId="HeaderChar">
+    <w:name w:val="Header Char"/>
+    <w:basedOn w:val="DefaultParagraphFont"/>
+    <w:link w:val="Header"/>
+    <w:uiPriority w:val="99"/>
+    <w:rsid w:val="00752631"/>
+  </w:style>
+  <w:style w:type="paragraph" w:styleId="Footer">
+    <w:name w:val="footer"/>
+    <w:basedOn w:val="Normal"/>
+    <w:link w:val="FooterChar"/>
+    <w:uiPriority w:val="99"/>
+    <w:unhideWhenUsed/>
+    <w:rsid w:val="00752631"/>
+    <w:pPr>
+      <w:tabs>
+        <w:tab w:val="center" w:pos="4513"/>
+        <w:tab w:val="right" w:pos="9026"/>
+      </w:tabs>
+      <w:spacing w:after="0" w:line="240" w:lineRule="auto"/>
+    </w:pPr>
+  </w:style>
+  <w:style w:type="character" w:customStyle="1" w:styleId="FooterChar">
+    <w:name w:val="Footer Char"/>
+    <w:basedOn w:val="DefaultParagraphFont"/>
+    <w:link w:val="Footer"/>
+    <w:uiPriority w:val="99"/>
+    <w:rsid w:val="00752631"/>
   </w:style>
 </w:styles>
 </file>

</xml_diff>

<commit_message>
done analysis for average number of exclamation marks within an email and talked about it in report
</commit_message>
<xml_diff>
--- a/Project Spam Email Detector.docx
+++ b/Project Spam Email Detector.docx
@@ -1557,9 +1557,9 @@
         </w:rPr>
         <w:lastRenderedPageBreak/>
         <w:drawing>
-          <wp:inline distT="0" distB="0" distL="0" distR="0" wp14:anchorId="6A966F59" wp14:editId="3985960B">
-            <wp:extent cx="5712123" cy="2806700"/>
-            <wp:effectExtent l="0" t="0" r="3175" b="0"/>
+          <wp:inline distT="0" distB="0" distL="0" distR="0" wp14:anchorId="6A966F59" wp14:editId="4E2F5BEE">
+            <wp:extent cx="4552950" cy="2237130"/>
+            <wp:effectExtent l="0" t="0" r="0" b="0"/>
             <wp:docPr id="1694644437" name="Picture 1"/>
             <wp:cNvGraphicFramePr>
               <a:graphicFrameLocks xmlns:a="http://schemas.openxmlformats.org/drawingml/2006/main" noChangeAspect="1"/>
@@ -1580,7 +1580,7 @@
                   <pic:spPr>
                     <a:xfrm>
                       <a:off x="0" y="0"/>
-                      <a:ext cx="5847774" cy="2873353"/>
+                      <a:ext cx="4661746" cy="2290588"/>
                     </a:xfrm>
                     <a:prstGeom prst="rect">
                       <a:avLst/>
@@ -1727,11 +1727,7 @@
           </mc:Choice>
           <mc:Fallback>
             <w:pict>
-              <v:shapetype w14:anchorId="564247D8" id="_x0000_t202" coordsize="21600,21600" o:spt="202" path="m,l,21600r21600,l21600,xe">
-                <v:stroke joinstyle="miter"/>
-                <v:path gradientshapeok="t" o:connecttype="rect"/>
-              </v:shapetype>
-              <v:shape id="_x0000_s1028" type="#_x0000_t202" style="position:absolute;margin-left:-35.5pt;margin-top:159.45pt;width:344.5pt;height:.05pt;z-index:251666432;visibility:visible;mso-wrap-style:square;mso-wrap-distance-left:9pt;mso-wrap-distance-top:0;mso-wrap-distance-right:9pt;mso-wrap-distance-bottom:0;mso-position-horizontal:absolute;mso-position-horizontal-relative:text;mso-position-vertical:absolute;mso-position-vertical-relative:text;v-text-anchor:top" o:gfxdata="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" stroked="f">
+              <v:shape w14:anchorId="564247D8" id="_x0000_s1028" type="#_x0000_t202" style="position:absolute;margin-left:-35.5pt;margin-top:159.45pt;width:344.5pt;height:.05pt;z-index:251666432;visibility:visible;mso-wrap-style:square;mso-wrap-distance-left:9pt;mso-wrap-distance-top:0;mso-wrap-distance-right:9pt;mso-wrap-distance-bottom:0;mso-position-horizontal:absolute;mso-position-horizontal-relative:text;mso-position-vertical:absolute;mso-position-vertical-relative:text;v-text-anchor:top" o:gfxdata="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" stroked="f">
                 <v:textbox style="mso-fit-shape-to-text:t" inset="0,0,0,0">
                   <w:txbxContent>
                     <w:p>
@@ -1978,7 +1974,31 @@
     </w:p>
     <w:p>
       <w:r>
-        <w:t xml:space="preserve">For spam emails, it includes words such as prize, win, and claim which can be interpreted as spam emails that can be classified as fake prize giveaway and lottery emails. With these type of emails, it includes text content that includes false promises of massive wealth to trick the user into giving away their money and data. This backs up figure 2 with the most </w:t>
+        <w:t xml:space="preserve">For spam emails, it includes words such as </w:t>
+      </w:r>
+      <w:r>
+        <w:t>“call”, “</w:t>
+      </w:r>
+      <w:r>
+        <w:t>prize</w:t>
+      </w:r>
+      <w:r>
+        <w:t>”</w:t>
+      </w:r>
+      <w:r>
+        <w:t xml:space="preserve">, </w:t>
+      </w:r>
+      <w:r>
+        <w:t>“</w:t>
+      </w:r>
+      <w:r>
+        <w:t>win</w:t>
+      </w:r>
+      <w:r>
+        <w:t>”</w:t>
+      </w:r>
+      <w:r>
+        <w:t xml:space="preserve">, and claim which can be interpreted as spam emails that can be classified as fake prize giveaway and lottery emails. With these type of emails, it includes text content that includes false promises of massive wealth to trick the user into giving away their money and data. This backs up figure 2 with the most </w:t>
       </w:r>
       <w:r>
         <w:t>common topics people see in spam emails with prize &amp; giveaways topping the chart.</w:t>
@@ -1987,6 +2007,369 @@
     <w:p>
       <w:r>
         <w:t>When looking at the frequent words seen in ham emails, the type of language seen is more colloquial and informal with words including “u”, “good”, “like” etc… Words like these are great indicators to tell if an email is legitimate as spam emails are more likely to copy the text content of emails from companies and organisations to make it look as realistic as possible whereas with ham emails, it is most likely the person you are emailing is someone you know personally such as a friend, colleague so there would be no need to use such professional language.</w:t>
+      </w:r>
+    </w:p>
+    <w:p/>
+    <w:p/>
+    <w:p/>
+    <w:p/>
+    <w:p>
+      <w:r>
+        <w:rPr>
+          <w:u w:val="single"/>
+        </w:rPr>
+        <w:lastRenderedPageBreak/>
+        <w:t>Punctuation Analysis:</w:t>
+      </w:r>
+      <w:r>
+        <w:rPr>
+          <w:u w:val="single"/>
+        </w:rPr>
+        <w:br/>
+      </w:r>
+      <w:r>
+        <w:t>Punctuation analysis is important for this report as spam emails often use punctuation differently from legitimate emails. It is common practice within spam emails to use excessive punctuation to garner attention, create urgency, and encourage the recipient to take action immediately. For example, “</w:t>
+      </w:r>
+      <w:r>
+        <w:t>WINNER!! As a valued network customer you have been selected to receivea Â£900 prize reward! To claim call 09061701461. Claim code KL341. Valid 12 hours only.</w:t>
+      </w:r>
+      <w:r>
+        <w:t>” This is an example of a spam email within the dataset.</w:t>
+      </w:r>
+    </w:p>
+    <w:p>
+      <w:r>
+        <w:t xml:space="preserve">This analysis is also important as it can be used to see whether punctuation can help distinguish spam from ham. If spam emails contain more </w:t>
+      </w:r>
+      <w:r>
+        <w:t>exclamation</w:t>
+      </w:r>
+      <w:r>
+        <w:t xml:space="preserve"> marks, question marks, and symbols on a consistent basis, these characteristics will become useful features for my model and classifier.</w:t>
+      </w:r>
+    </w:p>
+    <w:p>
+      <w:r>
+        <w:t xml:space="preserve">First I did a count of the number of </w:t>
+      </w:r>
+      <w:r>
+        <w:t>exclamation</w:t>
+      </w:r>
+      <w:r>
+        <w:t xml:space="preserve"> marks (!).</w:t>
+      </w:r>
+    </w:p>
+    <w:p>
+      <w:pPr>
+        <w:keepNext/>
+      </w:pPr>
+      <w:r>
+        <w:drawing>
+          <wp:inline distT="0" distB="0" distL="0" distR="0" wp14:anchorId="7334AE1A" wp14:editId="5375B6F5">
+            <wp:extent cx="5731510" cy="1130300"/>
+            <wp:effectExtent l="0" t="0" r="2540" b="0"/>
+            <wp:docPr id="536868887" name="Picture 1"/>
+            <wp:cNvGraphicFramePr>
+              <a:graphicFrameLocks xmlns:a="http://schemas.openxmlformats.org/drawingml/2006/main" noChangeAspect="1"/>
+            </wp:cNvGraphicFramePr>
+            <a:graphic xmlns:a="http://schemas.openxmlformats.org/drawingml/2006/main">
+              <a:graphicData uri="http://schemas.openxmlformats.org/drawingml/2006/picture">
+                <pic:pic xmlns:pic="http://schemas.openxmlformats.org/drawingml/2006/picture">
+                  <pic:nvPicPr>
+                    <pic:cNvPr id="536868887" name=""/>
+                    <pic:cNvPicPr/>
+                  </pic:nvPicPr>
+                  <pic:blipFill>
+                    <a:blip r:embed="rId22"/>
+                    <a:stretch>
+                      <a:fillRect/>
+                    </a:stretch>
+                  </pic:blipFill>
+                  <pic:spPr>
+                    <a:xfrm>
+                      <a:off x="0" y="0"/>
+                      <a:ext cx="5731510" cy="1130300"/>
+                    </a:xfrm>
+                    <a:prstGeom prst="rect">
+                      <a:avLst/>
+                    </a:prstGeom>
+                  </pic:spPr>
+                </pic:pic>
+              </a:graphicData>
+            </a:graphic>
+          </wp:inline>
+        </w:drawing>
+      </w:r>
+    </w:p>
+    <w:p>
+      <w:pPr>
+        <w:pStyle w:val="Caption"/>
+      </w:pPr>
+      <w:r>
+        <w:t xml:space="preserve">Figure </w:t>
+      </w:r>
+      <w:r>
+        <w:t>16</w:t>
+      </w:r>
+      <w:r>
+        <w:t xml:space="preserve"> code displaying count of </w:t>
+      </w:r>
+      <w:r>
+        <w:t>exclamation</w:t>
+      </w:r>
+      <w:r>
+        <w:t xml:space="preserve"> marks within spam and ham emails</w:t>
+      </w:r>
+    </w:p>
+    <w:p/>
+    <w:p>
+      <w:pPr>
+        <w:keepNext/>
+      </w:pPr>
+      <w:r>
+        <w:drawing>
+          <wp:inline distT="0" distB="0" distL="0" distR="0" wp14:anchorId="16D600DA" wp14:editId="2AC11057">
+            <wp:extent cx="6470650" cy="704850"/>
+            <wp:effectExtent l="0" t="0" r="6350" b="0"/>
+            <wp:docPr id="1043560394" name="Picture 1"/>
+            <wp:cNvGraphicFramePr>
+              <a:graphicFrameLocks xmlns:a="http://schemas.openxmlformats.org/drawingml/2006/main" noChangeAspect="1"/>
+            </wp:cNvGraphicFramePr>
+            <a:graphic xmlns:a="http://schemas.openxmlformats.org/drawingml/2006/main">
+              <a:graphicData uri="http://schemas.openxmlformats.org/drawingml/2006/picture">
+                <pic:pic xmlns:pic="http://schemas.openxmlformats.org/drawingml/2006/picture">
+                  <pic:nvPicPr>
+                    <pic:cNvPr id="1043560394" name=""/>
+                    <pic:cNvPicPr/>
+                  </pic:nvPicPr>
+                  <pic:blipFill>
+                    <a:blip r:embed="rId23"/>
+                    <a:stretch>
+                      <a:fillRect/>
+                    </a:stretch>
+                  </pic:blipFill>
+                  <pic:spPr>
+                    <a:xfrm>
+                      <a:off x="0" y="0"/>
+                      <a:ext cx="6470650" cy="704850"/>
+                    </a:xfrm>
+                    <a:prstGeom prst="rect">
+                      <a:avLst/>
+                    </a:prstGeom>
+                  </pic:spPr>
+                </pic:pic>
+              </a:graphicData>
+            </a:graphic>
+          </wp:inline>
+        </w:drawing>
+      </w:r>
+    </w:p>
+    <w:p>
+      <w:pPr>
+        <w:pStyle w:val="Caption"/>
+        <w:tabs>
+          <w:tab w:val="center" w:pos="4513"/>
+        </w:tabs>
+      </w:pPr>
+      <w:r>
+        <w:t>Figure 17 output of code displayed in figure 16</w:t>
+      </w:r>
+      <w:r>
+        <w:tab/>
+      </w:r>
+    </w:p>
+    <w:p>
+      <w:r>
+        <w:t xml:space="preserve">As you can see, the amount of times a punctuation mark appeared in spam email was 546 and for a ham email it was 852. This was inaccurate and not correlating to the statement I made earlier. This is because there are 4825 ham emails as opposed to 747 spam emails making it unfair to analyse the amount of </w:t>
+      </w:r>
+      <w:r>
+        <w:t>exclamation</w:t>
+      </w:r>
+      <w:r>
+        <w:t xml:space="preserve"> marks via a total count. So to improve the consistency of my analysis I calculated the average</w:t>
+      </w:r>
+      <w:r>
+        <w:t xml:space="preserve"> amount of </w:t>
+      </w:r>
+      <w:r>
+        <w:t>exclamation</w:t>
+      </w:r>
+      <w:r>
+        <w:t xml:space="preserve"> marks per email</w:t>
+      </w:r>
+      <w:r>
+        <w:t xml:space="preserve"> instead to display a fairer outcome.</w:t>
+      </w:r>
+    </w:p>
+    <w:p/>
+    <w:p>
+      <w:pPr>
+        <w:keepNext/>
+      </w:pPr>
+      <w:r>
+        <w:drawing>
+          <wp:inline distT="0" distB="0" distL="0" distR="0" wp14:anchorId="4E4DAF60" wp14:editId="04E3A238">
+            <wp:extent cx="6060328" cy="800100"/>
+            <wp:effectExtent l="0" t="0" r="0" b="0"/>
+            <wp:docPr id="1355335364" name="Picture 1"/>
+            <wp:cNvGraphicFramePr>
+              <a:graphicFrameLocks xmlns:a="http://schemas.openxmlformats.org/drawingml/2006/main" noChangeAspect="1"/>
+            </wp:cNvGraphicFramePr>
+            <a:graphic xmlns:a="http://schemas.openxmlformats.org/drawingml/2006/main">
+              <a:graphicData uri="http://schemas.openxmlformats.org/drawingml/2006/picture">
+                <pic:pic xmlns:pic="http://schemas.openxmlformats.org/drawingml/2006/picture">
+                  <pic:nvPicPr>
+                    <pic:cNvPr id="1355335364" name=""/>
+                    <pic:cNvPicPr/>
+                  </pic:nvPicPr>
+                  <pic:blipFill>
+                    <a:blip r:embed="rId24"/>
+                    <a:stretch>
+                      <a:fillRect/>
+                    </a:stretch>
+                  </pic:blipFill>
+                  <pic:spPr>
+                    <a:xfrm>
+                      <a:off x="0" y="0"/>
+                      <a:ext cx="6067806" cy="801087"/>
+                    </a:xfrm>
+                    <a:prstGeom prst="rect">
+                      <a:avLst/>
+                    </a:prstGeom>
+                  </pic:spPr>
+                </pic:pic>
+              </a:graphicData>
+            </a:graphic>
+          </wp:inline>
+        </w:drawing>
+      </w:r>
+    </w:p>
+    <w:p>
+      <w:pPr>
+        <w:pStyle w:val="Caption"/>
+      </w:pPr>
+      <w:r>
+        <w:t xml:space="preserve">Figure </w:t>
+      </w:r>
+      <w:r>
+        <w:t>18</w:t>
+      </w:r>
+      <w:r>
+        <w:t xml:space="preserve"> code to produce average amount of </w:t>
+      </w:r>
+      <w:r>
+        <w:t>exclamation</w:t>
+      </w:r>
+      <w:r>
+        <w:t xml:space="preserve"> marks within email</w:t>
+      </w:r>
+    </w:p>
+    <w:p/>
+    <w:p>
+      <w:pPr>
+        <w:keepNext/>
+      </w:pPr>
+      <w:r>
+        <w:lastRenderedPageBreak/>
+        <w:drawing>
+          <wp:inline distT="0" distB="0" distL="0" distR="0" wp14:anchorId="0A7242B7" wp14:editId="22A3F016">
+            <wp:extent cx="4075410" cy="984250"/>
+            <wp:effectExtent l="0" t="0" r="1905" b="6350"/>
+            <wp:docPr id="208157402" name="Picture 1"/>
+            <wp:cNvGraphicFramePr>
+              <a:graphicFrameLocks xmlns:a="http://schemas.openxmlformats.org/drawingml/2006/main" noChangeAspect="1"/>
+            </wp:cNvGraphicFramePr>
+            <a:graphic xmlns:a="http://schemas.openxmlformats.org/drawingml/2006/main">
+              <a:graphicData uri="http://schemas.openxmlformats.org/drawingml/2006/picture">
+                <pic:pic xmlns:pic="http://schemas.openxmlformats.org/drawingml/2006/picture">
+                  <pic:nvPicPr>
+                    <pic:cNvPr id="208157402" name=""/>
+                    <pic:cNvPicPr/>
+                  </pic:nvPicPr>
+                  <pic:blipFill>
+                    <a:blip r:embed="rId25"/>
+                    <a:stretch>
+                      <a:fillRect/>
+                    </a:stretch>
+                  </pic:blipFill>
+                  <pic:spPr>
+                    <a:xfrm>
+                      <a:off x="0" y="0"/>
+                      <a:ext cx="4089344" cy="987615"/>
+                    </a:xfrm>
+                    <a:prstGeom prst="rect">
+                      <a:avLst/>
+                    </a:prstGeom>
+                  </pic:spPr>
+                </pic:pic>
+              </a:graphicData>
+            </a:graphic>
+          </wp:inline>
+        </w:drawing>
+      </w:r>
+    </w:p>
+    <w:p>
+      <w:pPr>
+        <w:pStyle w:val="Caption"/>
+      </w:pPr>
+      <w:r>
+        <w:t>Figure 19 output displaying average number of exclamation marks per email</w:t>
+      </w:r>
+    </w:p>
+    <w:p/>
+    <w:p>
+      <w:pPr>
+        <w:keepNext/>
+      </w:pPr>
+      <w:r>
+        <w:drawing>
+          <wp:inline distT="0" distB="0" distL="0" distR="0" wp14:anchorId="32C42D45" wp14:editId="2B09845D">
+            <wp:extent cx="3835597" cy="3092609"/>
+            <wp:effectExtent l="0" t="0" r="0" b="0"/>
+            <wp:docPr id="1614299226" name="Picture 1"/>
+            <wp:cNvGraphicFramePr>
+              <a:graphicFrameLocks xmlns:a="http://schemas.openxmlformats.org/drawingml/2006/main" noChangeAspect="1"/>
+            </wp:cNvGraphicFramePr>
+            <a:graphic xmlns:a="http://schemas.openxmlformats.org/drawingml/2006/main">
+              <a:graphicData uri="http://schemas.openxmlformats.org/drawingml/2006/picture">
+                <pic:pic xmlns:pic="http://schemas.openxmlformats.org/drawingml/2006/picture">
+                  <pic:nvPicPr>
+                    <pic:cNvPr id="1614299226" name=""/>
+                    <pic:cNvPicPr/>
+                  </pic:nvPicPr>
+                  <pic:blipFill>
+                    <a:blip r:embed="rId26"/>
+                    <a:stretch>
+                      <a:fillRect/>
+                    </a:stretch>
+                  </pic:blipFill>
+                  <pic:spPr>
+                    <a:xfrm>
+                      <a:off x="0" y="0"/>
+                      <a:ext cx="3835597" cy="3092609"/>
+                    </a:xfrm>
+                    <a:prstGeom prst="rect">
+                      <a:avLst/>
+                    </a:prstGeom>
+                  </pic:spPr>
+                </pic:pic>
+              </a:graphicData>
+            </a:graphic>
+          </wp:inline>
+        </w:drawing>
+      </w:r>
+    </w:p>
+    <w:p>
+      <w:pPr>
+        <w:pStyle w:val="Caption"/>
+      </w:pPr>
+      <w:r>
+        <w:t>Figure 20 average number of exclamation marks per email</w:t>
+      </w:r>
+    </w:p>
+    <w:p>
+      <w:r>
+        <w:t>By calculating the average number of exclamation marks per email, it now shows that exclamation marks within spam emails are more prevalent than in legitimate emails. This is a good indicator to see whether an email is legitimate or not.</w:t>
       </w:r>
     </w:p>
     <w:sectPr>

</xml_diff>

<commit_message>
done analysis for average number of question marks
</commit_message>
<xml_diff>
--- a/Project Spam Email Detector.docx
+++ b/Project Spam Email Detector.docx
@@ -1617,6 +1617,9 @@
         <w:keepNext/>
       </w:pPr>
       <w:r>
+        <w:rPr>
+          <w:noProof/>
+        </w:rPr>
         <w:drawing>
           <wp:inline distT="0" distB="0" distL="0" distR="0" wp14:anchorId="4DD9067F" wp14:editId="5E5E1B1C">
             <wp:extent cx="3016250" cy="1842068"/>
@@ -1747,6 +1750,9 @@
         </mc:AlternateContent>
       </w:r>
       <w:r>
+        <w:rPr>
+          <w:noProof/>
+        </w:rPr>
         <w:drawing>
           <wp:anchor distT="0" distB="0" distL="114300" distR="114300" simplePos="0" relativeHeight="251664384" behindDoc="0" locked="0" layoutInCell="1" allowOverlap="1" wp14:anchorId="1F86DF3D" wp14:editId="3257D067">
             <wp:simplePos x="0" y="0"/>
@@ -2031,7 +2037,15 @@
         <w:t>Punctuation analysis is important for this report as spam emails often use punctuation differently from legitimate emails. It is common practice within spam emails to use excessive punctuation to garner attention, create urgency, and encourage the recipient to take action immediately. For example, “</w:t>
       </w:r>
       <w:r>
-        <w:t>WINNER!! As a valued network customer you have been selected to receivea Â£900 prize reward! To claim call 09061701461. Claim code KL341. Valid 12 hours only.</w:t>
+        <w:t xml:space="preserve">WINNER!! As a valued network customer you have been selected to </w:t>
+      </w:r>
+      <w:proofErr w:type="spellStart"/>
+      <w:r>
+        <w:t>receivea</w:t>
+      </w:r>
+      <w:proofErr w:type="spellEnd"/>
+      <w:r>
+        <w:t xml:space="preserve"> Â£900 prize reward! To claim call 09061701461. Claim code KL341. Valid 12 hours only.</w:t>
       </w:r>
       <w:r>
         <w:t>” This is an example of a spam email within the dataset.</w:t>
@@ -2064,6 +2078,9 @@
         <w:keepNext/>
       </w:pPr>
       <w:r>
+        <w:rPr>
+          <w:noProof/>
+        </w:rPr>
         <w:drawing>
           <wp:inline distT="0" distB="0" distL="0" distR="0" wp14:anchorId="7334AE1A" wp14:editId="5375B6F5">
             <wp:extent cx="5731510" cy="1130300"/>
@@ -2127,6 +2144,9 @@
         <w:keepNext/>
       </w:pPr>
       <w:r>
+        <w:rPr>
+          <w:noProof/>
+        </w:rPr>
         <w:drawing>
           <wp:inline distT="0" distB="0" distL="0" distR="0" wp14:anchorId="16D600DA" wp14:editId="2AC11057">
             <wp:extent cx="6470650" cy="704850"/>
@@ -2207,6 +2227,9 @@
         <w:keepNext/>
       </w:pPr>
       <w:r>
+        <w:rPr>
+          <w:noProof/>
+        </w:rPr>
         <w:drawing>
           <wp:inline distT="0" distB="0" distL="0" distR="0" wp14:anchorId="4E4DAF60" wp14:editId="04E3A238">
             <wp:extent cx="6060328" cy="800100"/>
@@ -2270,6 +2293,9 @@
         <w:keepNext/>
       </w:pPr>
       <w:r>
+        <w:rPr>
+          <w:noProof/>
+        </w:rPr>
         <w:lastRenderedPageBreak/>
         <w:drawing>
           <wp:inline distT="0" distB="0" distL="0" distR="0" wp14:anchorId="0A7242B7" wp14:editId="22A3F016">
@@ -2322,6 +2348,9 @@
         <w:keepNext/>
       </w:pPr>
       <w:r>
+        <w:rPr>
+          <w:noProof/>
+        </w:rPr>
         <w:drawing>
           <wp:inline distT="0" distB="0" distL="0" distR="0" wp14:anchorId="32C42D45" wp14:editId="2B09845D">
             <wp:extent cx="3835597" cy="3092609"/>
@@ -2370,6 +2399,181 @@
     <w:p>
       <w:r>
         <w:t>By calculating the average number of exclamation marks per email, it now shows that exclamation marks within spam emails are more prevalent than in legitimate emails. This is a good indicator to see whether an email is legitimate or not.</w:t>
+      </w:r>
+    </w:p>
+    <w:p>
+      <w:r>
+        <w:t>Next was the count of question marks:</w:t>
+      </w:r>
+    </w:p>
+    <w:p>
+      <w:pPr>
+        <w:keepNext/>
+      </w:pPr>
+      <w:r>
+        <w:drawing>
+          <wp:inline distT="0" distB="0" distL="0" distR="0" wp14:anchorId="359D18E9" wp14:editId="17B0ECB5">
+            <wp:extent cx="5731510" cy="1117600"/>
+            <wp:effectExtent l="0" t="0" r="2540" b="6350"/>
+            <wp:docPr id="309467103" name="Picture 1"/>
+            <wp:cNvGraphicFramePr>
+              <a:graphicFrameLocks xmlns:a="http://schemas.openxmlformats.org/drawingml/2006/main" noChangeAspect="1"/>
+            </wp:cNvGraphicFramePr>
+            <a:graphic xmlns:a="http://schemas.openxmlformats.org/drawingml/2006/main">
+              <a:graphicData uri="http://schemas.openxmlformats.org/drawingml/2006/picture">
+                <pic:pic xmlns:pic="http://schemas.openxmlformats.org/drawingml/2006/picture">
+                  <pic:nvPicPr>
+                    <pic:cNvPr id="309467103" name=""/>
+                    <pic:cNvPicPr/>
+                  </pic:nvPicPr>
+                  <pic:blipFill>
+                    <a:blip r:embed="rId27"/>
+                    <a:stretch>
+                      <a:fillRect/>
+                    </a:stretch>
+                  </pic:blipFill>
+                  <pic:spPr>
+                    <a:xfrm>
+                      <a:off x="0" y="0"/>
+                      <a:ext cx="5731510" cy="1117600"/>
+                    </a:xfrm>
+                    <a:prstGeom prst="rect">
+                      <a:avLst/>
+                    </a:prstGeom>
+                  </pic:spPr>
+                </pic:pic>
+              </a:graphicData>
+            </a:graphic>
+          </wp:inline>
+        </w:drawing>
+      </w:r>
+    </w:p>
+    <w:p>
+      <w:pPr>
+        <w:pStyle w:val="Caption"/>
+      </w:pPr>
+      <w:r>
+        <w:t>Figure 21 Output of question mark analysis code</w:t>
+      </w:r>
+    </w:p>
+    <w:p/>
+    <w:p>
+      <w:pPr>
+        <w:keepNext/>
+      </w:pPr>
+      <w:r>
+        <w:lastRenderedPageBreak/>
+        <w:drawing>
+          <wp:inline distT="0" distB="0" distL="0" distR="0" wp14:anchorId="69C940D2" wp14:editId="68C8A2AF">
+            <wp:extent cx="4007056" cy="3105310"/>
+            <wp:effectExtent l="0" t="0" r="0" b="0"/>
+            <wp:docPr id="1657353223" name="Picture 1"/>
+            <wp:cNvGraphicFramePr>
+              <a:graphicFrameLocks xmlns:a="http://schemas.openxmlformats.org/drawingml/2006/main" noChangeAspect="1"/>
+            </wp:cNvGraphicFramePr>
+            <a:graphic xmlns:a="http://schemas.openxmlformats.org/drawingml/2006/main">
+              <a:graphicData uri="http://schemas.openxmlformats.org/drawingml/2006/picture">
+                <pic:pic xmlns:pic="http://schemas.openxmlformats.org/drawingml/2006/picture">
+                  <pic:nvPicPr>
+                    <pic:cNvPr id="1657353223" name=""/>
+                    <pic:cNvPicPr/>
+                  </pic:nvPicPr>
+                  <pic:blipFill>
+                    <a:blip r:embed="rId28"/>
+                    <a:stretch>
+                      <a:fillRect/>
+                    </a:stretch>
+                  </pic:blipFill>
+                  <pic:spPr>
+                    <a:xfrm>
+                      <a:off x="0" y="0"/>
+                      <a:ext cx="4007056" cy="3105310"/>
+                    </a:xfrm>
+                    <a:prstGeom prst="rect">
+                      <a:avLst/>
+                    </a:prstGeom>
+                  </pic:spPr>
+                </pic:pic>
+              </a:graphicData>
+            </a:graphic>
+          </wp:inline>
+        </w:drawing>
+      </w:r>
+    </w:p>
+    <w:p>
+      <w:pPr>
+        <w:pStyle w:val="Caption"/>
+      </w:pPr>
+      <w:r>
+        <w:t>Figure 22 Chart showcasing average no of question marks per spam and ham email</w:t>
+      </w:r>
+    </w:p>
+    <w:p/>
+    <w:p>
+      <w:r>
+        <w:t xml:space="preserve">With </w:t>
+      </w:r>
+      <w:r>
+        <w:t xml:space="preserve">the </w:t>
+      </w:r>
+      <w:r>
+        <w:t xml:space="preserve">output shown here, it displays how ham emails have a higher percentage of question marks (?) per email with a total of 1375 and it having an average of 0.28 whereas with spam emails, it has a total of 175 and an average of 0.23. </w:t>
+      </w:r>
+    </w:p>
+    <w:p>
+      <w:r>
+        <w:t>What this can entail is that within legitimate emails, they are more likely to be asking questions and having genuine conversation with the recipient. With spam emails on the other hand, the way question marks would generally be used is in a way to convey the user that such thing that they are promoting is too good to be true</w:t>
+      </w:r>
+      <w:r>
+        <w:t xml:space="preserve">. </w:t>
+      </w:r>
+    </w:p>
+    <w:p>
+      <w:r>
+        <w:t>Another way they are used within spam emails is in a more “direct” manner making a direct statement as such. For example, “</w:t>
+      </w:r>
+      <w:r>
+        <w:t xml:space="preserve">Want 2 get laid tonight? Want real Dogging locations sent direct 2 </w:t>
+      </w:r>
+      <w:proofErr w:type="spellStart"/>
+      <w:r>
+        <w:t>ur</w:t>
+      </w:r>
+      <w:proofErr w:type="spellEnd"/>
+      <w:r>
+        <w:t xml:space="preserve"> mob? Join the UK's largest Dogging Network </w:t>
+      </w:r>
+      <w:proofErr w:type="spellStart"/>
+      <w:r>
+        <w:t>bt</w:t>
+      </w:r>
+      <w:proofErr w:type="spellEnd"/>
+      <w:r>
+        <w:t xml:space="preserve"> </w:t>
+      </w:r>
+      <w:proofErr w:type="spellStart"/>
+      <w:r>
+        <w:t>Txting</w:t>
+      </w:r>
+      <w:proofErr w:type="spellEnd"/>
+      <w:r>
+        <w:t xml:space="preserve"> GRAVEL to 69888! Nt. ec2a. </w:t>
+      </w:r>
+      <w:hyperlink r:id="rId29" w:history="1">
+        <w:r>
+          <w:rPr>
+            <w:rStyle w:val="Hyperlink"/>
+          </w:rPr>
+          <w:t>31p.msg@150p</w:t>
+        </w:r>
+      </w:hyperlink>
+      <w:r>
+        <w:t xml:space="preserve">.” </w:t>
+      </w:r>
+    </w:p>
+    <w:p>
+      <w:r>
+        <w:t>To conclude, using question marks as an indicator to see if the text content within an email is legitimate or otherwise is not an efficient way of doing so as question marks are very commonly used in normal conversation.</w:t>
       </w:r>
     </w:p>
     <w:sectPr>
@@ -3272,6 +3476,7 @@
   <w:style w:type="character" w:default="1" w:styleId="DefaultParagraphFont">
     <w:name w:val="Default Paragraph Font"/>
     <w:uiPriority w:val="1"/>
+    <w:semiHidden/>
     <w:unhideWhenUsed/>
   </w:style>
   <w:style w:type="table" w:default="1" w:styleId="TableNormal">

</xml_diff>

<commit_message>
started number analysis, wrote paragraph explaning what i did, ploted chart and box plot and explained contents within them
</commit_message>
<xml_diff>
--- a/Project Spam Email Detector.docx
+++ b/Project Spam Email Detector.docx
@@ -2037,15 +2037,7 @@
         <w:t>Punctuation analysis is important for this report as spam emails often use punctuation differently from legitimate emails. It is common practice within spam emails to use excessive punctuation to garner attention, create urgency, and encourage the recipient to take action immediately. For example, “</w:t>
       </w:r>
       <w:r>
-        <w:t xml:space="preserve">WINNER!! As a valued network customer you have been selected to </w:t>
-      </w:r>
-      <w:proofErr w:type="spellStart"/>
-      <w:r>
-        <w:t>receivea</w:t>
-      </w:r>
-      <w:proofErr w:type="spellEnd"/>
-      <w:r>
-        <w:t xml:space="preserve"> Â£900 prize reward! To claim call 09061701461. Claim code KL341. Valid 12 hours only.</w:t>
+        <w:t>WINNER!! As a valued network customer you have been selected to receivea Â£900 prize reward! To claim call 09061701461. Claim code KL341. Valid 12 hours only.</w:t>
       </w:r>
       <w:r>
         <w:t>” This is an example of a spam email within the dataset.</w:t>
@@ -2574,6 +2566,499 @@
     <w:p>
       <w:r>
         <w:t>To conclude, using question marks as an indicator to see if the text content within an email is legitimate or otherwise is not an efficient way of doing so as question marks are very commonly used in normal conversation.</w:t>
+      </w:r>
+    </w:p>
+    <w:p/>
+    <w:p>
+      <w:pPr>
+        <w:rPr>
+          <w:u w:val="single"/>
+        </w:rPr>
+      </w:pPr>
+      <w:r>
+        <w:rPr>
+          <w:u w:val="single"/>
+        </w:rPr>
+        <w:t>Number &amp; Symbol analysis:</w:t>
+      </w:r>
+    </w:p>
+    <w:p>
+      <w:r>
+        <w:t>This part of the analysis is something that will directly help and impact the machine learning model and detector that will be constructed later on.</w:t>
+      </w:r>
+    </w:p>
+    <w:p>
+      <w:r>
+        <w:t xml:space="preserve">The reasoning and purpose of </w:t>
+      </w:r>
+      <w:r>
+        <w:t xml:space="preserve">performing analysis on numbers and symbols is to investigate whether spam emails have distinctive numerical and symbolic patterns that differs in legitimate emails. Spam emails are designed to grab the attention of users and convince them to take immediate action for example: </w:t>
+      </w:r>
+    </w:p>
+    <w:p>
+      <w:r>
+        <w:lastRenderedPageBreak/>
+        <w:t>“</w:t>
+      </w:r>
+      <w:r>
+        <w:t xml:space="preserve">Sunshine Quiz </w:t>
+      </w:r>
+      <w:proofErr w:type="spellStart"/>
+      <w:r>
+        <w:t>Wkly</w:t>
+      </w:r>
+      <w:proofErr w:type="spellEnd"/>
+      <w:r>
+        <w:t xml:space="preserve"> Q! Win a top Sony DVD player if u know which country the Algarve is in? Txt </w:t>
+      </w:r>
+      <w:proofErr w:type="spellStart"/>
+      <w:r>
+        <w:t>ansr</w:t>
+      </w:r>
+      <w:proofErr w:type="spellEnd"/>
+      <w:r>
+        <w:t xml:space="preserve"> to 82277. Â£1.50 </w:t>
+      </w:r>
+      <w:proofErr w:type="spellStart"/>
+      <w:r>
+        <w:t>SP:Tyrone</w:t>
+      </w:r>
+      <w:proofErr w:type="spellEnd"/>
+      <w:r>
+        <w:t>”, “</w:t>
+      </w:r>
+      <w:r>
+        <w:t xml:space="preserve">You are a winner U have been specially selected 2 receive Â£1000 cash or a 4* holiday (flights </w:t>
+      </w:r>
+      <w:proofErr w:type="spellStart"/>
+      <w:r>
+        <w:t>inc</w:t>
+      </w:r>
+      <w:proofErr w:type="spellEnd"/>
+      <w:r>
+        <w:t>) speak to a live operator 2 claim 0871277810810</w:t>
+      </w:r>
+      <w:r>
+        <w:t>”</w:t>
+      </w:r>
+    </w:p>
+    <w:p>
+      <w:r>
+        <w:t>With these emails you can see how these emails attempt to sway your attentiveness to take action. This can be with the over exaggeration of exclamation marks and capital letters, and the numbers and symbols being utilised. The absurd amounts of money supposedly being rewarded to you can make the user have the intuition to think such sum cannot be awarded to them however, with the structure of the text content being constructed, how legitimate it seems to be is why the end users potentially get trapped into these professional scams</w:t>
+      </w:r>
+      <w:r>
+        <w:t>.</w:t>
+      </w:r>
+    </w:p>
+    <w:p>
+      <w:r>
+        <w:t>Therefore reviewing the patterns that these numbers and symbols have within these spam emails is important.</w:t>
+      </w:r>
+    </w:p>
+    <w:p/>
+    <w:p>
+      <w:r>
+        <w:t>How many numbers does each email contain?</w:t>
+      </w:r>
+    </w:p>
+    <w:p>
+      <w:pPr>
+        <w:keepNext/>
+      </w:pPr>
+      <w:r>
+        <w:drawing>
+          <wp:inline distT="0" distB="0" distL="0" distR="0" wp14:anchorId="4E6A637A" wp14:editId="3BD402C9">
+            <wp:extent cx="4360525" cy="952500"/>
+            <wp:effectExtent l="0" t="0" r="2540" b="0"/>
+            <wp:docPr id="1600356544" name="Picture 1"/>
+            <wp:cNvGraphicFramePr>
+              <a:graphicFrameLocks xmlns:a="http://schemas.openxmlformats.org/drawingml/2006/main" noChangeAspect="1"/>
+            </wp:cNvGraphicFramePr>
+            <a:graphic xmlns:a="http://schemas.openxmlformats.org/drawingml/2006/main">
+              <a:graphicData uri="http://schemas.openxmlformats.org/drawingml/2006/picture">
+                <pic:pic xmlns:pic="http://schemas.openxmlformats.org/drawingml/2006/picture">
+                  <pic:nvPicPr>
+                    <pic:cNvPr id="1600356544" name=""/>
+                    <pic:cNvPicPr/>
+                  </pic:nvPicPr>
+                  <pic:blipFill>
+                    <a:blip r:embed="rId30"/>
+                    <a:stretch>
+                      <a:fillRect/>
+                    </a:stretch>
+                  </pic:blipFill>
+                  <pic:spPr>
+                    <a:xfrm>
+                      <a:off x="0" y="0"/>
+                      <a:ext cx="4364761" cy="953425"/>
+                    </a:xfrm>
+                    <a:prstGeom prst="rect">
+                      <a:avLst/>
+                    </a:prstGeom>
+                  </pic:spPr>
+                </pic:pic>
+              </a:graphicData>
+            </a:graphic>
+          </wp:inline>
+        </w:drawing>
+      </w:r>
+    </w:p>
+    <w:p>
+      <w:pPr>
+        <w:pStyle w:val="Caption"/>
+      </w:pPr>
+      <w:r>
+        <w:t>Figure 23 code displaying the count of how many digits appear</w:t>
+      </w:r>
+    </w:p>
+    <w:p>
+      <w:r>
+        <w:t>What this does is that I am selecting the column that contains the text content of emails which, in this case it is “Message”. Then this specific operation I am computing should be performed on every email so to do that I included .apply(). This enables the function to automatically loop through every row for both spam and ham emails.</w:t>
+      </w:r>
+      <w:r>
+        <w:t xml:space="preserve"> Next is to look at each character in the email which is done with char.isdigit(). With this, Python checks for each character and labels each non digitised character as false and true for each numerical digit.</w:t>
+      </w:r>
+    </w:p>
+    <w:p>
+      <w:r>
+        <w:t>Now it is time to calculate the average:</w:t>
+      </w:r>
+    </w:p>
+    <w:p>
+      <w:pPr>
+        <w:keepNext/>
+      </w:pPr>
+      <w:r>
+        <w:rPr>
+          <w:noProof/>
+        </w:rPr>
+        <mc:AlternateContent>
+          <mc:Choice Requires="wps">
+            <w:drawing>
+              <wp:anchor distT="0" distB="0" distL="114300" distR="114300" simplePos="0" relativeHeight="251672576" behindDoc="0" locked="0" layoutInCell="1" allowOverlap="1" wp14:anchorId="0323F5DA" wp14:editId="5109758A">
+                <wp:simplePos x="0" y="0"/>
+                <wp:positionH relativeFrom="column">
+                  <wp:posOffset>3879850</wp:posOffset>
+                </wp:positionH>
+                <wp:positionV relativeFrom="paragraph">
+                  <wp:posOffset>1379220</wp:posOffset>
+                </wp:positionV>
+                <wp:extent cx="2406650" cy="635"/>
+                <wp:effectExtent l="0" t="0" r="0" b="0"/>
+                <wp:wrapNone/>
+                <wp:docPr id="1799766454" name="Text Box 1"/>
+                <wp:cNvGraphicFramePr/>
+                <a:graphic xmlns:a="http://schemas.openxmlformats.org/drawingml/2006/main">
+                  <a:graphicData uri="http://schemas.microsoft.com/office/word/2010/wordprocessingShape">
+                    <wps:wsp>
+                      <wps:cNvSpPr txBox="1"/>
+                      <wps:spPr>
+                        <a:xfrm>
+                          <a:off x="0" y="0"/>
+                          <a:ext cx="2406650" cy="635"/>
+                        </a:xfrm>
+                        <a:prstGeom prst="rect">
+                          <a:avLst/>
+                        </a:prstGeom>
+                        <a:solidFill>
+                          <a:prstClr val="white"/>
+                        </a:solidFill>
+                        <a:ln>
+                          <a:noFill/>
+                        </a:ln>
+                      </wps:spPr>
+                      <wps:txbx>
+                        <w:txbxContent>
+                          <w:p>
+                            <w:pPr>
+                              <w:pStyle w:val="Caption"/>
+                              <w:rPr>
+                                <w:sz w:val="22"/>
+                                <w:szCs w:val="22"/>
+                              </w:rPr>
+                            </w:pPr>
+                            <w:r>
+                              <w:t>Figure 25 output displaying average amount of numbers within a spam and ham email</w:t>
+                            </w:r>
+                          </w:p>
+                        </w:txbxContent>
+                      </wps:txbx>
+                      <wps:bodyPr rot="0" spcFirstLastPara="0" vertOverflow="overflow" horzOverflow="overflow" vert="horz" wrap="square" lIns="0" tIns="0" rIns="0" bIns="0" numCol="1" spcCol="0" rtlCol="0" fromWordArt="0" anchor="t" anchorCtr="0" forceAA="0" compatLnSpc="1">
+                        <a:prstTxWarp prst="textNoShape">
+                          <a:avLst/>
+                        </a:prstTxWarp>
+                        <a:spAutoFit/>
+                      </wps:bodyPr>
+                    </wps:wsp>
+                  </a:graphicData>
+                </a:graphic>
+              </wp:anchor>
+            </w:drawing>
+          </mc:Choice>
+          <mc:Fallback>
+            <w:pict>
+              <v:shapetype w14:anchorId="0323F5DA" id="_x0000_t202" coordsize="21600,21600" o:spt="202" path="m,l,21600r21600,l21600,xe">
+                <v:stroke joinstyle="miter"/>
+                <v:path gradientshapeok="t" o:connecttype="rect"/>
+              </v:shapetype>
+              <v:shape id="_x0000_s1030" type="#_x0000_t202" style="position:absolute;margin-left:305.5pt;margin-top:108.6pt;width:189.5pt;height:.05pt;z-index:251672576;visibility:visible;mso-wrap-style:square;mso-wrap-distance-left:9pt;mso-wrap-distance-top:0;mso-wrap-distance-right:9pt;mso-wrap-distance-bottom:0;mso-position-horizontal:absolute;mso-position-horizontal-relative:text;mso-position-vertical:absolute;mso-position-vertical-relative:text;v-text-anchor:top" o:gfxdata="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" stroked="f">
+                <v:textbox style="mso-fit-shape-to-text:t" inset="0,0,0,0">
+                  <w:txbxContent>
+                    <w:p>
+                      <w:pPr>
+                        <w:pStyle w:val="Caption"/>
+                        <w:rPr>
+                          <w:sz w:val="22"/>
+                          <w:szCs w:val="22"/>
+                        </w:rPr>
+                      </w:pPr>
+                      <w:r>
+                        <w:t>Figure 25 output displaying average amount of numbers within a spam and ham email</w:t>
+                      </w:r>
+                    </w:p>
+                  </w:txbxContent>
+                </v:textbox>
+              </v:shape>
+            </w:pict>
+          </mc:Fallback>
+        </mc:AlternateContent>
+      </w:r>
+      <w:r>
+        <w:drawing>
+          <wp:anchor distT="0" distB="0" distL="114300" distR="114300" simplePos="0" relativeHeight="251670528" behindDoc="0" locked="0" layoutInCell="1" allowOverlap="1" wp14:anchorId="18C868D3" wp14:editId="1B5AF5A7">
+            <wp:simplePos x="0" y="0"/>
+            <wp:positionH relativeFrom="column">
+              <wp:posOffset>3879850</wp:posOffset>
+            </wp:positionH>
+            <wp:positionV relativeFrom="paragraph">
+              <wp:posOffset>59055</wp:posOffset>
+            </wp:positionV>
+            <wp:extent cx="2406650" cy="1263015"/>
+            <wp:effectExtent l="0" t="0" r="0" b="0"/>
+            <wp:wrapNone/>
+            <wp:docPr id="928560419" name="Picture 1"/>
+            <wp:cNvGraphicFramePr>
+              <a:graphicFrameLocks xmlns:a="http://schemas.openxmlformats.org/drawingml/2006/main" noChangeAspect="1"/>
+            </wp:cNvGraphicFramePr>
+            <a:graphic xmlns:a="http://schemas.openxmlformats.org/drawingml/2006/main">
+              <a:graphicData uri="http://schemas.openxmlformats.org/drawingml/2006/picture">
+                <pic:pic xmlns:pic="http://schemas.openxmlformats.org/drawingml/2006/picture">
+                  <pic:nvPicPr>
+                    <pic:cNvPr id="928560419" name=""/>
+                    <pic:cNvPicPr/>
+                  </pic:nvPicPr>
+                  <pic:blipFill>
+                    <a:blip r:embed="rId31">
+                      <a:extLst>
+                        <a:ext uri="{28A0092B-C50C-407E-A947-70E740481C1C}">
+                          <a14:useLocalDpi xmlns:a14="http://schemas.microsoft.com/office/drawing/2010/main" val="0"/>
+                        </a:ext>
+                      </a:extLst>
+                    </a:blip>
+                    <a:stretch>
+                      <a:fillRect/>
+                    </a:stretch>
+                  </pic:blipFill>
+                  <pic:spPr>
+                    <a:xfrm>
+                      <a:off x="0" y="0"/>
+                      <a:ext cx="2424288" cy="1272271"/>
+                    </a:xfrm>
+                    <a:prstGeom prst="rect">
+                      <a:avLst/>
+                    </a:prstGeom>
+                  </pic:spPr>
+                </pic:pic>
+              </a:graphicData>
+            </a:graphic>
+            <wp14:sizeRelH relativeFrom="margin">
+              <wp14:pctWidth>0</wp14:pctWidth>
+            </wp14:sizeRelH>
+            <wp14:sizeRelV relativeFrom="margin">
+              <wp14:pctHeight>0</wp14:pctHeight>
+            </wp14:sizeRelV>
+          </wp:anchor>
+        </w:drawing>
+      </w:r>
+      <w:r>
+        <w:drawing>
+          <wp:inline distT="0" distB="0" distL="0" distR="0" wp14:anchorId="52FD5766" wp14:editId="4B2B64E7">
+            <wp:extent cx="3651250" cy="1188085"/>
+            <wp:effectExtent l="0" t="0" r="6350" b="0"/>
+            <wp:docPr id="378519814" name="Picture 1"/>
+            <wp:cNvGraphicFramePr>
+              <a:graphicFrameLocks xmlns:a="http://schemas.openxmlformats.org/drawingml/2006/main" noChangeAspect="1"/>
+            </wp:cNvGraphicFramePr>
+            <a:graphic xmlns:a="http://schemas.openxmlformats.org/drawingml/2006/main">
+              <a:graphicData uri="http://schemas.openxmlformats.org/drawingml/2006/picture">
+                <pic:pic xmlns:pic="http://schemas.openxmlformats.org/drawingml/2006/picture">
+                  <pic:nvPicPr>
+                    <pic:cNvPr id="378519814" name=""/>
+                    <pic:cNvPicPr/>
+                  </pic:nvPicPr>
+                  <pic:blipFill>
+                    <a:blip r:embed="rId32"/>
+                    <a:stretch>
+                      <a:fillRect/>
+                    </a:stretch>
+                  </pic:blipFill>
+                  <pic:spPr>
+                    <a:xfrm>
+                      <a:off x="0" y="0"/>
+                      <a:ext cx="3679385" cy="1197240"/>
+                    </a:xfrm>
+                    <a:prstGeom prst="rect">
+                      <a:avLst/>
+                    </a:prstGeom>
+                  </pic:spPr>
+                </pic:pic>
+              </a:graphicData>
+            </a:graphic>
+          </wp:inline>
+        </w:drawing>
+      </w:r>
+    </w:p>
+    <w:p>
+      <w:pPr>
+        <w:pStyle w:val="Caption"/>
+      </w:pPr>
+      <w:r>
+        <w:t>Figure 24 code to show the average numbers in spam and ham emails</w:t>
+      </w:r>
+    </w:p>
+    <w:p/>
+    <w:p/>
+    <w:p>
+      <w:r>
+        <w:t>What this shows is that spam emails contain, on average, more numerical digits than legitimate emails and that there is a direct correlation between a high usage of digits within an email and it potentially being classified as spam.</w:t>
+      </w:r>
+    </w:p>
+    <w:p>
+      <w:pPr>
+        <w:keepNext/>
+      </w:pPr>
+      <w:r>
+        <w:lastRenderedPageBreak/>
+        <w:drawing>
+          <wp:inline distT="0" distB="0" distL="0" distR="0" wp14:anchorId="1F5888ED" wp14:editId="2289A8CB">
+            <wp:extent cx="4045158" cy="3035456"/>
+            <wp:effectExtent l="0" t="0" r="0" b="0"/>
+            <wp:docPr id="1857456600" name="Picture 1"/>
+            <wp:cNvGraphicFramePr>
+              <a:graphicFrameLocks xmlns:a="http://schemas.openxmlformats.org/drawingml/2006/main" noChangeAspect="1"/>
+            </wp:cNvGraphicFramePr>
+            <a:graphic xmlns:a="http://schemas.openxmlformats.org/drawingml/2006/main">
+              <a:graphicData uri="http://schemas.openxmlformats.org/drawingml/2006/picture">
+                <pic:pic xmlns:pic="http://schemas.openxmlformats.org/drawingml/2006/picture">
+                  <pic:nvPicPr>
+                    <pic:cNvPr id="1857456600" name=""/>
+                    <pic:cNvPicPr/>
+                  </pic:nvPicPr>
+                  <pic:blipFill>
+                    <a:blip r:embed="rId33"/>
+                    <a:stretch>
+                      <a:fillRect/>
+                    </a:stretch>
+                  </pic:blipFill>
+                  <pic:spPr>
+                    <a:xfrm>
+                      <a:off x="0" y="0"/>
+                      <a:ext cx="4045158" cy="3035456"/>
+                    </a:xfrm>
+                    <a:prstGeom prst="rect">
+                      <a:avLst/>
+                    </a:prstGeom>
+                  </pic:spPr>
+                </pic:pic>
+              </a:graphicData>
+            </a:graphic>
+          </wp:inline>
+        </w:drawing>
+      </w:r>
+    </w:p>
+    <w:p>
+      <w:pPr>
+        <w:pStyle w:val="Caption"/>
+      </w:pPr>
+      <w:r>
+        <w:t>Figure 26 chart displaying the average number of numerical digitised character per email</w:t>
+      </w:r>
+    </w:p>
+    <w:p/>
+    <w:p>
+      <w:r>
+        <w:t>To showcase what this data I calculated is trying to tell us, I also plotted a box plot as that goes into depth into the distribution and variability within each category. It also tells us the median value, how spread out the data is, and what category of emails has more variation in this case the amount of digits being used.</w:t>
+      </w:r>
+    </w:p>
+    <w:p>
+      <w:r>
+        <w:t>Box plots will also help justify why this part of the analysis is useful for distinguishing spam from legitimate emails.</w:t>
+      </w:r>
+    </w:p>
+    <w:p>
+      <w:pPr>
+        <w:keepNext/>
+      </w:pPr>
+      <w:r>
+        <w:drawing>
+          <wp:inline distT="0" distB="0" distL="0" distR="0" wp14:anchorId="38D00F1F" wp14:editId="20E0E4B1">
+            <wp:extent cx="4045158" cy="3054507"/>
+            <wp:effectExtent l="0" t="0" r="0" b="0"/>
+            <wp:docPr id="1826671980" name="Picture 1"/>
+            <wp:cNvGraphicFramePr>
+              <a:graphicFrameLocks xmlns:a="http://schemas.openxmlformats.org/drawingml/2006/main" noChangeAspect="1"/>
+            </wp:cNvGraphicFramePr>
+            <a:graphic xmlns:a="http://schemas.openxmlformats.org/drawingml/2006/main">
+              <a:graphicData uri="http://schemas.openxmlformats.org/drawingml/2006/picture">
+                <pic:pic xmlns:pic="http://schemas.openxmlformats.org/drawingml/2006/picture">
+                  <pic:nvPicPr>
+                    <pic:cNvPr id="1826671980" name=""/>
+                    <pic:cNvPicPr/>
+                  </pic:nvPicPr>
+                  <pic:blipFill>
+                    <a:blip r:embed="rId34"/>
+                    <a:stretch>
+                      <a:fillRect/>
+                    </a:stretch>
+                  </pic:blipFill>
+                  <pic:spPr>
+                    <a:xfrm>
+                      <a:off x="0" y="0"/>
+                      <a:ext cx="4045158" cy="3054507"/>
+                    </a:xfrm>
+                    <a:prstGeom prst="rect">
+                      <a:avLst/>
+                    </a:prstGeom>
+                  </pic:spPr>
+                </pic:pic>
+              </a:graphicData>
+            </a:graphic>
+          </wp:inline>
+        </w:drawing>
+      </w:r>
+    </w:p>
+    <w:p>
+      <w:pPr>
+        <w:pStyle w:val="Caption"/>
+      </w:pPr>
+      <w:r>
+        <w:t>Figure 27 box plot to show the distribution of numerical value by spam and ham emails</w:t>
+      </w:r>
+    </w:p>
+    <w:p/>
+    <w:p>
+      <w:r>
+        <w:lastRenderedPageBreak/>
+        <w:t xml:space="preserve">What this plot shows is that ham emails has almost all values at 0 with some outliers with the highest one going all the way up to 23, meaning that one of the ham emails had 23 digits within it. With spam, the box sits higher with the median around 16, the middle 50% of values between 10 and 22, </w:t>
+      </w:r>
+      <w:r>
+        <w:t xml:space="preserve">a lowest count being 0, </w:t>
+      </w:r>
+      <w:r>
+        <w:t>and a max of 40</w:t>
+      </w:r>
+      <w:r>
+        <w:t>. This shows that spam emails tend to be packed with numbers within its emails due to the content of it including prices, phone numbers, “you won £xxxx”, etc.</w:t>
       </w:r>
     </w:p>
     <w:sectPr>

</xml_diff>

<commit_message>
done analysis of longest numerical sequence within both email categories and talked about it in mini report
</commit_message>
<xml_diff>
--- a/Project Spam Email Detector.docx
+++ b/Project Spam Email Detector.docx
@@ -2403,6 +2403,9 @@
         <w:keepNext/>
       </w:pPr>
       <w:r>
+        <w:rPr>
+          <w:noProof/>
+        </w:rPr>
         <w:drawing>
           <wp:inline distT="0" distB="0" distL="0" distR="0" wp14:anchorId="359D18E9" wp14:editId="17B0ECB5">
             <wp:extent cx="5731510" cy="1117600"/>
@@ -2454,6 +2457,9 @@
         <w:keepNext/>
       </w:pPr>
       <w:r>
+        <w:rPr>
+          <w:noProof/>
+        </w:rPr>
         <w:lastRenderedPageBreak/>
         <w:drawing>
           <wp:inline distT="0" distB="0" distL="0" distR="0" wp14:anchorId="69C940D2" wp14:editId="68C8A2AF">
@@ -2666,6 +2672,9 @@
         <w:keepNext/>
       </w:pPr>
       <w:r>
+        <w:rPr>
+          <w:noProof/>
+        </w:rPr>
         <w:drawing>
           <wp:inline distT="0" distB="0" distL="0" distR="0" wp14:anchorId="4E6A637A" wp14:editId="3BD402C9">
             <wp:extent cx="4360525" cy="952500"/>
@@ -2824,6 +2833,9 @@
         </mc:AlternateContent>
       </w:r>
       <w:r>
+        <w:rPr>
+          <w:noProof/>
+        </w:rPr>
         <w:drawing>
           <wp:anchor distT="0" distB="0" distL="114300" distR="114300" simplePos="0" relativeHeight="251670528" behindDoc="0" locked="0" layoutInCell="1" allowOverlap="1" wp14:anchorId="18C868D3" wp14:editId="1B5AF5A7">
             <wp:simplePos x="0" y="0"/>
@@ -2881,6 +2893,9 @@
         </w:drawing>
       </w:r>
       <w:r>
+        <w:rPr>
+          <w:noProof/>
+        </w:rPr>
         <w:drawing>
           <wp:inline distT="0" distB="0" distL="0" distR="0" wp14:anchorId="52FD5766" wp14:editId="4B2B64E7">
             <wp:extent cx="3651250" cy="1188085"/>
@@ -2938,6 +2953,9 @@
         <w:keepNext/>
       </w:pPr>
       <w:r>
+        <w:rPr>
+          <w:noProof/>
+        </w:rPr>
         <w:lastRenderedPageBreak/>
         <w:drawing>
           <wp:inline distT="0" distB="0" distL="0" distR="0" wp14:anchorId="1F5888ED" wp14:editId="2289A8CB">
@@ -3000,6 +3018,9 @@
         <w:keepNext/>
       </w:pPr>
       <w:r>
+        <w:rPr>
+          <w:noProof/>
+        </w:rPr>
         <w:drawing>
           <wp:inline distT="0" distB="0" distL="0" distR="0" wp14:anchorId="38D00F1F" wp14:editId="20E0E4B1">
             <wp:extent cx="4045158" cy="3054507"/>
@@ -3058,9 +3079,206 @@
         <w:t>and a max of 40</w:t>
       </w:r>
       <w:r>
-        <w:t>. This shows that spam emails tend to be packed with numbers within its emails due to the content of it including prices, phone numbers, “you won £xxxx”, etc.</w:t>
-      </w:r>
-    </w:p>
+        <w:t>. This shows that spam emails tend to be packed with numbers within its emails due to the content of it including prices, phone numbers, “you won £</w:t>
+      </w:r>
+      <w:proofErr w:type="spellStart"/>
+      <w:r>
+        <w:t>xxxx</w:t>
+      </w:r>
+      <w:proofErr w:type="spellEnd"/>
+      <w:r>
+        <w:t>”, etc.</w:t>
+      </w:r>
+    </w:p>
+    <w:p>
+      <w:r>
+        <w:t>Another example of number analysis that can be performed to further differentiate spam and ham emails, to remain consistent in the analysis in terms of that a conclusion cannot be made with one test, and to improve the accuracy of the model to be made is researching if spam emails contain longer numerical sequences than legitimate emails.</w:t>
+      </w:r>
+    </w:p>
+    <w:p>
+      <w:r>
+        <w:t>This is important as by just counting digits and calculating the average numerical digits per email only tells us how many numbers exist. Measuring the length of each number tells us what kind of numbers are being used.</w:t>
+      </w:r>
+      <w:r>
+        <w:t xml:space="preserve"> For example with an email including this passage: “Win £5000 today!” What it shows is that the numbers found is 5000 and the length of the longest number within the email is 4. Another example: “Call 08001234567 now!” The numbers found within this spam email is 08001234567 and its longest length being 11.</w:t>
+      </w:r>
+    </w:p>
+    <w:p>
+      <w:r>
+        <w:t>Spam often contains prize amounts, phone numbers, account numbers, voucher codes, tracking numbers and these types of numbers tend to have a longer sequence of digits than the simple dates, times, and occasional long number found in ham emails.</w:t>
+      </w:r>
+    </w:p>
+    <w:p>
+      <w:r>
+        <w:t>To do this first another module had to be imported, which in this case is regular Expressions (import re). this is because regular Expressions (regex) enables us to search for patterns in text. This helps as instead of searching for one exact number, we want to find every sequence of digits.</w:t>
+      </w:r>
+    </w:p>
+    <w:p/>
+    <w:p>
+      <w:pPr>
+        <w:keepNext/>
+      </w:pPr>
+      <w:r>
+        <w:drawing>
+          <wp:inline distT="0" distB="0" distL="0" distR="0" wp14:anchorId="48F2DF3E" wp14:editId="181E7DBE">
+            <wp:extent cx="4883486" cy="1187450"/>
+            <wp:effectExtent l="0" t="0" r="0" b="0"/>
+            <wp:docPr id="14889249" name="Picture 1"/>
+            <wp:cNvGraphicFramePr>
+              <a:graphicFrameLocks xmlns:a="http://schemas.openxmlformats.org/drawingml/2006/main" noChangeAspect="1"/>
+            </wp:cNvGraphicFramePr>
+            <a:graphic xmlns:a="http://schemas.openxmlformats.org/drawingml/2006/main">
+              <a:graphicData uri="http://schemas.openxmlformats.org/drawingml/2006/picture">
+                <pic:pic xmlns:pic="http://schemas.openxmlformats.org/drawingml/2006/picture">
+                  <pic:nvPicPr>
+                    <pic:cNvPr id="14889249" name=""/>
+                    <pic:cNvPicPr/>
+                  </pic:nvPicPr>
+                  <pic:blipFill>
+                    <a:blip r:embed="rId35"/>
+                    <a:stretch>
+                      <a:fillRect/>
+                    </a:stretch>
+                  </pic:blipFill>
+                  <pic:spPr>
+                    <a:xfrm>
+                      <a:off x="0" y="0"/>
+                      <a:ext cx="4888876" cy="1188761"/>
+                    </a:xfrm>
+                    <a:prstGeom prst="rect">
+                      <a:avLst/>
+                    </a:prstGeom>
+                  </pic:spPr>
+                </pic:pic>
+              </a:graphicData>
+            </a:graphic>
+          </wp:inline>
+        </w:drawing>
+      </w:r>
+    </w:p>
+    <w:p>
+      <w:pPr>
+        <w:pStyle w:val="Caption"/>
+      </w:pPr>
+      <w:r>
+        <w:t>Figure 28 function which operates to find the longest number length with email</w:t>
+      </w:r>
+    </w:p>
+    <w:p>
+      <w:r>
+        <w:t>What this function does is that it finds all the numbers using regex built in function re.findall and also using \d which mean all digits 0-9 and + which mean one or more consecutive digits. Then what I implemented helps when encountering emails that do not have any numbers within them using “if not numbers: return 0” 0 in this case means no numerical sequence. The next step is to find the longest number which was done with the last return statement.</w:t>
+      </w:r>
+    </w:p>
+    <w:p>
+      <w:pPr>
+        <w:keepNext/>
+      </w:pPr>
+      <w:r>
+        <w:drawing>
+          <wp:inline distT="0" distB="0" distL="0" distR="0" wp14:anchorId="4844FE35" wp14:editId="7427C098">
+            <wp:extent cx="5302245" cy="946150"/>
+            <wp:effectExtent l="0" t="0" r="0" b="6350"/>
+            <wp:docPr id="51661649" name="Picture 1"/>
+            <wp:cNvGraphicFramePr>
+              <a:graphicFrameLocks xmlns:a="http://schemas.openxmlformats.org/drawingml/2006/main" noChangeAspect="1"/>
+            </wp:cNvGraphicFramePr>
+            <a:graphic xmlns:a="http://schemas.openxmlformats.org/drawingml/2006/main">
+              <a:graphicData uri="http://schemas.openxmlformats.org/drawingml/2006/picture">
+                <pic:pic xmlns:pic="http://schemas.openxmlformats.org/drawingml/2006/picture">
+                  <pic:nvPicPr>
+                    <pic:cNvPr id="51661649" name=""/>
+                    <pic:cNvPicPr/>
+                  </pic:nvPicPr>
+                  <pic:blipFill>
+                    <a:blip r:embed="rId36"/>
+                    <a:stretch>
+                      <a:fillRect/>
+                    </a:stretch>
+                  </pic:blipFill>
+                  <pic:spPr>
+                    <a:xfrm>
+                      <a:off x="0" y="0"/>
+                      <a:ext cx="5320826" cy="949466"/>
+                    </a:xfrm>
+                    <a:prstGeom prst="rect">
+                      <a:avLst/>
+                    </a:prstGeom>
+                  </pic:spPr>
+                </pic:pic>
+              </a:graphicData>
+            </a:graphic>
+          </wp:inline>
+        </w:drawing>
+      </w:r>
+    </w:p>
+    <w:p>
+      <w:pPr>
+        <w:pStyle w:val="Caption"/>
+      </w:pPr>
+      <w:r>
+        <w:t>Figure 29 applying the function shown on figure 28 to every email and comparing the two emails types</w:t>
+      </w:r>
+    </w:p>
+    <w:p>
+      <w:pPr>
+        <w:keepNext/>
+      </w:pPr>
+      <w:r>
+        <w:lastRenderedPageBreak/>
+        <w:drawing>
+          <wp:inline distT="0" distB="0" distL="0" distR="0" wp14:anchorId="2D794DD3" wp14:editId="075FE54C">
+            <wp:extent cx="3858260" cy="1244600"/>
+            <wp:effectExtent l="0" t="0" r="8890" b="0"/>
+            <wp:docPr id="1573005034" name="Picture 1"/>
+            <wp:cNvGraphicFramePr>
+              <a:graphicFrameLocks xmlns:a="http://schemas.openxmlformats.org/drawingml/2006/main" noChangeAspect="1"/>
+            </wp:cNvGraphicFramePr>
+            <a:graphic xmlns:a="http://schemas.openxmlformats.org/drawingml/2006/main">
+              <a:graphicData uri="http://schemas.openxmlformats.org/drawingml/2006/picture">
+                <pic:pic xmlns:pic="http://schemas.openxmlformats.org/drawingml/2006/picture">
+                  <pic:nvPicPr>
+                    <pic:cNvPr id="1573005034" name=""/>
+                    <pic:cNvPicPr/>
+                  </pic:nvPicPr>
+                  <pic:blipFill>
+                    <a:blip r:embed="rId37"/>
+                    <a:stretch>
+                      <a:fillRect/>
+                    </a:stretch>
+                  </pic:blipFill>
+                  <pic:spPr>
+                    <a:xfrm>
+                      <a:off x="0" y="0"/>
+                      <a:ext cx="3858871" cy="1244797"/>
+                    </a:xfrm>
+                    <a:prstGeom prst="rect">
+                      <a:avLst/>
+                    </a:prstGeom>
+                  </pic:spPr>
+                </pic:pic>
+              </a:graphicData>
+            </a:graphic>
+          </wp:inline>
+        </w:drawing>
+      </w:r>
+    </w:p>
+    <w:p>
+      <w:pPr>
+        <w:pStyle w:val="Caption"/>
+      </w:pPr>
+      <w:r>
+        <w:t>Figure 30 output of the longest_number_length and comparison code block</w:t>
+      </w:r>
+    </w:p>
+    <w:p>
+      <w:r>
+        <w:t>What this shows is that there are an average number sequence length of 7.65 within spam emails and only 0.19 within ham emails. What can be gathered from this data is that emails with longer numerical sequences are more likely to be spam, because they often include phone numbers, account numbers, tracking numbers and IDs. Whereas with legitimate emails, the vast majority of emails do not even have a numerical digitised character within them</w:t>
+      </w:r>
+      <w:r>
+        <w:t xml:space="preserve"> let alone a sequence. This can be backed up with figure 25 which shows there was an average of 0.30 numbers within a ham email.</w:t>
+      </w:r>
+    </w:p>
+    <w:p/>
     <w:sectPr>
       <w:pgSz w:w="11906" w:h="16838"/>
       <w:pgMar w:top="1440" w:right="1440" w:bottom="1440" w:left="1440" w:header="708" w:footer="708" w:gutter="0"/>

</xml_diff>

<commit_message>
done currency analysis of dollars, pounds, and euros
</commit_message>
<xml_diff>
--- a/Project Spam Email Detector.docx
+++ b/Project Spam Email Detector.docx
@@ -2531,31 +2531,7 @@
         <w:t>Another way they are used within spam emails is in a more “direct” manner making a direct statement as such. For example, “</w:t>
       </w:r>
       <w:r>
-        <w:t xml:space="preserve">Want 2 get laid tonight? Want real Dogging locations sent direct 2 </w:t>
-      </w:r>
-      <w:proofErr w:type="spellStart"/>
-      <w:r>
-        <w:t>ur</w:t>
-      </w:r>
-      <w:proofErr w:type="spellEnd"/>
-      <w:r>
-        <w:t xml:space="preserve"> mob? Join the UK's largest Dogging Network </w:t>
-      </w:r>
-      <w:proofErr w:type="spellStart"/>
-      <w:r>
-        <w:t>bt</w:t>
-      </w:r>
-      <w:proofErr w:type="spellEnd"/>
-      <w:r>
-        <w:t xml:space="preserve"> </w:t>
-      </w:r>
-      <w:proofErr w:type="spellStart"/>
-      <w:r>
-        <w:t>Txting</w:t>
-      </w:r>
-      <w:proofErr w:type="spellEnd"/>
-      <w:r>
-        <w:t xml:space="preserve"> GRAVEL to 69888! Nt. ec2a. </w:t>
+        <w:t xml:space="preserve">Want 2 get laid tonight? Want real Dogging locations sent direct 2 ur mob? Join the UK's largest Dogging Network bt Txting GRAVEL to 69888! Nt. ec2a. </w:t>
       </w:r>
       <w:hyperlink r:id="rId29" w:history="1">
         <w:r>
@@ -2589,6 +2565,13 @@
       </w:r>
     </w:p>
     <w:p>
+      <w:pPr>
+        <w:rPr>
+          <w:u w:val="single"/>
+        </w:rPr>
+      </w:pPr>
+    </w:p>
+    <w:p>
       <w:r>
         <w:t>This part of the analysis is something that will directly help and impact the machine learning model and detector that will be constructed later on.</w:t>
       </w:r>
@@ -2607,42 +2590,13 @@
         <w:t>“</w:t>
       </w:r>
       <w:r>
-        <w:t xml:space="preserve">Sunshine Quiz </w:t>
-      </w:r>
-      <w:proofErr w:type="spellStart"/>
-      <w:r>
-        <w:t>Wkly</w:t>
-      </w:r>
-      <w:proofErr w:type="spellEnd"/>
-      <w:r>
-        <w:t xml:space="preserve"> Q! Win a top Sony DVD player if u know which country the Algarve is in? Txt </w:t>
-      </w:r>
-      <w:proofErr w:type="spellStart"/>
-      <w:r>
-        <w:t>ansr</w:t>
-      </w:r>
-      <w:proofErr w:type="spellEnd"/>
-      <w:r>
-        <w:t xml:space="preserve"> to 82277. Â£1.50 </w:t>
-      </w:r>
-      <w:proofErr w:type="spellStart"/>
-      <w:r>
-        <w:t>SP:Tyrone</w:t>
-      </w:r>
-      <w:proofErr w:type="spellEnd"/>
+        <w:t>Sunshine Quiz Wkly Q! Win a top Sony DVD player if u know which country the Algarve is in? Txt ansr to 82277. Â£1.50 SP:Tyrone</w:t>
+      </w:r>
       <w:r>
         <w:t>”, “</w:t>
       </w:r>
       <w:r>
-        <w:t xml:space="preserve">You are a winner U have been specially selected 2 receive Â£1000 cash or a 4* holiday (flights </w:t>
-      </w:r>
-      <w:proofErr w:type="spellStart"/>
-      <w:r>
-        <w:t>inc</w:t>
-      </w:r>
-      <w:proofErr w:type="spellEnd"/>
-      <w:r>
-        <w:t>) speak to a live operator 2 claim 0871277810810</w:t>
+        <w:t>You are a winner U have been specially selected 2 receive Â£1000 cash or a 4* holiday (flights inc) speak to a live operator 2 claim 0871277810810</w:t>
       </w:r>
       <w:r>
         <w:t>”</w:t>
@@ -2661,7 +2615,19 @@
         <w:t>Therefore reviewing the patterns that these numbers and symbols have within these spam emails is important.</w:t>
       </w:r>
     </w:p>
-    <w:p/>
+    <w:p>
+      <w:pPr>
+        <w:rPr>
+          <w:u w:val="single"/>
+        </w:rPr>
+      </w:pPr>
+      <w:r>
+        <w:rPr>
+          <w:u w:val="single"/>
+        </w:rPr>
+        <w:t>Number Analysis:</w:t>
+      </w:r>
+    </w:p>
     <w:p>
       <w:r>
         <w:t>How many numbers does each email contain?</w:t>
@@ -3079,17 +3045,16 @@
         <w:t>and a max of 40</w:t>
       </w:r>
       <w:r>
-        <w:t>. This shows that spam emails tend to be packed with numbers within its emails due to the content of it including prices, phone numbers, “you won £</w:t>
-      </w:r>
-      <w:proofErr w:type="spellStart"/>
-      <w:r>
-        <w:t>xxxx</w:t>
-      </w:r>
-      <w:proofErr w:type="spellEnd"/>
-      <w:r>
-        <w:t>”, etc.</w:t>
-      </w:r>
-    </w:p>
+        <w:t>. This shows that spam emails tend to be packed with numbers within its emails due to the content of it including prices, phone numbers, “you won £xxxx”, etc.</w:t>
+      </w:r>
+    </w:p>
+    <w:p/>
+    <w:p>
+      <w:r>
+        <w:t>Do spam emails contain longer numerical sequences than legitimate emails?</w:t>
+      </w:r>
+    </w:p>
+    <w:p/>
     <w:p>
       <w:r>
         <w:t>Another example of number analysis that can be performed to further differentiate spam and ham emails, to remain consistent in the analysis in terms of that a conclusion cannot be made with one test, and to improve the accuracy of the model to be made is researching if spam emails contain longer numerical sequences than legitimate emails.</w:t>
@@ -3119,6 +3084,9 @@
         <w:keepNext/>
       </w:pPr>
       <w:r>
+        <w:rPr>
+          <w:noProof/>
+        </w:rPr>
         <w:drawing>
           <wp:inline distT="0" distB="0" distL="0" distR="0" wp14:anchorId="48F2DF3E" wp14:editId="181E7DBE">
             <wp:extent cx="4883486" cy="1187450"/>
@@ -3174,6 +3142,10 @@
         <w:keepNext/>
       </w:pPr>
       <w:r>
+        <w:rPr>
+          <w:noProof/>
+        </w:rPr>
+        <w:lastRenderedPageBreak/>
         <w:drawing>
           <wp:inline distT="0" distB="0" distL="0" distR="0" wp14:anchorId="4844FE35" wp14:editId="7427C098">
             <wp:extent cx="5302245" cy="946150"/>
@@ -3224,7 +3196,9 @@
         <w:keepNext/>
       </w:pPr>
       <w:r>
-        <w:lastRenderedPageBreak/>
+        <w:rPr>
+          <w:noProof/>
+        </w:rPr>
         <w:drawing>
           <wp:inline distT="0" distB="0" distL="0" distR="0" wp14:anchorId="2D794DD3" wp14:editId="075FE54C">
             <wp:extent cx="3858260" cy="1244600"/>
@@ -3279,6 +3253,371 @@
       </w:r>
     </w:p>
     <w:p/>
+    <w:p>
+      <w:pPr>
+        <w:keepNext/>
+      </w:pPr>
+      <w:r>
+        <w:rPr>
+          <w:noProof/>
+        </w:rPr>
+        <w:drawing>
+          <wp:inline distT="0" distB="0" distL="0" distR="0" wp14:anchorId="5DB50813" wp14:editId="0503A1F0">
+            <wp:extent cx="4045158" cy="3029106"/>
+            <wp:effectExtent l="0" t="0" r="0" b="0"/>
+            <wp:docPr id="324389559" name="Picture 1"/>
+            <wp:cNvGraphicFramePr>
+              <a:graphicFrameLocks xmlns:a="http://schemas.openxmlformats.org/drawingml/2006/main" noChangeAspect="1"/>
+            </wp:cNvGraphicFramePr>
+            <a:graphic xmlns:a="http://schemas.openxmlformats.org/drawingml/2006/main">
+              <a:graphicData uri="http://schemas.openxmlformats.org/drawingml/2006/picture">
+                <pic:pic xmlns:pic="http://schemas.openxmlformats.org/drawingml/2006/picture">
+                  <pic:nvPicPr>
+                    <pic:cNvPr id="324389559" name=""/>
+                    <pic:cNvPicPr/>
+                  </pic:nvPicPr>
+                  <pic:blipFill>
+                    <a:blip r:embed="rId38"/>
+                    <a:stretch>
+                      <a:fillRect/>
+                    </a:stretch>
+                  </pic:blipFill>
+                  <pic:spPr>
+                    <a:xfrm>
+                      <a:off x="0" y="0"/>
+                      <a:ext cx="4045158" cy="3029106"/>
+                    </a:xfrm>
+                    <a:prstGeom prst="rect">
+                      <a:avLst/>
+                    </a:prstGeom>
+                  </pic:spPr>
+                </pic:pic>
+              </a:graphicData>
+            </a:graphic>
+          </wp:inline>
+        </w:drawing>
+      </w:r>
+    </w:p>
+    <w:p>
+      <w:pPr>
+        <w:pStyle w:val="Caption"/>
+      </w:pPr>
+      <w:r>
+        <w:t>Figure 31 chart displaying the average length of the longest numerical sequence in both spam and ham emails</w:t>
+      </w:r>
+    </w:p>
+    <w:p>
+      <w:pPr>
+        <w:rPr>
+          <w:u w:val="single"/>
+        </w:rPr>
+      </w:pPr>
+      <w:r>
+        <w:rPr>
+          <w:u w:val="single"/>
+        </w:rPr>
+        <w:t>Symbol Analysis:</w:t>
+      </w:r>
+    </w:p>
+    <w:p>
+      <w:r>
+        <w:lastRenderedPageBreak/>
+        <w:t>Spam emails rely on visual attention-grabbing techniques and symbols is one method they usually implement. Symbols often indicate promotions, urgency, or attempts to get users to click on links.</w:t>
+      </w:r>
+    </w:p>
+    <w:p/>
+    <w:p>
+      <w:r>
+        <w:t>Do spam emails use promotional and attention-grabbing symbols more frequently than legitimate emails?</w:t>
+      </w:r>
+    </w:p>
+    <w:p>
+      <w:r>
+        <w:t>For the mini report I will focus on these four symbols: %,£,$ as these have a direct connection to attention-grabbing and spam behaviour.</w:t>
+      </w:r>
+    </w:p>
+    <w:p/>
+    <w:p>
+      <w:r>
+        <w:t>First, I calculated the percentage count of the two email categories.</w:t>
+      </w:r>
+    </w:p>
+    <w:p>
+      <w:pPr>
+        <w:keepNext/>
+      </w:pPr>
+      <w:r>
+        <w:drawing>
+          <wp:inline distT="0" distB="0" distL="0" distR="0" wp14:anchorId="19DFA5E3" wp14:editId="47D91854">
+            <wp:extent cx="3825142" cy="1212850"/>
+            <wp:effectExtent l="0" t="0" r="4445" b="6350"/>
+            <wp:docPr id="787445283" name="Picture 1"/>
+            <wp:cNvGraphicFramePr>
+              <a:graphicFrameLocks xmlns:a="http://schemas.openxmlformats.org/drawingml/2006/main" noChangeAspect="1"/>
+            </wp:cNvGraphicFramePr>
+            <a:graphic xmlns:a="http://schemas.openxmlformats.org/drawingml/2006/main">
+              <a:graphicData uri="http://schemas.openxmlformats.org/drawingml/2006/picture">
+                <pic:pic xmlns:pic="http://schemas.openxmlformats.org/drawingml/2006/picture">
+                  <pic:nvPicPr>
+                    <pic:cNvPr id="787445283" name=""/>
+                    <pic:cNvPicPr/>
+                  </pic:nvPicPr>
+                  <pic:blipFill>
+                    <a:blip r:embed="rId39"/>
+                    <a:stretch>
+                      <a:fillRect/>
+                    </a:stretch>
+                  </pic:blipFill>
+                  <pic:spPr>
+                    <a:xfrm>
+                      <a:off x="0" y="0"/>
+                      <a:ext cx="3833655" cy="1215549"/>
+                    </a:xfrm>
+                    <a:prstGeom prst="rect">
+                      <a:avLst/>
+                    </a:prstGeom>
+                  </pic:spPr>
+                </pic:pic>
+              </a:graphicData>
+            </a:graphic>
+          </wp:inline>
+        </w:drawing>
+      </w:r>
+    </w:p>
+    <w:p>
+      <w:pPr>
+        <w:pStyle w:val="Caption"/>
+      </w:pPr>
+      <w:r>
+        <w:t>Figure 32 code output displaying average percent count</w:t>
+      </w:r>
+    </w:p>
+    <w:p/>
+    <w:p>
+      <w:r>
+        <w:t>As you can see, spam emails tend to utilise percentages more than legitimate emails. This can be due to that within ham emails, it is normal conversations that can be informal and therefore tend not to need to include the percentage symbols. When it does include them, it is used in a way that does not seem predatory and consistent within spam behaviour. Whereas with spam emails, it is used to signify a promotion (price decrease) which correlates with spam behaviour.</w:t>
+      </w:r>
+    </w:p>
+    <w:p/>
+    <w:p>
+      <w:r>
+        <w:t>Next I looked at the currency symbols ($, £</w:t>
+      </w:r>
+      <w:r>
+        <w:t xml:space="preserve">, </w:t>
+      </w:r>
+      <w:r>
+        <w:t>):</w:t>
+      </w:r>
+    </w:p>
+    <w:p>
+      <w:pPr>
+        <w:keepNext/>
+      </w:pPr>
+      <w:r>
+        <w:rPr>
+          <w:noProof/>
+        </w:rPr>
+        <mc:AlternateContent>
+          <mc:Choice Requires="wps">
+            <w:drawing>
+              <wp:anchor distT="0" distB="0" distL="114300" distR="114300" simplePos="0" relativeHeight="251675648" behindDoc="0" locked="0" layoutInCell="1" allowOverlap="1" wp14:anchorId="666B0979" wp14:editId="7ABA16BC">
+                <wp:simplePos x="0" y="0"/>
+                <wp:positionH relativeFrom="column">
+                  <wp:posOffset>3994150</wp:posOffset>
+                </wp:positionH>
+                <wp:positionV relativeFrom="paragraph">
+                  <wp:posOffset>1479550</wp:posOffset>
+                </wp:positionV>
+                <wp:extent cx="2401570" cy="635"/>
+                <wp:effectExtent l="0" t="0" r="0" b="0"/>
+                <wp:wrapNone/>
+                <wp:docPr id="864947248" name="Text Box 1"/>
+                <wp:cNvGraphicFramePr/>
+                <a:graphic xmlns:a="http://schemas.openxmlformats.org/drawingml/2006/main">
+                  <a:graphicData uri="http://schemas.microsoft.com/office/word/2010/wordprocessingShape">
+                    <wps:wsp>
+                      <wps:cNvSpPr txBox="1"/>
+                      <wps:spPr>
+                        <a:xfrm>
+                          <a:off x="0" y="0"/>
+                          <a:ext cx="2401570" cy="635"/>
+                        </a:xfrm>
+                        <a:prstGeom prst="rect">
+                          <a:avLst/>
+                        </a:prstGeom>
+                        <a:solidFill>
+                          <a:prstClr val="white"/>
+                        </a:solidFill>
+                        <a:ln>
+                          <a:noFill/>
+                        </a:ln>
+                      </wps:spPr>
+                      <wps:txbx>
+                        <w:txbxContent>
+                          <w:p>
+                            <w:pPr>
+                              <w:pStyle w:val="Caption"/>
+                              <w:rPr>
+                                <w:sz w:val="22"/>
+                                <w:szCs w:val="22"/>
+                              </w:rPr>
+                            </w:pPr>
+                            <w:r>
+                              <w:t>Figure 34 average amount of pound (sterling) symbols used within emails</w:t>
+                            </w:r>
+                          </w:p>
+                        </w:txbxContent>
+                      </wps:txbx>
+                      <wps:bodyPr rot="0" spcFirstLastPara="0" vertOverflow="overflow" horzOverflow="overflow" vert="horz" wrap="square" lIns="0" tIns="0" rIns="0" bIns="0" numCol="1" spcCol="0" rtlCol="0" fromWordArt="0" anchor="t" anchorCtr="0" forceAA="0" compatLnSpc="1">
+                        <a:prstTxWarp prst="textNoShape">
+                          <a:avLst/>
+                        </a:prstTxWarp>
+                        <a:spAutoFit/>
+                      </wps:bodyPr>
+                    </wps:wsp>
+                  </a:graphicData>
+                </a:graphic>
+              </wp:anchor>
+            </w:drawing>
+          </mc:Choice>
+          <mc:Fallback>
+            <w:pict>
+              <v:shapetype w14:anchorId="666B0979" id="_x0000_t202" coordsize="21600,21600" o:spt="202" path="m,l,21600r21600,l21600,xe">
+                <v:stroke joinstyle="miter"/>
+                <v:path gradientshapeok="t" o:connecttype="rect"/>
+              </v:shapetype>
+              <v:shape id="_x0000_s1031" type="#_x0000_t202" style="position:absolute;margin-left:314.5pt;margin-top:116.5pt;width:189.1pt;height:.05pt;z-index:251675648;visibility:visible;mso-wrap-style:square;mso-wrap-distance-left:9pt;mso-wrap-distance-top:0;mso-wrap-distance-right:9pt;mso-wrap-distance-bottom:0;mso-position-horizontal:absolute;mso-position-horizontal-relative:text;mso-position-vertical:absolute;mso-position-vertical-relative:text;v-text-anchor:top" o:gfxdata="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" stroked="f">
+                <v:textbox style="mso-fit-shape-to-text:t" inset="0,0,0,0">
+                  <w:txbxContent>
+                    <w:p>
+                      <w:pPr>
+                        <w:pStyle w:val="Caption"/>
+                        <w:rPr>
+                          <w:sz w:val="22"/>
+                          <w:szCs w:val="22"/>
+                        </w:rPr>
+                      </w:pPr>
+                      <w:r>
+                        <w:t>Figure 34 average amount of pound (sterling) symbols used within emails</w:t>
+                      </w:r>
+                    </w:p>
+                  </w:txbxContent>
+                </v:textbox>
+              </v:shape>
+            </w:pict>
+          </mc:Fallback>
+        </mc:AlternateContent>
+      </w:r>
+      <w:r>
+        <w:drawing>
+          <wp:anchor distT="0" distB="0" distL="114300" distR="114300" simplePos="0" relativeHeight="251673600" behindDoc="0" locked="0" layoutInCell="1" allowOverlap="1" wp14:anchorId="007DC5C1" wp14:editId="6E448029">
+            <wp:simplePos x="0" y="0"/>
+            <wp:positionH relativeFrom="column">
+              <wp:posOffset>3994150</wp:posOffset>
+            </wp:positionH>
+            <wp:positionV relativeFrom="paragraph">
+              <wp:posOffset>96520</wp:posOffset>
+            </wp:positionV>
+            <wp:extent cx="2401856" cy="1325880"/>
+            <wp:effectExtent l="0" t="0" r="0" b="7620"/>
+            <wp:wrapNone/>
+            <wp:docPr id="510733312" name="Picture 1"/>
+            <wp:cNvGraphicFramePr>
+              <a:graphicFrameLocks xmlns:a="http://schemas.openxmlformats.org/drawingml/2006/main" noChangeAspect="1"/>
+            </wp:cNvGraphicFramePr>
+            <a:graphic xmlns:a="http://schemas.openxmlformats.org/drawingml/2006/main">
+              <a:graphicData uri="http://schemas.openxmlformats.org/drawingml/2006/picture">
+                <pic:pic xmlns:pic="http://schemas.openxmlformats.org/drawingml/2006/picture">
+                  <pic:nvPicPr>
+                    <pic:cNvPr id="510733312" name=""/>
+                    <pic:cNvPicPr/>
+                  </pic:nvPicPr>
+                  <pic:blipFill>
+                    <a:blip r:embed="rId40">
+                      <a:extLst>
+                        <a:ext uri="{28A0092B-C50C-407E-A947-70E740481C1C}">
+                          <a14:useLocalDpi xmlns:a14="http://schemas.microsoft.com/office/drawing/2010/main" val="0"/>
+                        </a:ext>
+                      </a:extLst>
+                    </a:blip>
+                    <a:stretch>
+                      <a:fillRect/>
+                    </a:stretch>
+                  </pic:blipFill>
+                  <pic:spPr>
+                    <a:xfrm>
+                      <a:off x="0" y="0"/>
+                      <a:ext cx="2408230" cy="1329398"/>
+                    </a:xfrm>
+                    <a:prstGeom prst="rect">
+                      <a:avLst/>
+                    </a:prstGeom>
+                  </pic:spPr>
+                </pic:pic>
+              </a:graphicData>
+            </a:graphic>
+            <wp14:sizeRelH relativeFrom="margin">
+              <wp14:pctWidth>0</wp14:pctWidth>
+            </wp14:sizeRelH>
+            <wp14:sizeRelV relativeFrom="margin">
+              <wp14:pctHeight>0</wp14:pctHeight>
+            </wp14:sizeRelV>
+          </wp:anchor>
+        </w:drawing>
+      </w:r>
+      <w:r>
+        <w:drawing>
+          <wp:inline distT="0" distB="0" distL="0" distR="0" wp14:anchorId="5EAE8A32" wp14:editId="4B7E8BA5">
+            <wp:extent cx="3721100" cy="1421683"/>
+            <wp:effectExtent l="0" t="0" r="0" b="7620"/>
+            <wp:docPr id="1642671769" name="Picture 1"/>
+            <wp:cNvGraphicFramePr>
+              <a:graphicFrameLocks xmlns:a="http://schemas.openxmlformats.org/drawingml/2006/main" noChangeAspect="1"/>
+            </wp:cNvGraphicFramePr>
+            <a:graphic xmlns:a="http://schemas.openxmlformats.org/drawingml/2006/main">
+              <a:graphicData uri="http://schemas.openxmlformats.org/drawingml/2006/picture">
+                <pic:pic xmlns:pic="http://schemas.openxmlformats.org/drawingml/2006/picture">
+                  <pic:nvPicPr>
+                    <pic:cNvPr id="1642671769" name=""/>
+                    <pic:cNvPicPr/>
+                  </pic:nvPicPr>
+                  <pic:blipFill>
+                    <a:blip r:embed="rId41"/>
+                    <a:stretch>
+                      <a:fillRect/>
+                    </a:stretch>
+                  </pic:blipFill>
+                  <pic:spPr>
+                    <a:xfrm>
+                      <a:off x="0" y="0"/>
+                      <a:ext cx="3740908" cy="1429251"/>
+                    </a:xfrm>
+                    <a:prstGeom prst="rect">
+                      <a:avLst/>
+                    </a:prstGeom>
+                  </pic:spPr>
+                </pic:pic>
+              </a:graphicData>
+            </a:graphic>
+          </wp:inline>
+        </w:drawing>
+      </w:r>
+    </w:p>
+    <w:p>
+      <w:pPr>
+        <w:pStyle w:val="Caption"/>
+      </w:pPr>
+      <w:r>
+        <w:t>Figure 33 average amount of dollar symbols used within emails</w:t>
+      </w:r>
+    </w:p>
+    <w:p/>
+    <w:p>
+      <w:r>
+        <w:t>What we can see is that spam emails use the dollar symbols than ham emails, mainly due to the symbols resembling a price of an item that is usually an attention-grabbing price, a price that does not seem real relative to the item being shown for it.</w:t>
+      </w:r>
+    </w:p>
     <w:sectPr>
       <w:pgSz w:w="11906" w:h="16838"/>
       <w:pgMar w:top="1440" w:right="1440" w:bottom="1440" w:left="1440" w:header="708" w:footer="708" w:gutter="0"/>

</xml_diff>

<commit_message>
combined symbols and punctuation marks into one bar chart and talked about the results on word doc
</commit_message>
<xml_diff>
--- a/Project Spam Email Detector.docx
+++ b/Project Spam Email Detector.docx
@@ -3615,7 +3615,84 @@
     <w:p/>
     <w:p>
       <w:r>
-        <w:t>What we can see is that spam emails use the dollar symbols than ham emails, mainly due to the symbols resembling a price of an item that is usually an attention-grabbing price, a price that does not seem real relative to the item being shown for it.</w:t>
+        <w:t>What we can see is that spam emails use the dollar</w:t>
+      </w:r>
+      <w:r>
+        <w:t xml:space="preserve"> and pound</w:t>
+      </w:r>
+      <w:r>
+        <w:t xml:space="preserve"> symbols than ham emails, mainly due to the symbols resembling a price of an item that is usually an attention-grabbing price, a price that does not seem real relative to the item being shown for it.</w:t>
+      </w:r>
+    </w:p>
+    <w:p/>
+    <w:p>
+      <w:pPr>
+        <w:keepNext/>
+      </w:pPr>
+      <w:r>
+        <w:lastRenderedPageBreak/>
+        <w:drawing>
+          <wp:inline distT="0" distB="0" distL="0" distR="0" wp14:anchorId="48FB74FF" wp14:editId="71C438CF">
+            <wp:extent cx="4045158" cy="3264068"/>
+            <wp:effectExtent l="0" t="0" r="0" b="0"/>
+            <wp:docPr id="1175444609" name="Picture 1"/>
+            <wp:cNvGraphicFramePr>
+              <a:graphicFrameLocks xmlns:a="http://schemas.openxmlformats.org/drawingml/2006/main" noChangeAspect="1"/>
+            </wp:cNvGraphicFramePr>
+            <a:graphic xmlns:a="http://schemas.openxmlformats.org/drawingml/2006/main">
+              <a:graphicData uri="http://schemas.openxmlformats.org/drawingml/2006/picture">
+                <pic:pic xmlns:pic="http://schemas.openxmlformats.org/drawingml/2006/picture">
+                  <pic:nvPicPr>
+                    <pic:cNvPr id="1175444609" name=""/>
+                    <pic:cNvPicPr/>
+                  </pic:nvPicPr>
+                  <pic:blipFill>
+                    <a:blip r:embed="rId42"/>
+                    <a:stretch>
+                      <a:fillRect/>
+                    </a:stretch>
+                  </pic:blipFill>
+                  <pic:spPr>
+                    <a:xfrm>
+                      <a:off x="0" y="0"/>
+                      <a:ext cx="4045158" cy="3264068"/>
+                    </a:xfrm>
+                    <a:prstGeom prst="rect">
+                      <a:avLst/>
+                    </a:prstGeom>
+                  </pic:spPr>
+                </pic:pic>
+              </a:graphicData>
+            </a:graphic>
+          </wp:inline>
+        </w:drawing>
+      </w:r>
+    </w:p>
+    <w:p>
+      <w:pPr>
+        <w:pStyle w:val="Caption"/>
+      </w:pPr>
+      <w:r>
+        <w:t>Figure 35 plot displaying average count for symbols in emails</w:t>
+      </w:r>
+    </w:p>
+    <w:p/>
+    <w:p>
+      <w:r>
+        <w:t xml:space="preserve">The reason why this plot was made to be able to see the comparison the symbols being used within spam and legitimate emails visually. What we can see from the chart is that exclamation points have the highest count overall, question marks has the highest for legitimate emails. Once again that can be the case because legitimate emails tend to consist of general conversations where the sender may be asking questions to the recipient. Whereas with spam emails, it will be less prevalent. There is a correlation with exclamation points being a recurring feature and the statement that spam emails are created to grab the attention of users and be exaggerate in a way, so the use of exclamation points help reach that point out to users. </w:t>
+      </w:r>
+    </w:p>
+    <w:p>
+      <w:r>
+        <w:t xml:space="preserve">One thing that is surprising is the pound (£) symbol not being higher on the chart. The reason being is because that the most prevalent form of spam emails was prizes &amp; giveaways (see figure 2) this could potentially due to the volume of exclamation points being utilised as to increase the users attention span to these emails, multiple exclamation points would be used within a single email to manufacture the sense of urgency and surprise within the text contents of a spam email. </w:t>
+      </w:r>
+    </w:p>
+    <w:p>
+      <w:r>
+        <w:t>To conclude, to answer the question, yes spam emails do use promotional and attention-grabbing symbols to garner the attention of others</w:t>
+      </w:r>
+      <w:r>
+        <w:t>. This is shown by a combination of currency symbols being used to show a price to the user that would be deemed unbelievable and a barging in fact, the exclamation points scattered within spam emails to create a sense of urgency, which overall persuades the user to click on the links of these emails. With legitimate emails, these symbols and numbers are less frequent.</w:t>
       </w:r>
     </w:p>
     <w:sectPr>

</xml_diff>

<commit_message>
calculated the count of urls between spam and ham emails
</commit_message>
<xml_diff>
--- a/Project Spam Email Detector.docx
+++ b/Project Spam Email Detector.docx
@@ -2531,7 +2531,31 @@
         <w:t>Another way they are used within spam emails is in a more “direct” manner making a direct statement as such. For example, “</w:t>
       </w:r>
       <w:r>
-        <w:t xml:space="preserve">Want 2 get laid tonight? Want real Dogging locations sent direct 2 ur mob? Join the UK's largest Dogging Network bt Txting GRAVEL to 69888! Nt. ec2a. </w:t>
+        <w:t xml:space="preserve">Want 2 get laid tonight? Want real Dogging locations sent direct 2 </w:t>
+      </w:r>
+      <w:proofErr w:type="spellStart"/>
+      <w:r>
+        <w:t>ur</w:t>
+      </w:r>
+      <w:proofErr w:type="spellEnd"/>
+      <w:r>
+        <w:t xml:space="preserve"> mob? Join the UK's largest Dogging Network </w:t>
+      </w:r>
+      <w:proofErr w:type="spellStart"/>
+      <w:r>
+        <w:t>bt</w:t>
+      </w:r>
+      <w:proofErr w:type="spellEnd"/>
+      <w:r>
+        <w:t xml:space="preserve"> </w:t>
+      </w:r>
+      <w:proofErr w:type="spellStart"/>
+      <w:r>
+        <w:t>Txting</w:t>
+      </w:r>
+      <w:proofErr w:type="spellEnd"/>
+      <w:r>
+        <w:t xml:space="preserve"> GRAVEL to 69888! Nt. ec2a. </w:t>
       </w:r>
       <w:hyperlink r:id="rId29" w:history="1">
         <w:r>
@@ -2590,13 +2614,42 @@
         <w:t>“</w:t>
       </w:r>
       <w:r>
-        <w:t>Sunshine Quiz Wkly Q! Win a top Sony DVD player if u know which country the Algarve is in? Txt ansr to 82277. Â£1.50 SP:Tyrone</w:t>
-      </w:r>
+        <w:t xml:space="preserve">Sunshine Quiz </w:t>
+      </w:r>
+      <w:proofErr w:type="spellStart"/>
+      <w:r>
+        <w:t>Wkly</w:t>
+      </w:r>
+      <w:proofErr w:type="spellEnd"/>
+      <w:r>
+        <w:t xml:space="preserve"> Q! Win a top Sony DVD player if u know which country the Algarve is in? Txt </w:t>
+      </w:r>
+      <w:proofErr w:type="spellStart"/>
+      <w:r>
+        <w:t>ansr</w:t>
+      </w:r>
+      <w:proofErr w:type="spellEnd"/>
+      <w:r>
+        <w:t xml:space="preserve"> to 82277. Â£1.50 </w:t>
+      </w:r>
+      <w:proofErr w:type="spellStart"/>
+      <w:r>
+        <w:t>SP:Tyrone</w:t>
+      </w:r>
+      <w:proofErr w:type="spellEnd"/>
       <w:r>
         <w:t>”, “</w:t>
       </w:r>
       <w:r>
-        <w:t>You are a winner U have been specially selected 2 receive Â£1000 cash or a 4* holiday (flights inc) speak to a live operator 2 claim 0871277810810</w:t>
+        <w:t xml:space="preserve">You are a winner U have been specially selected 2 receive Â£1000 cash or a 4* holiday (flights </w:t>
+      </w:r>
+      <w:proofErr w:type="spellStart"/>
+      <w:r>
+        <w:t>inc</w:t>
+      </w:r>
+      <w:proofErr w:type="spellEnd"/>
+      <w:r>
+        <w:t>) speak to a live operator 2 claim 0871277810810</w:t>
       </w:r>
       <w:r>
         <w:t>”</w:t>
@@ -3045,7 +3098,15 @@
         <w:t>and a max of 40</w:t>
       </w:r>
       <w:r>
-        <w:t>. This shows that spam emails tend to be packed with numbers within its emails due to the content of it including prices, phone numbers, “you won £xxxx”, etc.</w:t>
+        <w:t>. This shows that spam emails tend to be packed with numbers within its emails due to the content of it including prices, phone numbers, “you won £</w:t>
+      </w:r>
+      <w:proofErr w:type="spellStart"/>
+      <w:r>
+        <w:t>xxxx</w:t>
+      </w:r>
+      <w:proofErr w:type="spellEnd"/>
+      <w:r>
+        <w:t>”, etc.</w:t>
       </w:r>
     </w:p>
     <w:p/>
@@ -3679,12 +3740,30 @@
     <w:p/>
     <w:p>
       <w:r>
-        <w:t xml:space="preserve">The reason why this plot was made to be able to see the comparison the symbols being used within spam and legitimate emails visually. What we can see from the chart is that exclamation points have the highest count overall, question marks has the highest for legitimate emails. Once again that can be the case because legitimate emails tend to consist of general conversations where the sender may be asking questions to the recipient. Whereas with spam emails, it will be less prevalent. There is a correlation with exclamation points being a recurring feature and the statement that spam emails are created to grab the attention of users and be exaggerate in a way, so the use of exclamation points help reach that point out to users. </w:t>
-      </w:r>
-    </w:p>
-    <w:p>
-      <w:r>
-        <w:t xml:space="preserve">One thing that is surprising is the pound (£) symbol not being higher on the chart. The reason being is because that the most prevalent form of spam emails was prizes &amp; giveaways (see figure 2) this could potentially due to the volume of exclamation points being utilised as to increase the users attention span to these emails, multiple exclamation points would be used within a single email to manufacture the sense of urgency and surprise within the text contents of a spam email. </w:t>
+        <w:t>The reason why this plot was made</w:t>
+      </w:r>
+      <w:r>
+        <w:t xml:space="preserve"> was</w:t>
+      </w:r>
+      <w:r>
+        <w:t xml:space="preserve"> to be able to see the comparison </w:t>
+      </w:r>
+      <w:r>
+        <w:t>of</w:t>
+      </w:r>
+      <w:r>
+        <w:t xml:space="preserve"> symbols being used within spam and legitimate emails visually. What we can see from the chart is that exclamation points have the highest count overall, question marks has the highest for legitimate emails. Once again that can be the case because legitimate emails tend to consist of general conversations where the sender may be asking questions to the recipient. Whereas with spam emails it will be less prevalent. There is a correlation with exclamation points being a recurring feature and the statement that spam emails are created to grab the attention of users and be exaggerate in a way, so the use of exclamation points help reach that point out to users. </w:t>
+      </w:r>
+    </w:p>
+    <w:p>
+      <w:r>
+        <w:t>One thing that is surprising is the pound (£) symbol not being higher on the chart. The reason being is because that the most prevalent form of spam emails was prizes &amp; giveaways (see figure 2) this could potentially</w:t>
+      </w:r>
+      <w:r>
+        <w:t xml:space="preserve"> be</w:t>
+      </w:r>
+      <w:r>
+        <w:t xml:space="preserve"> due to the volume of exclamation points being utilised as to increase the users attention span to these emails, multiple exclamation points would be used within a single email to manufacture the sense of urgency and surprise within the text contents of a spam email. </w:t>
       </w:r>
     </w:p>
     <w:p>
@@ -3695,6 +3774,159 @@
         <w:t>. This is shown by a combination of currency symbols being used to show a price to the user that would be deemed unbelievable and a barging in fact, the exclamation points scattered within spam emails to create a sense of urgency, which overall persuades the user to click on the links of these emails. With legitimate emails, these symbols and numbers are less frequent.</w:t>
       </w:r>
     </w:p>
+    <w:p/>
+    <w:p>
+      <w:pPr>
+        <w:rPr>
+          <w:u w:val="single"/>
+        </w:rPr>
+      </w:pPr>
+      <w:r>
+        <w:rPr>
+          <w:u w:val="single"/>
+        </w:rPr>
+        <w:t>URL/Links Analysis:</w:t>
+      </w:r>
+    </w:p>
+    <w:p>
+      <w:r>
+        <w:t>URLs have a clear connection to phishing &amp; spam, and it also would translate into a useful machine learning feature for later on.</w:t>
+      </w:r>
+    </w:p>
+    <w:p/>
+    <w:p>
+      <w:r>
+        <w:t>This part of the analysis is important as the primary objective of spam emails is to encourage the recipient to click on a link. These links may direct users to: phishing websites, fake login pages, fake shopping sites, promotional offers, and many more. Legitimate emails can also contain links, but they are generally less frequent and are often from trusted organisations.</w:t>
+      </w:r>
+    </w:p>
+    <w:p>
+      <w:r>
+        <w:t>By analysing URL usage, we can investigate whether the presence of links is a distinguishing characteristic of spam emails.</w:t>
+      </w:r>
+    </w:p>
+    <w:p>
+      <w:r>
+        <w:t>Do spam emails contain more URLs than legitimate emails?</w:t>
+      </w:r>
+    </w:p>
+    <w:p>
+      <w:pPr>
+        <w:keepNext/>
+      </w:pPr>
+      <w:r>
+        <w:drawing>
+          <wp:inline distT="0" distB="0" distL="0" distR="0" wp14:anchorId="5199044B" wp14:editId="701DE4B1">
+            <wp:extent cx="5168900" cy="1041400"/>
+            <wp:effectExtent l="0" t="0" r="0" b="6350"/>
+            <wp:docPr id="1431231889" name="Picture 1"/>
+            <wp:cNvGraphicFramePr>
+              <a:graphicFrameLocks xmlns:a="http://schemas.openxmlformats.org/drawingml/2006/main" noChangeAspect="1"/>
+            </wp:cNvGraphicFramePr>
+            <a:graphic xmlns:a="http://schemas.openxmlformats.org/drawingml/2006/main">
+              <a:graphicData uri="http://schemas.openxmlformats.org/drawingml/2006/picture">
+                <pic:pic xmlns:pic="http://schemas.openxmlformats.org/drawingml/2006/picture">
+                  <pic:nvPicPr>
+                    <pic:cNvPr id="1431231889" name=""/>
+                    <pic:cNvPicPr/>
+                  </pic:nvPicPr>
+                  <pic:blipFill>
+                    <a:blip r:embed="rId43"/>
+                    <a:stretch>
+                      <a:fillRect/>
+                    </a:stretch>
+                  </pic:blipFill>
+                  <pic:spPr>
+                    <a:xfrm>
+                      <a:off x="0" y="0"/>
+                      <a:ext cx="5169173" cy="1041455"/>
+                    </a:xfrm>
+                    <a:prstGeom prst="rect">
+                      <a:avLst/>
+                    </a:prstGeom>
+                  </pic:spPr>
+                </pic:pic>
+              </a:graphicData>
+            </a:graphic>
+          </wp:inline>
+        </w:drawing>
+      </w:r>
+    </w:p>
+    <w:p>
+      <w:pPr>
+        <w:pStyle w:val="Caption"/>
+      </w:pPr>
+      <w:r>
+        <w:t>Figure 36 code to find different URL types in emails</w:t>
+      </w:r>
+    </w:p>
+    <w:p>
+      <w:r>
+        <w:t>What this code does is that it uses the regex module to be able to find specific text content within an email using re.findall(). First it find https text using https?. The question mark is added to mean that the s is optional. It then look for :// as that is an essential part of a link. Then I added \S+ which means to match every non-space character until a space appears, which means to combine https:// together alongside the potential site name as just one URL. For example: “</w:t>
+      </w:r>
+      <w:r>
+        <w:t>http://wap. xxxmobilemovieclub.com?n=QJKGIGHJJGCBL</w:t>
+      </w:r>
+      <w:r>
+        <w:t>” this is one of the spam emails that have this within the dataset.</w:t>
+      </w:r>
+    </w:p>
+    <w:p>
+      <w:r>
+        <w:t>Then the | symbol, which in python means the OR operator. What it does is that the text we are trying to find will either match the left side (https://) or the right side (www.) with the backslash after www indicating python to look for a dot (.) and then \S+ which combines the characters together until the next space. Last, it will count the amount of URLs with the return statement.</w:t>
+      </w:r>
+    </w:p>
+    <w:p/>
+    <w:p>
+      <w:pPr>
+        <w:keepNext/>
+      </w:pPr>
+      <w:r>
+        <w:drawing>
+          <wp:inline distT="0" distB="0" distL="0" distR="0" wp14:anchorId="3B701C80" wp14:editId="0E9574CA">
+            <wp:extent cx="4579935" cy="698500"/>
+            <wp:effectExtent l="0" t="0" r="0" b="6350"/>
+            <wp:docPr id="1398283142" name="Picture 1"/>
+            <wp:cNvGraphicFramePr>
+              <a:graphicFrameLocks xmlns:a="http://schemas.openxmlformats.org/drawingml/2006/main" noChangeAspect="1"/>
+            </wp:cNvGraphicFramePr>
+            <a:graphic xmlns:a="http://schemas.openxmlformats.org/drawingml/2006/main">
+              <a:graphicData uri="http://schemas.openxmlformats.org/drawingml/2006/picture">
+                <pic:pic xmlns:pic="http://schemas.openxmlformats.org/drawingml/2006/picture">
+                  <pic:nvPicPr>
+                    <pic:cNvPr id="1398283142" name=""/>
+                    <pic:cNvPicPr/>
+                  </pic:nvPicPr>
+                  <pic:blipFill>
+                    <a:blip r:embed="rId44"/>
+                    <a:stretch>
+                      <a:fillRect/>
+                    </a:stretch>
+                  </pic:blipFill>
+                  <pic:spPr>
+                    <a:xfrm>
+                      <a:off x="0" y="0"/>
+                      <a:ext cx="4584224" cy="699154"/>
+                    </a:xfrm>
+                    <a:prstGeom prst="rect">
+                      <a:avLst/>
+                    </a:prstGeom>
+                  </pic:spPr>
+                </pic:pic>
+              </a:graphicData>
+            </a:graphic>
+          </wp:inline>
+        </w:drawing>
+      </w:r>
+    </w:p>
+    <w:p>
+      <w:pPr>
+        <w:pStyle w:val="Caption"/>
+      </w:pPr>
+      <w:r>
+        <w:t>Figure 37 comparing the URL count between the two email categories</w:t>
+      </w:r>
+    </w:p>
+    <w:p/>
     <w:sectPr>
       <w:pgSz w:w="11906" w:h="16838"/>
       <w:pgMar w:top="1440" w:right="1440" w:bottom="1440" w:left="1440" w:header="708" w:footer="708" w:gutter="0"/>

</xml_diff>

<commit_message>
paragraph explaining analysis conducted on urls
</commit_message>
<xml_diff>
--- a/Project Spam Email Detector.docx
+++ b/Project Spam Email Detector.docx
@@ -2531,31 +2531,7 @@
         <w:t>Another way they are used within spam emails is in a more “direct” manner making a direct statement as such. For example, “</w:t>
       </w:r>
       <w:r>
-        <w:t xml:space="preserve">Want 2 get laid tonight? Want real Dogging locations sent direct 2 </w:t>
-      </w:r>
-      <w:proofErr w:type="spellStart"/>
-      <w:r>
-        <w:t>ur</w:t>
-      </w:r>
-      <w:proofErr w:type="spellEnd"/>
-      <w:r>
-        <w:t xml:space="preserve"> mob? Join the UK's largest Dogging Network </w:t>
-      </w:r>
-      <w:proofErr w:type="spellStart"/>
-      <w:r>
-        <w:t>bt</w:t>
-      </w:r>
-      <w:proofErr w:type="spellEnd"/>
-      <w:r>
-        <w:t xml:space="preserve"> </w:t>
-      </w:r>
-      <w:proofErr w:type="spellStart"/>
-      <w:r>
-        <w:t>Txting</w:t>
-      </w:r>
-      <w:proofErr w:type="spellEnd"/>
-      <w:r>
-        <w:t xml:space="preserve"> GRAVEL to 69888! Nt. ec2a. </w:t>
+        <w:t xml:space="preserve">Want 2 get laid tonight? Want real Dogging locations sent direct 2 ur mob? Join the UK's largest Dogging Network bt Txting GRAVEL to 69888! Nt. ec2a. </w:t>
       </w:r>
       <w:hyperlink r:id="rId29" w:history="1">
         <w:r>
@@ -2614,42 +2590,13 @@
         <w:t>“</w:t>
       </w:r>
       <w:r>
-        <w:t xml:space="preserve">Sunshine Quiz </w:t>
-      </w:r>
-      <w:proofErr w:type="spellStart"/>
-      <w:r>
-        <w:t>Wkly</w:t>
-      </w:r>
-      <w:proofErr w:type="spellEnd"/>
-      <w:r>
-        <w:t xml:space="preserve"> Q! Win a top Sony DVD player if u know which country the Algarve is in? Txt </w:t>
-      </w:r>
-      <w:proofErr w:type="spellStart"/>
-      <w:r>
-        <w:t>ansr</w:t>
-      </w:r>
-      <w:proofErr w:type="spellEnd"/>
-      <w:r>
-        <w:t xml:space="preserve"> to 82277. Â£1.50 </w:t>
-      </w:r>
-      <w:proofErr w:type="spellStart"/>
-      <w:r>
-        <w:t>SP:Tyrone</w:t>
-      </w:r>
-      <w:proofErr w:type="spellEnd"/>
+        <w:t>Sunshine Quiz Wkly Q! Win a top Sony DVD player if u know which country the Algarve is in? Txt ansr to 82277. Â£1.50 SP:Tyrone</w:t>
+      </w:r>
       <w:r>
         <w:t>”, “</w:t>
       </w:r>
       <w:r>
-        <w:t xml:space="preserve">You are a winner U have been specially selected 2 receive Â£1000 cash or a 4* holiday (flights </w:t>
-      </w:r>
-      <w:proofErr w:type="spellStart"/>
-      <w:r>
-        <w:t>inc</w:t>
-      </w:r>
-      <w:proofErr w:type="spellEnd"/>
-      <w:r>
-        <w:t>) speak to a live operator 2 claim 0871277810810</w:t>
+        <w:t>You are a winner U have been specially selected 2 receive Â£1000 cash or a 4* holiday (flights inc) speak to a live operator 2 claim 0871277810810</w:t>
       </w:r>
       <w:r>
         <w:t>”</w:t>
@@ -3098,15 +3045,7 @@
         <w:t>and a max of 40</w:t>
       </w:r>
       <w:r>
-        <w:t>. This shows that spam emails tend to be packed with numbers within its emails due to the content of it including prices, phone numbers, “you won £</w:t>
-      </w:r>
-      <w:proofErr w:type="spellStart"/>
-      <w:r>
-        <w:t>xxxx</w:t>
-      </w:r>
-      <w:proofErr w:type="spellEnd"/>
-      <w:r>
-        <w:t>”, etc.</w:t>
+        <w:t>. This shows that spam emails tend to be packed with numbers within its emails due to the content of it including prices, phone numbers, “you won £xxxx”, etc.</w:t>
       </w:r>
     </w:p>
     <w:p/>
@@ -3923,9 +3862,171 @@
         <w:pStyle w:val="Caption"/>
       </w:pPr>
       <w:r>
+        <w:drawing>
+          <wp:anchor distT="0" distB="0" distL="114300" distR="114300" simplePos="0" relativeHeight="251676672" behindDoc="0" locked="0" layoutInCell="1" allowOverlap="1" wp14:anchorId="1071B219" wp14:editId="2E48FB9D">
+            <wp:simplePos x="0" y="0"/>
+            <wp:positionH relativeFrom="margin">
+              <wp:align>left</wp:align>
+            </wp:positionH>
+            <wp:positionV relativeFrom="paragraph">
+              <wp:posOffset>267335</wp:posOffset>
+            </wp:positionV>
+            <wp:extent cx="2838450" cy="2190688"/>
+            <wp:effectExtent l="0" t="0" r="0" b="635"/>
+            <wp:wrapNone/>
+            <wp:docPr id="660279683" name="Picture 1"/>
+            <wp:cNvGraphicFramePr>
+              <a:graphicFrameLocks xmlns:a="http://schemas.openxmlformats.org/drawingml/2006/main" noChangeAspect="1"/>
+            </wp:cNvGraphicFramePr>
+            <a:graphic xmlns:a="http://schemas.openxmlformats.org/drawingml/2006/main">
+              <a:graphicData uri="http://schemas.openxmlformats.org/drawingml/2006/picture">
+                <pic:pic xmlns:pic="http://schemas.openxmlformats.org/drawingml/2006/picture">
+                  <pic:nvPicPr>
+                    <pic:cNvPr id="660279683" name=""/>
+                    <pic:cNvPicPr/>
+                  </pic:nvPicPr>
+                  <pic:blipFill>
+                    <a:blip r:embed="rId45">
+                      <a:extLst>
+                        <a:ext uri="{28A0092B-C50C-407E-A947-70E740481C1C}">
+                          <a14:useLocalDpi xmlns:a14="http://schemas.microsoft.com/office/drawing/2010/main" val="0"/>
+                        </a:ext>
+                      </a:extLst>
+                    </a:blip>
+                    <a:stretch>
+                      <a:fillRect/>
+                    </a:stretch>
+                  </pic:blipFill>
+                  <pic:spPr>
+                    <a:xfrm>
+                      <a:off x="0" y="0"/>
+                      <a:ext cx="2842636" cy="2193919"/>
+                    </a:xfrm>
+                    <a:prstGeom prst="rect">
+                      <a:avLst/>
+                    </a:prstGeom>
+                  </pic:spPr>
+                </pic:pic>
+              </a:graphicData>
+            </a:graphic>
+            <wp14:sizeRelH relativeFrom="margin">
+              <wp14:pctWidth>0</wp14:pctWidth>
+            </wp14:sizeRelH>
+            <wp14:sizeRelV relativeFrom="margin">
+              <wp14:pctHeight>0</wp14:pctHeight>
+            </wp14:sizeRelV>
+          </wp:anchor>
+        </w:drawing>
+      </w:r>
+      <w:r>
         <w:t>Figure 37 comparing the URL count between the two email categories</w:t>
       </w:r>
     </w:p>
+    <w:p/>
+    <w:p/>
+    <w:p/>
+    <w:p/>
+    <w:p/>
+    <w:p/>
+    <w:p>
+      <w:r>
+        <w:rPr>
+          <w:noProof/>
+        </w:rPr>
+        <mc:AlternateContent>
+          <mc:Choice Requires="wps">
+            <w:drawing>
+              <wp:anchor distT="0" distB="0" distL="114300" distR="114300" simplePos="0" relativeHeight="251678720" behindDoc="0" locked="0" layoutInCell="1" allowOverlap="1" wp14:anchorId="3F60554F" wp14:editId="2D1F801B">
+                <wp:simplePos x="0" y="0"/>
+                <wp:positionH relativeFrom="margin">
+                  <wp:posOffset>-19050</wp:posOffset>
+                </wp:positionH>
+                <wp:positionV relativeFrom="paragraph">
+                  <wp:posOffset>568325</wp:posOffset>
+                </wp:positionV>
+                <wp:extent cx="3241675" cy="635"/>
+                <wp:effectExtent l="0" t="0" r="0" b="0"/>
+                <wp:wrapNone/>
+                <wp:docPr id="1806744744" name="Text Box 1"/>
+                <wp:cNvGraphicFramePr/>
+                <a:graphic xmlns:a="http://schemas.openxmlformats.org/drawingml/2006/main">
+                  <a:graphicData uri="http://schemas.microsoft.com/office/word/2010/wordprocessingShape">
+                    <wps:wsp>
+                      <wps:cNvSpPr txBox="1"/>
+                      <wps:spPr>
+                        <a:xfrm>
+                          <a:off x="0" y="0"/>
+                          <a:ext cx="3241675" cy="635"/>
+                        </a:xfrm>
+                        <a:prstGeom prst="rect">
+                          <a:avLst/>
+                        </a:prstGeom>
+                        <a:solidFill>
+                          <a:prstClr val="white"/>
+                        </a:solidFill>
+                        <a:ln>
+                          <a:noFill/>
+                        </a:ln>
+                      </wps:spPr>
+                      <wps:txbx>
+                        <w:txbxContent>
+                          <w:p>
+                            <w:pPr>
+                              <w:pStyle w:val="Caption"/>
+                            </w:pPr>
+                            <w:r>
+                              <w:t>Figure 38 chart displaying average count of URLs within spam and ham emails</w:t>
+                            </w:r>
+                          </w:p>
+                        </w:txbxContent>
+                      </wps:txbx>
+                      <wps:bodyPr rot="0" spcFirstLastPara="0" vertOverflow="overflow" horzOverflow="overflow" vert="horz" wrap="square" lIns="0" tIns="0" rIns="0" bIns="0" numCol="1" spcCol="0" rtlCol="0" fromWordArt="0" anchor="t" anchorCtr="0" forceAA="0" compatLnSpc="1">
+                        <a:prstTxWarp prst="textNoShape">
+                          <a:avLst/>
+                        </a:prstTxWarp>
+                        <a:spAutoFit/>
+                      </wps:bodyPr>
+                    </wps:wsp>
+                  </a:graphicData>
+                </a:graphic>
+              </wp:anchor>
+            </w:drawing>
+          </mc:Choice>
+          <mc:Fallback>
+            <w:pict>
+              <v:shape w14:anchorId="3F60554F" id="_x0000_s1032" type="#_x0000_t202" style="position:absolute;margin-left:-1.5pt;margin-top:44.75pt;width:255.25pt;height:.05pt;z-index:251678720;visibility:visible;mso-wrap-style:square;mso-wrap-distance-left:9pt;mso-wrap-distance-top:0;mso-wrap-distance-right:9pt;mso-wrap-distance-bottom:0;mso-position-horizontal:absolute;mso-position-horizontal-relative:margin;mso-position-vertical:absolute;mso-position-vertical-relative:text;v-text-anchor:top" o:gfxdata="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" stroked="f">
+                <v:textbox style="mso-fit-shape-to-text:t" inset="0,0,0,0">
+                  <w:txbxContent>
+                    <w:p>
+                      <w:pPr>
+                        <w:pStyle w:val="Caption"/>
+                      </w:pPr>
+                      <w:r>
+                        <w:t>Figure 38 chart displaying average count of URLs within spam and ham emails</w:t>
+                      </w:r>
+                    </w:p>
+                  </w:txbxContent>
+                </v:textbox>
+                <w10:wrap anchorx="margin"/>
+              </v:shape>
+            </w:pict>
+          </mc:Fallback>
+        </mc:AlternateContent>
+      </w:r>
+    </w:p>
+    <w:p>
+      <w:r>
+        <w:lastRenderedPageBreak/>
+        <w:t>What these figures above tell us is that there are only an average of 0.000415 URLs within legitimate emails and an average of 0.14 in spam emails. This shows that URLs are more common within spam emails as they tend to include links for prizes and giveaways that can be used as phishing whereas with ham emails, links are less frequent and are usually from trusted people/organisations. As there was a significant difference between the two, URL count will serve as a useful predictive feature during machine learning model development.</w:t>
+      </w:r>
+    </w:p>
+    <w:p>
+      <w:r>
+        <w:t>To conclude and answer the question, yes URLs are more common in spam emails than legitimate emails with the evidence shown above.</w:t>
+      </w:r>
+    </w:p>
+    <w:p/>
+    <w:p/>
     <w:p/>
     <w:sectPr>
       <w:pgSz w:w="11906" w:h="16838"/>

</xml_diff>

<commit_message>
Added reference list and explained what is correlation analysis, why is it useful, what am i gonna do with it etc...
</commit_message>
<xml_diff>
--- a/Project Spam Email Detector.docx
+++ b/Project Spam Email Detector.docx
@@ -1,6 +1,6 @@
 
 <file path=word/document.xml><?xml version="1.0" encoding="utf-8"?>
-<w:document xmlns:wpc="http://schemas.microsoft.com/office/word/2010/wordprocessingCanvas" xmlns:cx="http://schemas.microsoft.com/office/drawing/2014/chartex" xmlns:cx1="http://schemas.microsoft.com/office/drawing/2015/9/8/chartex" xmlns:cx2="http://schemas.microsoft.com/office/drawing/2015/10/21/chartex" xmlns:cx3="http://schemas.microsoft.com/office/drawing/2016/5/9/chartex" xmlns:cx4="http://schemas.microsoft.com/office/drawing/2016/5/10/chartex" xmlns:cx5="http://schemas.microsoft.com/office/drawing/2016/5/11/chartex" xmlns:cx6="http://schemas.microsoft.com/office/drawing/2016/5/12/chartex" xmlns:cx7="http://schemas.microsoft.com/office/drawing/2016/5/13/chartex" xmlns:cx8="http://schemas.microsoft.com/office/drawing/2016/5/14/chartex" xmlns:mc="http://schemas.openxmlformats.org/markup-compatibility/2006" xmlns:aink="http://schemas.microsoft.com/office/drawing/2016/ink" xmlns:am3d="http://schemas.microsoft.com/office/drawing/2017/model3d" xmlns:o="urn:schemas-microsoft-com:office:office" xmlns:oel="http://schemas.microsoft.com/office/2019/extlst" xmlns:r="http://schemas.openxmlformats.org/officeDocument/2006/relationships" xmlns:m="http://schemas.openxmlformats.org/officeDocument/2006/math" xmlns:v="urn:schemas-microsoft-com:vml" xmlns:wp14="http://schemas.microsoft.com/office/word/2010/wordprocessingDrawing" xmlns:wp="http://schemas.openxmlformats.org/drawingml/2006/wordprocessingDrawing" xmlns:w10="urn:schemas-microsoft-com:office:word" xmlns:w="http://schemas.openxmlformats.org/wordprocessingml/2006/main" xmlns:w14="http://schemas.microsoft.com/office/word/2010/wordml" xmlns:w15="http://schemas.microsoft.com/office/word/2012/wordml" xmlns:w16cex="http://schemas.microsoft.com/office/word/2018/wordml/cex" xmlns:w16cid="http://schemas.microsoft.com/office/word/2016/wordml/cid" xmlns:w16="http://schemas.microsoft.com/office/word/2018/wordml" xmlns:w16du="http://schemas.microsoft.com/office/word/2023/wordml/word16du" xmlns:w16sdtdh="http://schemas.microsoft.com/office/word/2020/wordml/sdtdatahash" xmlns:w16sdtfl="http://schemas.microsoft.com/office/word/2024/wordml/sdtformatlock" xmlns:w16se="http://schemas.microsoft.com/office/word/2015/wordml/symex" xmlns:wpg="http://schemas.microsoft.com/office/word/2010/wordprocessingGroup" xmlns:wpi="http://schemas.microsoft.com/office/word/2010/wordprocessingInk" xmlns:wne="http://schemas.microsoft.com/office/word/2006/wordml" xmlns:wps="http://schemas.microsoft.com/office/word/2010/wordprocessingShape" mc:Ignorable="w14 w15 w16se w16cid w16 w16cex w16sdtdh w16sdtfl w16du wp14">
+<w:document xmlns:wpc="http://schemas.microsoft.com/office/word/2010/wordprocessingCanvas" xmlns:cx="http://schemas.microsoft.com/office/drawing/2014/chartex" xmlns:cx1="http://schemas.microsoft.com/office/drawing/2015/9/8/chartex" xmlns:cx2="http://schemas.microsoft.com/office/drawing/2015/10/21/chartex" xmlns:cx3="http://schemas.microsoft.com/office/drawing/2016/5/9/chartex" xmlns:cx4="http://schemas.microsoft.com/office/drawing/2016/5/10/chartex" xmlns:cx5="http://schemas.microsoft.com/office/drawing/2016/5/11/chartex" xmlns:cx6="http://schemas.microsoft.com/office/drawing/2016/5/12/chartex" xmlns:cx7="http://schemas.microsoft.com/office/drawing/2016/5/13/chartex" xmlns:cx8="http://schemas.microsoft.com/office/drawing/2016/5/14/chartex" xmlns:mc="http://schemas.openxmlformats.org/markup-compatibility/2006" xmlns:aink="http://schemas.microsoft.com/office/drawing/2016/ink" xmlns:am3d="http://schemas.microsoft.com/office/drawing/2017/model3d" xmlns:o="urn:schemas-microsoft-com:office:office" xmlns:oel="http://schemas.microsoft.com/office/2019/extlst" xmlns:r="http://schemas.openxmlformats.org/officeDocument/2006/relationships" xmlns:m="http://schemas.openxmlformats.org/officeDocument/2006/math" xmlns:v="urn:schemas-microsoft-com:vml" xmlns:wp14="http://schemas.microsoft.com/office/word/2010/wordprocessingDrawing" xmlns:wp="http://schemas.openxmlformats.org/drawingml/2006/wordprocessingDrawing" xmlns:w10="urn:schemas-microsoft-com:office:word" xmlns:w="http://schemas.openxmlformats.org/wordprocessingml/2006/main" xmlns:w14="http://schemas.microsoft.com/office/word/2010/wordml" xmlns:w15="http://schemas.microsoft.com/office/word/2012/wordml" xmlns:w16cei="http://schemas.microsoft.com/office/word/2026/wordml/cei" xmlns:w16cex="http://schemas.microsoft.com/office/word/2018/wordml/cex" xmlns:w16cid="http://schemas.microsoft.com/office/word/2016/wordml/cid" xmlns:w16="http://schemas.microsoft.com/office/word/2018/wordml" xmlns:w16du="http://schemas.microsoft.com/office/word/2023/wordml/word16du" xmlns:w16sdtdh="http://schemas.microsoft.com/office/word/2020/wordml/sdtdatahash" xmlns:w16sdtfl="http://schemas.microsoft.com/office/word/2024/wordml/sdtformatlock" xmlns:w16se="http://schemas.microsoft.com/office/word/2015/wordml/symex" xmlns:wpg="http://schemas.microsoft.com/office/word/2010/wordprocessingGroup" xmlns:wpi="http://schemas.microsoft.com/office/word/2010/wordprocessingInk" xmlns:wne="http://schemas.microsoft.com/office/word/2006/wordml" xmlns:wps="http://schemas.microsoft.com/office/word/2010/wordprocessingShape" mc:Ignorable="w14 w15 w16se w16cid w16 w16cex w16sdtdh w16sdtfl w16du wp14">
   <w:body>
     <w:p>
       <w:pPr>
@@ -3347,6 +3347,9 @@
         <w:keepNext/>
       </w:pPr>
       <w:r>
+        <w:rPr>
+          <w:noProof/>
+        </w:rPr>
         <w:drawing>
           <wp:inline distT="0" distB="0" distL="0" distR="0" wp14:anchorId="19DFA5E3" wp14:editId="47D91854">
             <wp:extent cx="3825142" cy="1212850"/>
@@ -3510,6 +3513,9 @@
         </mc:AlternateContent>
       </w:r>
       <w:r>
+        <w:rPr>
+          <w:noProof/>
+        </w:rPr>
         <w:drawing>
           <wp:anchor distT="0" distB="0" distL="114300" distR="114300" simplePos="0" relativeHeight="251673600" behindDoc="0" locked="0" layoutInCell="1" allowOverlap="1" wp14:anchorId="007DC5C1" wp14:editId="6E448029">
             <wp:simplePos x="0" y="0"/>
@@ -3567,6 +3573,9 @@
         </w:drawing>
       </w:r>
       <w:r>
+        <w:rPr>
+          <w:noProof/>
+        </w:rPr>
         <w:drawing>
           <wp:inline distT="0" distB="0" distL="0" distR="0" wp14:anchorId="5EAE8A32" wp14:editId="4B7E8BA5">
             <wp:extent cx="3721100" cy="1421683"/>
@@ -3630,6 +3639,9 @@
         <w:keepNext/>
       </w:pPr>
       <w:r>
+        <w:rPr>
+          <w:noProof/>
+        </w:rPr>
         <w:lastRenderedPageBreak/>
         <w:drawing>
           <wp:inline distT="0" distB="0" distL="0" distR="0" wp14:anchorId="48FB74FF" wp14:editId="71C438CF">
@@ -3753,6 +3765,9 @@
         <w:keepNext/>
       </w:pPr>
       <w:r>
+        <w:rPr>
+          <w:noProof/>
+        </w:rPr>
         <w:drawing>
           <wp:inline distT="0" distB="0" distL="0" distR="0" wp14:anchorId="5199044B" wp14:editId="701DE4B1">
             <wp:extent cx="5168900" cy="1041400"/>
@@ -3820,6 +3835,9 @@
         <w:keepNext/>
       </w:pPr>
       <w:r>
+        <w:rPr>
+          <w:noProof/>
+        </w:rPr>
         <w:drawing>
           <wp:inline distT="0" distB="0" distL="0" distR="0" wp14:anchorId="3B701C80" wp14:editId="0E9574CA">
             <wp:extent cx="4579935" cy="698500"/>
@@ -3862,6 +3880,9 @@
         <w:pStyle w:val="Caption"/>
       </w:pPr>
       <w:r>
+        <w:rPr>
+          <w:noProof/>
+        </w:rPr>
         <w:drawing>
           <wp:anchor distT="0" distB="0" distL="114300" distR="114300" simplePos="0" relativeHeight="251676672" behindDoc="0" locked="0" layoutInCell="1" allowOverlap="1" wp14:anchorId="1071B219" wp14:editId="2E48FB9D">
             <wp:simplePos x="0" y="0"/>
@@ -4026,7 +4047,74 @@
       </w:r>
     </w:p>
     <w:p/>
-    <w:p/>
+    <w:p>
+      <w:pPr>
+        <w:rPr>
+          <w:u w:val="single"/>
+        </w:rPr>
+      </w:pPr>
+      <w:r>
+        <w:rPr>
+          <w:u w:val="single"/>
+        </w:rPr>
+        <w:t>Correlation Analysis:</w:t>
+      </w:r>
+    </w:p>
+    <w:p>
+      <w:r>
+        <w:t xml:space="preserve">This is one of the most important parts of the exploratory data analysis stage because we are now looking at how features relate and correlate with each other as opposed to looking at features individually. </w:t>
+      </w:r>
+      <w:r>
+        <w:t>It also provides a natural bridge into the ML stage.</w:t>
+      </w:r>
+    </w:p>
+    <w:p>
+      <w:r>
+        <w:t xml:space="preserve">Correlation analysis measures the strength and direction of the relationship between two variables and datasets to see how strong that relationship may be. </w:t>
+      </w:r>
+      <w:r>
+        <w:t>(James, 2021)</w:t>
+      </w:r>
+      <w:r>
+        <w:t>. The analysis conducted will be able to answer questions such as: Do longer emails usually contain more words?, Do emails with more numbers also tend to contain more symbols?, Do emails with more URLs also have more exclamation marks?.</w:t>
+      </w:r>
+    </w:p>
+    <w:p>
+      <w:r>
+        <w:t>The purpose of correlation analysis in this case is to identify relationships between the features extracted during EDA. After identifying and understanding these relationships will help determine which features provide unique information, which features are closely related, whether some features may be redundant or are likely to contribute useful information to the machine learning model.</w:t>
+      </w:r>
+    </w:p>
+    <w:p>
+      <w:r>
+        <w:t>What does correlation tell us?</w:t>
+      </w:r>
+    </w:p>
+    <w:p>
+      <w:r>
+        <w:t>Correlation values range from -1 to +1. +1 is a perfect positive correlation</w:t>
+      </w:r>
+      <w:r>
+        <w:t>, so as one feature increases, the other always increase. 0 means no correlation which tells use the features being used have no obvious relationship. -1 stands for perfect negative correlation where one feature increases while the other decreases.</w:t>
+      </w:r>
+    </w:p>
+    <w:p>
+      <w:r>
+        <w:t>Why does this matter for machine learning?</w:t>
+      </w:r>
+    </w:p>
+    <w:p>
+      <w:r>
+        <w:t>Well feature engineering is about creating useful features to provide the best results and correlation analysis helps evaluate the feature set before training a model. A quick example:</w:t>
+      </w:r>
+    </w:p>
+    <w:p>
+      <w:r>
+        <w:t>Email Length ─────── 0.98 ─────── Word Count</w:t>
+      </w:r>
+      <w:r>
+        <w:t>. This shows that these features contain very similar information. Understanding these relationships will help when explaining my design decisions for the model.</w:t>
+      </w:r>
+    </w:p>
     <w:p/>
     <w:sectPr>
       <w:pgSz w:w="11906" w:h="16838"/>
@@ -4039,7 +4127,7 @@
 </file>
 
 <file path=word/endnotes.xml><?xml version="1.0" encoding="utf-8"?>
-<w:endnotes xmlns:wpc="http://schemas.microsoft.com/office/word/2010/wordprocessingCanvas" xmlns:cx="http://schemas.microsoft.com/office/drawing/2014/chartex" xmlns:cx1="http://schemas.microsoft.com/office/drawing/2015/9/8/chartex" xmlns:cx2="http://schemas.microsoft.com/office/drawing/2015/10/21/chartex" xmlns:cx3="http://schemas.microsoft.com/office/drawing/2016/5/9/chartex" xmlns:cx4="http://schemas.microsoft.com/office/drawing/2016/5/10/chartex" xmlns:cx5="http://schemas.microsoft.com/office/drawing/2016/5/11/chartex" xmlns:cx6="http://schemas.microsoft.com/office/drawing/2016/5/12/chartex" xmlns:cx7="http://schemas.microsoft.com/office/drawing/2016/5/13/chartex" xmlns:cx8="http://schemas.microsoft.com/office/drawing/2016/5/14/chartex" xmlns:mc="http://schemas.openxmlformats.org/markup-compatibility/2006" xmlns:aink="http://schemas.microsoft.com/office/drawing/2016/ink" xmlns:am3d="http://schemas.microsoft.com/office/drawing/2017/model3d" xmlns:o="urn:schemas-microsoft-com:office:office" xmlns:oel="http://schemas.microsoft.com/office/2019/extlst" xmlns:r="http://schemas.openxmlformats.org/officeDocument/2006/relationships" xmlns:m="http://schemas.openxmlformats.org/officeDocument/2006/math" xmlns:v="urn:schemas-microsoft-com:vml" xmlns:wp14="http://schemas.microsoft.com/office/word/2010/wordprocessingDrawing" xmlns:wp="http://schemas.openxmlformats.org/drawingml/2006/wordprocessingDrawing" xmlns:w10="urn:schemas-microsoft-com:office:word" xmlns:w="http://schemas.openxmlformats.org/wordprocessingml/2006/main" xmlns:w14="http://schemas.microsoft.com/office/word/2010/wordml" xmlns:w15="http://schemas.microsoft.com/office/word/2012/wordml" xmlns:w16cex="http://schemas.microsoft.com/office/word/2018/wordml/cex" xmlns:w16cid="http://schemas.microsoft.com/office/word/2016/wordml/cid" xmlns:w16="http://schemas.microsoft.com/office/word/2018/wordml" xmlns:w16du="http://schemas.microsoft.com/office/word/2023/wordml/word16du" xmlns:w16sdtdh="http://schemas.microsoft.com/office/word/2020/wordml/sdtdatahash" xmlns:w16sdtfl="http://schemas.microsoft.com/office/word/2024/wordml/sdtformatlock" xmlns:w16se="http://schemas.microsoft.com/office/word/2015/wordml/symex" xmlns:wpg="http://schemas.microsoft.com/office/word/2010/wordprocessingGroup" xmlns:wpi="http://schemas.microsoft.com/office/word/2010/wordprocessingInk" xmlns:wne="http://schemas.microsoft.com/office/word/2006/wordml" xmlns:wps="http://schemas.microsoft.com/office/word/2010/wordprocessingShape" mc:Ignorable="w14 w15 w16se w16cid w16 w16cex w16sdtdh w16sdtfl w16du wp14">
+<w:endnotes xmlns:wpc="http://schemas.microsoft.com/office/word/2010/wordprocessingCanvas" xmlns:cx="http://schemas.microsoft.com/office/drawing/2014/chartex" xmlns:cx1="http://schemas.microsoft.com/office/drawing/2015/9/8/chartex" xmlns:cx2="http://schemas.microsoft.com/office/drawing/2015/10/21/chartex" xmlns:cx3="http://schemas.microsoft.com/office/drawing/2016/5/9/chartex" xmlns:cx4="http://schemas.microsoft.com/office/drawing/2016/5/10/chartex" xmlns:cx5="http://schemas.microsoft.com/office/drawing/2016/5/11/chartex" xmlns:cx6="http://schemas.microsoft.com/office/drawing/2016/5/12/chartex" xmlns:cx7="http://schemas.microsoft.com/office/drawing/2016/5/13/chartex" xmlns:cx8="http://schemas.microsoft.com/office/drawing/2016/5/14/chartex" xmlns:mc="http://schemas.openxmlformats.org/markup-compatibility/2006" xmlns:aink="http://schemas.microsoft.com/office/drawing/2016/ink" xmlns:am3d="http://schemas.microsoft.com/office/drawing/2017/model3d" xmlns:o="urn:schemas-microsoft-com:office:office" xmlns:oel="http://schemas.microsoft.com/office/2019/extlst" xmlns:r="http://schemas.openxmlformats.org/officeDocument/2006/relationships" xmlns:m="http://schemas.openxmlformats.org/officeDocument/2006/math" xmlns:v="urn:schemas-microsoft-com:vml" xmlns:wp14="http://schemas.microsoft.com/office/word/2010/wordprocessingDrawing" xmlns:wp="http://schemas.openxmlformats.org/drawingml/2006/wordprocessingDrawing" xmlns:w10="urn:schemas-microsoft-com:office:word" xmlns:w="http://schemas.openxmlformats.org/wordprocessingml/2006/main" xmlns:w14="http://schemas.microsoft.com/office/word/2010/wordml" xmlns:w15="http://schemas.microsoft.com/office/word/2012/wordml" xmlns:w16cei="http://schemas.microsoft.com/office/word/2026/wordml/cei" xmlns:w16cex="http://schemas.microsoft.com/office/word/2018/wordml/cex" xmlns:w16cid="http://schemas.microsoft.com/office/word/2016/wordml/cid" xmlns:w16="http://schemas.microsoft.com/office/word/2018/wordml" xmlns:w16du="http://schemas.microsoft.com/office/word/2023/wordml/word16du" xmlns:w16sdtdh="http://schemas.microsoft.com/office/word/2020/wordml/sdtdatahash" xmlns:w16sdtfl="http://schemas.microsoft.com/office/word/2024/wordml/sdtformatlock" xmlns:w16se="http://schemas.microsoft.com/office/word/2015/wordml/symex" xmlns:wpg="http://schemas.microsoft.com/office/word/2010/wordprocessingGroup" xmlns:wpi="http://schemas.microsoft.com/office/word/2010/wordprocessingInk" xmlns:wne="http://schemas.microsoft.com/office/word/2006/wordml" xmlns:wps="http://schemas.microsoft.com/office/word/2010/wordprocessingShape" mc:Ignorable="w14 w15 w16se w16cid w16 w16cex w16sdtdh w16sdtfl w16du wp14">
   <w:endnote w:type="separator" w:id="-1">
     <w:p>
       <w:pPr>
@@ -4064,7 +4152,7 @@
 </file>
 
 <file path=word/footnotes.xml><?xml version="1.0" encoding="utf-8"?>
-<w:footnotes xmlns:wpc="http://schemas.microsoft.com/office/word/2010/wordprocessingCanvas" xmlns:cx="http://schemas.microsoft.com/office/drawing/2014/chartex" xmlns:cx1="http://schemas.microsoft.com/office/drawing/2015/9/8/chartex" xmlns:cx2="http://schemas.microsoft.com/office/drawing/2015/10/21/chartex" xmlns:cx3="http://schemas.microsoft.com/office/drawing/2016/5/9/chartex" xmlns:cx4="http://schemas.microsoft.com/office/drawing/2016/5/10/chartex" xmlns:cx5="http://schemas.microsoft.com/office/drawing/2016/5/11/chartex" xmlns:cx6="http://schemas.microsoft.com/office/drawing/2016/5/12/chartex" xmlns:cx7="http://schemas.microsoft.com/office/drawing/2016/5/13/chartex" xmlns:cx8="http://schemas.microsoft.com/office/drawing/2016/5/14/chartex" xmlns:mc="http://schemas.openxmlformats.org/markup-compatibility/2006" xmlns:aink="http://schemas.microsoft.com/office/drawing/2016/ink" xmlns:am3d="http://schemas.microsoft.com/office/drawing/2017/model3d" xmlns:o="urn:schemas-microsoft-com:office:office" xmlns:oel="http://schemas.microsoft.com/office/2019/extlst" xmlns:r="http://schemas.openxmlformats.org/officeDocument/2006/relationships" xmlns:m="http://schemas.openxmlformats.org/officeDocument/2006/math" xmlns:v="urn:schemas-microsoft-com:vml" xmlns:wp14="http://schemas.microsoft.com/office/word/2010/wordprocessingDrawing" xmlns:wp="http://schemas.openxmlformats.org/drawingml/2006/wordprocessingDrawing" xmlns:w10="urn:schemas-microsoft-com:office:word" xmlns:w="http://schemas.openxmlformats.org/wordprocessingml/2006/main" xmlns:w14="http://schemas.microsoft.com/office/word/2010/wordml" xmlns:w15="http://schemas.microsoft.com/office/word/2012/wordml" xmlns:w16cex="http://schemas.microsoft.com/office/word/2018/wordml/cex" xmlns:w16cid="http://schemas.microsoft.com/office/word/2016/wordml/cid" xmlns:w16="http://schemas.microsoft.com/office/word/2018/wordml" xmlns:w16du="http://schemas.microsoft.com/office/word/2023/wordml/word16du" xmlns:w16sdtdh="http://schemas.microsoft.com/office/word/2020/wordml/sdtdatahash" xmlns:w16sdtfl="http://schemas.microsoft.com/office/word/2024/wordml/sdtformatlock" xmlns:w16se="http://schemas.microsoft.com/office/word/2015/wordml/symex" xmlns:wpg="http://schemas.microsoft.com/office/word/2010/wordprocessingGroup" xmlns:wpi="http://schemas.microsoft.com/office/word/2010/wordprocessingInk" xmlns:wne="http://schemas.microsoft.com/office/word/2006/wordml" xmlns:wps="http://schemas.microsoft.com/office/word/2010/wordprocessingShape" mc:Ignorable="w14 w15 w16se w16cid w16 w16cex w16sdtdh w16sdtfl w16du wp14">
+<w:footnotes xmlns:wpc="http://schemas.microsoft.com/office/word/2010/wordprocessingCanvas" xmlns:cx="http://schemas.microsoft.com/office/drawing/2014/chartex" xmlns:cx1="http://schemas.microsoft.com/office/drawing/2015/9/8/chartex" xmlns:cx2="http://schemas.microsoft.com/office/drawing/2015/10/21/chartex" xmlns:cx3="http://schemas.microsoft.com/office/drawing/2016/5/9/chartex" xmlns:cx4="http://schemas.microsoft.com/office/drawing/2016/5/10/chartex" xmlns:cx5="http://schemas.microsoft.com/office/drawing/2016/5/11/chartex" xmlns:cx6="http://schemas.microsoft.com/office/drawing/2016/5/12/chartex" xmlns:cx7="http://schemas.microsoft.com/office/drawing/2016/5/13/chartex" xmlns:cx8="http://schemas.microsoft.com/office/drawing/2016/5/14/chartex" xmlns:mc="http://schemas.openxmlformats.org/markup-compatibility/2006" xmlns:aink="http://schemas.microsoft.com/office/drawing/2016/ink" xmlns:am3d="http://schemas.microsoft.com/office/drawing/2017/model3d" xmlns:o="urn:schemas-microsoft-com:office:office" xmlns:oel="http://schemas.microsoft.com/office/2019/extlst" xmlns:r="http://schemas.openxmlformats.org/officeDocument/2006/relationships" xmlns:m="http://schemas.openxmlformats.org/officeDocument/2006/math" xmlns:v="urn:schemas-microsoft-com:vml" xmlns:wp14="http://schemas.microsoft.com/office/word/2010/wordprocessingDrawing" xmlns:wp="http://schemas.openxmlformats.org/drawingml/2006/wordprocessingDrawing" xmlns:w10="urn:schemas-microsoft-com:office:word" xmlns:w="http://schemas.openxmlformats.org/wordprocessingml/2006/main" xmlns:w14="http://schemas.microsoft.com/office/word/2010/wordml" xmlns:w15="http://schemas.microsoft.com/office/word/2012/wordml" xmlns:w16cei="http://schemas.microsoft.com/office/word/2026/wordml/cei" xmlns:w16cex="http://schemas.microsoft.com/office/word/2018/wordml/cex" xmlns:w16cid="http://schemas.microsoft.com/office/word/2016/wordml/cid" xmlns:w16="http://schemas.microsoft.com/office/word/2018/wordml" xmlns:w16du="http://schemas.microsoft.com/office/word/2023/wordml/word16du" xmlns:w16sdtdh="http://schemas.microsoft.com/office/word/2020/wordml/sdtdatahash" xmlns:w16sdtfl="http://schemas.microsoft.com/office/word/2024/wordml/sdtformatlock" xmlns:w16se="http://schemas.microsoft.com/office/word/2015/wordml/symex" xmlns:wpg="http://schemas.microsoft.com/office/word/2010/wordprocessingGroup" xmlns:wpi="http://schemas.microsoft.com/office/word/2010/wordprocessingInk" xmlns:wne="http://schemas.microsoft.com/office/word/2006/wordml" xmlns:wps="http://schemas.microsoft.com/office/word/2010/wordprocessingShape" mc:Ignorable="w14 w15 w16se w16cid w16 w16cex w16sdtdh w16sdtfl w16du wp14">
   <w:footnote w:type="separator" w:id="-1">
     <w:p>
       <w:pPr>
@@ -4089,7 +4177,7 @@
 </file>
 
 <file path=word/numbering.xml><?xml version="1.0" encoding="utf-8"?>
-<w:numbering xmlns:wpc="http://schemas.microsoft.com/office/word/2010/wordprocessingCanvas" xmlns:cx="http://schemas.microsoft.com/office/drawing/2014/chartex" xmlns:cx1="http://schemas.microsoft.com/office/drawing/2015/9/8/chartex" xmlns:cx2="http://schemas.microsoft.com/office/drawing/2015/10/21/chartex" xmlns:cx3="http://schemas.microsoft.com/office/drawing/2016/5/9/chartex" xmlns:cx4="http://schemas.microsoft.com/office/drawing/2016/5/10/chartex" xmlns:cx5="http://schemas.microsoft.com/office/drawing/2016/5/11/chartex" xmlns:cx6="http://schemas.microsoft.com/office/drawing/2016/5/12/chartex" xmlns:cx7="http://schemas.microsoft.com/office/drawing/2016/5/13/chartex" xmlns:cx8="http://schemas.microsoft.com/office/drawing/2016/5/14/chartex" xmlns:mc="http://schemas.openxmlformats.org/markup-compatibility/2006" xmlns:aink="http://schemas.microsoft.com/office/drawing/2016/ink" xmlns:am3d="http://schemas.microsoft.com/office/drawing/2017/model3d" xmlns:o="urn:schemas-microsoft-com:office:office" xmlns:oel="http://schemas.microsoft.com/office/2019/extlst" xmlns:r="http://schemas.openxmlformats.org/officeDocument/2006/relationships" xmlns:m="http://schemas.openxmlformats.org/officeDocument/2006/math" xmlns:v="urn:schemas-microsoft-com:vml" xmlns:wp14="http://schemas.microsoft.com/office/word/2010/wordprocessingDrawing" xmlns:wp="http://schemas.openxmlformats.org/drawingml/2006/wordprocessingDrawing" xmlns:w10="urn:schemas-microsoft-com:office:word" xmlns:w="http://schemas.openxmlformats.org/wordprocessingml/2006/main" xmlns:w14="http://schemas.microsoft.com/office/word/2010/wordml" xmlns:w15="http://schemas.microsoft.com/office/word/2012/wordml" xmlns:w16cex="http://schemas.microsoft.com/office/word/2018/wordml/cex" xmlns:w16cid="http://schemas.microsoft.com/office/word/2016/wordml/cid" xmlns:w16="http://schemas.microsoft.com/office/word/2018/wordml" xmlns:w16du="http://schemas.microsoft.com/office/word/2023/wordml/word16du" xmlns:w16sdtdh="http://schemas.microsoft.com/office/word/2020/wordml/sdtdatahash" xmlns:w16sdtfl="http://schemas.microsoft.com/office/word/2024/wordml/sdtformatlock" xmlns:w16se="http://schemas.microsoft.com/office/word/2015/wordml/symex" xmlns:wpg="http://schemas.microsoft.com/office/word/2010/wordprocessingGroup" xmlns:wpi="http://schemas.microsoft.com/office/word/2010/wordprocessingInk" xmlns:wne="http://schemas.microsoft.com/office/word/2006/wordml" xmlns:wps="http://schemas.microsoft.com/office/word/2010/wordprocessingShape" mc:Ignorable="w14 w15 w16se w16cid w16 w16cex w16sdtdh w16sdtfl w16du wp14">
+<w:numbering xmlns:wpc="http://schemas.microsoft.com/office/word/2010/wordprocessingCanvas" xmlns:cx="http://schemas.microsoft.com/office/drawing/2014/chartex" xmlns:cx1="http://schemas.microsoft.com/office/drawing/2015/9/8/chartex" xmlns:cx2="http://schemas.microsoft.com/office/drawing/2015/10/21/chartex" xmlns:cx3="http://schemas.microsoft.com/office/drawing/2016/5/9/chartex" xmlns:cx4="http://schemas.microsoft.com/office/drawing/2016/5/10/chartex" xmlns:cx5="http://schemas.microsoft.com/office/drawing/2016/5/11/chartex" xmlns:cx6="http://schemas.microsoft.com/office/drawing/2016/5/12/chartex" xmlns:cx7="http://schemas.microsoft.com/office/drawing/2016/5/13/chartex" xmlns:cx8="http://schemas.microsoft.com/office/drawing/2016/5/14/chartex" xmlns:mc="http://schemas.openxmlformats.org/markup-compatibility/2006" xmlns:aink="http://schemas.microsoft.com/office/drawing/2016/ink" xmlns:am3d="http://schemas.microsoft.com/office/drawing/2017/model3d" xmlns:o="urn:schemas-microsoft-com:office:office" xmlns:oel="http://schemas.microsoft.com/office/2019/extlst" xmlns:r="http://schemas.openxmlformats.org/officeDocument/2006/relationships" xmlns:m="http://schemas.openxmlformats.org/officeDocument/2006/math" xmlns:v="urn:schemas-microsoft-com:vml" xmlns:wp14="http://schemas.microsoft.com/office/word/2010/wordprocessingDrawing" xmlns:wp="http://schemas.openxmlformats.org/drawingml/2006/wordprocessingDrawing" xmlns:w10="urn:schemas-microsoft-com:office:word" xmlns:w="http://schemas.openxmlformats.org/wordprocessingml/2006/main" xmlns:w14="http://schemas.microsoft.com/office/word/2010/wordml" xmlns:w15="http://schemas.microsoft.com/office/word/2012/wordml" xmlns:w16cei="http://schemas.microsoft.com/office/word/2026/wordml/cei" xmlns:w16cex="http://schemas.microsoft.com/office/word/2018/wordml/cex" xmlns:w16cid="http://schemas.microsoft.com/office/word/2016/wordml/cid" xmlns:w16="http://schemas.microsoft.com/office/word/2018/wordml" xmlns:w16du="http://schemas.microsoft.com/office/word/2023/wordml/word16du" xmlns:w16sdtdh="http://schemas.microsoft.com/office/word/2020/wordml/sdtdatahash" xmlns:w16sdtfl="http://schemas.microsoft.com/office/word/2024/wordml/sdtformatlock" xmlns:w16se="http://schemas.microsoft.com/office/word/2015/wordml/symex" xmlns:wpg="http://schemas.microsoft.com/office/word/2010/wordprocessingGroup" xmlns:wpi="http://schemas.microsoft.com/office/word/2010/wordprocessingInk" xmlns:wne="http://schemas.microsoft.com/office/word/2006/wordml" xmlns:wps="http://schemas.microsoft.com/office/word/2010/wordprocessingShape" mc:Ignorable="w14 w15 w16se w16cid w16 w16cex w16sdtdh w16sdtfl w16du wp14">
   <w:abstractNum w:abstractNumId="0" w15:restartNumberingAfterBreak="0">
     <w:nsid w:val="1DC41E49"/>
     <w:multiLevelType w:val="hybridMultilevel"/>
@@ -4928,7 +5016,6 @@
   <w:style w:type="character" w:default="1" w:styleId="DefaultParagraphFont">
     <w:name w:val="Default Paragraph Font"/>
     <w:uiPriority w:val="1"/>
-    <w:semiHidden/>
     <w:unhideWhenUsed/>
   </w:style>
   <w:style w:type="table" w:default="1" w:styleId="TableNormal">

</xml_diff>

<commit_message>
done the correlation matrix and started explanation on word
</commit_message>
<xml_diff>
--- a/Project Spam Email Detector.docx
+++ b/Project Spam Email Detector.docx
@@ -4113,6 +4113,161 @@
       </w:r>
       <w:r>
         <w:t>. This shows that these features contain very similar information. Understanding these relationships will help when explaining my design decisions for the model.</w:t>
+      </w:r>
+    </w:p>
+    <w:p>
+      <w:pPr>
+        <w:keepNext/>
+      </w:pPr>
+      <w:r>
+        <w:lastRenderedPageBreak/>
+        <w:drawing>
+          <wp:inline distT="0" distB="0" distL="0" distR="0" wp14:anchorId="782E6A56" wp14:editId="664003AA">
+            <wp:extent cx="2686050" cy="2465883"/>
+            <wp:effectExtent l="0" t="0" r="0" b="0"/>
+            <wp:docPr id="1358752247" name="Picture 1"/>
+            <wp:cNvGraphicFramePr>
+              <a:graphicFrameLocks xmlns:a="http://schemas.openxmlformats.org/drawingml/2006/main" noChangeAspect="1"/>
+            </wp:cNvGraphicFramePr>
+            <a:graphic xmlns:a="http://schemas.openxmlformats.org/drawingml/2006/main">
+              <a:graphicData uri="http://schemas.openxmlformats.org/drawingml/2006/picture">
+                <pic:pic xmlns:pic="http://schemas.openxmlformats.org/drawingml/2006/picture">
+                  <pic:nvPicPr>
+                    <pic:cNvPr id="1358752247" name=""/>
+                    <pic:cNvPicPr/>
+                  </pic:nvPicPr>
+                  <pic:blipFill>
+                    <a:blip r:embed="rId46"/>
+                    <a:stretch>
+                      <a:fillRect/>
+                    </a:stretch>
+                  </pic:blipFill>
+                  <pic:spPr>
+                    <a:xfrm>
+                      <a:off x="0" y="0"/>
+                      <a:ext cx="2690016" cy="2469524"/>
+                    </a:xfrm>
+                    <a:prstGeom prst="rect">
+                      <a:avLst/>
+                    </a:prstGeom>
+                  </pic:spPr>
+                </pic:pic>
+              </a:graphicData>
+            </a:graphic>
+          </wp:inline>
+        </w:drawing>
+      </w:r>
+    </w:p>
+    <w:p>
+      <w:pPr>
+        <w:pStyle w:val="Caption"/>
+      </w:pPr>
+      <w:r>
+        <w:t>Figure 39 selecting features to be used in correlation matrix</w:t>
+      </w:r>
+    </w:p>
+    <w:p>
+      <w:r>
+        <w:t>Here It is just the selection process of the features going to be implemented in the correlation matrix. I chose the most appropriate features from the EDA.</w:t>
+      </w:r>
+    </w:p>
+    <w:p>
+      <w:pPr>
+        <w:keepNext/>
+      </w:pPr>
+      <w:r>
+        <w:drawing>
+          <wp:inline distT="0" distB="0" distL="0" distR="0" wp14:anchorId="450CB4F7" wp14:editId="205B97FB">
+            <wp:extent cx="3815021" cy="850900"/>
+            <wp:effectExtent l="0" t="0" r="0" b="6350"/>
+            <wp:docPr id="1563860482" name="Picture 1"/>
+            <wp:cNvGraphicFramePr>
+              <a:graphicFrameLocks xmlns:a="http://schemas.openxmlformats.org/drawingml/2006/main" noChangeAspect="1"/>
+            </wp:cNvGraphicFramePr>
+            <a:graphic xmlns:a="http://schemas.openxmlformats.org/drawingml/2006/main">
+              <a:graphicData uri="http://schemas.openxmlformats.org/drawingml/2006/picture">
+                <pic:pic xmlns:pic="http://schemas.openxmlformats.org/drawingml/2006/picture">
+                  <pic:nvPicPr>
+                    <pic:cNvPr id="1563860482" name=""/>
+                    <pic:cNvPicPr/>
+                  </pic:nvPicPr>
+                  <pic:blipFill>
+                    <a:blip r:embed="rId47"/>
+                    <a:stretch>
+                      <a:fillRect/>
+                    </a:stretch>
+                  </pic:blipFill>
+                  <pic:spPr>
+                    <a:xfrm>
+                      <a:off x="0" y="0"/>
+                      <a:ext cx="3822138" cy="852487"/>
+                    </a:xfrm>
+                    <a:prstGeom prst="rect">
+                      <a:avLst/>
+                    </a:prstGeom>
+                  </pic:spPr>
+                </pic:pic>
+              </a:graphicData>
+            </a:graphic>
+          </wp:inline>
+        </w:drawing>
+      </w:r>
+    </w:p>
+    <w:p>
+      <w:pPr>
+        <w:pStyle w:val="Caption"/>
+      </w:pPr>
+      <w:r>
+        <w:t>Figure 40 calculating correlation matrix</w:t>
+      </w:r>
+    </w:p>
+    <w:p>
+      <w:r>
+        <w:t>This is the code that calculates the correlation matrix. .corr() compares every feature with every other feature until every combination has been analysed</w:t>
+      </w:r>
+    </w:p>
+    <w:p/>
+    <w:p/>
+    <w:p/>
+    <w:p/>
+    <w:p>
+      <w:r>
+        <w:lastRenderedPageBreak/>
+        <w:drawing>
+          <wp:inline distT="0" distB="0" distL="0" distR="0" wp14:anchorId="4474ECEE" wp14:editId="54B22F84">
+            <wp:extent cx="5315223" cy="3886400"/>
+            <wp:effectExtent l="0" t="0" r="0" b="0"/>
+            <wp:docPr id="2093397666" name="Picture 1"/>
+            <wp:cNvGraphicFramePr>
+              <a:graphicFrameLocks xmlns:a="http://schemas.openxmlformats.org/drawingml/2006/main" noChangeAspect="1"/>
+            </wp:cNvGraphicFramePr>
+            <a:graphic xmlns:a="http://schemas.openxmlformats.org/drawingml/2006/main">
+              <a:graphicData uri="http://schemas.openxmlformats.org/drawingml/2006/picture">
+                <pic:pic xmlns:pic="http://schemas.openxmlformats.org/drawingml/2006/picture">
+                  <pic:nvPicPr>
+                    <pic:cNvPr id="2093397666" name=""/>
+                    <pic:cNvPicPr/>
+                  </pic:nvPicPr>
+                  <pic:blipFill>
+                    <a:blip r:embed="rId48"/>
+                    <a:stretch>
+                      <a:fillRect/>
+                    </a:stretch>
+                  </pic:blipFill>
+                  <pic:spPr>
+                    <a:xfrm>
+                      <a:off x="0" y="0"/>
+                      <a:ext cx="5315223" cy="3886400"/>
+                    </a:xfrm>
+                    <a:prstGeom prst="rect">
+                      <a:avLst/>
+                    </a:prstGeom>
+                  </pic:spPr>
+                </pic:pic>
+              </a:graphicData>
+            </a:graphic>
+          </wp:inline>
+        </w:drawing>
       </w:r>
     </w:p>
     <w:p/>

</xml_diff>

<commit_message>
explanation of correlation matrix completed
</commit_message>
<xml_diff>
--- a/Project Spam Email Detector.docx
+++ b/Project Spam Email Detector.docx
@@ -651,14 +651,27 @@
       <w:r>
         <w:t xml:space="preserve">Figure </w:t>
       </w:r>
-      <w:fldSimple w:instr=" SEQ Figure \* ARABIC ">
-        <w:r>
-          <w:rPr>
-            <w:noProof/>
-          </w:rPr>
-          <w:t>1</w:t>
-        </w:r>
-      </w:fldSimple>
+      <w:r>
+        <w:fldChar w:fldCharType="begin"/>
+      </w:r>
+      <w:r>
+        <w:instrText xml:space="preserve"> SEQ Figure \* ARABIC </w:instrText>
+      </w:r>
+      <w:r>
+        <w:fldChar w:fldCharType="separate"/>
+      </w:r>
+      <w:r>
+        <w:rPr>
+          <w:noProof/>
+        </w:rPr>
+        <w:t>1</w:t>
+      </w:r>
+      <w:r>
+        <w:rPr>
+          <w:noProof/>
+        </w:rPr>
+        <w:fldChar w:fldCharType="end"/>
+      </w:r>
       <w:r>
         <w:t xml:space="preserve"> containing number of emails vs spam emails sent</w:t>
       </w:r>
@@ -734,14 +747,27 @@
       <w:r>
         <w:t xml:space="preserve">Figure </w:t>
       </w:r>
-      <w:fldSimple w:instr=" SEQ Figure \* ARABIC ">
-        <w:r>
-          <w:rPr>
-            <w:noProof/>
-          </w:rPr>
-          <w:t>2</w:t>
-        </w:r>
-      </w:fldSimple>
+      <w:r>
+        <w:fldChar w:fldCharType="begin"/>
+      </w:r>
+      <w:r>
+        <w:instrText xml:space="preserve"> SEQ Figure \* ARABIC </w:instrText>
+      </w:r>
+      <w:r>
+        <w:fldChar w:fldCharType="separate"/>
+      </w:r>
+      <w:r>
+        <w:rPr>
+          <w:noProof/>
+        </w:rPr>
+        <w:t>2</w:t>
+      </w:r>
+      <w:r>
+        <w:rPr>
+          <w:noProof/>
+        </w:rPr>
+        <w:fldChar w:fldCharType="end"/>
+      </w:r>
       <w:r>
         <w:t xml:space="preserve"> the most common topics people see in spam emails they receive</w:t>
       </w:r>
@@ -805,14 +831,27 @@
       <w:r>
         <w:t xml:space="preserve">Figure </w:t>
       </w:r>
-      <w:fldSimple w:instr=" SEQ Figure \* ARABIC ">
-        <w:r>
-          <w:rPr>
-            <w:noProof/>
-          </w:rPr>
-          <w:t>3</w:t>
-        </w:r>
-      </w:fldSimple>
+      <w:r>
+        <w:fldChar w:fldCharType="begin"/>
+      </w:r>
+      <w:r>
+        <w:instrText xml:space="preserve"> SEQ Figure \* ARABIC </w:instrText>
+      </w:r>
+      <w:r>
+        <w:fldChar w:fldCharType="separate"/>
+      </w:r>
+      <w:r>
+        <w:rPr>
+          <w:noProof/>
+        </w:rPr>
+        <w:t>3</w:t>
+      </w:r>
+      <w:r>
+        <w:rPr>
+          <w:noProof/>
+        </w:rPr>
+        <w:fldChar w:fldCharType="end"/>
+      </w:r>
       <w:r>
         <w:t xml:space="preserve"> Average monthly spam call received by age and gender</w:t>
       </w:r>
@@ -919,14 +958,27 @@
       <w:r>
         <w:t xml:space="preserve">Figure </w:t>
       </w:r>
-      <w:fldSimple w:instr=" SEQ Figure \* ARABIC ">
-        <w:r>
-          <w:rPr>
-            <w:noProof/>
-          </w:rPr>
-          <w:t>4</w:t>
-        </w:r>
-      </w:fldSimple>
+      <w:r>
+        <w:fldChar w:fldCharType="begin"/>
+      </w:r>
+      <w:r>
+        <w:instrText xml:space="preserve"> SEQ Figure \* ARABIC </w:instrText>
+      </w:r>
+      <w:r>
+        <w:fldChar w:fldCharType="separate"/>
+      </w:r>
+      <w:r>
+        <w:rPr>
+          <w:noProof/>
+        </w:rPr>
+        <w:t>4</w:t>
+      </w:r>
+      <w:r>
+        <w:rPr>
+          <w:noProof/>
+        </w:rPr>
+        <w:fldChar w:fldCharType="end"/>
+      </w:r>
       <w:r>
         <w:t xml:space="preserve"> loading spam email dataset into my python file</w:t>
       </w:r>
@@ -1161,14 +1213,27 @@
       <w:r>
         <w:t xml:space="preserve">Figure </w:t>
       </w:r>
-      <w:fldSimple w:instr=" SEQ Figure \* ARABIC ">
-        <w:r>
-          <w:rPr>
-            <w:noProof/>
-          </w:rPr>
-          <w:t>5</w:t>
-        </w:r>
-      </w:fldSimple>
+      <w:r>
+        <w:fldChar w:fldCharType="begin"/>
+      </w:r>
+      <w:r>
+        <w:instrText xml:space="preserve"> SEQ Figure \* ARABIC </w:instrText>
+      </w:r>
+      <w:r>
+        <w:fldChar w:fldCharType="separate"/>
+      </w:r>
+      <w:r>
+        <w:rPr>
+          <w:noProof/>
+        </w:rPr>
+        <w:t>5</w:t>
+      </w:r>
+      <w:r>
+        <w:rPr>
+          <w:noProof/>
+        </w:rPr>
+        <w:fldChar w:fldCharType="end"/>
+      </w:r>
       <w:r>
         <w:t xml:space="preserve"> Bar chart showcasing the number of spam and ham emails</w:t>
       </w:r>
@@ -2772,11 +2837,7 @@
           </mc:Choice>
           <mc:Fallback>
             <w:pict>
-              <v:shapetype w14:anchorId="0323F5DA" id="_x0000_t202" coordsize="21600,21600" o:spt="202" path="m,l,21600r21600,l21600,xe">
-                <v:stroke joinstyle="miter"/>
-                <v:path gradientshapeok="t" o:connecttype="rect"/>
-              </v:shapetype>
-              <v:shape id="_x0000_s1030" type="#_x0000_t202" style="position:absolute;margin-left:305.5pt;margin-top:108.6pt;width:189.5pt;height:.05pt;z-index:251672576;visibility:visible;mso-wrap-style:square;mso-wrap-distance-left:9pt;mso-wrap-distance-top:0;mso-wrap-distance-right:9pt;mso-wrap-distance-bottom:0;mso-position-horizontal:absolute;mso-position-horizontal-relative:text;mso-position-vertical:absolute;mso-position-vertical-relative:text;v-text-anchor:top" o:gfxdata="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" stroked="f">
+              <v:shape w14:anchorId="0323F5DA" id="_x0000_s1030" type="#_x0000_t202" style="position:absolute;margin-left:305.5pt;margin-top:108.6pt;width:189.5pt;height:.05pt;z-index:251672576;visibility:visible;mso-wrap-style:square;mso-wrap-distance-left:9pt;mso-wrap-distance-top:0;mso-wrap-distance-right:9pt;mso-wrap-distance-bottom:0;mso-position-horizontal:absolute;mso-position-horizontal-relative:text;mso-position-vertical:absolute;mso-position-vertical-relative:text;v-text-anchor:top" o:gfxdata="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" stroked="f">
                 <v:textbox style="mso-fit-shape-to-text:t" inset="0,0,0,0">
                   <w:txbxContent>
                     <w:p>
@@ -3486,11 +3547,7 @@
           </mc:Choice>
           <mc:Fallback>
             <w:pict>
-              <v:shapetype w14:anchorId="666B0979" id="_x0000_t202" coordsize="21600,21600" o:spt="202" path="m,l,21600r21600,l21600,xe">
-                <v:stroke joinstyle="miter"/>
-                <v:path gradientshapeok="t" o:connecttype="rect"/>
-              </v:shapetype>
-              <v:shape id="_x0000_s1031" type="#_x0000_t202" style="position:absolute;margin-left:314.5pt;margin-top:116.5pt;width:189.1pt;height:.05pt;z-index:251675648;visibility:visible;mso-wrap-style:square;mso-wrap-distance-left:9pt;mso-wrap-distance-top:0;mso-wrap-distance-right:9pt;mso-wrap-distance-bottom:0;mso-position-horizontal:absolute;mso-position-horizontal-relative:text;mso-position-vertical:absolute;mso-position-vertical-relative:text;v-text-anchor:top" o:gfxdata="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" stroked="f">
+              <v:shape w14:anchorId="666B0979" id="_x0000_s1031" type="#_x0000_t202" style="position:absolute;margin-left:314.5pt;margin-top:116.5pt;width:189.1pt;height:.05pt;z-index:251675648;visibility:visible;mso-wrap-style:square;mso-wrap-distance-left:9pt;mso-wrap-distance-top:0;mso-wrap-distance-right:9pt;mso-wrap-distance-bottom:0;mso-position-horizontal:absolute;mso-position-horizontal-relative:text;mso-position-vertical:absolute;mso-position-vertical-relative:text;v-text-anchor:top" o:gfxdata="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" stroked="f">
                 <v:textbox style="mso-fit-shape-to-text:t" inset="0,0,0,0">
                   <w:txbxContent>
                     <w:p>
@@ -4120,9 +4177,12 @@
         <w:keepNext/>
       </w:pPr>
       <w:r>
+        <w:rPr>
+          <w:noProof/>
+        </w:rPr>
         <w:lastRenderedPageBreak/>
         <w:drawing>
-          <wp:inline distT="0" distB="0" distL="0" distR="0" wp14:anchorId="782E6A56" wp14:editId="664003AA">
+          <wp:inline distT="0" distB="0" distL="0" distR="0" wp14:anchorId="782E6A56" wp14:editId="46A83572">
             <wp:extent cx="2686050" cy="2465883"/>
             <wp:effectExtent l="0" t="0" r="0" b="0"/>
             <wp:docPr id="1358752247" name="Picture 1"/>
@@ -4176,8 +4236,11 @@
         <w:keepNext/>
       </w:pPr>
       <w:r>
+        <w:rPr>
+          <w:noProof/>
+        </w:rPr>
         <w:drawing>
-          <wp:inline distT="0" distB="0" distL="0" distR="0" wp14:anchorId="450CB4F7" wp14:editId="205B97FB">
+          <wp:inline distT="0" distB="0" distL="0" distR="0" wp14:anchorId="450CB4F7" wp14:editId="1E4CE106">
             <wp:extent cx="3815021" cy="850900"/>
             <wp:effectExtent l="0" t="0" r="0" b="6350"/>
             <wp:docPr id="1563860482" name="Picture 1"/>
@@ -4225,14 +4288,241 @@
       <w:r>
         <w:t>This is the code that calculates the correlation matrix. .corr() compares every feature with every other feature until every combination has been analysed</w:t>
       </w:r>
+      <w:r>
+        <w:t>.</w:t>
+      </w:r>
+    </w:p>
+    <w:p/>
+    <w:p>
+      <w:r>
+        <w:rPr>
+          <w:noProof/>
+        </w:rPr>
+        <mc:AlternateContent>
+          <mc:Choice Requires="wps">
+            <w:drawing>
+              <wp:anchor distT="0" distB="0" distL="114300" distR="114300" simplePos="0" relativeHeight="251681792" behindDoc="0" locked="0" layoutInCell="1" allowOverlap="1" wp14:anchorId="3CC90502" wp14:editId="7A6E4DB7">
+                <wp:simplePos x="0" y="0"/>
+                <wp:positionH relativeFrom="column">
+                  <wp:posOffset>1744345</wp:posOffset>
+                </wp:positionH>
+                <wp:positionV relativeFrom="paragraph">
+                  <wp:posOffset>2244725</wp:posOffset>
+                </wp:positionV>
+                <wp:extent cx="3072765" cy="635"/>
+                <wp:effectExtent l="0" t="0" r="0" b="0"/>
+                <wp:wrapNone/>
+                <wp:docPr id="877684592" name="Text Box 1"/>
+                <wp:cNvGraphicFramePr/>
+                <a:graphic xmlns:a="http://schemas.openxmlformats.org/drawingml/2006/main">
+                  <a:graphicData uri="http://schemas.microsoft.com/office/word/2010/wordprocessingShape">
+                    <wps:wsp>
+                      <wps:cNvSpPr txBox="1"/>
+                      <wps:spPr>
+                        <a:xfrm>
+                          <a:off x="0" y="0"/>
+                          <a:ext cx="3072765" cy="635"/>
+                        </a:xfrm>
+                        <a:prstGeom prst="rect">
+                          <a:avLst/>
+                        </a:prstGeom>
+                        <a:solidFill>
+                          <a:prstClr val="white"/>
+                        </a:solidFill>
+                        <a:ln>
+                          <a:noFill/>
+                        </a:ln>
+                      </wps:spPr>
+                      <wps:txbx>
+                        <w:txbxContent>
+                          <w:p>
+                            <w:pPr>
+                              <w:pStyle w:val="Caption"/>
+                              <w:rPr>
+                                <w:sz w:val="22"/>
+                                <w:szCs w:val="22"/>
+                              </w:rPr>
+                            </w:pPr>
+                            <w:r>
+                              <w:t>Figure 41 code displaying plotting the correlation matrix</w:t>
+                            </w:r>
+                          </w:p>
+                        </w:txbxContent>
+                      </wps:txbx>
+                      <wps:bodyPr rot="0" spcFirstLastPara="0" vertOverflow="overflow" horzOverflow="overflow" vert="horz" wrap="square" lIns="0" tIns="0" rIns="0" bIns="0" numCol="1" spcCol="0" rtlCol="0" fromWordArt="0" anchor="t" anchorCtr="0" forceAA="0" compatLnSpc="1">
+                        <a:prstTxWarp prst="textNoShape">
+                          <a:avLst/>
+                        </a:prstTxWarp>
+                        <a:spAutoFit/>
+                      </wps:bodyPr>
+                    </wps:wsp>
+                  </a:graphicData>
+                </a:graphic>
+              </wp:anchor>
+            </w:drawing>
+          </mc:Choice>
+          <mc:Fallback>
+            <w:pict>
+              <v:shape w14:anchorId="3CC90502" id="_x0000_s1033" type="#_x0000_t202" style="position:absolute;margin-left:137.35pt;margin-top:176.75pt;width:241.95pt;height:.05pt;z-index:251681792;visibility:visible;mso-wrap-style:square;mso-wrap-distance-left:9pt;mso-wrap-distance-top:0;mso-wrap-distance-right:9pt;mso-wrap-distance-bottom:0;mso-position-horizontal:absolute;mso-position-horizontal-relative:text;mso-position-vertical:absolute;mso-position-vertical-relative:text;v-text-anchor:top" o:gfxdata="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" stroked="f">
+                <v:textbox style="mso-fit-shape-to-text:t" inset="0,0,0,0">
+                  <w:txbxContent>
+                    <w:p>
+                      <w:pPr>
+                        <w:pStyle w:val="Caption"/>
+                        <w:rPr>
+                          <w:sz w:val="22"/>
+                          <w:szCs w:val="22"/>
+                        </w:rPr>
+                      </w:pPr>
+                      <w:r>
+                        <w:t>Figure 41 code displaying plotting the correlation matrix</w:t>
+                      </w:r>
+                    </w:p>
+                  </w:txbxContent>
+                </v:textbox>
+              </v:shape>
+            </w:pict>
+          </mc:Fallback>
+        </mc:AlternateContent>
+      </w:r>
+      <w:r>
+        <w:drawing>
+          <wp:anchor distT="0" distB="0" distL="114300" distR="114300" simplePos="0" relativeHeight="251679744" behindDoc="0" locked="0" layoutInCell="1" allowOverlap="1" wp14:anchorId="1180AB08" wp14:editId="6C0D7001">
+            <wp:simplePos x="0" y="0"/>
+            <wp:positionH relativeFrom="column">
+              <wp:posOffset>3376295</wp:posOffset>
+            </wp:positionH>
+            <wp:positionV relativeFrom="paragraph">
+              <wp:posOffset>143510</wp:posOffset>
+            </wp:positionV>
+            <wp:extent cx="3072808" cy="1962075"/>
+            <wp:effectExtent l="0" t="0" r="0" b="635"/>
+            <wp:wrapNone/>
+            <wp:docPr id="198359866" name="Picture 1"/>
+            <wp:cNvGraphicFramePr>
+              <a:graphicFrameLocks xmlns:a="http://schemas.openxmlformats.org/drawingml/2006/main" noChangeAspect="1"/>
+            </wp:cNvGraphicFramePr>
+            <a:graphic xmlns:a="http://schemas.openxmlformats.org/drawingml/2006/main">
+              <a:graphicData uri="http://schemas.openxmlformats.org/drawingml/2006/picture">
+                <pic:pic xmlns:pic="http://schemas.openxmlformats.org/drawingml/2006/picture">
+                  <pic:nvPicPr>
+                    <pic:cNvPr id="198359866" name=""/>
+                    <pic:cNvPicPr/>
+                  </pic:nvPicPr>
+                  <pic:blipFill rotWithShape="1">
+                    <a:blip r:embed="rId48">
+                      <a:extLst>
+                        <a:ext uri="{28A0092B-C50C-407E-A947-70E740481C1C}">
+                          <a14:useLocalDpi xmlns:a14="http://schemas.microsoft.com/office/drawing/2010/main" val="0"/>
+                        </a:ext>
+                      </a:extLst>
+                    </a:blip>
+                    <a:srcRect r="21026"/>
+                    <a:stretch>
+                      <a:fillRect/>
+                    </a:stretch>
+                  </pic:blipFill>
+                  <pic:spPr bwMode="auto">
+                    <a:xfrm>
+                      <a:off x="0" y="0"/>
+                      <a:ext cx="3072808" cy="1962075"/>
+                    </a:xfrm>
+                    <a:prstGeom prst="rect">
+                      <a:avLst/>
+                    </a:prstGeom>
+                    <a:ln>
+                      <a:noFill/>
+                    </a:ln>
+                    <a:extLst>
+                      <a:ext uri="{53640926-AAD7-44D8-BBD7-CCE9431645EC}">
+                        <a14:shadowObscured xmlns:a14="http://schemas.microsoft.com/office/drawing/2010/main"/>
+                      </a:ext>
+                    </a:extLst>
+                  </pic:spPr>
+                </pic:pic>
+              </a:graphicData>
+            </a:graphic>
+            <wp14:sizeRelH relativeFrom="margin">
+              <wp14:pctWidth>0</wp14:pctWidth>
+            </wp14:sizeRelH>
+            <wp14:sizeRelV relativeFrom="margin">
+              <wp14:pctHeight>0</wp14:pctHeight>
+            </wp14:sizeRelV>
+          </wp:anchor>
+        </w:drawing>
+      </w:r>
+      <w:r>
+        <w:drawing>
+          <wp:inline distT="0" distB="0" distL="0" distR="0" wp14:anchorId="34389BE6" wp14:editId="6401FCC8">
+            <wp:extent cx="3213952" cy="2178050"/>
+            <wp:effectExtent l="0" t="0" r="5715" b="0"/>
+            <wp:docPr id="1016430411" name="Picture 1"/>
+            <wp:cNvGraphicFramePr>
+              <a:graphicFrameLocks xmlns:a="http://schemas.openxmlformats.org/drawingml/2006/main" noChangeAspect="1"/>
+            </wp:cNvGraphicFramePr>
+            <a:graphic xmlns:a="http://schemas.openxmlformats.org/drawingml/2006/main">
+              <a:graphicData uri="http://schemas.openxmlformats.org/drawingml/2006/picture">
+                <pic:pic xmlns:pic="http://schemas.openxmlformats.org/drawingml/2006/picture">
+                  <pic:nvPicPr>
+                    <pic:cNvPr id="1016430411" name=""/>
+                    <pic:cNvPicPr/>
+                  </pic:nvPicPr>
+                  <pic:blipFill>
+                    <a:blip r:embed="rId49"/>
+                    <a:stretch>
+                      <a:fillRect/>
+                    </a:stretch>
+                  </pic:blipFill>
+                  <pic:spPr>
+                    <a:xfrm>
+                      <a:off x="0" y="0"/>
+                      <a:ext cx="3217512" cy="2180463"/>
+                    </a:xfrm>
+                    <a:prstGeom prst="rect">
+                      <a:avLst/>
+                    </a:prstGeom>
+                  </pic:spPr>
+                </pic:pic>
+              </a:graphicData>
+            </a:graphic>
+          </wp:inline>
+        </w:drawing>
+      </w:r>
     </w:p>
     <w:p/>
     <w:p/>
+    <w:p>
+      <w:r>
+        <w:t>This part of the code shows the plot of the correlation matrix. There was a simpler alternative however such solution wouldn’t of have included the correlation values inside the boxes.</w:t>
+      </w:r>
+    </w:p>
     <w:p/>
+    <w:p>
+      <w:r>
+        <w:lastRenderedPageBreak/>
+        <w:t xml:space="preserve">What it does is first converts the correlation matrix into an image with plt.imshow() where it will turn every number within the correlation matrix into a coloured square. cmap chooses the colour scheme. Plt.colorbar() adds the colour scale. Plt.xticks &amp; plt.yticks in this case adds labels to the x-axis and the same for the y-axis. </w:t>
+      </w:r>
+    </w:p>
+    <w:p>
+      <w:r>
+        <w:t>For the nested for loops, it visits every square in the matrix. In plt.text(), the purpose of it is to write the correlation value inside each coloured square</w:t>
+      </w:r>
+      <w:r>
+        <w:t>. correlation_matrix.iloc retrieves the value in row I and column j and displays the value with 2 decimal places with :.2f. so for example 0.973850 becomes 0.9</w:t>
+      </w:r>
+      <w:r>
+        <w:t>7.</w:t>
+      </w:r>
+    </w:p>
     <w:p/>
     <w:p>
-      <w:r>
-        <w:lastRenderedPageBreak/>
+      <w:pPr>
+        <w:keepNext/>
+      </w:pPr>
+      <w:r>
+        <w:rPr>
+          <w:noProof/>
+        </w:rPr>
         <w:drawing>
           <wp:inline distT="0" distB="0" distL="0" distR="0" wp14:anchorId="4474ECEE" wp14:editId="54B22F84">
             <wp:extent cx="5315223" cy="3886400"/>
@@ -4249,7 +4539,7 @@
                     <pic:cNvPicPr/>
                   </pic:nvPicPr>
                   <pic:blipFill>
-                    <a:blip r:embed="rId48"/>
+                    <a:blip r:embed="rId50"/>
                     <a:stretch>
                       <a:fillRect/>
                     </a:stretch>
@@ -4268,6 +4558,105 @@
             </a:graphic>
           </wp:inline>
         </w:drawing>
+      </w:r>
+    </w:p>
+    <w:p>
+      <w:pPr>
+        <w:pStyle w:val="Caption"/>
+      </w:pPr>
+      <w:r>
+        <w:t>Figure 42 correlation matrix of email features</w:t>
+      </w:r>
+    </w:p>
+    <w:p/>
+    <w:p>
+      <w:r>
+        <w:t>Correlation analysis summary:</w:t>
+      </w:r>
+    </w:p>
+    <w:p>
+      <w:r>
+        <w:t>Correlation analysis was performed to understand the relationships between the engineered email features and determine whether they provide unique information for spam classification.</w:t>
+      </w:r>
+    </w:p>
+    <w:p>
+      <w:r>
+        <w:t>The strongest correlation observed was between word count and email length:</w:t>
+      </w:r>
+    </w:p>
+    <w:p>
+      <w:r>
+        <w:t>Word Count ↔ Email Length: r = 0.97</w:t>
+      </w:r>
+    </w:p>
+    <w:p>
+      <w:r>
+        <w:t>This indicates a very strong positive relationship, meaning longer emails naturally contain more words. Since both features measure email size, they may provide similar information to the machine learning model. During feature selection, their impact can be tested by training models with and without one of these features.</w:t>
+      </w:r>
+    </w:p>
+    <w:p>
+      <w:r>
+        <w:t>The next strongest relationships were:</w:t>
+      </w:r>
+    </w:p>
+    <w:p>
+      <w:r>
+        <w:lastRenderedPageBreak/>
+        <w:t>Number Count ↔ Pound Count: r = 0.58</w:t>
+      </w:r>
+      <w:r>
+        <w:br/>
+        <w:t>Longest Number Length ↔ Pound Count: r = 0.51</w:t>
+      </w:r>
+    </w:p>
+    <w:p>
+      <w:r>
+        <w:t>These moderate correlations suggest that emails containing currency symbols often contain more numerical information, which supports the idea that spam emails may use financial incentives such as prizes, discounts, or money-related offers.</w:t>
+      </w:r>
+    </w:p>
+    <w:p>
+      <w:r>
+        <w:t>Other relationships were mostly weak. For example:</w:t>
+      </w:r>
+    </w:p>
+    <w:p>
+      <w:r>
+        <w:t>URL Count ↔ Word Count: r = 0.09</w:t>
+      </w:r>
+    </w:p>
+    <w:p>
+      <w:r>
+        <w:t>This shows that URL usage is mostly independent of email length, suggesting that URL count provides different information and may be a useful feature for classification.</w:t>
+      </w:r>
+    </w:p>
+    <w:p>
+      <w:r>
+        <w:t>The weakest correlation was:</w:t>
+      </w:r>
+    </w:p>
+    <w:p>
+      <w:r>
+        <w:t>Dollar Count ↔ Pound Count: r = -0.01</w:t>
+      </w:r>
+    </w:p>
+    <w:p>
+      <w:r>
+        <w:t>This indicates almost no relationship between the two features, likely because currency symbols appear infrequently in the dataset.</w:t>
+      </w:r>
+    </w:p>
+    <w:p>
+      <w:r>
+        <w:t>More key findings include that word count and email length contain similar information and may require feature selection. Numerical and currency-based features show a relationship, supporting their usefulness in detecting spam patterns. Most features have weak correlation, meaning that they capture different characteristics of emails.</w:t>
+      </w:r>
+    </w:p>
+    <w:p>
+      <w:r>
+        <w:t>The impact that this will have on the detector and the machine learning model is that the analysis suggests that most engineered features can be retained because they provide unique information. However, highly correlated features such as word count and email length should be tested during model development to determine whether removing one improves model efficiency or performance.</w:t>
+      </w:r>
+    </w:p>
+    <w:p>
+      <w:r>
+        <w:t>The next stage will involve preparing these features alongside text-based features for machine learning classification.</w:t>
       </w:r>
     </w:p>
     <w:p/>

</xml_diff>

<commit_message>
started machine learning phase
</commit_message>
<xml_diff>
--- a/Project Spam Email Detector.docx
+++ b/Project Spam Email Detector.docx
@@ -651,27 +651,14 @@
       <w:r>
         <w:t xml:space="preserve">Figure </w:t>
       </w:r>
-      <w:r>
-        <w:fldChar w:fldCharType="begin"/>
-      </w:r>
-      <w:r>
-        <w:instrText xml:space="preserve"> SEQ Figure \* ARABIC </w:instrText>
-      </w:r>
-      <w:r>
-        <w:fldChar w:fldCharType="separate"/>
-      </w:r>
-      <w:r>
-        <w:rPr>
-          <w:noProof/>
-        </w:rPr>
-        <w:t>1</w:t>
-      </w:r>
-      <w:r>
-        <w:rPr>
-          <w:noProof/>
-        </w:rPr>
-        <w:fldChar w:fldCharType="end"/>
-      </w:r>
+      <w:fldSimple w:instr=" SEQ Figure \* ARABIC ">
+        <w:r>
+          <w:rPr>
+            <w:noProof/>
+          </w:rPr>
+          <w:t>1</w:t>
+        </w:r>
+      </w:fldSimple>
       <w:r>
         <w:t xml:space="preserve"> containing number of emails vs spam emails sent</w:t>
       </w:r>
@@ -747,27 +734,14 @@
       <w:r>
         <w:t xml:space="preserve">Figure </w:t>
       </w:r>
-      <w:r>
-        <w:fldChar w:fldCharType="begin"/>
-      </w:r>
-      <w:r>
-        <w:instrText xml:space="preserve"> SEQ Figure \* ARABIC </w:instrText>
-      </w:r>
-      <w:r>
-        <w:fldChar w:fldCharType="separate"/>
-      </w:r>
-      <w:r>
-        <w:rPr>
-          <w:noProof/>
-        </w:rPr>
-        <w:t>2</w:t>
-      </w:r>
-      <w:r>
-        <w:rPr>
-          <w:noProof/>
-        </w:rPr>
-        <w:fldChar w:fldCharType="end"/>
-      </w:r>
+      <w:fldSimple w:instr=" SEQ Figure \* ARABIC ">
+        <w:r>
+          <w:rPr>
+            <w:noProof/>
+          </w:rPr>
+          <w:t>2</w:t>
+        </w:r>
+      </w:fldSimple>
       <w:r>
         <w:t xml:space="preserve"> the most common topics people see in spam emails they receive</w:t>
       </w:r>
@@ -831,27 +805,14 @@
       <w:r>
         <w:t xml:space="preserve">Figure </w:t>
       </w:r>
-      <w:r>
-        <w:fldChar w:fldCharType="begin"/>
-      </w:r>
-      <w:r>
-        <w:instrText xml:space="preserve"> SEQ Figure \* ARABIC </w:instrText>
-      </w:r>
-      <w:r>
-        <w:fldChar w:fldCharType="separate"/>
-      </w:r>
-      <w:r>
-        <w:rPr>
-          <w:noProof/>
-        </w:rPr>
-        <w:t>3</w:t>
-      </w:r>
-      <w:r>
-        <w:rPr>
-          <w:noProof/>
-        </w:rPr>
-        <w:fldChar w:fldCharType="end"/>
-      </w:r>
+      <w:fldSimple w:instr=" SEQ Figure \* ARABIC ">
+        <w:r>
+          <w:rPr>
+            <w:noProof/>
+          </w:rPr>
+          <w:t>3</w:t>
+        </w:r>
+      </w:fldSimple>
       <w:r>
         <w:t xml:space="preserve"> Average monthly spam call received by age and gender</w:t>
       </w:r>
@@ -958,27 +919,14 @@
       <w:r>
         <w:t xml:space="preserve">Figure </w:t>
       </w:r>
-      <w:r>
-        <w:fldChar w:fldCharType="begin"/>
-      </w:r>
-      <w:r>
-        <w:instrText xml:space="preserve"> SEQ Figure \* ARABIC </w:instrText>
-      </w:r>
-      <w:r>
-        <w:fldChar w:fldCharType="separate"/>
-      </w:r>
-      <w:r>
-        <w:rPr>
-          <w:noProof/>
-        </w:rPr>
-        <w:t>4</w:t>
-      </w:r>
-      <w:r>
-        <w:rPr>
-          <w:noProof/>
-        </w:rPr>
-        <w:fldChar w:fldCharType="end"/>
-      </w:r>
+      <w:fldSimple w:instr=" SEQ Figure \* ARABIC ">
+        <w:r>
+          <w:rPr>
+            <w:noProof/>
+          </w:rPr>
+          <w:t>4</w:t>
+        </w:r>
+      </w:fldSimple>
       <w:r>
         <w:t xml:space="preserve"> loading spam email dataset into my python file</w:t>
       </w:r>
@@ -1213,27 +1161,14 @@
       <w:r>
         <w:t xml:space="preserve">Figure </w:t>
       </w:r>
-      <w:r>
-        <w:fldChar w:fldCharType="begin"/>
-      </w:r>
-      <w:r>
-        <w:instrText xml:space="preserve"> SEQ Figure \* ARABIC </w:instrText>
-      </w:r>
-      <w:r>
-        <w:fldChar w:fldCharType="separate"/>
-      </w:r>
-      <w:r>
-        <w:rPr>
-          <w:noProof/>
-        </w:rPr>
-        <w:t>5</w:t>
-      </w:r>
-      <w:r>
-        <w:rPr>
-          <w:noProof/>
-        </w:rPr>
-        <w:fldChar w:fldCharType="end"/>
-      </w:r>
+      <w:fldSimple w:instr=" SEQ Figure \* ARABIC ">
+        <w:r>
+          <w:rPr>
+            <w:noProof/>
+          </w:rPr>
+          <w:t>5</w:t>
+        </w:r>
+      </w:fldSimple>
       <w:r>
         <w:t xml:space="preserve"> Bar chart showcasing the number of spam and ham emails</w:t>
       </w:r>
@@ -4386,6 +4321,9 @@
         </mc:AlternateContent>
       </w:r>
       <w:r>
+        <w:rPr>
+          <w:noProof/>
+        </w:rPr>
         <w:drawing>
           <wp:anchor distT="0" distB="0" distL="114300" distR="114300" simplePos="0" relativeHeight="251679744" behindDoc="0" locked="0" layoutInCell="1" allowOverlap="1" wp14:anchorId="1180AB08" wp14:editId="6C0D7001">
             <wp:simplePos x="0" y="0"/>
@@ -4452,6 +4390,9 @@
         </w:drawing>
       </w:r>
       <w:r>
+        <w:rPr>
+          <w:noProof/>
+        </w:rPr>
         <w:drawing>
           <wp:inline distT="0" distB="0" distL="0" distR="0" wp14:anchorId="34389BE6" wp14:editId="6401FCC8">
             <wp:extent cx="3213952" cy="2178050"/>
@@ -4660,6 +4601,214 @@
       </w:r>
     </w:p>
     <w:p/>
+    <w:p>
+      <w:pPr>
+        <w:rPr>
+          <w:u w:val="single"/>
+        </w:rPr>
+      </w:pPr>
+      <w:r>
+        <w:rPr>
+          <w:u w:val="single"/>
+        </w:rPr>
+        <w:t>Machine Learning Model Phase:</w:t>
+      </w:r>
+    </w:p>
+    <w:p>
+      <w:r>
+        <w:t>This part of the project is where the goal changes from understanding the data through data analysis to applying the data to building a model that can accurately classify unseen emails. The step that I will conduct in the section will include:</w:t>
+      </w:r>
+    </w:p>
+    <w:p>
+      <w:pPr>
+        <w:pStyle w:val="ListParagraph"/>
+        <w:numPr>
+          <w:ilvl w:val="0"/>
+          <w:numId w:val="3"/>
+        </w:numPr>
+      </w:pPr>
+      <w:r>
+        <w:t>Data Preparation</w:t>
+      </w:r>
+    </w:p>
+    <w:p>
+      <w:pPr>
+        <w:pStyle w:val="ListParagraph"/>
+        <w:numPr>
+          <w:ilvl w:val="0"/>
+          <w:numId w:val="3"/>
+        </w:numPr>
+      </w:pPr>
+      <w:r>
+        <w:t>Feature Engineering</w:t>
+      </w:r>
+    </w:p>
+    <w:p>
+      <w:pPr>
+        <w:pStyle w:val="ListParagraph"/>
+        <w:numPr>
+          <w:ilvl w:val="0"/>
+          <w:numId w:val="3"/>
+        </w:numPr>
+      </w:pPr>
+      <w:r>
+        <w:t>Text Vectorisation (TD-IDF)</w:t>
+      </w:r>
+    </w:p>
+    <w:p>
+      <w:pPr>
+        <w:pStyle w:val="ListParagraph"/>
+        <w:numPr>
+          <w:ilvl w:val="0"/>
+          <w:numId w:val="3"/>
+        </w:numPr>
+      </w:pPr>
+      <w:r>
+        <w:t>Train/Test Split</w:t>
+      </w:r>
+    </w:p>
+    <w:p>
+      <w:pPr>
+        <w:pStyle w:val="ListParagraph"/>
+        <w:numPr>
+          <w:ilvl w:val="0"/>
+          <w:numId w:val="3"/>
+        </w:numPr>
+      </w:pPr>
+      <w:r>
+        <w:t>Model Training</w:t>
+      </w:r>
+    </w:p>
+    <w:p>
+      <w:pPr>
+        <w:pStyle w:val="ListParagraph"/>
+        <w:numPr>
+          <w:ilvl w:val="0"/>
+          <w:numId w:val="3"/>
+        </w:numPr>
+      </w:pPr>
+      <w:r>
+        <w:t>Model Evaluation</w:t>
+      </w:r>
+    </w:p>
+    <w:p>
+      <w:pPr>
+        <w:pStyle w:val="ListParagraph"/>
+        <w:numPr>
+          <w:ilvl w:val="0"/>
+          <w:numId w:val="3"/>
+        </w:numPr>
+      </w:pPr>
+      <w:r>
+        <w:t>Model Comparison</w:t>
+      </w:r>
+    </w:p>
+    <w:p>
+      <w:pPr>
+        <w:pStyle w:val="ListParagraph"/>
+        <w:numPr>
+          <w:ilvl w:val="0"/>
+          <w:numId w:val="3"/>
+        </w:numPr>
+      </w:pPr>
+      <w:r>
+        <w:t>Final Model Selection</w:t>
+      </w:r>
+    </w:p>
+    <w:p/>
+    <w:p/>
+    <w:p>
+      <w:pPr>
+        <w:rPr>
+          <w:u w:val="single"/>
+        </w:rPr>
+      </w:pPr>
+      <w:r>
+        <w:rPr>
+          <w:u w:val="single"/>
+        </w:rPr>
+        <w:lastRenderedPageBreak/>
+        <w:t>Preparing the Dataset:</w:t>
+      </w:r>
+    </w:p>
+    <w:p>
+      <w:r>
+        <w:t>Before a machine learning model can be trained, the dataset must be separated into features (information used to make prediction) and the target variable which is the value that the model is trying to predict.</w:t>
+      </w:r>
+    </w:p>
+    <w:p>
+      <w:r>
+        <w:t>In this project, the feature is the emails, while the target variable is the email category.</w:t>
+      </w:r>
+    </w:p>
+    <w:p>
+      <w:pPr>
+        <w:keepNext/>
+      </w:pPr>
+      <w:r>
+        <w:drawing>
+          <wp:inline distT="0" distB="0" distL="0" distR="0" wp14:anchorId="6245C204" wp14:editId="22757A01">
+            <wp:extent cx="2954915" cy="1111250"/>
+            <wp:effectExtent l="0" t="0" r="0" b="0"/>
+            <wp:docPr id="1392038226" name="Picture 1"/>
+            <wp:cNvGraphicFramePr>
+              <a:graphicFrameLocks xmlns:a="http://schemas.openxmlformats.org/drawingml/2006/main" noChangeAspect="1"/>
+            </wp:cNvGraphicFramePr>
+            <a:graphic xmlns:a="http://schemas.openxmlformats.org/drawingml/2006/main">
+              <a:graphicData uri="http://schemas.openxmlformats.org/drawingml/2006/picture">
+                <pic:pic xmlns:pic="http://schemas.openxmlformats.org/drawingml/2006/picture">
+                  <pic:nvPicPr>
+                    <pic:cNvPr id="1392038226" name=""/>
+                    <pic:cNvPicPr/>
+                  </pic:nvPicPr>
+                  <pic:blipFill>
+                    <a:blip r:embed="rId51"/>
+                    <a:stretch>
+                      <a:fillRect/>
+                    </a:stretch>
+                  </pic:blipFill>
+                  <pic:spPr>
+                    <a:xfrm>
+                      <a:off x="0" y="0"/>
+                      <a:ext cx="2964489" cy="1114850"/>
+                    </a:xfrm>
+                    <a:prstGeom prst="rect">
+                      <a:avLst/>
+                    </a:prstGeom>
+                  </pic:spPr>
+                </pic:pic>
+              </a:graphicData>
+            </a:graphic>
+          </wp:inline>
+        </w:drawing>
+      </w:r>
+    </w:p>
+    <w:p>
+      <w:pPr>
+        <w:pStyle w:val="Caption"/>
+      </w:pPr>
+      <w:r>
+        <w:t>Figure 43 features and target variable code</w:t>
+      </w:r>
+    </w:p>
+    <w:p>
+      <w:r>
+        <w:t>X stores the independent variable, which contains the information the model will learn from</w:t>
+      </w:r>
+    </w:p>
+    <w:p>
+      <w:r>
+        <w:t>Y stores the dependent variable (label/email category), which tells the model whether each email is spam or legitimate</w:t>
+      </w:r>
+    </w:p>
+    <w:p>
+      <w:r>
+        <w:t>Next we have to encode the labels as machine learning algorithms cannot process text labels such as “spam” and “ham”.</w:t>
+      </w:r>
+      <w:r>
+        <w:t xml:space="preserve"> This means that the labels must be converted into numerical values</w:t>
+      </w:r>
+    </w:p>
     <w:sectPr>
       <w:pgSz w:w="11906" w:h="16838"/>
       <w:pgMar w:top="1440" w:right="1440" w:bottom="1440" w:left="1440" w:header="708" w:footer="708" w:gutter="0"/>
@@ -4723,6 +4872,95 @@
 <file path=word/numbering.xml><?xml version="1.0" encoding="utf-8"?>
 <w:numbering xmlns:wpc="http://schemas.microsoft.com/office/word/2010/wordprocessingCanvas" xmlns:cx="http://schemas.microsoft.com/office/drawing/2014/chartex" xmlns:cx1="http://schemas.microsoft.com/office/drawing/2015/9/8/chartex" xmlns:cx2="http://schemas.microsoft.com/office/drawing/2015/10/21/chartex" xmlns:cx3="http://schemas.microsoft.com/office/drawing/2016/5/9/chartex" xmlns:cx4="http://schemas.microsoft.com/office/drawing/2016/5/10/chartex" xmlns:cx5="http://schemas.microsoft.com/office/drawing/2016/5/11/chartex" xmlns:cx6="http://schemas.microsoft.com/office/drawing/2016/5/12/chartex" xmlns:cx7="http://schemas.microsoft.com/office/drawing/2016/5/13/chartex" xmlns:cx8="http://schemas.microsoft.com/office/drawing/2016/5/14/chartex" xmlns:mc="http://schemas.openxmlformats.org/markup-compatibility/2006" xmlns:aink="http://schemas.microsoft.com/office/drawing/2016/ink" xmlns:am3d="http://schemas.microsoft.com/office/drawing/2017/model3d" xmlns:o="urn:schemas-microsoft-com:office:office" xmlns:oel="http://schemas.microsoft.com/office/2019/extlst" xmlns:r="http://schemas.openxmlformats.org/officeDocument/2006/relationships" xmlns:m="http://schemas.openxmlformats.org/officeDocument/2006/math" xmlns:v="urn:schemas-microsoft-com:vml" xmlns:wp14="http://schemas.microsoft.com/office/word/2010/wordprocessingDrawing" xmlns:wp="http://schemas.openxmlformats.org/drawingml/2006/wordprocessingDrawing" xmlns:w10="urn:schemas-microsoft-com:office:word" xmlns:w="http://schemas.openxmlformats.org/wordprocessingml/2006/main" xmlns:w14="http://schemas.microsoft.com/office/word/2010/wordml" xmlns:w15="http://schemas.microsoft.com/office/word/2012/wordml" xmlns:w16cei="http://schemas.microsoft.com/office/word/2026/wordml/cei" xmlns:w16cex="http://schemas.microsoft.com/office/word/2018/wordml/cex" xmlns:w16cid="http://schemas.microsoft.com/office/word/2016/wordml/cid" xmlns:w16="http://schemas.microsoft.com/office/word/2018/wordml" xmlns:w16du="http://schemas.microsoft.com/office/word/2023/wordml/word16du" xmlns:w16sdtdh="http://schemas.microsoft.com/office/word/2020/wordml/sdtdatahash" xmlns:w16sdtfl="http://schemas.microsoft.com/office/word/2024/wordml/sdtformatlock" xmlns:w16se="http://schemas.microsoft.com/office/word/2015/wordml/symex" xmlns:wpg="http://schemas.microsoft.com/office/word/2010/wordprocessingGroup" xmlns:wpi="http://schemas.microsoft.com/office/word/2010/wordprocessingInk" xmlns:wne="http://schemas.microsoft.com/office/word/2006/wordml" xmlns:wps="http://schemas.microsoft.com/office/word/2010/wordprocessingShape" mc:Ignorable="w14 w15 w16se w16cid w16 w16cex w16sdtdh w16sdtfl w16du wp14">
   <w:abstractNum w:abstractNumId="0" w15:restartNumberingAfterBreak="0">
+    <w:nsid w:val="195E7152"/>
+    <w:multiLevelType w:val="hybridMultilevel"/>
+    <w:tmpl w:val="CF9AD38A"/>
+    <w:lvl w:ilvl="0" w:tplc="0809000F">
+      <w:start w:val="1"/>
+      <w:numFmt w:val="decimal"/>
+      <w:lvlText w:val="%1."/>
+      <w:lvlJc w:val="left"/>
+      <w:pPr>
+        <w:ind w:left="720" w:hanging="360"/>
+      </w:pPr>
+      <w:rPr>
+        <w:rFonts w:hint="default"/>
+      </w:rPr>
+    </w:lvl>
+    <w:lvl w:ilvl="1" w:tplc="08090019" w:tentative="1">
+      <w:start w:val="1"/>
+      <w:numFmt w:val="lowerLetter"/>
+      <w:lvlText w:val="%2."/>
+      <w:lvlJc w:val="left"/>
+      <w:pPr>
+        <w:ind w:left="1440" w:hanging="360"/>
+      </w:pPr>
+    </w:lvl>
+    <w:lvl w:ilvl="2" w:tplc="0809001B" w:tentative="1">
+      <w:start w:val="1"/>
+      <w:numFmt w:val="lowerRoman"/>
+      <w:lvlText w:val="%3."/>
+      <w:lvlJc w:val="right"/>
+      <w:pPr>
+        <w:ind w:left="2160" w:hanging="180"/>
+      </w:pPr>
+    </w:lvl>
+    <w:lvl w:ilvl="3" w:tplc="0809000F" w:tentative="1">
+      <w:start w:val="1"/>
+      <w:numFmt w:val="decimal"/>
+      <w:lvlText w:val="%4."/>
+      <w:lvlJc w:val="left"/>
+      <w:pPr>
+        <w:ind w:left="2880" w:hanging="360"/>
+      </w:pPr>
+    </w:lvl>
+    <w:lvl w:ilvl="4" w:tplc="08090019" w:tentative="1">
+      <w:start w:val="1"/>
+      <w:numFmt w:val="lowerLetter"/>
+      <w:lvlText w:val="%5."/>
+      <w:lvlJc w:val="left"/>
+      <w:pPr>
+        <w:ind w:left="3600" w:hanging="360"/>
+      </w:pPr>
+    </w:lvl>
+    <w:lvl w:ilvl="5" w:tplc="0809001B" w:tentative="1">
+      <w:start w:val="1"/>
+      <w:numFmt w:val="lowerRoman"/>
+      <w:lvlText w:val="%6."/>
+      <w:lvlJc w:val="right"/>
+      <w:pPr>
+        <w:ind w:left="4320" w:hanging="180"/>
+      </w:pPr>
+    </w:lvl>
+    <w:lvl w:ilvl="6" w:tplc="0809000F" w:tentative="1">
+      <w:start w:val="1"/>
+      <w:numFmt w:val="decimal"/>
+      <w:lvlText w:val="%7."/>
+      <w:lvlJc w:val="left"/>
+      <w:pPr>
+        <w:ind w:left="5040" w:hanging="360"/>
+      </w:pPr>
+    </w:lvl>
+    <w:lvl w:ilvl="7" w:tplc="08090019" w:tentative="1">
+      <w:start w:val="1"/>
+      <w:numFmt w:val="lowerLetter"/>
+      <w:lvlText w:val="%8."/>
+      <w:lvlJc w:val="left"/>
+      <w:pPr>
+        <w:ind w:left="5760" w:hanging="360"/>
+      </w:pPr>
+    </w:lvl>
+    <w:lvl w:ilvl="8" w:tplc="0809001B" w:tentative="1">
+      <w:start w:val="1"/>
+      <w:numFmt w:val="lowerRoman"/>
+      <w:lvlText w:val="%9."/>
+      <w:lvlJc w:val="right"/>
+      <w:pPr>
+        <w:ind w:left="6480" w:hanging="180"/>
+      </w:pPr>
+    </w:lvl>
+  </w:abstractNum>
+  <w:abstractNum w:abstractNumId="1" w15:restartNumberingAfterBreak="0">
     <w:nsid w:val="1DC41E49"/>
     <w:multiLevelType w:val="hybridMultilevel"/>
     <w:tmpl w:val="19CE3CC6"/>
@@ -4835,7 +5073,7 @@
       </w:rPr>
     </w:lvl>
   </w:abstractNum>
-  <w:abstractNum w:abstractNumId="1" w15:restartNumberingAfterBreak="0">
+  <w:abstractNum w:abstractNumId="2" w15:restartNumberingAfterBreak="0">
     <w:nsid w:val="76706902"/>
     <w:multiLevelType w:val="hybridMultilevel"/>
     <w:tmpl w:val="94B0A006"/>
@@ -4949,9 +5187,12 @@
     </w:lvl>
   </w:abstractNum>
   <w:num w:numId="1" w16cid:durableId="136147354">
+    <w:abstractNumId w:val="2"/>
+  </w:num>
+  <w:num w:numId="2" w16cid:durableId="1029723402">
     <w:abstractNumId w:val="1"/>
   </w:num>
-  <w:num w:numId="2" w16cid:durableId="1029723402">
+  <w:num w:numId="3" w16cid:durableId="1705061597">
     <w:abstractNumId w:val="0"/>
   </w:num>
 </w:numbering>
@@ -5560,6 +5801,7 @@
   <w:style w:type="character" w:default="1" w:styleId="DefaultParagraphFont">
     <w:name w:val="Default Paragraph Font"/>
     <w:uiPriority w:val="1"/>
+    <w:semiHidden/>
     <w:unhideWhenUsed/>
   </w:style>
   <w:style w:type="table" w:default="1" w:styleId="TableNormal">

</xml_diff>

<commit_message>
split the dataset and converted email text into numbers via td-idf
</commit_message>
<xml_diff>
--- a/Project Spam Email Detector.docx
+++ b/Project Spam Email Detector.docx
@@ -2037,7 +2037,15 @@
         <w:t>Punctuation analysis is important for this report as spam emails often use punctuation differently from legitimate emails. It is common practice within spam emails to use excessive punctuation to garner attention, create urgency, and encourage the recipient to take action immediately. For example, “</w:t>
       </w:r>
       <w:r>
-        <w:t>WINNER!! As a valued network customer you have been selected to receivea Â£900 prize reward! To claim call 09061701461. Claim code KL341. Valid 12 hours only.</w:t>
+        <w:t xml:space="preserve">WINNER!! As a valued network customer you have been selected to </w:t>
+      </w:r>
+      <w:proofErr w:type="spellStart"/>
+      <w:r>
+        <w:t>receivea</w:t>
+      </w:r>
+      <w:proofErr w:type="spellEnd"/>
+      <w:r>
+        <w:t xml:space="preserve"> Â£900 prize reward! To claim call 09061701461. Claim code KL341. Valid 12 hours only.</w:t>
       </w:r>
       <w:r>
         <w:t>” This is an example of a spam email within the dataset.</w:t>
@@ -2531,7 +2539,31 @@
         <w:t>Another way they are used within spam emails is in a more “direct” manner making a direct statement as such. For example, “</w:t>
       </w:r>
       <w:r>
-        <w:t xml:space="preserve">Want 2 get laid tonight? Want real Dogging locations sent direct 2 ur mob? Join the UK's largest Dogging Network bt Txting GRAVEL to 69888! Nt. ec2a. </w:t>
+        <w:t xml:space="preserve">Want 2 get laid tonight? Want real Dogging locations sent direct 2 </w:t>
+      </w:r>
+      <w:proofErr w:type="spellStart"/>
+      <w:r>
+        <w:t>ur</w:t>
+      </w:r>
+      <w:proofErr w:type="spellEnd"/>
+      <w:r>
+        <w:t xml:space="preserve"> mob? Join the UK's largest Dogging Network </w:t>
+      </w:r>
+      <w:proofErr w:type="spellStart"/>
+      <w:r>
+        <w:t>bt</w:t>
+      </w:r>
+      <w:proofErr w:type="spellEnd"/>
+      <w:r>
+        <w:t xml:space="preserve"> </w:t>
+      </w:r>
+      <w:proofErr w:type="spellStart"/>
+      <w:r>
+        <w:t>Txting</w:t>
+      </w:r>
+      <w:proofErr w:type="spellEnd"/>
+      <w:r>
+        <w:t xml:space="preserve"> GRAVEL to 69888! Nt. ec2a. </w:t>
       </w:r>
       <w:hyperlink r:id="rId29" w:history="1">
         <w:r>
@@ -2590,13 +2622,42 @@
         <w:t>“</w:t>
       </w:r>
       <w:r>
-        <w:t>Sunshine Quiz Wkly Q! Win a top Sony DVD player if u know which country the Algarve is in? Txt ansr to 82277. Â£1.50 SP:Tyrone</w:t>
-      </w:r>
+        <w:t xml:space="preserve">Sunshine Quiz </w:t>
+      </w:r>
+      <w:proofErr w:type="spellStart"/>
+      <w:r>
+        <w:t>Wkly</w:t>
+      </w:r>
+      <w:proofErr w:type="spellEnd"/>
+      <w:r>
+        <w:t xml:space="preserve"> Q! Win a top Sony DVD player if u know which country the Algarve is in? Txt </w:t>
+      </w:r>
+      <w:proofErr w:type="spellStart"/>
+      <w:r>
+        <w:t>ansr</w:t>
+      </w:r>
+      <w:proofErr w:type="spellEnd"/>
+      <w:r>
+        <w:t xml:space="preserve"> to 82277. Â£1.50 </w:t>
+      </w:r>
+      <w:proofErr w:type="spellStart"/>
+      <w:r>
+        <w:t>SP:Tyrone</w:t>
+      </w:r>
+      <w:proofErr w:type="spellEnd"/>
       <w:r>
         <w:t>”, “</w:t>
       </w:r>
       <w:r>
-        <w:t>You are a winner U have been specially selected 2 receive Â£1000 cash or a 4* holiday (flights inc) speak to a live operator 2 claim 0871277810810</w:t>
+        <w:t xml:space="preserve">You are a winner U have been specially selected 2 receive Â£1000 cash or a 4* holiday (flights </w:t>
+      </w:r>
+      <w:proofErr w:type="spellStart"/>
+      <w:r>
+        <w:t>inc</w:t>
+      </w:r>
+      <w:proofErr w:type="spellEnd"/>
+      <w:r>
+        <w:t>) speak to a live operator 2 claim 0871277810810</w:t>
       </w:r>
       <w:r>
         <w:t>”</w:t>
@@ -3041,7 +3102,15 @@
         <w:t>and a max of 40</w:t>
       </w:r>
       <w:r>
-        <w:t>. This shows that spam emails tend to be packed with numbers within its emails due to the content of it including prices, phone numbers, “you won £xxxx”, etc.</w:t>
+        <w:t>. This shows that spam emails tend to be packed with numbers within its emails due to the content of it including prices, phone numbers, “you won £</w:t>
+      </w:r>
+      <w:proofErr w:type="spellStart"/>
+      <w:r>
+        <w:t>xxxx</w:t>
+      </w:r>
+      <w:proofErr w:type="spellEnd"/>
+      <w:r>
+        <w:t>”, etc.</w:t>
       </w:r>
     </w:p>
     <w:p/>
@@ -3237,7 +3306,15 @@
         <w:pStyle w:val="Caption"/>
       </w:pPr>
       <w:r>
-        <w:t>Figure 30 output of the longest_number_length and comparison code block</w:t>
+        <w:t xml:space="preserve">Figure 30 output of the </w:t>
+      </w:r>
+      <w:proofErr w:type="spellStart"/>
+      <w:r>
+        <w:t>longest_number_length</w:t>
+      </w:r>
+      <w:proofErr w:type="spellEnd"/>
+      <w:r>
+        <w:t xml:space="preserve"> and comparison code block</w:t>
       </w:r>
     </w:p>
     <w:p>
@@ -3810,7 +3887,15 @@
         <w:t>What this code does is that it uses the regex module to be able to find specific text content within an email using re.findall(). First it find https text using https?. The question mark is added to mean that the s is optional. It then look for :// as that is an essential part of a link. Then I added \S+ which means to match every non-space character until a space appears, which means to combine https:// together alongside the potential site name as just one URL. For example: “</w:t>
       </w:r>
       <w:r>
-        <w:t>http://wap. xxxmobilemovieclub.com?n=QJKGIGHJJGCBL</w:t>
+        <w:t xml:space="preserve">http://wap. </w:t>
+      </w:r>
+      <w:proofErr w:type="spellStart"/>
+      <w:r>
+        <w:t>xxxmobilemovieclub.com?n</w:t>
+      </w:r>
+      <w:proofErr w:type="spellEnd"/>
+      <w:r>
+        <w:t>=QJKGIGHJJGCBL</w:t>
       </w:r>
       <w:r>
         <w:t>” this is one of the spam emails that have this within the dataset.</w:t>
@@ -4441,7 +4526,15 @@
     <w:p>
       <w:r>
         <w:lastRenderedPageBreak/>
-        <w:t xml:space="preserve">What it does is first converts the correlation matrix into an image with plt.imshow() where it will turn every number within the correlation matrix into a coloured square. cmap chooses the colour scheme. Plt.colorbar() adds the colour scale. Plt.xticks &amp; plt.yticks in this case adds labels to the x-axis and the same for the y-axis. </w:t>
+        <w:t xml:space="preserve">What it does is first converts the correlation matrix into an image with plt.imshow() where it will turn every number within the correlation matrix into a coloured square. </w:t>
+      </w:r>
+      <w:proofErr w:type="spellStart"/>
+      <w:r>
+        <w:t>cmap</w:t>
+      </w:r>
+      <w:proofErr w:type="spellEnd"/>
+      <w:r>
+        <w:t xml:space="preserve"> chooses the colour scheme. Plt.colorbar() adds the colour scale. Plt.xticks &amp; plt.yticks in this case adds labels to the x-axis and the same for the y-axis. </w:t>
       </w:r>
     </w:p>
     <w:p>
@@ -4746,6 +4839,9 @@
         <w:keepNext/>
       </w:pPr>
       <w:r>
+        <w:rPr>
+          <w:noProof/>
+        </w:rPr>
         <w:drawing>
           <wp:inline distT="0" distB="0" distL="0" distR="0" wp14:anchorId="6245C204" wp14:editId="22757A01">
             <wp:extent cx="2954915" cy="1111250"/>
@@ -4807,6 +4903,93 @@
       </w:r>
       <w:r>
         <w:t xml:space="preserve"> This means that the labels must be converted into numerical values</w:t>
+      </w:r>
+    </w:p>
+    <w:p>
+      <w:r>
+        <w:rPr>
+          <w:u w:val="single"/>
+        </w:rPr>
+        <w:t>Converting Text into Numerical Features and Values:</w:t>
+      </w:r>
+    </w:p>
+    <w:p>
+      <w:r>
+        <w:t>Once again, machine learning model only work with numerical data. Therefore, the email test must be converted into numbers before training the model</w:t>
+      </w:r>
+    </w:p>
+    <w:p>
+      <w:pPr>
+        <w:keepNext/>
+      </w:pPr>
+      <w:r>
+        <w:drawing>
+          <wp:inline distT="0" distB="0" distL="0" distR="0" wp14:anchorId="10ED9769" wp14:editId="05D66320">
+            <wp:extent cx="5054860" cy="914447"/>
+            <wp:effectExtent l="0" t="0" r="0" b="0"/>
+            <wp:docPr id="148313113" name="Picture 1"/>
+            <wp:cNvGraphicFramePr>
+              <a:graphicFrameLocks xmlns:a="http://schemas.openxmlformats.org/drawingml/2006/main" noChangeAspect="1"/>
+            </wp:cNvGraphicFramePr>
+            <a:graphic xmlns:a="http://schemas.openxmlformats.org/drawingml/2006/main">
+              <a:graphicData uri="http://schemas.openxmlformats.org/drawingml/2006/picture">
+                <pic:pic xmlns:pic="http://schemas.openxmlformats.org/drawingml/2006/picture">
+                  <pic:nvPicPr>
+                    <pic:cNvPr id="148313113" name=""/>
+                    <pic:cNvPicPr/>
+                  </pic:nvPicPr>
+                  <pic:blipFill>
+                    <a:blip r:embed="rId52"/>
+                    <a:stretch>
+                      <a:fillRect/>
+                    </a:stretch>
+                  </pic:blipFill>
+                  <pic:spPr>
+                    <a:xfrm>
+                      <a:off x="0" y="0"/>
+                      <a:ext cx="5054860" cy="914447"/>
+                    </a:xfrm>
+                    <a:prstGeom prst="rect">
+                      <a:avLst/>
+                    </a:prstGeom>
+                  </pic:spPr>
+                </pic:pic>
+              </a:graphicData>
+            </a:graphic>
+          </wp:inline>
+        </w:drawing>
+      </w:r>
+    </w:p>
+    <w:p>
+      <w:pPr>
+        <w:pStyle w:val="Caption"/>
+      </w:pPr>
+      <w:r>
+        <w:t>Figure 44 converting text contents of emails into numerical values</w:t>
+      </w:r>
+    </w:p>
+    <w:p>
+      <w:r>
+        <w:t>TF-IDF or Term Frequency-Inverse Document Frequency vectorizer transforms each email into a numerical representation based on the words it contains. Unlike a simple word count, TF-IDF assigns an importance level to all words so words that are distinctive across the dataset are assigned greater importance, whereas common words such as the, and, or is has its importance level reduced.</w:t>
+      </w:r>
+    </w:p>
+    <w:p/>
+    <w:p>
+      <w:pPr>
+        <w:rPr>
+          <w:u w:val="single"/>
+        </w:rPr>
+      </w:pPr>
+      <w:r>
+        <w:rPr>
+          <w:u w:val="single"/>
+        </w:rPr>
+        <w:t>Splitting the Dataset:</w:t>
+      </w:r>
+    </w:p>
+    <w:p>
+      <w:r>
+        <w:t xml:space="preserve"> </w:t>
       </w:r>
     </w:p>
     <w:sectPr>

</xml_diff>

<commit_message>
trained the dataset and have made predictions for the model
</commit_message>
<xml_diff>
--- a/Project Spam Email Detector.docx
+++ b/Project Spam Email Detector.docx
@@ -2037,15 +2037,7 @@
         <w:t>Punctuation analysis is important for this report as spam emails often use punctuation differently from legitimate emails. It is common practice within spam emails to use excessive punctuation to garner attention, create urgency, and encourage the recipient to take action immediately. For example, “</w:t>
       </w:r>
       <w:r>
-        <w:t xml:space="preserve">WINNER!! As a valued network customer you have been selected to </w:t>
-      </w:r>
-      <w:proofErr w:type="spellStart"/>
-      <w:r>
-        <w:t>receivea</w:t>
-      </w:r>
-      <w:proofErr w:type="spellEnd"/>
-      <w:r>
-        <w:t xml:space="preserve"> Â£900 prize reward! To claim call 09061701461. Claim code KL341. Valid 12 hours only.</w:t>
+        <w:t>WINNER!! As a valued network customer you have been selected to receivea Â£900 prize reward! To claim call 09061701461. Claim code KL341. Valid 12 hours only.</w:t>
       </w:r>
       <w:r>
         <w:t>” This is an example of a spam email within the dataset.</w:t>
@@ -2539,31 +2531,7 @@
         <w:t>Another way they are used within spam emails is in a more “direct” manner making a direct statement as such. For example, “</w:t>
       </w:r>
       <w:r>
-        <w:t xml:space="preserve">Want 2 get laid tonight? Want real Dogging locations sent direct 2 </w:t>
-      </w:r>
-      <w:proofErr w:type="spellStart"/>
-      <w:r>
-        <w:t>ur</w:t>
-      </w:r>
-      <w:proofErr w:type="spellEnd"/>
-      <w:r>
-        <w:t xml:space="preserve"> mob? Join the UK's largest Dogging Network </w:t>
-      </w:r>
-      <w:proofErr w:type="spellStart"/>
-      <w:r>
-        <w:t>bt</w:t>
-      </w:r>
-      <w:proofErr w:type="spellEnd"/>
-      <w:r>
-        <w:t xml:space="preserve"> </w:t>
-      </w:r>
-      <w:proofErr w:type="spellStart"/>
-      <w:r>
-        <w:t>Txting</w:t>
-      </w:r>
-      <w:proofErr w:type="spellEnd"/>
-      <w:r>
-        <w:t xml:space="preserve"> GRAVEL to 69888! Nt. ec2a. </w:t>
+        <w:t xml:space="preserve">Want 2 get laid tonight? Want real Dogging locations sent direct 2 ur mob? Join the UK's largest Dogging Network bt Txting GRAVEL to 69888! Nt. ec2a. </w:t>
       </w:r>
       <w:hyperlink r:id="rId29" w:history="1">
         <w:r>
@@ -2622,42 +2590,13 @@
         <w:t>“</w:t>
       </w:r>
       <w:r>
-        <w:t xml:space="preserve">Sunshine Quiz </w:t>
-      </w:r>
-      <w:proofErr w:type="spellStart"/>
-      <w:r>
-        <w:t>Wkly</w:t>
-      </w:r>
-      <w:proofErr w:type="spellEnd"/>
-      <w:r>
-        <w:t xml:space="preserve"> Q! Win a top Sony DVD player if u know which country the Algarve is in? Txt </w:t>
-      </w:r>
-      <w:proofErr w:type="spellStart"/>
-      <w:r>
-        <w:t>ansr</w:t>
-      </w:r>
-      <w:proofErr w:type="spellEnd"/>
-      <w:r>
-        <w:t xml:space="preserve"> to 82277. Â£1.50 </w:t>
-      </w:r>
-      <w:proofErr w:type="spellStart"/>
-      <w:r>
-        <w:t>SP:Tyrone</w:t>
-      </w:r>
-      <w:proofErr w:type="spellEnd"/>
+        <w:t>Sunshine Quiz Wkly Q! Win a top Sony DVD player if u know which country the Algarve is in? Txt ansr to 82277. Â£1.50 SP:Tyrone</w:t>
+      </w:r>
       <w:r>
         <w:t>”, “</w:t>
       </w:r>
       <w:r>
-        <w:t xml:space="preserve">You are a winner U have been specially selected 2 receive Â£1000 cash or a 4* holiday (flights </w:t>
-      </w:r>
-      <w:proofErr w:type="spellStart"/>
-      <w:r>
-        <w:t>inc</w:t>
-      </w:r>
-      <w:proofErr w:type="spellEnd"/>
-      <w:r>
-        <w:t>) speak to a live operator 2 claim 0871277810810</w:t>
+        <w:t>You are a winner U have been specially selected 2 receive Â£1000 cash or a 4* holiday (flights inc) speak to a live operator 2 claim 0871277810810</w:t>
       </w:r>
       <w:r>
         <w:t>”</w:t>
@@ -3102,15 +3041,7 @@
         <w:t>and a max of 40</w:t>
       </w:r>
       <w:r>
-        <w:t>. This shows that spam emails tend to be packed with numbers within its emails due to the content of it including prices, phone numbers, “you won £</w:t>
-      </w:r>
-      <w:proofErr w:type="spellStart"/>
-      <w:r>
-        <w:t>xxxx</w:t>
-      </w:r>
-      <w:proofErr w:type="spellEnd"/>
-      <w:r>
-        <w:t>”, etc.</w:t>
+        <w:t>. This shows that spam emails tend to be packed with numbers within its emails due to the content of it including prices, phone numbers, “you won £xxxx”, etc.</w:t>
       </w:r>
     </w:p>
     <w:p/>
@@ -3306,15 +3237,7 @@
         <w:pStyle w:val="Caption"/>
       </w:pPr>
       <w:r>
-        <w:t xml:space="preserve">Figure 30 output of the </w:t>
-      </w:r>
-      <w:proofErr w:type="spellStart"/>
-      <w:r>
-        <w:t>longest_number_length</w:t>
-      </w:r>
-      <w:proofErr w:type="spellEnd"/>
-      <w:r>
-        <w:t xml:space="preserve"> and comparison code block</w:t>
+        <w:t>Figure 30 output of the longest_number_length and comparison code block</w:t>
       </w:r>
     </w:p>
     <w:p>
@@ -3887,15 +3810,7 @@
         <w:t>What this code does is that it uses the regex module to be able to find specific text content within an email using re.findall(). First it find https text using https?. The question mark is added to mean that the s is optional. It then look for :// as that is an essential part of a link. Then I added \S+ which means to match every non-space character until a space appears, which means to combine https:// together alongside the potential site name as just one URL. For example: “</w:t>
       </w:r>
       <w:r>
-        <w:t xml:space="preserve">http://wap. </w:t>
-      </w:r>
-      <w:proofErr w:type="spellStart"/>
-      <w:r>
-        <w:t>xxxmobilemovieclub.com?n</w:t>
-      </w:r>
-      <w:proofErr w:type="spellEnd"/>
-      <w:r>
-        <w:t>=QJKGIGHJJGCBL</w:t>
+        <w:t>http://wap. xxxmobilemovieclub.com?n=QJKGIGHJJGCBL</w:t>
       </w:r>
       <w:r>
         <w:t>” this is one of the spam emails that have this within the dataset.</w:t>
@@ -4526,15 +4441,7 @@
     <w:p>
       <w:r>
         <w:lastRenderedPageBreak/>
-        <w:t xml:space="preserve">What it does is first converts the correlation matrix into an image with plt.imshow() where it will turn every number within the correlation matrix into a coloured square. </w:t>
-      </w:r>
-      <w:proofErr w:type="spellStart"/>
-      <w:r>
-        <w:t>cmap</w:t>
-      </w:r>
-      <w:proofErr w:type="spellEnd"/>
-      <w:r>
-        <w:t xml:space="preserve"> chooses the colour scheme. Plt.colorbar() adds the colour scale. Plt.xticks &amp; plt.yticks in this case adds labels to the x-axis and the same for the y-axis. </w:t>
+        <w:t xml:space="preserve">What it does is first converts the correlation matrix into an image with plt.imshow() where it will turn every number within the correlation matrix into a coloured square. cmap chooses the colour scheme. Plt.colorbar() adds the colour scale. Plt.xticks &amp; plt.yticks in this case adds labels to the x-axis and the same for the y-axis. </w:t>
       </w:r>
     </w:p>
     <w:p>
@@ -4843,7 +4750,7 @@
           <w:noProof/>
         </w:rPr>
         <w:drawing>
-          <wp:inline distT="0" distB="0" distL="0" distR="0" wp14:anchorId="6245C204" wp14:editId="22757A01">
+          <wp:inline distT="0" distB="0" distL="0" distR="0" wp14:anchorId="6245C204" wp14:editId="59D484DA">
             <wp:extent cx="2954915" cy="1111250"/>
             <wp:effectExtent l="0" t="0" r="0" b="0"/>
             <wp:docPr id="1392038226" name="Picture 1"/>
@@ -4924,7 +4831,7 @@
       </w:pPr>
       <w:r>
         <w:drawing>
-          <wp:inline distT="0" distB="0" distL="0" distR="0" wp14:anchorId="10ED9769" wp14:editId="05D66320">
+          <wp:inline distT="0" distB="0" distL="0" distR="0" wp14:anchorId="10ED9769" wp14:editId="0F2D3C08">
             <wp:extent cx="5054860" cy="914447"/>
             <wp:effectExtent l="0" t="0" r="0" b="0"/>
             <wp:docPr id="148313113" name="Picture 1"/>
@@ -4975,21 +4882,292 @@
     </w:p>
     <w:p/>
     <w:p>
-      <w:pPr>
+      <w:r>
         <w:rPr>
           <w:u w:val="single"/>
         </w:rPr>
-      </w:pPr>
-      <w:r>
+        <w:t>Splitting the Dataset:</w:t>
+      </w:r>
+    </w:p>
+    <w:p>
+      <w:r>
+        <w:t>The purpose of this is that by dividing the dataset into separate training and testing sets, it helps evaluate how well the model performs on previously unseen data.</w:t>
+      </w:r>
+    </w:p>
+    <w:p>
+      <w:pPr>
+        <w:keepNext/>
+      </w:pPr>
+      <w:r>
+        <w:lastRenderedPageBreak/>
+        <w:drawing>
+          <wp:inline distT="0" distB="0" distL="0" distR="0" wp14:anchorId="0AA00CAA" wp14:editId="5DC715C2">
+            <wp:extent cx="3568700" cy="1113600"/>
+            <wp:effectExtent l="0" t="0" r="0" b="0"/>
+            <wp:docPr id="1777876303" name="Picture 1"/>
+            <wp:cNvGraphicFramePr>
+              <a:graphicFrameLocks xmlns:a="http://schemas.openxmlformats.org/drawingml/2006/main" noChangeAspect="1"/>
+            </wp:cNvGraphicFramePr>
+            <a:graphic xmlns:a="http://schemas.openxmlformats.org/drawingml/2006/main">
+              <a:graphicData uri="http://schemas.openxmlformats.org/drawingml/2006/picture">
+                <pic:pic xmlns:pic="http://schemas.openxmlformats.org/drawingml/2006/picture">
+                  <pic:nvPicPr>
+                    <pic:cNvPr id="1777876303" name=""/>
+                    <pic:cNvPicPr/>
+                  </pic:nvPicPr>
+                  <pic:blipFill>
+                    <a:blip r:embed="rId53"/>
+                    <a:stretch>
+                      <a:fillRect/>
+                    </a:stretch>
+                  </pic:blipFill>
+                  <pic:spPr>
+                    <a:xfrm>
+                      <a:off x="0" y="0"/>
+                      <a:ext cx="3568700" cy="1113600"/>
+                    </a:xfrm>
+                    <a:prstGeom prst="rect">
+                      <a:avLst/>
+                    </a:prstGeom>
+                  </pic:spPr>
+                </pic:pic>
+              </a:graphicData>
+            </a:graphic>
+          </wp:inline>
+        </w:drawing>
+      </w:r>
+    </w:p>
+    <w:p>
+      <w:pPr>
+        <w:pStyle w:val="Caption"/>
+      </w:pPr>
+      <w:r>
+        <w:t>Figure 45 code displaying dataset being split into training and testing sets</w:t>
+      </w:r>
+    </w:p>
+    <w:p>
+      <w:r>
+        <w:t>The training set is used to teach the model the patterns that distinguish spam from legitimate emails. The testing set is withheld during the training process and is only used after the model has been trained. This provides a fair assessment of how well the model generalises to new emails. Test_size=0.2 allocates 80% of the data for training and 20% for testing.</w:t>
+      </w:r>
+    </w:p>
+    <w:p>
+      <w:r>
+        <w:t>Random_state=42 ensures that the same split is produced each time the code is run, again making sure that this process is fair and just. It also makes the experiment reproducible.</w:t>
+      </w:r>
+    </w:p>
+    <w:p>
+      <w:r>
+        <w:t xml:space="preserve">Stratify=y preserves the original proportion of spam and ham emails in the two datasets, which prevents one class from being overrepresented in either set. </w:t>
+      </w:r>
+    </w:p>
+    <w:p>
+      <w:r>
+        <w:t>This step is crucial to the model as without it, the model could simply memorise all of the training data, leading to misleading high performance.</w:t>
+      </w:r>
+    </w:p>
+    <w:p/>
+    <w:p>
+      <w:pPr>
         <w:rPr>
           <w:u w:val="single"/>
         </w:rPr>
-        <w:t>Splitting the Dataset:</w:t>
-      </w:r>
-    </w:p>
-    <w:p>
-      <w:r>
+      </w:pPr>
+      <w:r>
+        <w:rPr>
+          <w:u w:val="single"/>
+        </w:rPr>
+        <w:t>Training the Machine Learning Model:</w:t>
+      </w:r>
+    </w:p>
+    <w:p>
+      <w:r>
+        <w:t>Now that the data has been prepared, the model can begin learning patterns that can distinguish spam from legitimate emails</w:t>
+      </w:r>
+    </w:p>
+    <w:p>
+      <w:pPr>
+        <w:keepNext/>
+      </w:pPr>
+      <w:r>
+        <w:drawing>
+          <wp:inline distT="0" distB="0" distL="0" distR="0" wp14:anchorId="79E4B5B8" wp14:editId="56188D31">
+            <wp:extent cx="3355853" cy="895350"/>
+            <wp:effectExtent l="0" t="0" r="0" b="0"/>
+            <wp:docPr id="1004666800" name="Picture 1"/>
+            <wp:cNvGraphicFramePr>
+              <a:graphicFrameLocks xmlns:a="http://schemas.openxmlformats.org/drawingml/2006/main" noChangeAspect="1"/>
+            </wp:cNvGraphicFramePr>
+            <a:graphic xmlns:a="http://schemas.openxmlformats.org/drawingml/2006/main">
+              <a:graphicData uri="http://schemas.openxmlformats.org/drawingml/2006/picture">
+                <pic:pic xmlns:pic="http://schemas.openxmlformats.org/drawingml/2006/picture">
+                  <pic:nvPicPr>
+                    <pic:cNvPr id="1004666800" name=""/>
+                    <pic:cNvPicPr/>
+                  </pic:nvPicPr>
+                  <pic:blipFill>
+                    <a:blip r:embed="rId54"/>
+                    <a:stretch>
+                      <a:fillRect/>
+                    </a:stretch>
+                  </pic:blipFill>
+                  <pic:spPr>
+                    <a:xfrm>
+                      <a:off x="0" y="0"/>
+                      <a:ext cx="3358394" cy="896028"/>
+                    </a:xfrm>
+                    <a:prstGeom prst="rect">
+                      <a:avLst/>
+                    </a:prstGeom>
+                  </pic:spPr>
+                </pic:pic>
+              </a:graphicData>
+            </a:graphic>
+          </wp:inline>
+        </w:drawing>
+      </w:r>
+    </w:p>
+    <w:p>
+      <w:pPr>
+        <w:pStyle w:val="Caption"/>
+      </w:pPr>
+      <w:r>
+        <w:t>Figure 46 code for training ML model</w:t>
+      </w:r>
+    </w:p>
+    <w:p>
+      <w:r>
+        <w:t>Within this code, it is creating a Multinomial Naive Bayes classifier. This is a supervised machine learning algorithm based on Bayes’ theorem. It is used for discrete data like word counts or frequencies.</w:t>
+      </w:r>
+    </w:p>
+    <w:p>
+      <w:r>
+        <w:t>Next, with model.fit(X_train, y_train), it starts the learning process. This model analyses every training email and begins identifying which words are commonly associated with spam and which are commonly associated with ham emails</w:t>
+      </w:r>
+      <w:r>
+        <w:t>. This will help the us learn how to find out what emails are spam easier.</w:t>
+      </w:r>
+    </w:p>
+    <w:p>
+      <w:r>
+        <w:t>Why Multinomial Naïve Bayes?</w:t>
+      </w:r>
+    </w:p>
+    <w:p>
+      <w:r>
+        <w:t>Multinomial Naïve Bayes is a good model to start with because it is simple to understand and explain, fast and light in terms of that it requires little memory and computer power, meaning that it runs well on large datasets.</w:t>
+      </w:r>
+      <w:r>
+        <w:rPr>
+          <w:rFonts w:ascii="Arial" w:hAnsi="Arial" w:cs="Arial"/>
+          <w:color w:val="040102"/>
+          <w:sz w:val="21"/>
+          <w:szCs w:val="21"/>
+          <w:shd w:val="clear" w:color="auto" w:fill="FFFFFF"/>
+        </w:rPr>
         <w:t xml:space="preserve"> </w:t>
+      </w:r>
+      <w:r>
+        <w:t>(</w:t>
+      </w:r>
+      <w:r>
+        <w:t>Ide</w:t>
+      </w:r>
+      <w:r>
+        <w:t>,</w:t>
+      </w:r>
+      <w:r>
+        <w:t xml:space="preserve"> Nolet,</w:t>
+      </w:r>
+      <w:r>
+        <w:t xml:space="preserve"> 2022)</w:t>
+      </w:r>
+      <w:r>
+        <w:t>. It is also great for text as it can fit data that shows counts &amp; frequencies.</w:t>
+      </w:r>
+    </w:p>
+    <w:p>
+      <w:r>
+        <w:t>This makes it easy for Naïve Bayes classifier to link with a text classification tool like TF-IDF.</w:t>
+      </w:r>
+    </w:p>
+    <w:p>
+      <w:pPr>
+        <w:rPr>
+          <w:u w:val="single"/>
+        </w:rPr>
+      </w:pPr>
+      <w:r>
+        <w:lastRenderedPageBreak/>
+        <w:t xml:space="preserve"> </w:t>
+      </w:r>
+      <w:r>
+        <w:rPr>
+          <w:u w:val="single"/>
+        </w:rPr>
+        <w:t>Generating Predictions for ML model:</w:t>
+      </w:r>
+    </w:p>
+    <w:p>
+      <w:r>
+        <w:t>After the training process, the model is used to classify emails that it has never seen before. Before doing so, generating predictions is a good way to see if results are accurate to the predictions that are made</w:t>
+      </w:r>
+      <w:r>
+        <w:t xml:space="preserve"> and that such model is efficient and accurate enough to be deployed into further development.</w:t>
+      </w:r>
+    </w:p>
+    <w:p>
+      <w:pPr>
+        <w:keepNext/>
+      </w:pPr>
+      <w:r>
+        <w:drawing>
+          <wp:inline distT="0" distB="0" distL="0" distR="0" wp14:anchorId="4EA3A49C" wp14:editId="76EEDD0B">
+            <wp:extent cx="3302170" cy="488975"/>
+            <wp:effectExtent l="0" t="0" r="0" b="6350"/>
+            <wp:docPr id="809716503" name="Picture 1"/>
+            <wp:cNvGraphicFramePr>
+              <a:graphicFrameLocks xmlns:a="http://schemas.openxmlformats.org/drawingml/2006/main" noChangeAspect="1"/>
+            </wp:cNvGraphicFramePr>
+            <a:graphic xmlns:a="http://schemas.openxmlformats.org/drawingml/2006/main">
+              <a:graphicData uri="http://schemas.openxmlformats.org/drawingml/2006/picture">
+                <pic:pic xmlns:pic="http://schemas.openxmlformats.org/drawingml/2006/picture">
+                  <pic:nvPicPr>
+                    <pic:cNvPr id="809716503" name=""/>
+                    <pic:cNvPicPr/>
+                  </pic:nvPicPr>
+                  <pic:blipFill>
+                    <a:blip r:embed="rId55"/>
+                    <a:stretch>
+                      <a:fillRect/>
+                    </a:stretch>
+                  </pic:blipFill>
+                  <pic:spPr>
+                    <a:xfrm>
+                      <a:off x="0" y="0"/>
+                      <a:ext cx="3302170" cy="488975"/>
+                    </a:xfrm>
+                    <a:prstGeom prst="rect">
+                      <a:avLst/>
+                    </a:prstGeom>
+                  </pic:spPr>
+                </pic:pic>
+              </a:graphicData>
+            </a:graphic>
+          </wp:inline>
+        </w:drawing>
+      </w:r>
+    </w:p>
+    <w:p>
+      <w:pPr>
+        <w:pStyle w:val="Caption"/>
+      </w:pPr>
+      <w:r>
+        <w:t>Figure 47 code displaying predictions being generated for the model</w:t>
+      </w:r>
+    </w:p>
+    <w:p>
+      <w:r>
+        <w:t>With this, each emails in the testing dataset is passed into the trained model. The model analyses the numerical features produced by TF-IDF and predicts whether each email belongs to the spam or ham category. These predictions being generated are then compared with the true labels to measure the model’s performance</w:t>
       </w:r>
     </w:p>
     <w:sectPr>
@@ -5984,7 +6162,6 @@
   <w:style w:type="character" w:default="1" w:styleId="DefaultParagraphFont">
     <w:name w:val="Default Paragraph Font"/>
     <w:uiPriority w:val="1"/>
-    <w:semiHidden/>
     <w:unhideWhenUsed/>
   </w:style>
   <w:style w:type="table" w:default="1" w:styleId="TableNormal">

</xml_diff>

<commit_message>
started evaluating the model and talking about it in mini report
</commit_message>
<xml_diff>
--- a/Project Spam Email Detector.docx
+++ b/Project Spam Email Detector.docx
@@ -5168,6 +5168,317 @@
     <w:p>
       <w:r>
         <w:t>With this, each emails in the testing dataset is passed into the trained model. The model analyses the numerical features produced by TF-IDF and predicts whether each email belongs to the spam or ham category. These predictions being generated are then compared with the true labels to measure the model’s performance</w:t>
+      </w:r>
+    </w:p>
+    <w:p/>
+    <w:p>
+      <w:r>
+        <w:rPr>
+          <w:u w:val="single"/>
+        </w:rPr>
+        <w:t>Evaluating the Model:</w:t>
+      </w:r>
+      <w:r>
+        <w:rPr>
+          <w:u w:val="single"/>
+        </w:rPr>
+        <w:br/>
+      </w:r>
+      <w:r>
+        <w:t>Here is where the predictions must now be compared with the true labels to determine how well the model performed.</w:t>
+      </w:r>
+    </w:p>
+    <w:p>
+      <w:pPr>
+        <w:keepNext/>
+      </w:pPr>
+      <w:r>
+        <w:drawing>
+          <wp:inline distT="0" distB="0" distL="0" distR="0" wp14:anchorId="15A15034" wp14:editId="688E872C">
+            <wp:extent cx="4381725" cy="736638"/>
+            <wp:effectExtent l="0" t="0" r="0" b="6350"/>
+            <wp:docPr id="2022342501" name="Picture 1"/>
+            <wp:cNvGraphicFramePr>
+              <a:graphicFrameLocks xmlns:a="http://schemas.openxmlformats.org/drawingml/2006/main" noChangeAspect="1"/>
+            </wp:cNvGraphicFramePr>
+            <a:graphic xmlns:a="http://schemas.openxmlformats.org/drawingml/2006/main">
+              <a:graphicData uri="http://schemas.openxmlformats.org/drawingml/2006/picture">
+                <pic:pic xmlns:pic="http://schemas.openxmlformats.org/drawingml/2006/picture">
+                  <pic:nvPicPr>
+                    <pic:cNvPr id="2022342501" name=""/>
+                    <pic:cNvPicPr/>
+                  </pic:nvPicPr>
+                  <pic:blipFill>
+                    <a:blip r:embed="rId56"/>
+                    <a:stretch>
+                      <a:fillRect/>
+                    </a:stretch>
+                  </pic:blipFill>
+                  <pic:spPr>
+                    <a:xfrm>
+                      <a:off x="0" y="0"/>
+                      <a:ext cx="4381725" cy="736638"/>
+                    </a:xfrm>
+                    <a:prstGeom prst="rect">
+                      <a:avLst/>
+                    </a:prstGeom>
+                  </pic:spPr>
+                </pic:pic>
+              </a:graphicData>
+            </a:graphic>
+          </wp:inline>
+        </w:drawing>
+      </w:r>
+    </w:p>
+    <w:p>
+      <w:pPr>
+        <w:pStyle w:val="Caption"/>
+      </w:pPr>
+      <w:r>
+        <w:t>Figure 48 testing the accuracy of the model</w:t>
+      </w:r>
+    </w:p>
+    <w:p>
+      <w:r>
+        <w:t xml:space="preserve">When running the code for this, at first it did not work due to the code earlier on train_test_split (see figure 45) </w:t>
+      </w:r>
+    </w:p>
+    <w:p>
+      <w:pPr>
+        <w:keepNext/>
+      </w:pPr>
+      <w:r>
+        <w:drawing>
+          <wp:inline distT="0" distB="0" distL="0" distR="0" wp14:anchorId="6F6E6398" wp14:editId="78EFA458">
+            <wp:extent cx="4927853" cy="742988"/>
+            <wp:effectExtent l="0" t="0" r="6350" b="0"/>
+            <wp:docPr id="1673589568" name="Picture 1"/>
+            <wp:cNvGraphicFramePr>
+              <a:graphicFrameLocks xmlns:a="http://schemas.openxmlformats.org/drawingml/2006/main" noChangeAspect="1"/>
+            </wp:cNvGraphicFramePr>
+            <a:graphic xmlns:a="http://schemas.openxmlformats.org/drawingml/2006/main">
+              <a:graphicData uri="http://schemas.openxmlformats.org/drawingml/2006/picture">
+                <pic:pic xmlns:pic="http://schemas.openxmlformats.org/drawingml/2006/picture">
+                  <pic:nvPicPr>
+                    <pic:cNvPr id="1673589568" name=""/>
+                    <pic:cNvPicPr/>
+                  </pic:nvPicPr>
+                  <pic:blipFill>
+                    <a:blip r:embed="rId57"/>
+                    <a:stretch>
+                      <a:fillRect/>
+                    </a:stretch>
+                  </pic:blipFill>
+                  <pic:spPr>
+                    <a:xfrm>
+                      <a:off x="0" y="0"/>
+                      <a:ext cx="4927853" cy="742988"/>
+                    </a:xfrm>
+                    <a:prstGeom prst="rect">
+                      <a:avLst/>
+                    </a:prstGeom>
+                  </pic:spPr>
+                </pic:pic>
+              </a:graphicData>
+            </a:graphic>
+          </wp:inline>
+        </w:drawing>
+      </w:r>
+    </w:p>
+    <w:p>
+      <w:pPr>
+        <w:pStyle w:val="Caption"/>
+      </w:pPr>
+      <w:r>
+        <w:t>Figure 49 error code for train_test_split code</w:t>
+      </w:r>
+    </w:p>
+    <w:p>
+      <w:r>
+        <w:t xml:space="preserve">What this means is that the dataset contained an extra category “{“mode”:”full” with only 1 row. So after encoding the text, the labels became 0 = ham, 1 = spam, and 2 = </w:t>
+      </w:r>
+      <w:r>
+        <w:t>“{“mode”:”full”</w:t>
+      </w:r>
+      <w:r>
+        <w:t xml:space="preserve">. This affects the whole code because when we try to split every class into training and testing sets it cant because the third class only has one example, therefore it cannot be split. </w:t>
+      </w:r>
+    </w:p>
+    <w:p>
+      <w:r>
+        <w:t>“{“mode”:”full”</w:t>
+      </w:r>
+      <w:r>
+        <w:t xml:space="preserve"> was also a common feature throughout the plots that were made during this project but now it doesn’t enable me to continue on with my evaluation of the model.</w:t>
+      </w:r>
+    </w:p>
+    <w:p>
+      <w:r>
+        <w:t>To fix it I add this after loading the dataset right at the beginning of the file</w:t>
+      </w:r>
+      <w:r>
+        <w:t>:</w:t>
+      </w:r>
+    </w:p>
+    <w:p>
+      <w:pPr>
+        <w:keepNext/>
+      </w:pPr>
+      <w:r>
+        <w:lastRenderedPageBreak/>
+        <w:drawing>
+          <wp:inline distT="0" distB="0" distL="0" distR="0" wp14:anchorId="64213F26" wp14:editId="2E727F84">
+            <wp:extent cx="4237038" cy="647700"/>
+            <wp:effectExtent l="0" t="0" r="0" b="0"/>
+            <wp:docPr id="771436692" name="Picture 1"/>
+            <wp:cNvGraphicFramePr>
+              <a:graphicFrameLocks xmlns:a="http://schemas.openxmlformats.org/drawingml/2006/main" noChangeAspect="1"/>
+            </wp:cNvGraphicFramePr>
+            <a:graphic xmlns:a="http://schemas.openxmlformats.org/drawingml/2006/main">
+              <a:graphicData uri="http://schemas.openxmlformats.org/drawingml/2006/picture">
+                <pic:pic xmlns:pic="http://schemas.openxmlformats.org/drawingml/2006/picture">
+                  <pic:nvPicPr>
+                    <pic:cNvPr id="771436692" name=""/>
+                    <pic:cNvPicPr/>
+                  </pic:nvPicPr>
+                  <pic:blipFill>
+                    <a:blip r:embed="rId58"/>
+                    <a:stretch>
+                      <a:fillRect/>
+                    </a:stretch>
+                  </pic:blipFill>
+                  <pic:spPr>
+                    <a:xfrm>
+                      <a:off x="0" y="0"/>
+                      <a:ext cx="4244068" cy="648775"/>
+                    </a:xfrm>
+                    <a:prstGeom prst="rect">
+                      <a:avLst/>
+                    </a:prstGeom>
+                  </pic:spPr>
+                </pic:pic>
+              </a:graphicData>
+            </a:graphic>
+          </wp:inline>
+        </w:drawing>
+      </w:r>
+    </w:p>
+    <w:p>
+      <w:pPr>
+        <w:pStyle w:val="Caption"/>
+      </w:pPr>
+      <w:r>
+        <w:t>Figure 50 fixing code by removing mode:full</w:t>
+      </w:r>
+    </w:p>
+    <w:p>
+      <w:r>
+        <w:t>What this does is that it only keeps rows where the category is ham and spam and removes the other class.</w:t>
+      </w:r>
+    </w:p>
+    <w:p>
+      <w:r>
+        <w:t>Now when checking the accuracy of the model, it will work.</w:t>
+      </w:r>
+    </w:p>
+    <w:p>
+      <w:pPr>
+        <w:keepNext/>
+      </w:pPr>
+      <w:r>
+        <w:drawing>
+          <wp:inline distT="0" distB="0" distL="0" distR="0" wp14:anchorId="5FCABB93" wp14:editId="6005A7F8">
+            <wp:extent cx="2807406" cy="730250"/>
+            <wp:effectExtent l="0" t="0" r="0" b="0"/>
+            <wp:docPr id="1319072200" name="Picture 1"/>
+            <wp:cNvGraphicFramePr>
+              <a:graphicFrameLocks xmlns:a="http://schemas.openxmlformats.org/drawingml/2006/main" noChangeAspect="1"/>
+            </wp:cNvGraphicFramePr>
+            <a:graphic xmlns:a="http://schemas.openxmlformats.org/drawingml/2006/main">
+              <a:graphicData uri="http://schemas.openxmlformats.org/drawingml/2006/picture">
+                <pic:pic xmlns:pic="http://schemas.openxmlformats.org/drawingml/2006/picture">
+                  <pic:nvPicPr>
+                    <pic:cNvPr id="1319072200" name=""/>
+                    <pic:cNvPicPr/>
+                  </pic:nvPicPr>
+                  <pic:blipFill>
+                    <a:blip r:embed="rId59"/>
+                    <a:stretch>
+                      <a:fillRect/>
+                    </a:stretch>
+                  </pic:blipFill>
+                  <pic:spPr>
+                    <a:xfrm>
+                      <a:off x="0" y="0"/>
+                      <a:ext cx="2816869" cy="732712"/>
+                    </a:xfrm>
+                    <a:prstGeom prst="rect">
+                      <a:avLst/>
+                    </a:prstGeom>
+                  </pic:spPr>
+                </pic:pic>
+              </a:graphicData>
+            </a:graphic>
+          </wp:inline>
+        </w:drawing>
+      </w:r>
+    </w:p>
+    <w:p>
+      <w:pPr>
+        <w:pStyle w:val="Caption"/>
+      </w:pPr>
+      <w:r>
+        <w:t>Figure 51 shows the two categories of email and not anything else</w:t>
+      </w:r>
+    </w:p>
+    <w:p>
+      <w:pPr>
+        <w:keepNext/>
+      </w:pPr>
+      <w:r>
+        <w:drawing>
+          <wp:inline distT="0" distB="0" distL="0" distR="0" wp14:anchorId="75CE207F" wp14:editId="7FC197C7">
+            <wp:extent cx="2997354" cy="641383"/>
+            <wp:effectExtent l="0" t="0" r="0" b="6350"/>
+            <wp:docPr id="833183916" name="Picture 1"/>
+            <wp:cNvGraphicFramePr>
+              <a:graphicFrameLocks xmlns:a="http://schemas.openxmlformats.org/drawingml/2006/main" noChangeAspect="1"/>
+            </wp:cNvGraphicFramePr>
+            <a:graphic xmlns:a="http://schemas.openxmlformats.org/drawingml/2006/main">
+              <a:graphicData uri="http://schemas.openxmlformats.org/drawingml/2006/picture">
+                <pic:pic xmlns:pic="http://schemas.openxmlformats.org/drawingml/2006/picture">
+                  <pic:nvPicPr>
+                    <pic:cNvPr id="833183916" name=""/>
+                    <pic:cNvPicPr/>
+                  </pic:nvPicPr>
+                  <pic:blipFill>
+                    <a:blip r:embed="rId60"/>
+                    <a:stretch>
+                      <a:fillRect/>
+                    </a:stretch>
+                  </pic:blipFill>
+                  <pic:spPr>
+                    <a:xfrm>
+                      <a:off x="0" y="0"/>
+                      <a:ext cx="2997354" cy="641383"/>
+                    </a:xfrm>
+                    <a:prstGeom prst="rect">
+                      <a:avLst/>
+                    </a:prstGeom>
+                  </pic:spPr>
+                </pic:pic>
+              </a:graphicData>
+            </a:graphic>
+          </wp:inline>
+        </w:drawing>
+      </w:r>
+    </w:p>
+    <w:p>
+      <w:pPr>
+        <w:pStyle w:val="Caption"/>
+      </w:pPr>
+      <w:r>
+        <w:t>Figure 52 accuracy score of ML model</w:t>
       </w:r>
     </w:p>
     <w:sectPr>

</xml_diff>

<commit_message>
done the accuracy score, clarification report and started typing up findings from the report
</commit_message>
<xml_diff>
--- a/Project Spam Email Detector.docx
+++ b/Project Spam Email Detector.docx
@@ -2037,7 +2037,15 @@
         <w:t>Punctuation analysis is important for this report as spam emails often use punctuation differently from legitimate emails. It is common practice within spam emails to use excessive punctuation to garner attention, create urgency, and encourage the recipient to take action immediately. For example, “</w:t>
       </w:r>
       <w:r>
-        <w:t>WINNER!! As a valued network customer you have been selected to receivea Â£900 prize reward! To claim call 09061701461. Claim code KL341. Valid 12 hours only.</w:t>
+        <w:t xml:space="preserve">WINNER!! As a valued network customer you have been selected to </w:t>
+      </w:r>
+      <w:proofErr w:type="spellStart"/>
+      <w:r>
+        <w:t>receivea</w:t>
+      </w:r>
+      <w:proofErr w:type="spellEnd"/>
+      <w:r>
+        <w:t xml:space="preserve"> Â£900 prize reward! To claim call 09061701461. Claim code KL341. Valid 12 hours only.</w:t>
       </w:r>
       <w:r>
         <w:t>” This is an example of a spam email within the dataset.</w:t>
@@ -2531,7 +2539,31 @@
         <w:t>Another way they are used within spam emails is in a more “direct” manner making a direct statement as such. For example, “</w:t>
       </w:r>
       <w:r>
-        <w:t xml:space="preserve">Want 2 get laid tonight? Want real Dogging locations sent direct 2 ur mob? Join the UK's largest Dogging Network bt Txting GRAVEL to 69888! Nt. ec2a. </w:t>
+        <w:t xml:space="preserve">Want 2 get laid tonight? Want real Dogging locations sent direct 2 </w:t>
+      </w:r>
+      <w:proofErr w:type="spellStart"/>
+      <w:r>
+        <w:t>ur</w:t>
+      </w:r>
+      <w:proofErr w:type="spellEnd"/>
+      <w:r>
+        <w:t xml:space="preserve"> mob? Join the UK's largest Dogging Network </w:t>
+      </w:r>
+      <w:proofErr w:type="spellStart"/>
+      <w:r>
+        <w:t>bt</w:t>
+      </w:r>
+      <w:proofErr w:type="spellEnd"/>
+      <w:r>
+        <w:t xml:space="preserve"> </w:t>
+      </w:r>
+      <w:proofErr w:type="spellStart"/>
+      <w:r>
+        <w:t>Txting</w:t>
+      </w:r>
+      <w:proofErr w:type="spellEnd"/>
+      <w:r>
+        <w:t xml:space="preserve"> GRAVEL to 69888! Nt. ec2a. </w:t>
       </w:r>
       <w:hyperlink r:id="rId29" w:history="1">
         <w:r>
@@ -2590,13 +2622,42 @@
         <w:t>“</w:t>
       </w:r>
       <w:r>
-        <w:t>Sunshine Quiz Wkly Q! Win a top Sony DVD player if u know which country the Algarve is in? Txt ansr to 82277. Â£1.50 SP:Tyrone</w:t>
-      </w:r>
+        <w:t xml:space="preserve">Sunshine Quiz </w:t>
+      </w:r>
+      <w:proofErr w:type="spellStart"/>
+      <w:r>
+        <w:t>Wkly</w:t>
+      </w:r>
+      <w:proofErr w:type="spellEnd"/>
+      <w:r>
+        <w:t xml:space="preserve"> Q! Win a top Sony DVD player if u know which country the Algarve is in? Txt </w:t>
+      </w:r>
+      <w:proofErr w:type="spellStart"/>
+      <w:r>
+        <w:t>ansr</w:t>
+      </w:r>
+      <w:proofErr w:type="spellEnd"/>
+      <w:r>
+        <w:t xml:space="preserve"> to 82277. Â£1.50 </w:t>
+      </w:r>
+      <w:proofErr w:type="spellStart"/>
+      <w:r>
+        <w:t>SP:Tyrone</w:t>
+      </w:r>
+      <w:proofErr w:type="spellEnd"/>
       <w:r>
         <w:t>”, “</w:t>
       </w:r>
       <w:r>
-        <w:t>You are a winner U have been specially selected 2 receive Â£1000 cash or a 4* holiday (flights inc) speak to a live operator 2 claim 0871277810810</w:t>
+        <w:t xml:space="preserve">You are a winner U have been specially selected 2 receive Â£1000 cash or a 4* holiday (flights </w:t>
+      </w:r>
+      <w:proofErr w:type="spellStart"/>
+      <w:r>
+        <w:t>inc</w:t>
+      </w:r>
+      <w:proofErr w:type="spellEnd"/>
+      <w:r>
+        <w:t>) speak to a live operator 2 claim 0871277810810</w:t>
       </w:r>
       <w:r>
         <w:t>”</w:t>
@@ -3041,7 +3102,15 @@
         <w:t>and a max of 40</w:t>
       </w:r>
       <w:r>
-        <w:t>. This shows that spam emails tend to be packed with numbers within its emails due to the content of it including prices, phone numbers, “you won £xxxx”, etc.</w:t>
+        <w:t>. This shows that spam emails tend to be packed with numbers within its emails due to the content of it including prices, phone numbers, “you won £</w:t>
+      </w:r>
+      <w:proofErr w:type="spellStart"/>
+      <w:r>
+        <w:t>xxxx</w:t>
+      </w:r>
+      <w:proofErr w:type="spellEnd"/>
+      <w:r>
+        <w:t>”, etc.</w:t>
       </w:r>
     </w:p>
     <w:p/>
@@ -3237,7 +3306,15 @@
         <w:pStyle w:val="Caption"/>
       </w:pPr>
       <w:r>
-        <w:t>Figure 30 output of the longest_number_length and comparison code block</w:t>
+        <w:t xml:space="preserve">Figure 30 output of the </w:t>
+      </w:r>
+      <w:proofErr w:type="spellStart"/>
+      <w:r>
+        <w:t>longest_number_length</w:t>
+      </w:r>
+      <w:proofErr w:type="spellEnd"/>
+      <w:r>
+        <w:t xml:space="preserve"> and comparison code block</w:t>
       </w:r>
     </w:p>
     <w:p>
@@ -3810,7 +3887,15 @@
         <w:t>What this code does is that it uses the regex module to be able to find specific text content within an email using re.findall(). First it find https text using https?. The question mark is added to mean that the s is optional. It then look for :// as that is an essential part of a link. Then I added \S+ which means to match every non-space character until a space appears, which means to combine https:// together alongside the potential site name as just one URL. For example: “</w:t>
       </w:r>
       <w:r>
-        <w:t>http://wap. xxxmobilemovieclub.com?n=QJKGIGHJJGCBL</w:t>
+        <w:t xml:space="preserve">http://wap. </w:t>
+      </w:r>
+      <w:proofErr w:type="spellStart"/>
+      <w:r>
+        <w:t>xxxmobilemovieclub.com?n</w:t>
+      </w:r>
+      <w:proofErr w:type="spellEnd"/>
+      <w:r>
+        <w:t>=QJKGIGHJJGCBL</w:t>
       </w:r>
       <w:r>
         <w:t>” this is one of the spam emails that have this within the dataset.</w:t>
@@ -4441,7 +4526,15 @@
     <w:p>
       <w:r>
         <w:lastRenderedPageBreak/>
-        <w:t xml:space="preserve">What it does is first converts the correlation matrix into an image with plt.imshow() where it will turn every number within the correlation matrix into a coloured square. cmap chooses the colour scheme. Plt.colorbar() adds the colour scale. Plt.xticks &amp; plt.yticks in this case adds labels to the x-axis and the same for the y-axis. </w:t>
+        <w:t xml:space="preserve">What it does is first converts the correlation matrix into an image with plt.imshow() where it will turn every number within the correlation matrix into a coloured square. </w:t>
+      </w:r>
+      <w:proofErr w:type="spellStart"/>
+      <w:r>
+        <w:t>cmap</w:t>
+      </w:r>
+      <w:proofErr w:type="spellEnd"/>
+      <w:r>
+        <w:t xml:space="preserve"> chooses the colour scheme. Plt.colorbar() adds the colour scale. Plt.xticks &amp; plt.yticks in this case adds labels to the x-axis and the same for the y-axis. </w:t>
       </w:r>
     </w:p>
     <w:p>
@@ -4830,6 +4923,9 @@
         <w:keepNext/>
       </w:pPr>
       <w:r>
+        <w:rPr>
+          <w:noProof/>
+        </w:rPr>
         <w:drawing>
           <wp:inline distT="0" distB="0" distL="0" distR="0" wp14:anchorId="10ED9769" wp14:editId="0F2D3C08">
             <wp:extent cx="5054860" cy="914447"/>
@@ -4899,6 +4995,9 @@
         <w:keepNext/>
       </w:pPr>
       <w:r>
+        <w:rPr>
+          <w:noProof/>
+        </w:rPr>
         <w:lastRenderedPageBreak/>
         <w:drawing>
           <wp:inline distT="0" distB="0" distL="0" distR="0" wp14:anchorId="0AA00CAA" wp14:editId="5DC715C2">
@@ -4989,6 +5088,9 @@
         <w:keepNext/>
       </w:pPr>
       <w:r>
+        <w:rPr>
+          <w:noProof/>
+        </w:rPr>
         <w:drawing>
           <wp:inline distT="0" distB="0" distL="0" distR="0" wp14:anchorId="79E4B5B8" wp14:editId="56188D31">
             <wp:extent cx="3355853" cy="895350"/>
@@ -5120,6 +5222,9 @@
         <w:keepNext/>
       </w:pPr>
       <w:r>
+        <w:rPr>
+          <w:noProof/>
+        </w:rPr>
         <w:drawing>
           <wp:inline distT="0" distB="0" distL="0" distR="0" wp14:anchorId="4EA3A49C" wp14:editId="76EEDD0B">
             <wp:extent cx="3302170" cy="488975"/>
@@ -5193,6 +5298,9 @@
         <w:keepNext/>
       </w:pPr>
       <w:r>
+        <w:rPr>
+          <w:noProof/>
+        </w:rPr>
         <w:drawing>
           <wp:inline distT="0" distB="0" distL="0" distR="0" wp14:anchorId="15A15034" wp14:editId="688E872C">
             <wp:extent cx="4381725" cy="736638"/>
@@ -5248,6 +5356,9 @@
         <w:keepNext/>
       </w:pPr>
       <w:r>
+        <w:rPr>
+          <w:noProof/>
+        </w:rPr>
         <w:drawing>
           <wp:inline distT="0" distB="0" distL="0" distR="0" wp14:anchorId="6F6E6398" wp14:editId="78EFA458">
             <wp:extent cx="4927853" cy="742988"/>
@@ -5295,21 +5406,12 @@
     </w:p>
     <w:p>
       <w:r>
-        <w:t xml:space="preserve">What this means is that the dataset contained an extra category “{“mode”:”full” with only 1 row. So after encoding the text, the labels became 0 = ham, 1 = spam, and 2 = </w:t>
-      </w:r>
-      <w:r>
-        <w:t>“{“mode”:”full”</w:t>
-      </w:r>
-      <w:r>
-        <w:t xml:space="preserve">. This affects the whole code because when we try to split every class into training and testing sets it cant because the third class only has one example, therefore it cannot be split. </w:t>
-      </w:r>
-    </w:p>
-    <w:p>
-      <w:r>
-        <w:t>“{“mode”:”full”</w:t>
-      </w:r>
-      <w:r>
-        <w:t xml:space="preserve"> was also a common feature throughout the plots that were made during this project but now it doesn’t enable me to continue on with my evaluation of the model.</w:t>
+        <w:t xml:space="preserve">What this means is that the dataset contained an extra category “{“mode”:”full” with only 1 row. So after encoding the text, the labels became 0 = ham, 1 = spam, and 2 = “{“mode”:”full”. This affects the whole code because when we try to split every class into training and testing sets it cant because the third class only has one example, therefore it cannot be split. </w:t>
+      </w:r>
+    </w:p>
+    <w:p>
+      <w:r>
+        <w:t>“{“mode”:”full” was also a common feature throughout the plots that were made during this project but now it doesn’t enable me to continue on with my evaluation of the model.</w:t>
       </w:r>
     </w:p>
     <w:p>
@@ -5325,6 +5427,9 @@
         <w:keepNext/>
       </w:pPr>
       <w:r>
+        <w:rPr>
+          <w:noProof/>
+        </w:rPr>
         <w:lastRenderedPageBreak/>
         <w:drawing>
           <wp:inline distT="0" distB="0" distL="0" distR="0" wp14:anchorId="64213F26" wp14:editId="2E727F84">
@@ -5386,6 +5491,9 @@
         <w:keepNext/>
       </w:pPr>
       <w:r>
+        <w:rPr>
+          <w:noProof/>
+        </w:rPr>
         <w:drawing>
           <wp:inline distT="0" distB="0" distL="0" distR="0" wp14:anchorId="5FCABB93" wp14:editId="6005A7F8">
             <wp:extent cx="2807406" cy="730250"/>
@@ -5436,6 +5544,9 @@
         <w:keepNext/>
       </w:pPr>
       <w:r>
+        <w:rPr>
+          <w:noProof/>
+        </w:rPr>
         <w:drawing>
           <wp:inline distT="0" distB="0" distL="0" distR="0" wp14:anchorId="75CE207F" wp14:editId="7FC197C7">
             <wp:extent cx="2997354" cy="641383"/>
@@ -5479,6 +5590,171 @@
       </w:pPr>
       <w:r>
         <w:t>Figure 52 accuracy score of ML model</w:t>
+      </w:r>
+    </w:p>
+    <w:p>
+      <w:r>
+        <w:t>With the figure above, it shows that the predictions aligned with the tests had a 97.22% accuracy score. This shows that the model created is accurate, efficient, and correctly classified around 97 out of every 100 emails within the test set. It also is able to tell what emails are legitimate and spam but this doesn’t conclude the evaluation process as accuracy is only one form of metric.</w:t>
+      </w:r>
+    </w:p>
+    <w:p>
+      <w:r>
+        <w:t>Next was the implementation of a classification report.</w:t>
+      </w:r>
+    </w:p>
+    <w:p>
+      <w:r>
+        <w:t xml:space="preserve">A classification report is another metric </w:t>
+      </w:r>
+      <w:r>
+        <w:t xml:space="preserve"> in the form of a table </w:t>
+      </w:r>
+      <w:r>
+        <w:t>that calculates several performance measures</w:t>
+      </w:r>
+      <w:r>
+        <w:t xml:space="preserve"> and sorts them into groups. </w:t>
+      </w:r>
+      <w:r>
+        <w:t>(scikit-learn, 2018)</w:t>
+      </w:r>
+      <w:r>
+        <w:t>.</w:t>
+      </w:r>
+    </w:p>
+    <w:p>
+      <w:r>
+        <w:t>Precision, where of all the emails predicted as spam, how many were actually spam?</w:t>
+      </w:r>
+    </w:p>
+    <w:p>
+      <w:r>
+        <w:t xml:space="preserve">Recall, of all </w:t>
+      </w:r>
+      <w:r>
+        <w:t>the spam emails, how many were did the model detect successfully?</w:t>
+      </w:r>
+    </w:p>
+    <w:p>
+      <w:r>
+        <w:t>F1-score, a balanced measuring tool that combines both precision &amp; recall.</w:t>
+      </w:r>
+    </w:p>
+    <w:p>
+      <w:r>
+        <w:t>Support, the number of examples belonging to each class.</w:t>
+      </w:r>
+    </w:p>
+    <w:p/>
+    <w:p>
+      <w:pPr>
+        <w:keepNext/>
+      </w:pPr>
+      <w:r>
+        <w:drawing>
+          <wp:inline distT="0" distB="0" distL="0" distR="0" wp14:anchorId="2280BC77" wp14:editId="5D1FB5EE">
+            <wp:extent cx="4929271" cy="311150"/>
+            <wp:effectExtent l="0" t="0" r="5080" b="0"/>
+            <wp:docPr id="1565742997" name="Picture 1"/>
+            <wp:cNvGraphicFramePr>
+              <a:graphicFrameLocks xmlns:a="http://schemas.openxmlformats.org/drawingml/2006/main" noChangeAspect="1"/>
+            </wp:cNvGraphicFramePr>
+            <a:graphic xmlns:a="http://schemas.openxmlformats.org/drawingml/2006/main">
+              <a:graphicData uri="http://schemas.openxmlformats.org/drawingml/2006/picture">
+                <pic:pic xmlns:pic="http://schemas.openxmlformats.org/drawingml/2006/picture">
+                  <pic:nvPicPr>
+                    <pic:cNvPr id="1565742997" name=""/>
+                    <pic:cNvPicPr/>
+                  </pic:nvPicPr>
+                  <pic:blipFill>
+                    <a:blip r:embed="rId61"/>
+                    <a:stretch>
+                      <a:fillRect/>
+                    </a:stretch>
+                  </pic:blipFill>
+                  <pic:spPr>
+                    <a:xfrm>
+                      <a:off x="0" y="0"/>
+                      <a:ext cx="4938771" cy="311750"/>
+                    </a:xfrm>
+                    <a:prstGeom prst="rect">
+                      <a:avLst/>
+                    </a:prstGeom>
+                  </pic:spPr>
+                </pic:pic>
+              </a:graphicData>
+            </a:graphic>
+          </wp:inline>
+        </w:drawing>
+      </w:r>
+    </w:p>
+    <w:p>
+      <w:pPr>
+        <w:pStyle w:val="Caption"/>
+      </w:pPr>
+      <w:r>
+        <w:t>Figure 53 classification report code</w:t>
+      </w:r>
+    </w:p>
+    <w:p>
+      <w:pPr>
+        <w:keepNext/>
+      </w:pPr>
+      <w:r>
+        <w:lastRenderedPageBreak/>
+        <w:drawing>
+          <wp:inline distT="0" distB="0" distL="0" distR="0" wp14:anchorId="46605A7D" wp14:editId="797C5256">
+            <wp:extent cx="5016758" cy="1644735"/>
+            <wp:effectExtent l="0" t="0" r="0" b="0"/>
+            <wp:docPr id="315336564" name="Picture 1"/>
+            <wp:cNvGraphicFramePr>
+              <a:graphicFrameLocks xmlns:a="http://schemas.openxmlformats.org/drawingml/2006/main" noChangeAspect="1"/>
+            </wp:cNvGraphicFramePr>
+            <a:graphic xmlns:a="http://schemas.openxmlformats.org/drawingml/2006/main">
+              <a:graphicData uri="http://schemas.openxmlformats.org/drawingml/2006/picture">
+                <pic:pic xmlns:pic="http://schemas.openxmlformats.org/drawingml/2006/picture">
+                  <pic:nvPicPr>
+                    <pic:cNvPr id="315336564" name=""/>
+                    <pic:cNvPicPr/>
+                  </pic:nvPicPr>
+                  <pic:blipFill>
+                    <a:blip r:embed="rId62"/>
+                    <a:stretch>
+                      <a:fillRect/>
+                    </a:stretch>
+                  </pic:blipFill>
+                  <pic:spPr>
+                    <a:xfrm>
+                      <a:off x="0" y="0"/>
+                      <a:ext cx="5016758" cy="1644735"/>
+                    </a:xfrm>
+                    <a:prstGeom prst="rect">
+                      <a:avLst/>
+                    </a:prstGeom>
+                  </pic:spPr>
+                </pic:pic>
+              </a:graphicData>
+            </a:graphic>
+          </wp:inline>
+        </w:drawing>
+      </w:r>
+    </w:p>
+    <w:p>
+      <w:pPr>
+        <w:pStyle w:val="Caption"/>
+      </w:pPr>
+      <w:r>
+        <w:t>Figure 54 classification report output</w:t>
+      </w:r>
+    </w:p>
+    <w:p>
+      <w:r>
+        <w:t>These results are very useful to see because it shows metrics that the accuracy score would hide.</w:t>
+      </w:r>
+    </w:p>
+    <w:p>
+      <w:r>
+        <w:t>From what we can see 0 represents ham legitimate emails and 1 p</w:t>
       </w:r>
     </w:p>
     <w:sectPr>

</xml_diff>

<commit_message>
talked about results of classification report. going to test using different ml algorithms to compare
</commit_message>
<xml_diff>
--- a/Project Spam Email Detector.docx
+++ b/Project Spam Email Detector.docx
@@ -2037,15 +2037,7 @@
         <w:t>Punctuation analysis is important for this report as spam emails often use punctuation differently from legitimate emails. It is common practice within spam emails to use excessive punctuation to garner attention, create urgency, and encourage the recipient to take action immediately. For example, “</w:t>
       </w:r>
       <w:r>
-        <w:t xml:space="preserve">WINNER!! As a valued network customer you have been selected to </w:t>
-      </w:r>
-      <w:proofErr w:type="spellStart"/>
-      <w:r>
-        <w:t>receivea</w:t>
-      </w:r>
-      <w:proofErr w:type="spellEnd"/>
-      <w:r>
-        <w:t xml:space="preserve"> Â£900 prize reward! To claim call 09061701461. Claim code KL341. Valid 12 hours only.</w:t>
+        <w:t>WINNER!! As a valued network customer you have been selected to receivea Â£900 prize reward! To claim call 09061701461. Claim code KL341. Valid 12 hours only.</w:t>
       </w:r>
       <w:r>
         <w:t>” This is an example of a spam email within the dataset.</w:t>
@@ -2539,31 +2531,7 @@
         <w:t>Another way they are used within spam emails is in a more “direct” manner making a direct statement as such. For example, “</w:t>
       </w:r>
       <w:r>
-        <w:t xml:space="preserve">Want 2 get laid tonight? Want real Dogging locations sent direct 2 </w:t>
-      </w:r>
-      <w:proofErr w:type="spellStart"/>
-      <w:r>
-        <w:t>ur</w:t>
-      </w:r>
-      <w:proofErr w:type="spellEnd"/>
-      <w:r>
-        <w:t xml:space="preserve"> mob? Join the UK's largest Dogging Network </w:t>
-      </w:r>
-      <w:proofErr w:type="spellStart"/>
-      <w:r>
-        <w:t>bt</w:t>
-      </w:r>
-      <w:proofErr w:type="spellEnd"/>
-      <w:r>
-        <w:t xml:space="preserve"> </w:t>
-      </w:r>
-      <w:proofErr w:type="spellStart"/>
-      <w:r>
-        <w:t>Txting</w:t>
-      </w:r>
-      <w:proofErr w:type="spellEnd"/>
-      <w:r>
-        <w:t xml:space="preserve"> GRAVEL to 69888! Nt. ec2a. </w:t>
+        <w:t xml:space="preserve">Want 2 get laid tonight? Want real Dogging locations sent direct 2 ur mob? Join the UK's largest Dogging Network bt Txting GRAVEL to 69888! Nt. ec2a. </w:t>
       </w:r>
       <w:hyperlink r:id="rId29" w:history="1">
         <w:r>
@@ -2622,42 +2590,13 @@
         <w:t>“</w:t>
       </w:r>
       <w:r>
-        <w:t xml:space="preserve">Sunshine Quiz </w:t>
-      </w:r>
-      <w:proofErr w:type="spellStart"/>
-      <w:r>
-        <w:t>Wkly</w:t>
-      </w:r>
-      <w:proofErr w:type="spellEnd"/>
-      <w:r>
-        <w:t xml:space="preserve"> Q! Win a top Sony DVD player if u know which country the Algarve is in? Txt </w:t>
-      </w:r>
-      <w:proofErr w:type="spellStart"/>
-      <w:r>
-        <w:t>ansr</w:t>
-      </w:r>
-      <w:proofErr w:type="spellEnd"/>
-      <w:r>
-        <w:t xml:space="preserve"> to 82277. Â£1.50 </w:t>
-      </w:r>
-      <w:proofErr w:type="spellStart"/>
-      <w:r>
-        <w:t>SP:Tyrone</w:t>
-      </w:r>
-      <w:proofErr w:type="spellEnd"/>
+        <w:t>Sunshine Quiz Wkly Q! Win a top Sony DVD player if u know which country the Algarve is in? Txt ansr to 82277. Â£1.50 SP:Tyrone</w:t>
+      </w:r>
       <w:r>
         <w:t>”, “</w:t>
       </w:r>
       <w:r>
-        <w:t xml:space="preserve">You are a winner U have been specially selected 2 receive Â£1000 cash or a 4* holiday (flights </w:t>
-      </w:r>
-      <w:proofErr w:type="spellStart"/>
-      <w:r>
-        <w:t>inc</w:t>
-      </w:r>
-      <w:proofErr w:type="spellEnd"/>
-      <w:r>
-        <w:t>) speak to a live operator 2 claim 0871277810810</w:t>
+        <w:t>You are a winner U have been specially selected 2 receive Â£1000 cash or a 4* holiday (flights inc) speak to a live operator 2 claim 0871277810810</w:t>
       </w:r>
       <w:r>
         <w:t>”</w:t>
@@ -3102,15 +3041,7 @@
         <w:t>and a max of 40</w:t>
       </w:r>
       <w:r>
-        <w:t>. This shows that spam emails tend to be packed with numbers within its emails due to the content of it including prices, phone numbers, “you won £</w:t>
-      </w:r>
-      <w:proofErr w:type="spellStart"/>
-      <w:r>
-        <w:t>xxxx</w:t>
-      </w:r>
-      <w:proofErr w:type="spellEnd"/>
-      <w:r>
-        <w:t>”, etc.</w:t>
+        <w:t>. This shows that spam emails tend to be packed with numbers within its emails due to the content of it including prices, phone numbers, “you won £xxxx”, etc.</w:t>
       </w:r>
     </w:p>
     <w:p/>
@@ -3306,15 +3237,7 @@
         <w:pStyle w:val="Caption"/>
       </w:pPr>
       <w:r>
-        <w:t xml:space="preserve">Figure 30 output of the </w:t>
-      </w:r>
-      <w:proofErr w:type="spellStart"/>
-      <w:r>
-        <w:t>longest_number_length</w:t>
-      </w:r>
-      <w:proofErr w:type="spellEnd"/>
-      <w:r>
-        <w:t xml:space="preserve"> and comparison code block</w:t>
+        <w:t>Figure 30 output of the longest_number_length and comparison code block</w:t>
       </w:r>
     </w:p>
     <w:p>
@@ -3887,15 +3810,7 @@
         <w:t>What this code does is that it uses the regex module to be able to find specific text content within an email using re.findall(). First it find https text using https?. The question mark is added to mean that the s is optional. It then look for :// as that is an essential part of a link. Then I added \S+ which means to match every non-space character until a space appears, which means to combine https:// together alongside the potential site name as just one URL. For example: “</w:t>
       </w:r>
       <w:r>
-        <w:t xml:space="preserve">http://wap. </w:t>
-      </w:r>
-      <w:proofErr w:type="spellStart"/>
-      <w:r>
-        <w:t>xxxmobilemovieclub.com?n</w:t>
-      </w:r>
-      <w:proofErr w:type="spellEnd"/>
-      <w:r>
-        <w:t>=QJKGIGHJJGCBL</w:t>
+        <w:t>http://wap. xxxmobilemovieclub.com?n=QJKGIGHJJGCBL</w:t>
       </w:r>
       <w:r>
         <w:t>” this is one of the spam emails that have this within the dataset.</w:t>
@@ -4526,15 +4441,7 @@
     <w:p>
       <w:r>
         <w:lastRenderedPageBreak/>
-        <w:t xml:space="preserve">What it does is first converts the correlation matrix into an image with plt.imshow() where it will turn every number within the correlation matrix into a coloured square. </w:t>
-      </w:r>
-      <w:proofErr w:type="spellStart"/>
-      <w:r>
-        <w:t>cmap</w:t>
-      </w:r>
-      <w:proofErr w:type="spellEnd"/>
-      <w:r>
-        <w:t xml:space="preserve"> chooses the colour scheme. Plt.colorbar() adds the colour scale. Plt.xticks &amp; plt.yticks in this case adds labels to the x-axis and the same for the y-axis. </w:t>
+        <w:t xml:space="preserve">What it does is first converts the correlation matrix into an image with plt.imshow() where it will turn every number within the correlation matrix into a coloured square. cmap chooses the colour scheme. Plt.colorbar() adds the colour scale. Plt.xticks &amp; plt.yticks in this case adds labels to the x-axis and the same for the y-axis. </w:t>
       </w:r>
     </w:p>
     <w:p>
@@ -5754,7 +5661,59 @@
     </w:p>
     <w:p>
       <w:r>
-        <w:t>From what we can see 0 represents ham legitimate emails and 1 p</w:t>
+        <w:t xml:space="preserve">From what we can see 0 represents ham legitimate emails and 1 </w:t>
+      </w:r>
+      <w:r>
+        <w:t>being spam emails.</w:t>
+      </w:r>
+    </w:p>
+    <w:p>
+      <w:r>
+        <w:t>What first can be gathered from the output is that the ham performance is excellent as the ham recall is 1.00 (100%). This means that the model successfully identified all 966 legitimate emails as ham. The ham precision of 0.97 means that when the model classified an email as ham, it was correct around 97% of the time.</w:t>
+      </w:r>
+    </w:p>
+    <w:p>
+      <w:r>
+        <w:t>The spam precision also had a perfect rating of 1.00. What this entails is that every email the model predicted as spam was actually spam in this test set. So the model was not incorrectly throwing legitimate emails into spam section often.</w:t>
+      </w:r>
+    </w:p>
+    <w:p>
+      <w:r>
+        <w:t>One weakness within the classification report however is the spam recall with only 79%. This shows that the machine learning model detected approximately 79% of the actual spam emails, but missed around 21%. The test set used contained 149 spam emails and 966 ham emails, so the model detected around 118 spam emails, while roughly 31 spam emails were incorrectly classified as ham. Those 31 emails incorrectly classified are known in this case as false negatives.</w:t>
+      </w:r>
+    </w:p>
+    <w:p>
+      <w:r>
+        <w:t>For a spam detector, this is important because these are spam emails that would get through the filter and in a real world scenario, this can lead to a user becoming a victim of a spam email which can lead to a phishing, scamming, and your information being taken.</w:t>
+      </w:r>
+    </w:p>
+    <w:p>
+      <w:r>
+        <w:t>This however concludes that the accuracy score of 97.22% is misleading. This is because the dataset was imbalanced in the beginning when loading the dataset and during this test where there are 966 ham emails and 149 spam emails. This shows that 87% of the test data is ham. The model can achieve a very high overall accuracy because there are many more ham emails and they had a recall of 100%. This is why relying on accuracy alone does not showcase the full picture.</w:t>
+      </w:r>
+    </w:p>
+    <w:p>
+      <w:r>
+        <w:t>To conclude, the Multinomial Naïve Bayes classifier a</w:t>
+      </w:r>
+      <w:r>
+        <w:t>chieved an overall accuracy of 97.22%. The model demonstrated particularly strong performance when identifying legitimate emails, achieving a recall of 1.00. Spam classification produced a precision of 1.00, indicating that emails classified as spam were correctly identified. However, spam recall was lower at 0.79, indicating that approximately 21% of spam emails were incorrectly classified as legitimate. This highlights a limitation of relying solely on accuracy, particularly given the imbalance between the ham and spam classes.</w:t>
+      </w:r>
+    </w:p>
+    <w:p>
+      <w:r>
+        <w:lastRenderedPageBreak/>
+        <w:t>This raises a new question now which is can alternative machine learning algorithms improve the detection of spam emails while maintaining high precision and reducing false negatives leading to a more reliable and accurate spam detector?</w:t>
+      </w:r>
+    </w:p>
+    <w:p>
+      <w:r>
+        <w:t>To answer this question the following Machine Learning algorithms will be used for training:</w:t>
+      </w:r>
+    </w:p>
+    <w:p>
+      <w:r>
+        <w:t>Logistic Regression, SVM, and Random Forest. The same train/test data will be used and same metrics will be compared as well.</w:t>
       </w:r>
     </w:p>
     <w:sectPr>

</xml_diff>

<commit_message>
started creating and testing a second model using logistic regression
</commit_message>
<xml_diff>
--- a/Project Spam Email Detector.docx
+++ b/Project Spam Email Detector.docx
@@ -5558,6 +5558,9 @@
         <w:keepNext/>
       </w:pPr>
       <w:r>
+        <w:rPr>
+          <w:noProof/>
+        </w:rPr>
         <w:drawing>
           <wp:inline distT="0" distB="0" distL="0" distR="0" wp14:anchorId="2280BC77" wp14:editId="5D1FB5EE">
             <wp:extent cx="4929271" cy="311150"/>
@@ -5608,6 +5611,9 @@
         <w:keepNext/>
       </w:pPr>
       <w:r>
+        <w:rPr>
+          <w:noProof/>
+        </w:rPr>
         <w:lastRenderedPageBreak/>
         <w:drawing>
           <wp:inline distT="0" distB="0" distL="0" distR="0" wp14:anchorId="46605A7D" wp14:editId="797C5256">
@@ -5714,6 +5720,91 @@
     <w:p>
       <w:r>
         <w:t>Logistic Regression, SVM, and Random Forest. The same train/test data will be used and same metrics will be compared as well.</w:t>
+      </w:r>
+    </w:p>
+    <w:p/>
+    <w:p>
+      <w:pPr>
+        <w:rPr>
+          <w:u w:val="single"/>
+        </w:rPr>
+      </w:pPr>
+      <w:r>
+        <w:rPr>
+          <w:u w:val="single"/>
+        </w:rPr>
+        <w:t>Logistic Regression:</w:t>
+      </w:r>
+    </w:p>
+    <w:p>
+      <w:r>
+        <w:t>First we are going to test the accuracy and efficiency of the data using logistic regression.</w:t>
+      </w:r>
+    </w:p>
+    <w:p>
+      <w:r>
+        <w:t xml:space="preserve">Logistic Regression is a supervised machine learning algorithm used to predict the probability using binary output (0/1). </w:t>
+      </w:r>
+      <w:r>
+        <w:t>(Lee, 2025)</w:t>
+      </w:r>
+      <w:r>
+        <w:t>. Logistic Regression is mainly used for classification problems and will learn patterns in the TF-IDF features that will help distinguish spam from ham.</w:t>
+      </w:r>
+    </w:p>
+    <w:p>
+      <w:pPr>
+        <w:keepNext/>
+      </w:pPr>
+      <w:r>
+        <w:drawing>
+          <wp:inline distT="0" distB="0" distL="0" distR="0" wp14:anchorId="3D2004A6" wp14:editId="105F1E43">
+            <wp:extent cx="4330923" cy="241312"/>
+            <wp:effectExtent l="0" t="0" r="0" b="6350"/>
+            <wp:docPr id="2027760969" name="Picture 1"/>
+            <wp:cNvGraphicFramePr>
+              <a:graphicFrameLocks xmlns:a="http://schemas.openxmlformats.org/drawingml/2006/main" noChangeAspect="1"/>
+            </wp:cNvGraphicFramePr>
+            <a:graphic xmlns:a="http://schemas.openxmlformats.org/drawingml/2006/main">
+              <a:graphicData uri="http://schemas.openxmlformats.org/drawingml/2006/picture">
+                <pic:pic xmlns:pic="http://schemas.openxmlformats.org/drawingml/2006/picture">
+                  <pic:nvPicPr>
+                    <pic:cNvPr id="2027760969" name=""/>
+                    <pic:cNvPicPr/>
+                  </pic:nvPicPr>
+                  <pic:blipFill>
+                    <a:blip r:embed="rId63"/>
+                    <a:stretch>
+                      <a:fillRect/>
+                    </a:stretch>
+                  </pic:blipFill>
+                  <pic:spPr>
+                    <a:xfrm>
+                      <a:off x="0" y="0"/>
+                      <a:ext cx="4330923" cy="241312"/>
+                    </a:xfrm>
+                    <a:prstGeom prst="rect">
+                      <a:avLst/>
+                    </a:prstGeom>
+                  </pic:spPr>
+                </pic:pic>
+              </a:graphicData>
+            </a:graphic>
+          </wp:inline>
+        </w:drawing>
+      </w:r>
+    </w:p>
+    <w:p>
+      <w:pPr>
+        <w:pStyle w:val="Caption"/>
+      </w:pPr>
+      <w:r>
+        <w:t>Figure 55 importing Logistic Regression into the file</w:t>
+      </w:r>
+    </w:p>
+    <w:p>
+      <w:r>
+        <w:t>Here the Logistic Regression algorithm is being imported from the scikit-learn library.</w:t>
       </w:r>
     </w:p>
     <w:sectPr>

</xml_diff>

<commit_message>
done the classification report and talked about results, compared it to naive bayes
</commit_message>
<xml_diff>
--- a/Project Spam Email Detector.docx
+++ b/Project Spam Email Detector.docx
@@ -5805,6 +5805,321 @@
     <w:p>
       <w:r>
         <w:t>Here the Logistic Regression algorithm is being imported from the scikit-learn library.</w:t>
+      </w:r>
+    </w:p>
+    <w:p/>
+    <w:p>
+      <w:pPr>
+        <w:keepNext/>
+      </w:pPr>
+      <w:r>
+        <w:drawing>
+          <wp:inline distT="0" distB="0" distL="0" distR="0" wp14:anchorId="54019F3E" wp14:editId="5D46DF6B">
+            <wp:extent cx="4457929" cy="1924149"/>
+            <wp:effectExtent l="0" t="0" r="0" b="0"/>
+            <wp:docPr id="2069874382" name="Picture 1"/>
+            <wp:cNvGraphicFramePr>
+              <a:graphicFrameLocks xmlns:a="http://schemas.openxmlformats.org/drawingml/2006/main" noChangeAspect="1"/>
+            </wp:cNvGraphicFramePr>
+            <a:graphic xmlns:a="http://schemas.openxmlformats.org/drawingml/2006/main">
+              <a:graphicData uri="http://schemas.openxmlformats.org/drawingml/2006/picture">
+                <pic:pic xmlns:pic="http://schemas.openxmlformats.org/drawingml/2006/picture">
+                  <pic:nvPicPr>
+                    <pic:cNvPr id="2069874382" name=""/>
+                    <pic:cNvPicPr/>
+                  </pic:nvPicPr>
+                  <pic:blipFill>
+                    <a:blip r:embed="rId64"/>
+                    <a:stretch>
+                      <a:fillRect/>
+                    </a:stretch>
+                  </pic:blipFill>
+                  <pic:spPr>
+                    <a:xfrm>
+                      <a:off x="0" y="0"/>
+                      <a:ext cx="4457929" cy="1924149"/>
+                    </a:xfrm>
+                    <a:prstGeom prst="rect">
+                      <a:avLst/>
+                    </a:prstGeom>
+                  </pic:spPr>
+                </pic:pic>
+              </a:graphicData>
+            </a:graphic>
+          </wp:inline>
+        </w:drawing>
+      </w:r>
+    </w:p>
+    <w:p>
+      <w:pPr>
+        <w:pStyle w:val="Caption"/>
+      </w:pPr>
+      <w:r>
+        <w:t>Figure 56 code creating and testing logistic regression model</w:t>
+      </w:r>
+    </w:p>
+    <w:p>
+      <w:r>
+        <w:t>Within this block of code here, it involves the creation of the logistic regression model and training the model. The training part is where the model learns from the prior training data so X_train revolves around email information and y_train includes the correct spam/ham labels. It looks for relationships between the words in the email and their categories. This is the same X &amp; y train that was used for the Naïve Bayes model as it makes the comparison fair.</w:t>
+      </w:r>
+    </w:p>
+    <w:p>
+      <w:pPr>
+        <w:keepNext/>
+      </w:pPr>
+      <w:r>
+        <w:drawing>
+          <wp:inline distT="0" distB="0" distL="0" distR="0" wp14:anchorId="176980ED" wp14:editId="4583BCAB">
+            <wp:extent cx="4286470" cy="609631"/>
+            <wp:effectExtent l="0" t="0" r="0" b="0"/>
+            <wp:docPr id="6702236" name="Picture 1"/>
+            <wp:cNvGraphicFramePr>
+              <a:graphicFrameLocks xmlns:a="http://schemas.openxmlformats.org/drawingml/2006/main" noChangeAspect="1"/>
+            </wp:cNvGraphicFramePr>
+            <a:graphic xmlns:a="http://schemas.openxmlformats.org/drawingml/2006/main">
+              <a:graphicData uri="http://schemas.openxmlformats.org/drawingml/2006/picture">
+                <pic:pic xmlns:pic="http://schemas.openxmlformats.org/drawingml/2006/picture">
+                  <pic:nvPicPr>
+                    <pic:cNvPr id="6702236" name=""/>
+                    <pic:cNvPicPr/>
+                  </pic:nvPicPr>
+                  <pic:blipFill>
+                    <a:blip r:embed="rId65"/>
+                    <a:stretch>
+                      <a:fillRect/>
+                    </a:stretch>
+                  </pic:blipFill>
+                  <pic:spPr>
+                    <a:xfrm>
+                      <a:off x="0" y="0"/>
+                      <a:ext cx="4286470" cy="609631"/>
+                    </a:xfrm>
+                    <a:prstGeom prst="rect">
+                      <a:avLst/>
+                    </a:prstGeom>
+                  </pic:spPr>
+                </pic:pic>
+              </a:graphicData>
+            </a:graphic>
+          </wp:inline>
+        </w:drawing>
+      </w:r>
+    </w:p>
+    <w:p>
+      <w:pPr>
+        <w:pStyle w:val="Caption"/>
+      </w:pPr>
+      <w:r>
+        <w:t>Figure 57 predictions being made for logistic regression model</w:t>
+      </w:r>
+    </w:p>
+    <w:p>
+      <w:r>
+        <w:t>Next, it’s the stage where predictions are being created for the Logistic Regression model.</w:t>
+      </w:r>
+    </w:p>
+    <w:p>
+      <w:r>
+        <w:lastRenderedPageBreak/>
+        <w:t>What this does is that the trained logistic regression model receives unseen testing emails and then churn out predictions with them only being 0 for ham and 1 for spam</w:t>
+      </w:r>
+      <w:r>
+        <w:t>.</w:t>
+      </w:r>
+    </w:p>
+    <w:p/>
+    <w:p>
+      <w:pPr>
+        <w:keepNext/>
+      </w:pPr>
+      <w:r>
+        <w:drawing>
+          <wp:inline distT="0" distB="0" distL="0" distR="0" wp14:anchorId="45521075" wp14:editId="784E2288">
+            <wp:extent cx="4838949" cy="1530429"/>
+            <wp:effectExtent l="0" t="0" r="0" b="0"/>
+            <wp:docPr id="140805987" name="Picture 1"/>
+            <wp:cNvGraphicFramePr>
+              <a:graphicFrameLocks xmlns:a="http://schemas.openxmlformats.org/drawingml/2006/main" noChangeAspect="1"/>
+            </wp:cNvGraphicFramePr>
+            <a:graphic xmlns:a="http://schemas.openxmlformats.org/drawingml/2006/main">
+              <a:graphicData uri="http://schemas.openxmlformats.org/drawingml/2006/picture">
+                <pic:pic xmlns:pic="http://schemas.openxmlformats.org/drawingml/2006/picture">
+                  <pic:nvPicPr>
+                    <pic:cNvPr id="140805987" name=""/>
+                    <pic:cNvPicPr/>
+                  </pic:nvPicPr>
+                  <pic:blipFill>
+                    <a:blip r:embed="rId66"/>
+                    <a:stretch>
+                      <a:fillRect/>
+                    </a:stretch>
+                  </pic:blipFill>
+                  <pic:spPr>
+                    <a:xfrm>
+                      <a:off x="0" y="0"/>
+                      <a:ext cx="4838949" cy="1530429"/>
+                    </a:xfrm>
+                    <a:prstGeom prst="rect">
+                      <a:avLst/>
+                    </a:prstGeom>
+                  </pic:spPr>
+                </pic:pic>
+              </a:graphicData>
+            </a:graphic>
+          </wp:inline>
+        </w:drawing>
+      </w:r>
+    </w:p>
+    <w:p>
+      <w:pPr>
+        <w:pStyle w:val="Caption"/>
+      </w:pPr>
+      <w:r>
+        <w:t>Figure 67 Calculating the accuracy of the model</w:t>
+      </w:r>
+    </w:p>
+    <w:p>
+      <w:r>
+        <w:t xml:space="preserve">Like with the Naïve Bayes model, it compares the actual answers from y_test with the models answers from the predictions and calculates how many were correct. </w:t>
+      </w:r>
+    </w:p>
+    <w:p>
+      <w:pPr>
+        <w:keepNext/>
+      </w:pPr>
+      <w:r>
+        <w:t xml:space="preserve"> </w:t>
+      </w:r>
+      <w:r>
+        <w:drawing>
+          <wp:inline distT="0" distB="0" distL="0" distR="0" wp14:anchorId="26678036" wp14:editId="6BAE53DB">
+            <wp:extent cx="3092609" cy="685835"/>
+            <wp:effectExtent l="0" t="0" r="0" b="0"/>
+            <wp:docPr id="1491704179" name="Picture 1"/>
+            <wp:cNvGraphicFramePr>
+              <a:graphicFrameLocks xmlns:a="http://schemas.openxmlformats.org/drawingml/2006/main" noChangeAspect="1"/>
+            </wp:cNvGraphicFramePr>
+            <a:graphic xmlns:a="http://schemas.openxmlformats.org/drawingml/2006/main">
+              <a:graphicData uri="http://schemas.openxmlformats.org/drawingml/2006/picture">
+                <pic:pic xmlns:pic="http://schemas.openxmlformats.org/drawingml/2006/picture">
+                  <pic:nvPicPr>
+                    <pic:cNvPr id="1491704179" name=""/>
+                    <pic:cNvPicPr/>
+                  </pic:nvPicPr>
+                  <pic:blipFill>
+                    <a:blip r:embed="rId67"/>
+                    <a:stretch>
+                      <a:fillRect/>
+                    </a:stretch>
+                  </pic:blipFill>
+                  <pic:spPr>
+                    <a:xfrm>
+                      <a:off x="0" y="0"/>
+                      <a:ext cx="3092609" cy="685835"/>
+                    </a:xfrm>
+                    <a:prstGeom prst="rect">
+                      <a:avLst/>
+                    </a:prstGeom>
+                  </pic:spPr>
+                </pic:pic>
+              </a:graphicData>
+            </a:graphic>
+          </wp:inline>
+        </w:drawing>
+      </w:r>
+    </w:p>
+    <w:p>
+      <w:pPr>
+        <w:pStyle w:val="Caption"/>
+      </w:pPr>
+      <w:r>
+        <w:t>Figure 68 Logistic Regression Accuracy result</w:t>
+      </w:r>
+    </w:p>
+    <w:p>
+      <w:r>
+        <w:t>As we can see, the accuracy of the logistic regression model (96.14%) is less than the accuracy score of the Naïve Bayes model with 97.22%.</w:t>
+      </w:r>
+    </w:p>
+    <w:p>
+      <w:r>
+        <w:t>However, this is not the complete picture as the Naïve Bayes model had a glaring weakness within the classification report: its spam recall was only 79%. So Logistic Regression may have a lower overall accuracy but may potentially detect more spam</w:t>
+      </w:r>
+      <w:r>
+        <w:t>.</w:t>
+      </w:r>
+    </w:p>
+    <w:p/>
+    <w:p>
+      <w:pPr>
+        <w:keepNext/>
+      </w:pPr>
+      <w:r>
+        <w:drawing>
+          <wp:inline distT="0" distB="0" distL="0" distR="0" wp14:anchorId="5A6755E4" wp14:editId="495703A3">
+            <wp:extent cx="4591286" cy="1860646"/>
+            <wp:effectExtent l="0" t="0" r="0" b="6350"/>
+            <wp:docPr id="822700682" name="Picture 1"/>
+            <wp:cNvGraphicFramePr>
+              <a:graphicFrameLocks xmlns:a="http://schemas.openxmlformats.org/drawingml/2006/main" noChangeAspect="1"/>
+            </wp:cNvGraphicFramePr>
+            <a:graphic xmlns:a="http://schemas.openxmlformats.org/drawingml/2006/main">
+              <a:graphicData uri="http://schemas.openxmlformats.org/drawingml/2006/picture">
+                <pic:pic xmlns:pic="http://schemas.openxmlformats.org/drawingml/2006/picture">
+                  <pic:nvPicPr>
+                    <pic:cNvPr id="822700682" name=""/>
+                    <pic:cNvPicPr/>
+                  </pic:nvPicPr>
+                  <pic:blipFill>
+                    <a:blip r:embed="rId68"/>
+                    <a:stretch>
+                      <a:fillRect/>
+                    </a:stretch>
+                  </pic:blipFill>
+                  <pic:spPr>
+                    <a:xfrm>
+                      <a:off x="0" y="0"/>
+                      <a:ext cx="4591286" cy="1860646"/>
+                    </a:xfrm>
+                    <a:prstGeom prst="rect">
+                      <a:avLst/>
+                    </a:prstGeom>
+                  </pic:spPr>
+                </pic:pic>
+              </a:graphicData>
+            </a:graphic>
+          </wp:inline>
+        </w:drawing>
+      </w:r>
+    </w:p>
+    <w:p>
+      <w:pPr>
+        <w:pStyle w:val="Caption"/>
+      </w:pPr>
+      <w:r>
+        <w:t>Figure 69 Logistic Regression classification report</w:t>
+      </w:r>
+    </w:p>
+    <w:p>
+      <w:r>
+        <w:t>From an overall standpoint, it seems that the average score and accuracy for Logistic Regression is lower than Naïve Bayes.</w:t>
+      </w:r>
+    </w:p>
+    <w:p>
+      <w:r>
+        <w:t xml:space="preserve">When analysing the report we can see that the spam precision stayed at 100%, which mean that when either model predicted an email as spam, it was correct. Another piece of data that </w:t>
+      </w:r>
+      <w:r>
+        <w:lastRenderedPageBreak/>
+        <w:t>stands out is that the spam recall became worse. This is the biggest difference as for Naïve Bayes the spam recall was 0.79% whereas with Logistic Regression, it was 0.71%</w:t>
+      </w:r>
+      <w:r>
+        <w:t>. So Logistic Regression detected a smaller proportion of the actual spam emails. With 149 spam emails in the test set, a 0.71 recall means it detected around 106 spam emails, leaving 43 incorrectly classified as ham. Meanwhile with Naïve Bayes, it detected 118  spam emails so 31 were missed.</w:t>
+      </w:r>
+    </w:p>
+    <w:p>
+      <w:r>
+        <w:t>To Conclude, this indicates that Logistic Regression failed to identify a greater proportion of the spam emails when compared to Naïve Bayes, meaning that Multinomial Naïve Bayes was the stronger model of the two for this specific dataset.</w:t>
       </w:r>
     </w:p>
     <w:sectPr>

</xml_diff>

<commit_message>
started testing the data using support vector machines
</commit_message>
<xml_diff>
--- a/Project Spam Email Detector.docx
+++ b/Project Spam Email Detector.docx
@@ -5757,6 +5757,9 @@
         <w:keepNext/>
       </w:pPr>
       <w:r>
+        <w:rPr>
+          <w:noProof/>
+        </w:rPr>
         <w:drawing>
           <wp:inline distT="0" distB="0" distL="0" distR="0" wp14:anchorId="3D2004A6" wp14:editId="105F1E43">
             <wp:extent cx="4330923" cy="241312"/>
@@ -5813,6 +5816,9 @@
         <w:keepNext/>
       </w:pPr>
       <w:r>
+        <w:rPr>
+          <w:noProof/>
+        </w:rPr>
         <w:drawing>
           <wp:inline distT="0" distB="0" distL="0" distR="0" wp14:anchorId="54019F3E" wp14:editId="5D46DF6B">
             <wp:extent cx="4457929" cy="1924149"/>
@@ -5868,6 +5874,9 @@
         <w:keepNext/>
       </w:pPr>
       <w:r>
+        <w:rPr>
+          <w:noProof/>
+        </w:rPr>
         <w:drawing>
           <wp:inline distT="0" distB="0" distL="0" distR="0" wp14:anchorId="176980ED" wp14:editId="4583BCAB">
             <wp:extent cx="4286470" cy="609631"/>
@@ -5933,6 +5942,9 @@
         <w:keepNext/>
       </w:pPr>
       <w:r>
+        <w:rPr>
+          <w:noProof/>
+        </w:rPr>
         <w:drawing>
           <wp:inline distT="0" distB="0" distL="0" distR="0" wp14:anchorId="45521075" wp14:editId="784E2288">
             <wp:extent cx="4838949" cy="1530429"/>
@@ -5991,6 +6003,9 @@
         <w:t xml:space="preserve"> </w:t>
       </w:r>
       <w:r>
+        <w:rPr>
+          <w:noProof/>
+        </w:rPr>
         <w:drawing>
           <wp:inline distT="0" distB="0" distL="0" distR="0" wp14:anchorId="26678036" wp14:editId="6BAE53DB">
             <wp:extent cx="3092609" cy="685835"/>
@@ -6055,6 +6070,9 @@
         <w:keepNext/>
       </w:pPr>
       <w:r>
+        <w:rPr>
+          <w:noProof/>
+        </w:rPr>
         <w:drawing>
           <wp:inline distT="0" distB="0" distL="0" distR="0" wp14:anchorId="5A6755E4" wp14:editId="495703A3">
             <wp:extent cx="4591286" cy="1860646"/>
@@ -6120,6 +6138,38 @@
     <w:p>
       <w:r>
         <w:t>To Conclude, this indicates that Logistic Regression failed to identify a greater proportion of the spam emails when compared to Naïve Bayes, meaning that Multinomial Naïve Bayes was the stronger model of the two for this specific dataset.</w:t>
+      </w:r>
+    </w:p>
+    <w:p>
+      <w:pPr>
+        <w:rPr>
+          <w:u w:val="single"/>
+        </w:rPr>
+      </w:pPr>
+      <w:r>
+        <w:rPr>
+          <w:u w:val="single"/>
+        </w:rPr>
+        <w:t>Support Vector Machine (SVM):</w:t>
+      </w:r>
+    </w:p>
+    <w:p>
+      <w:r>
+        <w:t xml:space="preserve">The next algorithm that will be looked at for training is the Support Vector Machine, or better known as SVM. </w:t>
+      </w:r>
+    </w:p>
+    <w:p>
+      <w:r>
+        <w:t xml:space="preserve">SVM is a supervised machine learning algorithm, so it is uses labelled data to predict known outcomes, which in this case is accuracy of spam and ham detection. SVM is used for classification, regression, and outlier detection. </w:t>
+      </w:r>
+      <w:r>
+        <w:t>(scikit-learn, 2018)</w:t>
+      </w:r>
+      <w:r>
+        <w:t xml:space="preserve">. Various advantages that it posses includes </w:t>
+      </w:r>
+      <w:r>
+        <w:t>being effective in cases where   the number of dimensions is greater than the number of samples</w:t>
       </w:r>
     </w:p>
     <w:sectPr>

</xml_diff>

<commit_message>
done svm model classification report and talked about the results
</commit_message>
<xml_diff>
--- a/Project Spam Email Detector.docx
+++ b/Project Spam Email Detector.docx
@@ -6304,6 +6304,72 @@
       </w:r>
       <w:r>
         <w:t>. This characteristic of SVM the model distinguish between spam and ham emails and especially those that have similar wording and structure.</w:t>
+      </w:r>
+    </w:p>
+    <w:p/>
+    <w:p>
+      <w:pPr>
+        <w:keepNext/>
+      </w:pPr>
+      <w:r>
+        <w:drawing>
+          <wp:inline distT="0" distB="0" distL="0" distR="0" wp14:anchorId="4F0DD889" wp14:editId="24694A48">
+            <wp:extent cx="4002739" cy="1454150"/>
+            <wp:effectExtent l="0" t="0" r="0" b="0"/>
+            <wp:docPr id="121625486" name="Picture 1"/>
+            <wp:cNvGraphicFramePr>
+              <a:graphicFrameLocks xmlns:a="http://schemas.openxmlformats.org/drawingml/2006/main" noChangeAspect="1"/>
+            </wp:cNvGraphicFramePr>
+            <a:graphic xmlns:a="http://schemas.openxmlformats.org/drawingml/2006/main">
+              <a:graphicData uri="http://schemas.openxmlformats.org/drawingml/2006/picture">
+                <pic:pic xmlns:pic="http://schemas.openxmlformats.org/drawingml/2006/picture">
+                  <pic:nvPicPr>
+                    <pic:cNvPr id="121625486" name=""/>
+                    <pic:cNvPicPr/>
+                  </pic:nvPicPr>
+                  <pic:blipFill>
+                    <a:blip r:embed="rId71"/>
+                    <a:stretch>
+                      <a:fillRect/>
+                    </a:stretch>
+                  </pic:blipFill>
+                  <pic:spPr>
+                    <a:xfrm>
+                      <a:off x="0" y="0"/>
+                      <a:ext cx="4006625" cy="1455562"/>
+                    </a:xfrm>
+                    <a:prstGeom prst="rect">
+                      <a:avLst/>
+                    </a:prstGeom>
+                  </pic:spPr>
+                </pic:pic>
+              </a:graphicData>
+            </a:graphic>
+          </wp:inline>
+        </w:drawing>
+      </w:r>
+    </w:p>
+    <w:p>
+      <w:pPr>
+        <w:pStyle w:val="Caption"/>
+      </w:pPr>
+      <w:r>
+        <w:t>Figure 73 SVM classification report</w:t>
+      </w:r>
+    </w:p>
+    <w:p>
+      <w:r>
+        <w:t xml:space="preserve">What can be gathered from the SVM classification report is that it is a significant improvement on the previous two models. What makes this result better than its predecessors is the spam recall. For SVM, it had a spam recall of 0.87 (87%) compared to Naïve Bayes with 0.79 and Logistic regression with 71%. This means that SVM is detecting approximately 87% of the actual spam emails. </w:t>
+      </w:r>
+    </w:p>
+    <w:p>
+      <w:r>
+        <w:t>The precision score of SVM is also very high with 0.99 which is only a 0.1 decrease from the other models. This shows that by using SVM it has a good balance of both high precision plus high recall which ultimately ends up with a high f1-score. The high f1-score is reflected in the report with it being 0.93 which is considerably better than Naïve Bayes with 0.88 and Logistic regression with 0.83.</w:t>
+      </w:r>
+    </w:p>
+    <w:p>
+      <w:r>
+        <w:t>To conclude, the support vector machine produced the strongest performance among the three evaluated classifiers, with an accuracy of 98.21% and more importantly achieving a spam recall of 0.87 and an f1 score of 0.93. The improvement in recall indicates that the SVM was able to identify a greater proportion of actual spam emails while maintaining a high spam precision of 0.99 when compared to other models.</w:t>
       </w:r>
     </w:p>
     <w:sectPr>

</xml_diff>

<commit_message>
doing further analysis, using confusion matrices on the three models to see where it went wrong for the models
</commit_message>
<xml_diff>
--- a/Project Spam Email Detector.docx
+++ b/Project Spam Email Detector.docx
@@ -2037,7 +2037,15 @@
         <w:t>Punctuation analysis is important for this report as spam emails often use punctuation differently from legitimate emails. It is common practice within spam emails to use excessive punctuation to garner attention, create urgency, and encourage the recipient to take action immediately. For example, “</w:t>
       </w:r>
       <w:r>
-        <w:t>WINNER!! As a valued network customer you have been selected to receivea Â£900 prize reward! To claim call 09061701461. Claim code KL341. Valid 12 hours only.</w:t>
+        <w:t xml:space="preserve">WINNER!! As a valued network customer you have been selected to </w:t>
+      </w:r>
+      <w:proofErr w:type="spellStart"/>
+      <w:r>
+        <w:t>receivea</w:t>
+      </w:r>
+      <w:proofErr w:type="spellEnd"/>
+      <w:r>
+        <w:t xml:space="preserve"> Â£900 prize reward! To claim call 09061701461. Claim code KL341. Valid 12 hours only.</w:t>
       </w:r>
       <w:r>
         <w:t>” This is an example of a spam email within the dataset.</w:t>
@@ -2531,7 +2539,31 @@
         <w:t>Another way they are used within spam emails is in a more “direct” manner making a direct statement as such. For example, “</w:t>
       </w:r>
       <w:r>
-        <w:t xml:space="preserve">Want 2 get laid tonight? Want real Dogging locations sent direct 2 ur mob? Join the UK's largest Dogging Network bt Txting GRAVEL to 69888! Nt. ec2a. </w:t>
+        <w:t xml:space="preserve">Want 2 get laid tonight? Want real Dogging locations sent direct 2 </w:t>
+      </w:r>
+      <w:proofErr w:type="spellStart"/>
+      <w:r>
+        <w:t>ur</w:t>
+      </w:r>
+      <w:proofErr w:type="spellEnd"/>
+      <w:r>
+        <w:t xml:space="preserve"> mob? Join the UK's largest Dogging Network </w:t>
+      </w:r>
+      <w:proofErr w:type="spellStart"/>
+      <w:r>
+        <w:t>bt</w:t>
+      </w:r>
+      <w:proofErr w:type="spellEnd"/>
+      <w:r>
+        <w:t xml:space="preserve"> </w:t>
+      </w:r>
+      <w:proofErr w:type="spellStart"/>
+      <w:r>
+        <w:t>Txting</w:t>
+      </w:r>
+      <w:proofErr w:type="spellEnd"/>
+      <w:r>
+        <w:t xml:space="preserve"> GRAVEL to 69888! Nt. ec2a. </w:t>
       </w:r>
       <w:hyperlink r:id="rId29" w:history="1">
         <w:r>
@@ -2590,13 +2622,42 @@
         <w:t>“</w:t>
       </w:r>
       <w:r>
-        <w:t>Sunshine Quiz Wkly Q! Win a top Sony DVD player if u know which country the Algarve is in? Txt ansr to 82277. Â£1.50 SP:Tyrone</w:t>
-      </w:r>
+        <w:t xml:space="preserve">Sunshine Quiz </w:t>
+      </w:r>
+      <w:proofErr w:type="spellStart"/>
+      <w:r>
+        <w:t>Wkly</w:t>
+      </w:r>
+      <w:proofErr w:type="spellEnd"/>
+      <w:r>
+        <w:t xml:space="preserve"> Q! Win a top Sony DVD player if u know which country the Algarve is in? Txt </w:t>
+      </w:r>
+      <w:proofErr w:type="spellStart"/>
+      <w:r>
+        <w:t>ansr</w:t>
+      </w:r>
+      <w:proofErr w:type="spellEnd"/>
+      <w:r>
+        <w:t xml:space="preserve"> to 82277. Â£1.50 </w:t>
+      </w:r>
+      <w:proofErr w:type="spellStart"/>
+      <w:r>
+        <w:t>SP:Tyrone</w:t>
+      </w:r>
+      <w:proofErr w:type="spellEnd"/>
       <w:r>
         <w:t>”, “</w:t>
       </w:r>
       <w:r>
-        <w:t>You are a winner U have been specially selected 2 receive Â£1000 cash or a 4* holiday (flights inc) speak to a live operator 2 claim 0871277810810</w:t>
+        <w:t xml:space="preserve">You are a winner U have been specially selected 2 receive Â£1000 cash or a 4* holiday (flights </w:t>
+      </w:r>
+      <w:proofErr w:type="spellStart"/>
+      <w:r>
+        <w:t>inc</w:t>
+      </w:r>
+      <w:proofErr w:type="spellEnd"/>
+      <w:r>
+        <w:t>) speak to a live operator 2 claim 0871277810810</w:t>
       </w:r>
       <w:r>
         <w:t>”</w:t>
@@ -3041,7 +3102,15 @@
         <w:t>and a max of 40</w:t>
       </w:r>
       <w:r>
-        <w:t>. This shows that spam emails tend to be packed with numbers within its emails due to the content of it including prices, phone numbers, “you won £xxxx”, etc.</w:t>
+        <w:t>. This shows that spam emails tend to be packed with numbers within its emails due to the content of it including prices, phone numbers, “you won £</w:t>
+      </w:r>
+      <w:proofErr w:type="spellStart"/>
+      <w:r>
+        <w:t>xxxx</w:t>
+      </w:r>
+      <w:proofErr w:type="spellEnd"/>
+      <w:r>
+        <w:t>”, etc.</w:t>
       </w:r>
     </w:p>
     <w:p/>
@@ -3237,7 +3306,15 @@
         <w:pStyle w:val="Caption"/>
       </w:pPr>
       <w:r>
-        <w:t>Figure 30 output of the longest_number_length and comparison code block</w:t>
+        <w:t xml:space="preserve">Figure 30 output of the </w:t>
+      </w:r>
+      <w:proofErr w:type="spellStart"/>
+      <w:r>
+        <w:t>longest_number_length</w:t>
+      </w:r>
+      <w:proofErr w:type="spellEnd"/>
+      <w:r>
+        <w:t xml:space="preserve"> and comparison code block</w:t>
       </w:r>
     </w:p>
     <w:p>
@@ -3810,7 +3887,15 @@
         <w:t>What this code does is that it uses the regex module to be able to find specific text content within an email using re.findall(). First it find https text using https?. The question mark is added to mean that the s is optional. It then look for :// as that is an essential part of a link. Then I added \S+ which means to match every non-space character until a space appears, which means to combine https:// together alongside the potential site name as just one URL. For example: “</w:t>
       </w:r>
       <w:r>
-        <w:t>http://wap. xxxmobilemovieclub.com?n=QJKGIGHJJGCBL</w:t>
+        <w:t xml:space="preserve">http://wap. </w:t>
+      </w:r>
+      <w:proofErr w:type="spellStart"/>
+      <w:r>
+        <w:t>xxxmobilemovieclub.com?n</w:t>
+      </w:r>
+      <w:proofErr w:type="spellEnd"/>
+      <w:r>
+        <w:t>=QJKGIGHJJGCBL</w:t>
       </w:r>
       <w:r>
         <w:t>” this is one of the spam emails that have this within the dataset.</w:t>
@@ -4441,7 +4526,15 @@
     <w:p>
       <w:r>
         <w:lastRenderedPageBreak/>
-        <w:t xml:space="preserve">What it does is first converts the correlation matrix into an image with plt.imshow() where it will turn every number within the correlation matrix into a coloured square. cmap chooses the colour scheme. Plt.colorbar() adds the colour scale. Plt.xticks &amp; plt.yticks in this case adds labels to the x-axis and the same for the y-axis. </w:t>
+        <w:t xml:space="preserve">What it does is first converts the correlation matrix into an image with plt.imshow() where it will turn every number within the correlation matrix into a coloured square. </w:t>
+      </w:r>
+      <w:proofErr w:type="spellStart"/>
+      <w:r>
+        <w:t>cmap</w:t>
+      </w:r>
+      <w:proofErr w:type="spellEnd"/>
+      <w:r>
+        <w:t xml:space="preserve"> chooses the colour scheme. Plt.colorbar() adds the colour scale. Plt.xticks &amp; plt.yticks in this case adds labels to the x-axis and the same for the y-axis. </w:t>
       </w:r>
     </w:p>
     <w:p>
@@ -6186,6 +6279,9 @@
         <w:keepNext/>
       </w:pPr>
       <w:r>
+        <w:rPr>
+          <w:noProof/>
+        </w:rPr>
         <w:drawing>
           <wp:inline distT="0" distB="0" distL="0" distR="0" wp14:anchorId="625A9FEA" wp14:editId="49B5C5D3">
             <wp:extent cx="4045158" cy="2425825"/>
@@ -6233,7 +6329,15 @@
     </w:p>
     <w:p>
       <w:r>
-        <w:t>Here is the code that is used when creating the svm model, it is identical to how the code is constructed on the other models that were implemented. The library and module that was used to  help was again scikit learn.</w:t>
+        <w:t xml:space="preserve">Here is the code that is used when creating the </w:t>
+      </w:r>
+      <w:proofErr w:type="spellStart"/>
+      <w:r>
+        <w:t>svm</w:t>
+      </w:r>
+      <w:proofErr w:type="spellEnd"/>
+      <w:r>
+        <w:t xml:space="preserve"> model, it is identical to how the code is constructed on the other models that were implemented. The library and module that was used to  help was again scikit learn.</w:t>
       </w:r>
     </w:p>
     <w:p>
@@ -6241,6 +6345,9 @@
         <w:keepNext/>
       </w:pPr>
       <w:r>
+        <w:rPr>
+          <w:noProof/>
+        </w:rPr>
         <w:drawing>
           <wp:inline distT="0" distB="0" distL="0" distR="0" wp14:anchorId="66EA0DF0" wp14:editId="3C2596C4">
             <wp:extent cx="2292468" cy="304816"/>
@@ -6312,6 +6419,9 @@
         <w:keepNext/>
       </w:pPr>
       <w:r>
+        <w:rPr>
+          <w:noProof/>
+        </w:rPr>
         <w:drawing>
           <wp:inline distT="0" distB="0" distL="0" distR="0" wp14:anchorId="4F0DD889" wp14:editId="24694A48">
             <wp:extent cx="4002739" cy="1454150"/>
@@ -6370,6 +6480,480 @@
     <w:p>
       <w:r>
         <w:t>To conclude, the support vector machine produced the strongest performance among the three evaluated classifiers, with an accuracy of 98.21% and more importantly achieving a spam recall of 0.87 and an f1 score of 0.93. The improvement in recall indicates that the SVM was able to identify a greater proportion of actual spam emails while maintaining a high spam precision of 0.99 when compared to other models.</w:t>
+      </w:r>
+    </w:p>
+    <w:p/>
+    <w:p>
+      <w:pPr>
+        <w:rPr>
+          <w:u w:val="single"/>
+        </w:rPr>
+      </w:pPr>
+      <w:r>
+        <w:rPr>
+          <w:u w:val="single"/>
+        </w:rPr>
+        <w:t>Further Analysis within the three models:</w:t>
+      </w:r>
+    </w:p>
+    <w:p>
+      <w:r>
+        <w:t>In terms of what would be used to analyse these models further, it will be a confusion matrix. This is being used because the classification reports tell us how well each model performed, while the confusion matrices shows us where the model made their mistakes</w:t>
+      </w:r>
+      <w:r>
+        <w:t>.</w:t>
+      </w:r>
+    </w:p>
+    <w:p/>
+    <w:p>
+      <w:r>
+        <w:rPr>
+          <w:noProof/>
+        </w:rPr>
+        <w:lastRenderedPageBreak/>
+        <mc:AlternateContent>
+          <mc:Choice Requires="wps">
+            <w:drawing>
+              <wp:anchor distT="0" distB="0" distL="114300" distR="114300" simplePos="0" relativeHeight="251684864" behindDoc="0" locked="0" layoutInCell="1" allowOverlap="1" wp14:anchorId="4B67464D" wp14:editId="01D94C7B">
+                <wp:simplePos x="0" y="0"/>
+                <wp:positionH relativeFrom="column">
+                  <wp:posOffset>1600200</wp:posOffset>
+                </wp:positionH>
+                <wp:positionV relativeFrom="paragraph">
+                  <wp:posOffset>2984500</wp:posOffset>
+                </wp:positionV>
+                <wp:extent cx="3256915" cy="635"/>
+                <wp:effectExtent l="0" t="0" r="0" b="0"/>
+                <wp:wrapNone/>
+                <wp:docPr id="1486320928" name="Text Box 1"/>
+                <wp:cNvGraphicFramePr/>
+                <a:graphic xmlns:a="http://schemas.openxmlformats.org/drawingml/2006/main">
+                  <a:graphicData uri="http://schemas.microsoft.com/office/word/2010/wordprocessingShape">
+                    <wps:wsp>
+                      <wps:cNvSpPr txBox="1"/>
+                      <wps:spPr>
+                        <a:xfrm>
+                          <a:off x="0" y="0"/>
+                          <a:ext cx="3256915" cy="635"/>
+                        </a:xfrm>
+                        <a:prstGeom prst="rect">
+                          <a:avLst/>
+                        </a:prstGeom>
+                        <a:solidFill>
+                          <a:prstClr val="white"/>
+                        </a:solidFill>
+                        <a:ln>
+                          <a:noFill/>
+                        </a:ln>
+                      </wps:spPr>
+                      <wps:txbx>
+                        <w:txbxContent>
+                          <w:p>
+                            <w:pPr>
+                              <w:pStyle w:val="Caption"/>
+                              <w:rPr>
+                                <w:sz w:val="22"/>
+                                <w:szCs w:val="22"/>
+                              </w:rPr>
+                            </w:pPr>
+                            <w:r>
+                              <w:t>Figure 74 confusion matrix code for all three models</w:t>
+                            </w:r>
+                          </w:p>
+                        </w:txbxContent>
+                      </wps:txbx>
+                      <wps:bodyPr rot="0" spcFirstLastPara="0" vertOverflow="overflow" horzOverflow="overflow" vert="horz" wrap="square" lIns="0" tIns="0" rIns="0" bIns="0" numCol="1" spcCol="0" rtlCol="0" fromWordArt="0" anchor="t" anchorCtr="0" forceAA="0" compatLnSpc="1">
+                        <a:prstTxWarp prst="textNoShape">
+                          <a:avLst/>
+                        </a:prstTxWarp>
+                        <a:spAutoFit/>
+                      </wps:bodyPr>
+                    </wps:wsp>
+                  </a:graphicData>
+                </a:graphic>
+              </wp:anchor>
+            </w:drawing>
+          </mc:Choice>
+          <mc:Fallback>
+            <w:pict>
+              <v:shapetype w14:anchorId="4B67464D" id="_x0000_t202" coordsize="21600,21600" o:spt="202" path="m,l,21600r21600,l21600,xe">
+                <v:stroke joinstyle="miter"/>
+                <v:path gradientshapeok="t" o:connecttype="rect"/>
+              </v:shapetype>
+              <v:shape id="_x0000_s1034" type="#_x0000_t202" style="position:absolute;margin-left:126pt;margin-top:235pt;width:256.45pt;height:.05pt;z-index:251684864;visibility:visible;mso-wrap-style:square;mso-wrap-distance-left:9pt;mso-wrap-distance-top:0;mso-wrap-distance-right:9pt;mso-wrap-distance-bottom:0;mso-position-horizontal:absolute;mso-position-horizontal-relative:text;mso-position-vertical:absolute;mso-position-vertical-relative:text;v-text-anchor:top" o:gfxdata="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" stroked="f">
+                <v:textbox style="mso-fit-shape-to-text:t" inset="0,0,0,0">
+                  <w:txbxContent>
+                    <w:p>
+                      <w:pPr>
+                        <w:pStyle w:val="Caption"/>
+                        <w:rPr>
+                          <w:sz w:val="22"/>
+                          <w:szCs w:val="22"/>
+                        </w:rPr>
+                      </w:pPr>
+                      <w:r>
+                        <w:t>Figure 74 confusion matrix code for all three models</w:t>
+                      </w:r>
+                    </w:p>
+                  </w:txbxContent>
+                </v:textbox>
+              </v:shape>
+            </w:pict>
+          </mc:Fallback>
+        </mc:AlternateContent>
+      </w:r>
+      <w:r>
+        <w:drawing>
+          <wp:anchor distT="0" distB="0" distL="114300" distR="114300" simplePos="0" relativeHeight="251682816" behindDoc="0" locked="0" layoutInCell="1" allowOverlap="1" wp14:anchorId="7E30B808" wp14:editId="58FEC717">
+            <wp:simplePos x="0" y="0"/>
+            <wp:positionH relativeFrom="column">
+              <wp:posOffset>3467100</wp:posOffset>
+            </wp:positionH>
+            <wp:positionV relativeFrom="paragraph">
+              <wp:posOffset>127000</wp:posOffset>
+            </wp:positionV>
+            <wp:extent cx="3257549" cy="2724150"/>
+            <wp:effectExtent l="0" t="0" r="635" b="0"/>
+            <wp:wrapNone/>
+            <wp:docPr id="1584570686" name="Picture 1"/>
+            <wp:cNvGraphicFramePr>
+              <a:graphicFrameLocks xmlns:a="http://schemas.openxmlformats.org/drawingml/2006/main" noChangeAspect="1"/>
+            </wp:cNvGraphicFramePr>
+            <a:graphic xmlns:a="http://schemas.openxmlformats.org/drawingml/2006/main">
+              <a:graphicData uri="http://schemas.openxmlformats.org/drawingml/2006/picture">
+                <pic:pic xmlns:pic="http://schemas.openxmlformats.org/drawingml/2006/picture">
+                  <pic:nvPicPr>
+                    <pic:cNvPr id="1584570686" name=""/>
+                    <pic:cNvPicPr/>
+                  </pic:nvPicPr>
+                  <pic:blipFill>
+                    <a:blip r:embed="rId72">
+                      <a:extLst>
+                        <a:ext uri="{28A0092B-C50C-407E-A947-70E740481C1C}">
+                          <a14:useLocalDpi xmlns:a14="http://schemas.microsoft.com/office/drawing/2010/main" val="0"/>
+                        </a:ext>
+                      </a:extLst>
+                    </a:blip>
+                    <a:stretch>
+                      <a:fillRect/>
+                    </a:stretch>
+                  </pic:blipFill>
+                  <pic:spPr>
+                    <a:xfrm>
+                      <a:off x="0" y="0"/>
+                      <a:ext cx="3265340" cy="2730665"/>
+                    </a:xfrm>
+                    <a:prstGeom prst="rect">
+                      <a:avLst/>
+                    </a:prstGeom>
+                  </pic:spPr>
+                </pic:pic>
+              </a:graphicData>
+            </a:graphic>
+            <wp14:sizeRelV relativeFrom="margin">
+              <wp14:pctHeight>0</wp14:pctHeight>
+            </wp14:sizeRelV>
+          </wp:anchor>
+        </w:drawing>
+      </w:r>
+      <w:r>
+        <w:drawing>
+          <wp:inline distT="0" distB="0" distL="0" distR="0" wp14:anchorId="2F8C522C" wp14:editId="47D33503">
+            <wp:extent cx="3441700" cy="2872599"/>
+            <wp:effectExtent l="0" t="0" r="6350" b="4445"/>
+            <wp:docPr id="1612336010" name="Picture 1"/>
+            <wp:cNvGraphicFramePr>
+              <a:graphicFrameLocks xmlns:a="http://schemas.openxmlformats.org/drawingml/2006/main" noChangeAspect="1"/>
+            </wp:cNvGraphicFramePr>
+            <a:graphic xmlns:a="http://schemas.openxmlformats.org/drawingml/2006/main">
+              <a:graphicData uri="http://schemas.openxmlformats.org/drawingml/2006/picture">
+                <pic:pic xmlns:pic="http://schemas.openxmlformats.org/drawingml/2006/picture">
+                  <pic:nvPicPr>
+                    <pic:cNvPr id="1612336010" name=""/>
+                    <pic:cNvPicPr/>
+                  </pic:nvPicPr>
+                  <pic:blipFill>
+                    <a:blip r:embed="rId73"/>
+                    <a:stretch>
+                      <a:fillRect/>
+                    </a:stretch>
+                  </pic:blipFill>
+                  <pic:spPr>
+                    <a:xfrm>
+                      <a:off x="0" y="0"/>
+                      <a:ext cx="3446713" cy="2876783"/>
+                    </a:xfrm>
+                    <a:prstGeom prst="rect">
+                      <a:avLst/>
+                    </a:prstGeom>
+                  </pic:spPr>
+                </pic:pic>
+              </a:graphicData>
+            </a:graphic>
+          </wp:inline>
+        </w:drawing>
+      </w:r>
+    </w:p>
+    <w:p/>
+    <w:p/>
+    <w:p>
+      <w:pPr>
+        <w:keepNext/>
+      </w:pPr>
+      <w:r>
+        <w:rPr>
+          <w:noProof/>
+        </w:rPr>
+        <mc:AlternateContent>
+          <mc:Choice Requires="wps">
+            <w:drawing>
+              <wp:anchor distT="0" distB="0" distL="114300" distR="114300" simplePos="0" relativeHeight="251687936" behindDoc="0" locked="0" layoutInCell="1" allowOverlap="1" wp14:anchorId="1FAE86C9" wp14:editId="4EF787FF">
+                <wp:simplePos x="0" y="0"/>
+                <wp:positionH relativeFrom="column">
+                  <wp:posOffset>3511550</wp:posOffset>
+                </wp:positionH>
+                <wp:positionV relativeFrom="paragraph">
+                  <wp:posOffset>2494915</wp:posOffset>
+                </wp:positionV>
+                <wp:extent cx="3021330" cy="635"/>
+                <wp:effectExtent l="0" t="0" r="0" b="0"/>
+                <wp:wrapNone/>
+                <wp:docPr id="1595151563" name="Text Box 1"/>
+                <wp:cNvGraphicFramePr/>
+                <a:graphic xmlns:a="http://schemas.openxmlformats.org/drawingml/2006/main">
+                  <a:graphicData uri="http://schemas.microsoft.com/office/word/2010/wordprocessingShape">
+                    <wps:wsp>
+                      <wps:cNvSpPr txBox="1"/>
+                      <wps:spPr>
+                        <a:xfrm>
+                          <a:off x="0" y="0"/>
+                          <a:ext cx="3021330" cy="635"/>
+                        </a:xfrm>
+                        <a:prstGeom prst="rect">
+                          <a:avLst/>
+                        </a:prstGeom>
+                        <a:solidFill>
+                          <a:prstClr val="white"/>
+                        </a:solidFill>
+                        <a:ln>
+                          <a:noFill/>
+                        </a:ln>
+                      </wps:spPr>
+                      <wps:txbx>
+                        <w:txbxContent>
+                          <w:p>
+                            <w:pPr>
+                              <w:pStyle w:val="Caption"/>
+                              <w:rPr>
+                                <w:sz w:val="22"/>
+                                <w:szCs w:val="22"/>
+                              </w:rPr>
+                            </w:pPr>
+                            <w:r>
+                              <w:t>Figure 76 Logistic Regression confusion matrix</w:t>
+                            </w:r>
+                          </w:p>
+                        </w:txbxContent>
+                      </wps:txbx>
+                      <wps:bodyPr rot="0" spcFirstLastPara="0" vertOverflow="overflow" horzOverflow="overflow" vert="horz" wrap="square" lIns="0" tIns="0" rIns="0" bIns="0" numCol="1" spcCol="0" rtlCol="0" fromWordArt="0" anchor="t" anchorCtr="0" forceAA="0" compatLnSpc="1">
+                        <a:prstTxWarp prst="textNoShape">
+                          <a:avLst/>
+                        </a:prstTxWarp>
+                        <a:spAutoFit/>
+                      </wps:bodyPr>
+                    </wps:wsp>
+                  </a:graphicData>
+                </a:graphic>
+              </wp:anchor>
+            </w:drawing>
+          </mc:Choice>
+          <mc:Fallback>
+            <w:pict>
+              <v:shape w14:anchorId="1FAE86C9" id="_x0000_s1035" type="#_x0000_t202" style="position:absolute;margin-left:276.5pt;margin-top:196.45pt;width:237.9pt;height:.05pt;z-index:251687936;visibility:visible;mso-wrap-style:square;mso-wrap-distance-left:9pt;mso-wrap-distance-top:0;mso-wrap-distance-right:9pt;mso-wrap-distance-bottom:0;mso-position-horizontal:absolute;mso-position-horizontal-relative:text;mso-position-vertical:absolute;mso-position-vertical-relative:text;v-text-anchor:top" o:gfxdata="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" stroked="f">
+                <v:textbox style="mso-fit-shape-to-text:t" inset="0,0,0,0">
+                  <w:txbxContent>
+                    <w:p>
+                      <w:pPr>
+                        <w:pStyle w:val="Caption"/>
+                        <w:rPr>
+                          <w:sz w:val="22"/>
+                          <w:szCs w:val="22"/>
+                        </w:rPr>
+                      </w:pPr>
+                      <w:r>
+                        <w:t>Figure 76 Logistic Regression confusion matrix</w:t>
+                      </w:r>
+                    </w:p>
+                  </w:txbxContent>
+                </v:textbox>
+              </v:shape>
+            </w:pict>
+          </mc:Fallback>
+        </mc:AlternateContent>
+      </w:r>
+      <w:r>
+        <w:drawing>
+          <wp:anchor distT="0" distB="0" distL="114300" distR="114300" simplePos="0" relativeHeight="251685888" behindDoc="0" locked="0" layoutInCell="1" allowOverlap="1" wp14:anchorId="68DF6E45" wp14:editId="3270AA5A">
+            <wp:simplePos x="0" y="0"/>
+            <wp:positionH relativeFrom="margin">
+              <wp:posOffset>3511550</wp:posOffset>
+            </wp:positionH>
+            <wp:positionV relativeFrom="paragraph">
+              <wp:posOffset>107315</wp:posOffset>
+            </wp:positionV>
+            <wp:extent cx="3021744" cy="2330450"/>
+            <wp:effectExtent l="0" t="0" r="7620" b="0"/>
+            <wp:wrapNone/>
+            <wp:docPr id="993049784" name="Picture 1"/>
+            <wp:cNvGraphicFramePr>
+              <a:graphicFrameLocks xmlns:a="http://schemas.openxmlformats.org/drawingml/2006/main" noChangeAspect="1"/>
+            </wp:cNvGraphicFramePr>
+            <a:graphic xmlns:a="http://schemas.openxmlformats.org/drawingml/2006/main">
+              <a:graphicData uri="http://schemas.openxmlformats.org/drawingml/2006/picture">
+                <pic:pic xmlns:pic="http://schemas.openxmlformats.org/drawingml/2006/picture">
+                  <pic:nvPicPr>
+                    <pic:cNvPr id="993049784" name=""/>
+                    <pic:cNvPicPr/>
+                  </pic:nvPicPr>
+                  <pic:blipFill>
+                    <a:blip r:embed="rId74">
+                      <a:extLst>
+                        <a:ext uri="{28A0092B-C50C-407E-A947-70E740481C1C}">
+                          <a14:useLocalDpi xmlns:a14="http://schemas.microsoft.com/office/drawing/2010/main" val="0"/>
+                        </a:ext>
+                      </a:extLst>
+                    </a:blip>
+                    <a:stretch>
+                      <a:fillRect/>
+                    </a:stretch>
+                  </pic:blipFill>
+                  <pic:spPr>
+                    <a:xfrm>
+                      <a:off x="0" y="0"/>
+                      <a:ext cx="3029139" cy="2336153"/>
+                    </a:xfrm>
+                    <a:prstGeom prst="rect">
+                      <a:avLst/>
+                    </a:prstGeom>
+                  </pic:spPr>
+                </pic:pic>
+              </a:graphicData>
+            </a:graphic>
+            <wp14:sizeRelH relativeFrom="margin">
+              <wp14:pctWidth>0</wp14:pctWidth>
+            </wp14:sizeRelH>
+            <wp14:sizeRelV relativeFrom="margin">
+              <wp14:pctHeight>0</wp14:pctHeight>
+            </wp14:sizeRelV>
+          </wp:anchor>
+        </w:drawing>
+      </w:r>
+      <w:r>
+        <w:drawing>
+          <wp:inline distT="0" distB="0" distL="0" distR="0" wp14:anchorId="08EC3548" wp14:editId="262D17E3">
+            <wp:extent cx="3194050" cy="2425670"/>
+            <wp:effectExtent l="0" t="0" r="6350" b="0"/>
+            <wp:docPr id="1839755360" name="Picture 1"/>
+            <wp:cNvGraphicFramePr>
+              <a:graphicFrameLocks xmlns:a="http://schemas.openxmlformats.org/drawingml/2006/main" noChangeAspect="1"/>
+            </wp:cNvGraphicFramePr>
+            <a:graphic xmlns:a="http://schemas.openxmlformats.org/drawingml/2006/main">
+              <a:graphicData uri="http://schemas.openxmlformats.org/drawingml/2006/picture">
+                <pic:pic xmlns:pic="http://schemas.openxmlformats.org/drawingml/2006/picture">
+                  <pic:nvPicPr>
+                    <pic:cNvPr id="1839755360" name=""/>
+                    <pic:cNvPicPr/>
+                  </pic:nvPicPr>
+                  <pic:blipFill>
+                    <a:blip r:embed="rId75"/>
+                    <a:stretch>
+                      <a:fillRect/>
+                    </a:stretch>
+                  </pic:blipFill>
+                  <pic:spPr>
+                    <a:xfrm>
+                      <a:off x="0" y="0"/>
+                      <a:ext cx="3196888" cy="2427826"/>
+                    </a:xfrm>
+                    <a:prstGeom prst="rect">
+                      <a:avLst/>
+                    </a:prstGeom>
+                  </pic:spPr>
+                </pic:pic>
+              </a:graphicData>
+            </a:graphic>
+          </wp:inline>
+        </w:drawing>
+      </w:r>
+    </w:p>
+    <w:p>
+      <w:pPr>
+        <w:pStyle w:val="Caption"/>
+      </w:pPr>
+      <w:r>
+        <w:t>Figure 75 Naive Bayes confusion matrix</w:t>
+      </w:r>
+    </w:p>
+    <w:p/>
+    <w:p>
+      <w:pPr>
+        <w:keepNext/>
+      </w:pPr>
+      <w:r>
+        <w:drawing>
+          <wp:inline distT="0" distB="0" distL="0" distR="0" wp14:anchorId="3A250458" wp14:editId="59489C51">
+            <wp:extent cx="2432050" cy="1875662"/>
+            <wp:effectExtent l="0" t="0" r="6350" b="0"/>
+            <wp:docPr id="1581118599" name="Picture 1"/>
+            <wp:cNvGraphicFramePr>
+              <a:graphicFrameLocks xmlns:a="http://schemas.openxmlformats.org/drawingml/2006/main" noChangeAspect="1"/>
+            </wp:cNvGraphicFramePr>
+            <a:graphic xmlns:a="http://schemas.openxmlformats.org/drawingml/2006/main">
+              <a:graphicData uri="http://schemas.openxmlformats.org/drawingml/2006/picture">
+                <pic:pic xmlns:pic="http://schemas.openxmlformats.org/drawingml/2006/picture">
+                  <pic:nvPicPr>
+                    <pic:cNvPr id="1581118599" name=""/>
+                    <pic:cNvPicPr/>
+                  </pic:nvPicPr>
+                  <pic:blipFill>
+                    <a:blip r:embed="rId76"/>
+                    <a:stretch>
+                      <a:fillRect/>
+                    </a:stretch>
+                  </pic:blipFill>
+                  <pic:spPr>
+                    <a:xfrm>
+                      <a:off x="0" y="0"/>
+                      <a:ext cx="2453960" cy="1892560"/>
+                    </a:xfrm>
+                    <a:prstGeom prst="rect">
+                      <a:avLst/>
+                    </a:prstGeom>
+                  </pic:spPr>
+                </pic:pic>
+              </a:graphicData>
+            </a:graphic>
+          </wp:inline>
+        </w:drawing>
+      </w:r>
+    </w:p>
+    <w:p>
+      <w:pPr>
+        <w:pStyle w:val="Caption"/>
+      </w:pPr>
+      <w:r>
+        <w:t xml:space="preserve">Figure </w:t>
+      </w:r>
+      <w:fldSimple w:instr=" SEQ Figure \* ARABIC ">
+        <w:r>
+          <w:rPr>
+            <w:noProof/>
+          </w:rPr>
+          <w:t>6</w:t>
+        </w:r>
+      </w:fldSimple>
+      <w:r>
+        <w:t xml:space="preserve"> SVM confusion matrix</w:t>
       </w:r>
     </w:p>
     <w:sectPr>

</xml_diff>

<commit_message>
talked about and analysed confusion matrices
</commit_message>
<xml_diff>
--- a/Project Spam Email Detector.docx
+++ b/Project Spam Email Detector.docx
@@ -1016,7 +1016,7 @@
               </wp:anchor>
             </w:drawing>
           </mc:Choice>
-          <mc:Fallback xmlns:w16cei="http://schemas.microsoft.com/office/word/2026/wordml/cei">
+          <mc:Fallback>
             <w:pict>
               <v:shapetype w14:anchorId="4B362868" id="_x0000_t202" coordsize="21600,21600" o:spt="202" path="m,l,21600r21600,l21600,xe">
                 <v:stroke joinstyle="miter"/>
@@ -1390,7 +1390,7 @@
               </wp:anchor>
             </w:drawing>
           </mc:Choice>
-          <mc:Fallback xmlns:w16cei="http://schemas.microsoft.com/office/word/2026/wordml/cei">
+          <mc:Fallback>
             <w:pict>
               <v:shape w14:anchorId="0F449CB2" id="_x0000_s1027" type="#_x0000_t202" style="position:absolute;margin-left:275.2pt;margin-top:186.25pt;width:225.55pt;height:.05pt;z-index:251663360;visibility:visible;mso-wrap-style:square;mso-wrap-distance-left:9pt;mso-wrap-distance-top:0;mso-wrap-distance-right:9pt;mso-wrap-distance-bottom:0;mso-position-horizontal:absolute;mso-position-horizontal-relative:text;mso-position-vertical:absolute;mso-position-vertical-relative:text;v-text-anchor:top" o:gfxdata="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" stroked="f">
                 <v:textbox style="mso-fit-shape-to-text:t" inset="0,0,0,0">
@@ -1728,7 +1728,7 @@
               </wp:anchor>
             </w:drawing>
           </mc:Choice>
-          <mc:Fallback xmlns:w16cei="http://schemas.microsoft.com/office/word/2026/wordml/cei">
+          <mc:Fallback>
             <w:pict>
               <v:shape w14:anchorId="564247D8" id="_x0000_s1028" type="#_x0000_t202" style="position:absolute;margin-left:-35.5pt;margin-top:159.45pt;width:344.5pt;height:.05pt;z-index:251666432;visibility:visible;mso-wrap-style:square;mso-wrap-distance-left:9pt;mso-wrap-distance-top:0;mso-wrap-distance-right:9pt;mso-wrap-distance-bottom:0;mso-position-horizontal:absolute;mso-position-horizontal-relative:text;mso-position-vertical:absolute;mso-position-vertical-relative:text;v-text-anchor:top" o:gfxdata="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" stroked="f">
                 <v:textbox style="mso-fit-shape-to-text:t" inset="0,0,0,0">
@@ -1885,7 +1885,7 @@
               </wp:anchor>
             </w:drawing>
           </mc:Choice>
-          <mc:Fallback xmlns:w16cei="http://schemas.microsoft.com/office/word/2026/wordml/cei">
+          <mc:Fallback>
             <w:pict>
               <v:shape w14:anchorId="1A8DB78E" id="_x0000_s1029" type="#_x0000_t202" style="position:absolute;margin-left:0;margin-top:365pt;width:490.95pt;height:.05pt;z-index:251669504;visibility:visible;mso-wrap-style:square;mso-wrap-distance-left:9pt;mso-wrap-distance-top:0;mso-wrap-distance-right:9pt;mso-wrap-distance-bottom:0;mso-position-horizontal:absolute;mso-position-horizontal-relative:text;mso-position-vertical:absolute;mso-position-vertical-relative:text;v-text-anchor:top" o:gfxdata="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" stroked="f">
                 <v:textbox style="mso-fit-shape-to-text:t" inset="0,0,0,0">
@@ -2037,15 +2037,7 @@
         <w:t>Punctuation analysis is important for this report as spam emails often use punctuation differently from legitimate emails. It is common practice within spam emails to use excessive punctuation to garner attention, create urgency, and encourage the recipient to take action immediately. For example, “</w:t>
       </w:r>
       <w:r>
-        <w:t xml:space="preserve">WINNER!! As a valued network customer you have been selected to </w:t>
-      </w:r>
-      <w:proofErr w:type="spellStart"/>
-      <w:r>
-        <w:t>receivea</w:t>
-      </w:r>
-      <w:proofErr w:type="spellEnd"/>
-      <w:r>
-        <w:t xml:space="preserve"> Â£900 prize reward! To claim call 09061701461. Claim code KL341. Valid 12 hours only.</w:t>
+        <w:t>WINNER!! As a valued network customer you have been selected to receivea Â£900 prize reward! To claim call 09061701461. Claim code KL341. Valid 12 hours only.</w:t>
       </w:r>
       <w:r>
         <w:t>” This is an example of a spam email within the dataset.</w:t>
@@ -2539,31 +2531,7 @@
         <w:t>Another way they are used within spam emails is in a more “direct” manner making a direct statement as such. For example, “</w:t>
       </w:r>
       <w:r>
-        <w:t xml:space="preserve">Want 2 get laid tonight? Want real Dogging locations sent direct 2 </w:t>
-      </w:r>
-      <w:proofErr w:type="spellStart"/>
-      <w:r>
-        <w:t>ur</w:t>
-      </w:r>
-      <w:proofErr w:type="spellEnd"/>
-      <w:r>
-        <w:t xml:space="preserve"> mob? Join the UK's largest Dogging Network </w:t>
-      </w:r>
-      <w:proofErr w:type="spellStart"/>
-      <w:r>
-        <w:t>bt</w:t>
-      </w:r>
-      <w:proofErr w:type="spellEnd"/>
-      <w:r>
-        <w:t xml:space="preserve"> </w:t>
-      </w:r>
-      <w:proofErr w:type="spellStart"/>
-      <w:r>
-        <w:t>Txting</w:t>
-      </w:r>
-      <w:proofErr w:type="spellEnd"/>
-      <w:r>
-        <w:t xml:space="preserve"> GRAVEL to 69888! Nt. ec2a. </w:t>
+        <w:t xml:space="preserve">Want 2 get laid tonight? Want real Dogging locations sent direct 2 ur mob? Join the UK's largest Dogging Network bt Txting GRAVEL to 69888! Nt. ec2a. </w:t>
       </w:r>
       <w:hyperlink r:id="rId29" w:history="1">
         <w:r>
@@ -2622,42 +2590,13 @@
         <w:t>“</w:t>
       </w:r>
       <w:r>
-        <w:t xml:space="preserve">Sunshine Quiz </w:t>
-      </w:r>
-      <w:proofErr w:type="spellStart"/>
-      <w:r>
-        <w:t>Wkly</w:t>
-      </w:r>
-      <w:proofErr w:type="spellEnd"/>
-      <w:r>
-        <w:t xml:space="preserve"> Q! Win a top Sony DVD player if u know which country the Algarve is in? Txt </w:t>
-      </w:r>
-      <w:proofErr w:type="spellStart"/>
-      <w:r>
-        <w:t>ansr</w:t>
-      </w:r>
-      <w:proofErr w:type="spellEnd"/>
-      <w:r>
-        <w:t xml:space="preserve"> to 82277. Â£1.50 </w:t>
-      </w:r>
-      <w:proofErr w:type="spellStart"/>
-      <w:r>
-        <w:t>SP:Tyrone</w:t>
-      </w:r>
-      <w:proofErr w:type="spellEnd"/>
+        <w:t>Sunshine Quiz Wkly Q! Win a top Sony DVD player if u know which country the Algarve is in? Txt ansr to 82277. Â£1.50 SP:Tyrone</w:t>
+      </w:r>
       <w:r>
         <w:t>”, “</w:t>
       </w:r>
       <w:r>
-        <w:t xml:space="preserve">You are a winner U have been specially selected 2 receive Â£1000 cash or a 4* holiday (flights </w:t>
-      </w:r>
-      <w:proofErr w:type="spellStart"/>
-      <w:r>
-        <w:t>inc</w:t>
-      </w:r>
-      <w:proofErr w:type="spellEnd"/>
-      <w:r>
-        <w:t>) speak to a live operator 2 claim 0871277810810</w:t>
+        <w:t>You are a winner U have been specially selected 2 receive Â£1000 cash or a 4* holiday (flights inc) speak to a live operator 2 claim 0871277810810</w:t>
       </w:r>
       <w:r>
         <w:t>”</w:t>
@@ -2831,7 +2770,7 @@
               </wp:anchor>
             </w:drawing>
           </mc:Choice>
-          <mc:Fallback xmlns:w16cei="http://schemas.microsoft.com/office/word/2026/wordml/cei">
+          <mc:Fallback>
             <w:pict>
               <v:shape w14:anchorId="0323F5DA" id="_x0000_s1030" type="#_x0000_t202" style="position:absolute;margin-left:305.5pt;margin-top:108.6pt;width:189.5pt;height:.05pt;z-index:251672576;visibility:visible;mso-wrap-style:square;mso-wrap-distance-left:9pt;mso-wrap-distance-top:0;mso-wrap-distance-right:9pt;mso-wrap-distance-bottom:0;mso-position-horizontal:absolute;mso-position-horizontal-relative:text;mso-position-vertical:absolute;mso-position-vertical-relative:text;v-text-anchor:top" o:gfxdata="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" stroked="f">
                 <v:textbox style="mso-fit-shape-to-text:t" inset="0,0,0,0">
@@ -3102,15 +3041,7 @@
         <w:t>and a max of 40</w:t>
       </w:r>
       <w:r>
-        <w:t>. This shows that spam emails tend to be packed with numbers within its emails due to the content of it including prices, phone numbers, “you won £</w:t>
-      </w:r>
-      <w:proofErr w:type="spellStart"/>
-      <w:r>
-        <w:t>xxxx</w:t>
-      </w:r>
-      <w:proofErr w:type="spellEnd"/>
-      <w:r>
-        <w:t>”, etc.</w:t>
+        <w:t>. This shows that spam emails tend to be packed with numbers within its emails due to the content of it including prices, phone numbers, “you won £xxxx”, etc.</w:t>
       </w:r>
     </w:p>
     <w:p/>
@@ -3306,15 +3237,7 @@
         <w:pStyle w:val="Caption"/>
       </w:pPr>
       <w:r>
-        <w:t xml:space="preserve">Figure 30 output of the </w:t>
-      </w:r>
-      <w:proofErr w:type="spellStart"/>
-      <w:r>
-        <w:t>longest_number_length</w:t>
-      </w:r>
-      <w:proofErr w:type="spellEnd"/>
-      <w:r>
-        <w:t xml:space="preserve"> and comparison code block</w:t>
+        <w:t>Figure 30 output of the longest_number_length and comparison code block</w:t>
       </w:r>
     </w:p>
     <w:p>
@@ -3557,7 +3480,7 @@
               </wp:anchor>
             </w:drawing>
           </mc:Choice>
-          <mc:Fallback xmlns:w16cei="http://schemas.microsoft.com/office/word/2026/wordml/cei">
+          <mc:Fallback>
             <w:pict>
               <v:shape w14:anchorId="666B0979" id="_x0000_s1031" type="#_x0000_t202" style="position:absolute;margin-left:314.5pt;margin-top:116.5pt;width:189.1pt;height:.05pt;z-index:251675648;visibility:visible;mso-wrap-style:square;mso-wrap-distance-left:9pt;mso-wrap-distance-top:0;mso-wrap-distance-right:9pt;mso-wrap-distance-bottom:0;mso-position-horizontal:absolute;mso-position-horizontal-relative:text;mso-position-vertical:absolute;mso-position-vertical-relative:text;v-text-anchor:top" o:gfxdata="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" stroked="f">
                 <v:textbox style="mso-fit-shape-to-text:t" inset="0,0,0,0">
@@ -3887,15 +3810,7 @@
         <w:t>What this code does is that it uses the regex module to be able to find specific text content within an email using re.findall(). First it find https text using https?. The question mark is added to mean that the s is optional. It then look for :// as that is an essential part of a link. Then I added \S+ which means to match every non-space character until a space appears, which means to combine https:// together alongside the potential site name as just one URL. For example: “</w:t>
       </w:r>
       <w:r>
-        <w:t xml:space="preserve">http://wap. </w:t>
-      </w:r>
-      <w:proofErr w:type="spellStart"/>
-      <w:r>
-        <w:t>xxxmobilemovieclub.com?n</w:t>
-      </w:r>
-      <w:proofErr w:type="spellEnd"/>
-      <w:r>
-        <w:t>=QJKGIGHJJGCBL</w:t>
+        <w:t>http://wap. xxxmobilemovieclub.com?n=QJKGIGHJJGCBL</w:t>
       </w:r>
       <w:r>
         <w:t>” this is one of the spam emails that have this within the dataset.</w:t>
@@ -4090,7 +4005,7 @@
               </wp:anchor>
             </w:drawing>
           </mc:Choice>
-          <mc:Fallback xmlns:w16cei="http://schemas.microsoft.com/office/word/2026/wordml/cei">
+          <mc:Fallback>
             <w:pict>
               <v:shape w14:anchorId="3F60554F" id="_x0000_s1032" type="#_x0000_t202" style="position:absolute;margin-left:-1.5pt;margin-top:44.75pt;width:255.25pt;height:.05pt;z-index:251678720;visibility:visible;mso-wrap-style:square;mso-wrap-distance-left:9pt;mso-wrap-distance-top:0;mso-wrap-distance-right:9pt;mso-wrap-distance-bottom:0;mso-position-horizontal:absolute;mso-position-horizontal-relative:margin;mso-position-vertical:absolute;mso-position-vertical-relative:text;v-text-anchor:top" o:gfxdata="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" stroked="f">
                 <v:textbox style="mso-fit-shape-to-text:t" inset="0,0,0,0">
@@ -4381,7 +4296,7 @@
               </wp:anchor>
             </w:drawing>
           </mc:Choice>
-          <mc:Fallback xmlns:w16cei="http://schemas.microsoft.com/office/word/2026/wordml/cei">
+          <mc:Fallback>
             <w:pict>
               <v:shape w14:anchorId="3CC90502" id="_x0000_s1033" type="#_x0000_t202" style="position:absolute;margin-left:137.35pt;margin-top:176.75pt;width:241.95pt;height:.05pt;z-index:251681792;visibility:visible;mso-wrap-style:square;mso-wrap-distance-left:9pt;mso-wrap-distance-top:0;mso-wrap-distance-right:9pt;mso-wrap-distance-bottom:0;mso-position-horizontal:absolute;mso-position-horizontal-relative:text;mso-position-vertical:absolute;mso-position-vertical-relative:text;v-text-anchor:top" o:gfxdata="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" stroked="f">
                 <v:textbox style="mso-fit-shape-to-text:t" inset="0,0,0,0">
@@ -4526,15 +4441,7 @@
     <w:p>
       <w:r>
         <w:lastRenderedPageBreak/>
-        <w:t xml:space="preserve">What it does is first converts the correlation matrix into an image with plt.imshow() where it will turn every number within the correlation matrix into a coloured square. </w:t>
-      </w:r>
-      <w:proofErr w:type="spellStart"/>
-      <w:r>
-        <w:t>cmap</w:t>
-      </w:r>
-      <w:proofErr w:type="spellEnd"/>
-      <w:r>
-        <w:t xml:space="preserve"> chooses the colour scheme. Plt.colorbar() adds the colour scale. Plt.xticks &amp; plt.yticks in this case adds labels to the x-axis and the same for the y-axis. </w:t>
+        <w:t xml:space="preserve">What it does is first converts the correlation matrix into an image with plt.imshow() where it will turn every number within the correlation matrix into a coloured square. cmap chooses the colour scheme. Plt.colorbar() adds the colour scale. Plt.xticks &amp; plt.yticks in this case adds labels to the x-axis and the same for the y-axis. </w:t>
       </w:r>
     </w:p>
     <w:p>
@@ -6329,15 +6236,7 @@
     </w:p>
     <w:p>
       <w:r>
-        <w:t xml:space="preserve">Here is the code that is used when creating the </w:t>
-      </w:r>
-      <w:proofErr w:type="spellStart"/>
-      <w:r>
-        <w:t>svm</w:t>
-      </w:r>
-      <w:proofErr w:type="spellEnd"/>
-      <w:r>
-        <w:t xml:space="preserve"> model, it is identical to how the code is constructed on the other models that were implemented. The library and module that was used to  help was again scikit learn.</w:t>
+        <w:t>Here is the code that is used when creating the svm model, it is identical to how the code is constructed on the other models that were implemented. The library and module that was used to  help was again scikit learn.</w:t>
       </w:r>
     </w:p>
     <w:p>
@@ -6576,11 +6475,7 @@
           </mc:Choice>
           <mc:Fallback>
             <w:pict>
-              <v:shapetype w14:anchorId="4B67464D" id="_x0000_t202" coordsize="21600,21600" o:spt="202" path="m,l,21600r21600,l21600,xe">
-                <v:stroke joinstyle="miter"/>
-                <v:path gradientshapeok="t" o:connecttype="rect"/>
-              </v:shapetype>
-              <v:shape id="_x0000_s1034" type="#_x0000_t202" style="position:absolute;margin-left:126pt;margin-top:235pt;width:256.45pt;height:.05pt;z-index:251684864;visibility:visible;mso-wrap-style:square;mso-wrap-distance-left:9pt;mso-wrap-distance-top:0;mso-wrap-distance-right:9pt;mso-wrap-distance-bottom:0;mso-position-horizontal:absolute;mso-position-horizontal-relative:text;mso-position-vertical:absolute;mso-position-vertical-relative:text;v-text-anchor:top" o:gfxdata="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" stroked="f">
+              <v:shape w14:anchorId="4B67464D" id="_x0000_s1034" type="#_x0000_t202" style="position:absolute;margin-left:126pt;margin-top:235pt;width:256.45pt;height:.05pt;z-index:251684864;visibility:visible;mso-wrap-style:square;mso-wrap-distance-left:9pt;mso-wrap-distance-top:0;mso-wrap-distance-right:9pt;mso-wrap-distance-bottom:0;mso-position-horizontal:absolute;mso-position-horizontal-relative:text;mso-position-vertical:absolute;mso-position-vertical-relative:text;v-text-anchor:top" o:gfxdata="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" stroked="f">
                 <v:textbox style="mso-fit-shape-to-text:t" inset="0,0,0,0">
                   <w:txbxContent>
                     <w:p>
@@ -6603,6 +6498,9 @@
         </mc:AlternateContent>
       </w:r>
       <w:r>
+        <w:rPr>
+          <w:noProof/>
+        </w:rPr>
         <w:drawing>
           <wp:anchor distT="0" distB="0" distL="114300" distR="114300" simplePos="0" relativeHeight="251682816" behindDoc="0" locked="0" layoutInCell="1" allowOverlap="1" wp14:anchorId="7E30B808" wp14:editId="58FEC717">
             <wp:simplePos x="0" y="0"/>
@@ -6657,6 +6555,9 @@
         </w:drawing>
       </w:r>
       <w:r>
+        <w:rPr>
+          <w:noProof/>
+        </w:rPr>
         <w:drawing>
           <wp:inline distT="0" distB="0" distL="0" distR="0" wp14:anchorId="2F8C522C" wp14:editId="47D33503">
             <wp:extent cx="3441700" cy="2872599"/>
@@ -6792,6 +6693,9 @@
         </mc:AlternateContent>
       </w:r>
       <w:r>
+        <w:rPr>
+          <w:noProof/>
+        </w:rPr>
         <w:drawing>
           <wp:anchor distT="0" distB="0" distL="114300" distR="114300" simplePos="0" relativeHeight="251685888" behindDoc="0" locked="0" layoutInCell="1" allowOverlap="1" wp14:anchorId="68DF6E45" wp14:editId="3270AA5A">
             <wp:simplePos x="0" y="0"/>
@@ -6849,6 +6753,9 @@
         </w:drawing>
       </w:r>
       <w:r>
+        <w:rPr>
+          <w:noProof/>
+        </w:rPr>
         <w:drawing>
           <wp:inline distT="0" distB="0" distL="0" distR="0" wp14:anchorId="08EC3548" wp14:editId="262D17E3">
             <wp:extent cx="3194050" cy="2425670"/>
@@ -6900,6 +6807,9 @@
         <w:keepNext/>
       </w:pPr>
       <w:r>
+        <w:rPr>
+          <w:noProof/>
+        </w:rPr>
         <w:drawing>
           <wp:inline distT="0" distB="0" distL="0" distR="0" wp14:anchorId="3A250458" wp14:editId="59489C51">
             <wp:extent cx="2432050" cy="1875662"/>
@@ -6944,18 +6854,120 @@
       <w:r>
         <w:t xml:space="preserve">Figure </w:t>
       </w:r>
-      <w:fldSimple w:instr=" SEQ Figure \* ARABIC ">
-        <w:r>
-          <w:rPr>
-            <w:noProof/>
-          </w:rPr>
-          <w:t>6</w:t>
-        </w:r>
-      </w:fldSimple>
+      <w:r>
+        <w:t>77</w:t>
+      </w:r>
       <w:r>
         <w:t xml:space="preserve"> SVM confusion matrix</w:t>
       </w:r>
     </w:p>
+    <w:p/>
+    <w:p>
+      <w:r>
+        <w:t>The use of confusion matrices were implemented here to investigate the types of classification errors that were produced by each model.</w:t>
+      </w:r>
+      <w:r>
+        <w:t xml:space="preserve"> </w:t>
+      </w:r>
+    </w:p>
+    <w:p/>
+    <w:p>
+      <w:r>
+        <w:rPr>
+          <w:noProof/>
+        </w:rPr>
+        <w:drawing>
+          <wp:inline distT="0" distB="0" distL="0" distR="0" wp14:anchorId="037CDEB7" wp14:editId="3B4299CE">
+            <wp:extent cx="2639952" cy="2774950"/>
+            <wp:effectExtent l="76200" t="76200" r="141605" b="139700"/>
+            <wp:docPr id="363750344" name="Picture 17"/>
+            <wp:cNvGraphicFramePr>
+              <a:graphicFrameLocks xmlns:a="http://schemas.openxmlformats.org/drawingml/2006/main" noChangeAspect="1"/>
+            </wp:cNvGraphicFramePr>
+            <a:graphic xmlns:a="http://schemas.openxmlformats.org/drawingml/2006/main">
+              <a:graphicData uri="http://schemas.openxmlformats.org/drawingml/2006/picture">
+                <pic:pic xmlns:pic="http://schemas.openxmlformats.org/drawingml/2006/picture">
+                  <pic:nvPicPr>
+                    <pic:cNvPr id="363750344" name="Picture 17"/>
+                    <pic:cNvPicPr/>
+                  </pic:nvPicPr>
+                  <pic:blipFill>
+                    <a:blip r:embed="rId77">
+                      <a:extLst>
+                        <a:ext uri="{28A0092B-C50C-407E-A947-70E740481C1C}">
+                          <a14:useLocalDpi xmlns:a14="http://schemas.microsoft.com/office/drawing/2010/main" val="0"/>
+                        </a:ext>
+                      </a:extLst>
+                    </a:blip>
+                    <a:stretch>
+                      <a:fillRect/>
+                    </a:stretch>
+                  </pic:blipFill>
+                  <pic:spPr>
+                    <a:xfrm>
+                      <a:off x="0" y="0"/>
+                      <a:ext cx="2643406" cy="2778581"/>
+                    </a:xfrm>
+                    <a:prstGeom prst="rect">
+                      <a:avLst/>
+                    </a:prstGeom>
+                    <a:ln w="38100" cap="sq">
+                      <a:solidFill>
+                        <a:srgbClr val="000000"/>
+                      </a:solidFill>
+                      <a:prstDash val="solid"/>
+                      <a:miter lim="800000"/>
+                    </a:ln>
+                    <a:effectLst>
+                      <a:outerShdw blurRad="50800" dist="38100" dir="2700000" algn="tl" rotWithShape="0">
+                        <a:srgbClr val="000000">
+                          <a:alpha val="43000"/>
+                        </a:srgbClr>
+                      </a:outerShdw>
+                    </a:effectLst>
+                  </pic:spPr>
+                </pic:pic>
+              </a:graphicData>
+            </a:graphic>
+          </wp:inline>
+        </w:drawing>
+      </w:r>
+    </w:p>
+    <w:p>
+      <w:r>
+        <w:t>This table created explains what the numbers within the boxes of the confusion matrices mean and stands for.</w:t>
+      </w:r>
+    </w:p>
+    <w:p>
+      <w:r>
+        <w:t>One particular piece that is important at this current stage are False Negatives.</w:t>
+      </w:r>
+    </w:p>
+    <w:p>
+      <w:r>
+        <w:t xml:space="preserve">With the first model Naïve Bayes, there were 118 emails correctly identified as spam and 31 that were spam incorrectly identified as ham (legitimate emails). This explains why the recall shown earlier in the classification report was 79%. </w:t>
+      </w:r>
+    </w:p>
+    <w:p>
+      <w:r>
+        <w:t>For Logistic Regression, there we 106 spam emails correctly identified as spam and 43 that</w:t>
+      </w:r>
+      <w:r>
+        <w:t xml:space="preserve"> </w:t>
+      </w:r>
+      <w:r>
+        <w:t>were incorrectly classified as ham therefore, it produced 43 false negatives which is worse than Naïve Bayes as it means this particular model had a spam recall percentage of 71.</w:t>
+      </w:r>
+      <w:r>
+        <w:t xml:space="preserve"> </w:t>
+      </w:r>
+    </w:p>
+    <w:p>
+      <w:r>
+        <w:t>With the third and final model that was trained (SVM), there were 130 spam emails correctly identified and19 that were incorrectly classified as legitimate emails. This means that SVM had 19 false negatives and compared with the other models, it clearly showcases how SVM is currently the best and strongest model in terms of accuracy and efficiency</w:t>
+      </w:r>
+    </w:p>
+    <w:p/>
     <w:sectPr>
       <w:pgSz w:w="11906" w:h="16838"/>
       <w:pgMar w:top="1440" w:right="1440" w:bottom="1440" w:left="1440" w:header="708" w:footer="708" w:gutter="0"/>
@@ -8348,6 +8360,25 @@
     <w:uiPriority w:val="99"/>
     <w:rsid w:val="00752631"/>
   </w:style>
+  <w:style w:type="table" w:styleId="TableGrid">
+    <w:name w:val="Table Grid"/>
+    <w:basedOn w:val="TableNormal"/>
+    <w:uiPriority w:val="39"/>
+    <w:rsid w:val="00DD0B22"/>
+    <w:pPr>
+      <w:spacing w:after="0" w:line="240" w:lineRule="auto"/>
+    </w:pPr>
+    <w:tblPr>
+      <w:tblBorders>
+        <w:top w:val="single" w:sz="4" w:space="0" w:color="auto"/>
+        <w:left w:val="single" w:sz="4" w:space="0" w:color="auto"/>
+        <w:bottom w:val="single" w:sz="4" w:space="0" w:color="auto"/>
+        <w:right w:val="single" w:sz="4" w:space="0" w:color="auto"/>
+        <w:insideH w:val="single" w:sz="4" w:space="0" w:color="auto"/>
+        <w:insideV w:val="single" w:sz="4" w:space="0" w:color="auto"/>
+      </w:tblBorders>
+    </w:tblPr>
+  </w:style>
 </w:styles>
 </file>
 

</xml_diff>

<commit_message>
moving on to hyperparameter tuning to see if svm model performance can be improved
</commit_message>
<xml_diff>
--- a/Project Spam Email Detector.docx
+++ b/Project Spam Email Detector.docx
@@ -2037,7 +2037,15 @@
         <w:t>Punctuation analysis is important for this report as spam emails often use punctuation differently from legitimate emails. It is common practice within spam emails to use excessive punctuation to garner attention, create urgency, and encourage the recipient to take action immediately. For example, “</w:t>
       </w:r>
       <w:r>
-        <w:t>WINNER!! As a valued network customer you have been selected to receivea Â£900 prize reward! To claim call 09061701461. Claim code KL341. Valid 12 hours only.</w:t>
+        <w:t xml:space="preserve">WINNER!! As a valued network customer you have been selected to </w:t>
+      </w:r>
+      <w:proofErr w:type="spellStart"/>
+      <w:r>
+        <w:t>receivea</w:t>
+      </w:r>
+      <w:proofErr w:type="spellEnd"/>
+      <w:r>
+        <w:t xml:space="preserve"> Â£900 prize reward! To claim call 09061701461. Claim code KL341. Valid 12 hours only.</w:t>
       </w:r>
       <w:r>
         <w:t>” This is an example of a spam email within the dataset.</w:t>
@@ -2531,7 +2539,31 @@
         <w:t>Another way they are used within spam emails is in a more “direct” manner making a direct statement as such. For example, “</w:t>
       </w:r>
       <w:r>
-        <w:t xml:space="preserve">Want 2 get laid tonight? Want real Dogging locations sent direct 2 ur mob? Join the UK's largest Dogging Network bt Txting GRAVEL to 69888! Nt. ec2a. </w:t>
+        <w:t xml:space="preserve">Want 2 get laid tonight? Want real Dogging locations sent direct 2 </w:t>
+      </w:r>
+      <w:proofErr w:type="spellStart"/>
+      <w:r>
+        <w:t>ur</w:t>
+      </w:r>
+      <w:proofErr w:type="spellEnd"/>
+      <w:r>
+        <w:t xml:space="preserve"> mob? Join the UK's largest Dogging Network </w:t>
+      </w:r>
+      <w:proofErr w:type="spellStart"/>
+      <w:r>
+        <w:t>bt</w:t>
+      </w:r>
+      <w:proofErr w:type="spellEnd"/>
+      <w:r>
+        <w:t xml:space="preserve"> </w:t>
+      </w:r>
+      <w:proofErr w:type="spellStart"/>
+      <w:r>
+        <w:t>Txting</w:t>
+      </w:r>
+      <w:proofErr w:type="spellEnd"/>
+      <w:r>
+        <w:t xml:space="preserve"> GRAVEL to 69888! Nt. ec2a. </w:t>
       </w:r>
       <w:hyperlink r:id="rId29" w:history="1">
         <w:r>
@@ -2590,13 +2622,42 @@
         <w:t>“</w:t>
       </w:r>
       <w:r>
-        <w:t>Sunshine Quiz Wkly Q! Win a top Sony DVD player if u know which country the Algarve is in? Txt ansr to 82277. Â£1.50 SP:Tyrone</w:t>
-      </w:r>
+        <w:t xml:space="preserve">Sunshine Quiz </w:t>
+      </w:r>
+      <w:proofErr w:type="spellStart"/>
+      <w:r>
+        <w:t>Wkly</w:t>
+      </w:r>
+      <w:proofErr w:type="spellEnd"/>
+      <w:r>
+        <w:t xml:space="preserve"> Q! Win a top Sony DVD player if u know which country the Algarve is in? Txt </w:t>
+      </w:r>
+      <w:proofErr w:type="spellStart"/>
+      <w:r>
+        <w:t>ansr</w:t>
+      </w:r>
+      <w:proofErr w:type="spellEnd"/>
+      <w:r>
+        <w:t xml:space="preserve"> to 82277. Â£1.50 </w:t>
+      </w:r>
+      <w:proofErr w:type="spellStart"/>
+      <w:r>
+        <w:t>SP:Tyrone</w:t>
+      </w:r>
+      <w:proofErr w:type="spellEnd"/>
       <w:r>
         <w:t>”, “</w:t>
       </w:r>
       <w:r>
-        <w:t>You are a winner U have been specially selected 2 receive Â£1000 cash or a 4* holiday (flights inc) speak to a live operator 2 claim 0871277810810</w:t>
+        <w:t xml:space="preserve">You are a winner U have been specially selected 2 receive Â£1000 cash or a 4* holiday (flights </w:t>
+      </w:r>
+      <w:proofErr w:type="spellStart"/>
+      <w:r>
+        <w:t>inc</w:t>
+      </w:r>
+      <w:proofErr w:type="spellEnd"/>
+      <w:r>
+        <w:t>) speak to a live operator 2 claim 0871277810810</w:t>
       </w:r>
       <w:r>
         <w:t>”</w:t>
@@ -3041,7 +3102,15 @@
         <w:t>and a max of 40</w:t>
       </w:r>
       <w:r>
-        <w:t>. This shows that spam emails tend to be packed with numbers within its emails due to the content of it including prices, phone numbers, “you won £xxxx”, etc.</w:t>
+        <w:t>. This shows that spam emails tend to be packed with numbers within its emails due to the content of it including prices, phone numbers, “you won £</w:t>
+      </w:r>
+      <w:proofErr w:type="spellStart"/>
+      <w:r>
+        <w:t>xxxx</w:t>
+      </w:r>
+      <w:proofErr w:type="spellEnd"/>
+      <w:r>
+        <w:t>”, etc.</w:t>
       </w:r>
     </w:p>
     <w:p/>
@@ -3237,7 +3306,15 @@
         <w:pStyle w:val="Caption"/>
       </w:pPr>
       <w:r>
-        <w:t>Figure 30 output of the longest_number_length and comparison code block</w:t>
+        <w:t xml:space="preserve">Figure 30 output of the </w:t>
+      </w:r>
+      <w:proofErr w:type="spellStart"/>
+      <w:r>
+        <w:t>longest_number_length</w:t>
+      </w:r>
+      <w:proofErr w:type="spellEnd"/>
+      <w:r>
+        <w:t xml:space="preserve"> and comparison code block</w:t>
       </w:r>
     </w:p>
     <w:p>
@@ -3810,7 +3887,15 @@
         <w:t>What this code does is that it uses the regex module to be able to find specific text content within an email using re.findall(). First it find https text using https?. The question mark is added to mean that the s is optional. It then look for :// as that is an essential part of a link. Then I added \S+ which means to match every non-space character until a space appears, which means to combine https:// together alongside the potential site name as just one URL. For example: “</w:t>
       </w:r>
       <w:r>
-        <w:t>http://wap. xxxmobilemovieclub.com?n=QJKGIGHJJGCBL</w:t>
+        <w:t xml:space="preserve">http://wap. </w:t>
+      </w:r>
+      <w:proofErr w:type="spellStart"/>
+      <w:r>
+        <w:t>xxxmobilemovieclub.com?n</w:t>
+      </w:r>
+      <w:proofErr w:type="spellEnd"/>
+      <w:r>
+        <w:t>=QJKGIGHJJGCBL</w:t>
       </w:r>
       <w:r>
         <w:t>” this is one of the spam emails that have this within the dataset.</w:t>
@@ -4441,7 +4526,15 @@
     <w:p>
       <w:r>
         <w:lastRenderedPageBreak/>
-        <w:t xml:space="preserve">What it does is first converts the correlation matrix into an image with plt.imshow() where it will turn every number within the correlation matrix into a coloured square. cmap chooses the colour scheme. Plt.colorbar() adds the colour scale. Plt.xticks &amp; plt.yticks in this case adds labels to the x-axis and the same for the y-axis. </w:t>
+        <w:t xml:space="preserve">What it does is first converts the correlation matrix into an image with plt.imshow() where it will turn every number within the correlation matrix into a coloured square. </w:t>
+      </w:r>
+      <w:proofErr w:type="spellStart"/>
+      <w:r>
+        <w:t>cmap</w:t>
+      </w:r>
+      <w:proofErr w:type="spellEnd"/>
+      <w:r>
+        <w:t xml:space="preserve"> chooses the colour scheme. Plt.colorbar() adds the colour scale. Plt.xticks &amp; plt.yticks in this case adds labels to the x-axis and the same for the y-axis. </w:t>
       </w:r>
     </w:p>
     <w:p>
@@ -6965,6 +7058,154 @@
     <w:p>
       <w:r>
         <w:t>With the third and final model that was trained (SVM), there were 130 spam emails correctly identified and19 that were incorrectly classified as legitimate emails. This means that SVM had 19 false negatives and compared with the other models, it clearly showcases how SVM is currently the best and strongest model in terms of accuracy and efficiency</w:t>
+      </w:r>
+      <w:r>
+        <w:t>.</w:t>
+      </w:r>
+    </w:p>
+    <w:p/>
+    <w:p>
+      <w:pPr>
+        <w:rPr>
+          <w:u w:val="single"/>
+        </w:rPr>
+      </w:pPr>
+      <w:r>
+        <w:rPr>
+          <w:u w:val="single"/>
+        </w:rPr>
+        <w:t>Can the performance of the SVM model be improved?</w:t>
+      </w:r>
+    </w:p>
+    <w:p>
+      <w:r>
+        <w:t>It has been established that Support Vector Machines was the best model used in terms of accuracy and overall performance with an accuracy of 98.21% and a spam recall of 0.87. However, if the spam email detector is going to be a reliable tool for detecting and differentiating spam and legitimate emails, the model has to been tuned to the limit performance wise.</w:t>
+      </w:r>
+    </w:p>
+    <w:p>
+      <w:r>
+        <w:t>One way that can be investigated to see whether changing the model’s settings can improve the performance is Hyperparameter Tuning.</w:t>
+      </w:r>
+    </w:p>
+    <w:p>
+      <w:r>
+        <w:lastRenderedPageBreak/>
+        <w:t xml:space="preserve">Hyperparameter tuning is the process of selecting the most optimised configuration settings, which are better known as hyperparameters before training a machine learning model, in order to improve accuracy and performance on unseen data. </w:t>
+      </w:r>
+      <w:r>
+        <w:t>(Belcic and Stryker, 2024)</w:t>
+      </w:r>
+      <w:r>
+        <w:t>.</w:t>
+      </w:r>
+    </w:p>
+    <w:p>
+      <w:r>
+        <w:t>In this case, a hyperparameter is a setting that will be chose before training the model. For the SVM model, an important hyperparameter is c</w:t>
+      </w:r>
+      <w:r>
+        <w:t xml:space="preserve"> and the default model that was used was svm_model = LinearSVC().</w:t>
+      </w:r>
+    </w:p>
+    <w:p>
+      <w:pPr>
+        <w:keepNext/>
+      </w:pPr>
+      <w:r>
+        <w:drawing>
+          <wp:inline distT="0" distB="0" distL="0" distR="0" wp14:anchorId="25F35687" wp14:editId="0B2BA809">
+            <wp:extent cx="3114721" cy="660400"/>
+            <wp:effectExtent l="0" t="0" r="9525" b="6350"/>
+            <wp:docPr id="1151692499" name="Picture 1"/>
+            <wp:cNvGraphicFramePr>
+              <a:graphicFrameLocks xmlns:a="http://schemas.openxmlformats.org/drawingml/2006/main" noChangeAspect="1"/>
+            </wp:cNvGraphicFramePr>
+            <a:graphic xmlns:a="http://schemas.openxmlformats.org/drawingml/2006/main">
+              <a:graphicData uri="http://schemas.openxmlformats.org/drawingml/2006/picture">
+                <pic:pic xmlns:pic="http://schemas.openxmlformats.org/drawingml/2006/picture">
+                  <pic:nvPicPr>
+                    <pic:cNvPr id="1151692499" name=""/>
+                    <pic:cNvPicPr/>
+                  </pic:nvPicPr>
+                  <pic:blipFill>
+                    <a:blip r:embed="rId78"/>
+                    <a:stretch>
+                      <a:fillRect/>
+                    </a:stretch>
+                  </pic:blipFill>
+                  <pic:spPr>
+                    <a:xfrm>
+                      <a:off x="0" y="0"/>
+                      <a:ext cx="3119662" cy="661448"/>
+                    </a:xfrm>
+                    <a:prstGeom prst="rect">
+                      <a:avLst/>
+                    </a:prstGeom>
+                  </pic:spPr>
+                </pic:pic>
+              </a:graphicData>
+            </a:graphic>
+          </wp:inline>
+        </w:drawing>
+      </w:r>
+    </w:p>
+    <w:p>
+      <w:pPr>
+        <w:pStyle w:val="Caption"/>
+      </w:pPr>
+      <w:r>
+        <w:t>Figure 78 default svm model</w:t>
+      </w:r>
+    </w:p>
+    <w:p>
+      <w:r>
+        <w:t>C controls how strong SVM tries to avoid incorrectly classifying training examples and there are different levels of this hyperparameter. A low C allows more training errors but its decision boundary is more simple and less complex, a high C penalises more training errors and tries harder to attempt to correctly classify the emails from the training data</w:t>
+      </w:r>
+    </w:p>
+    <w:p>
+      <w:r>
+        <w:t>What will commence is the different values of “c” will be tested to see which one produces the best results.</w:t>
+      </w:r>
+    </w:p>
+    <w:p>
+      <w:r>
+        <w:t>The different values of C will include:</w:t>
+      </w:r>
+    </w:p>
+    <w:p>
+      <w:r>
+        <w:t xml:space="preserve"> </w:t>
+      </w:r>
+      <w:r>
+        <w:t>C = 0.01</w:t>
+      </w:r>
+    </w:p>
+    <w:p>
+      <w:r>
+        <w:t>C = 0.1</w:t>
+      </w:r>
+    </w:p>
+    <w:p>
+      <w:r>
+        <w:t>C = 1</w:t>
+      </w:r>
+    </w:p>
+    <w:p>
+      <w:r>
+        <w:t>C = 10</w:t>
+      </w:r>
+    </w:p>
+    <w:p>
+      <w:r>
+        <w:t>C = 100</w:t>
+      </w:r>
+      <w:r>
+        <w:t>.</w:t>
+      </w:r>
+    </w:p>
+    <w:p>
+      <w:r>
+        <w:t>The original SVM (default model) effectively used C = 1.</w:t>
       </w:r>
     </w:p>
     <w:p/>
@@ -7960,7 +8201,6 @@
   <w:style w:type="character" w:default="1" w:styleId="DefaultParagraphFont">
     <w:name w:val="Default Paragraph Font"/>
     <w:uiPriority w:val="1"/>
-    <w:semiHidden/>
     <w:unhideWhenUsed/>
   </w:style>
   <w:style w:type="table" w:default="1" w:styleId="TableNormal">

</xml_diff>

<commit_message>
started testing the best c value and f1 score on hyperparameter tuning
</commit_message>
<xml_diff>
--- a/Project Spam Email Detector.docx
+++ b/Project Spam Email Detector.docx
@@ -2037,15 +2037,7 @@
         <w:t>Punctuation analysis is important for this report as spam emails often use punctuation differently from legitimate emails. It is common practice within spam emails to use excessive punctuation to garner attention, create urgency, and encourage the recipient to take action immediately. For example, “</w:t>
       </w:r>
       <w:r>
-        <w:t xml:space="preserve">WINNER!! As a valued network customer you have been selected to </w:t>
-      </w:r>
-      <w:proofErr w:type="spellStart"/>
-      <w:r>
-        <w:t>receivea</w:t>
-      </w:r>
-      <w:proofErr w:type="spellEnd"/>
-      <w:r>
-        <w:t xml:space="preserve"> Â£900 prize reward! To claim call 09061701461. Claim code KL341. Valid 12 hours only.</w:t>
+        <w:t>WINNER!! As a valued network customer you have been selected to receivea Â£900 prize reward! To claim call 09061701461. Claim code KL341. Valid 12 hours only.</w:t>
       </w:r>
       <w:r>
         <w:t>” This is an example of a spam email within the dataset.</w:t>
@@ -2539,31 +2531,7 @@
         <w:t>Another way they are used within spam emails is in a more “direct” manner making a direct statement as such. For example, “</w:t>
       </w:r>
       <w:r>
-        <w:t xml:space="preserve">Want 2 get laid tonight? Want real Dogging locations sent direct 2 </w:t>
-      </w:r>
-      <w:proofErr w:type="spellStart"/>
-      <w:r>
-        <w:t>ur</w:t>
-      </w:r>
-      <w:proofErr w:type="spellEnd"/>
-      <w:r>
-        <w:t xml:space="preserve"> mob? Join the UK's largest Dogging Network </w:t>
-      </w:r>
-      <w:proofErr w:type="spellStart"/>
-      <w:r>
-        <w:t>bt</w:t>
-      </w:r>
-      <w:proofErr w:type="spellEnd"/>
-      <w:r>
-        <w:t xml:space="preserve"> </w:t>
-      </w:r>
-      <w:proofErr w:type="spellStart"/>
-      <w:r>
-        <w:t>Txting</w:t>
-      </w:r>
-      <w:proofErr w:type="spellEnd"/>
-      <w:r>
-        <w:t xml:space="preserve"> GRAVEL to 69888! Nt. ec2a. </w:t>
+        <w:t xml:space="preserve">Want 2 get laid tonight? Want real Dogging locations sent direct 2 ur mob? Join the UK's largest Dogging Network bt Txting GRAVEL to 69888! Nt. ec2a. </w:t>
       </w:r>
       <w:hyperlink r:id="rId29" w:history="1">
         <w:r>
@@ -2622,42 +2590,13 @@
         <w:t>“</w:t>
       </w:r>
       <w:r>
-        <w:t xml:space="preserve">Sunshine Quiz </w:t>
-      </w:r>
-      <w:proofErr w:type="spellStart"/>
-      <w:r>
-        <w:t>Wkly</w:t>
-      </w:r>
-      <w:proofErr w:type="spellEnd"/>
-      <w:r>
-        <w:t xml:space="preserve"> Q! Win a top Sony DVD player if u know which country the Algarve is in? Txt </w:t>
-      </w:r>
-      <w:proofErr w:type="spellStart"/>
-      <w:r>
-        <w:t>ansr</w:t>
-      </w:r>
-      <w:proofErr w:type="spellEnd"/>
-      <w:r>
-        <w:t xml:space="preserve"> to 82277. Â£1.50 </w:t>
-      </w:r>
-      <w:proofErr w:type="spellStart"/>
-      <w:r>
-        <w:t>SP:Tyrone</w:t>
-      </w:r>
-      <w:proofErr w:type="spellEnd"/>
+        <w:t>Sunshine Quiz Wkly Q! Win a top Sony DVD player if u know which country the Algarve is in? Txt ansr to 82277. Â£1.50 SP:Tyrone</w:t>
+      </w:r>
       <w:r>
         <w:t>”, “</w:t>
       </w:r>
       <w:r>
-        <w:t xml:space="preserve">You are a winner U have been specially selected 2 receive Â£1000 cash or a 4* holiday (flights </w:t>
-      </w:r>
-      <w:proofErr w:type="spellStart"/>
-      <w:r>
-        <w:t>inc</w:t>
-      </w:r>
-      <w:proofErr w:type="spellEnd"/>
-      <w:r>
-        <w:t>) speak to a live operator 2 claim 0871277810810</w:t>
+        <w:t>You are a winner U have been specially selected 2 receive Â£1000 cash or a 4* holiday (flights inc) speak to a live operator 2 claim 0871277810810</w:t>
       </w:r>
       <w:r>
         <w:t>”</w:t>
@@ -3102,15 +3041,7 @@
         <w:t>and a max of 40</w:t>
       </w:r>
       <w:r>
-        <w:t>. This shows that spam emails tend to be packed with numbers within its emails due to the content of it including prices, phone numbers, “you won £</w:t>
-      </w:r>
-      <w:proofErr w:type="spellStart"/>
-      <w:r>
-        <w:t>xxxx</w:t>
-      </w:r>
-      <w:proofErr w:type="spellEnd"/>
-      <w:r>
-        <w:t>”, etc.</w:t>
+        <w:t>. This shows that spam emails tend to be packed with numbers within its emails due to the content of it including prices, phone numbers, “you won £xxxx”, etc.</w:t>
       </w:r>
     </w:p>
     <w:p/>
@@ -3306,15 +3237,7 @@
         <w:pStyle w:val="Caption"/>
       </w:pPr>
       <w:r>
-        <w:t xml:space="preserve">Figure 30 output of the </w:t>
-      </w:r>
-      <w:proofErr w:type="spellStart"/>
-      <w:r>
-        <w:t>longest_number_length</w:t>
-      </w:r>
-      <w:proofErr w:type="spellEnd"/>
-      <w:r>
-        <w:t xml:space="preserve"> and comparison code block</w:t>
+        <w:t>Figure 30 output of the longest_number_length and comparison code block</w:t>
       </w:r>
     </w:p>
     <w:p>
@@ -3887,15 +3810,7 @@
         <w:t>What this code does is that it uses the regex module to be able to find specific text content within an email using re.findall(). First it find https text using https?. The question mark is added to mean that the s is optional. It then look for :// as that is an essential part of a link. Then I added \S+ which means to match every non-space character until a space appears, which means to combine https:// together alongside the potential site name as just one URL. For example: “</w:t>
       </w:r>
       <w:r>
-        <w:t xml:space="preserve">http://wap. </w:t>
-      </w:r>
-      <w:proofErr w:type="spellStart"/>
-      <w:r>
-        <w:t>xxxmobilemovieclub.com?n</w:t>
-      </w:r>
-      <w:proofErr w:type="spellEnd"/>
-      <w:r>
-        <w:t>=QJKGIGHJJGCBL</w:t>
+        <w:t>http://wap. xxxmobilemovieclub.com?n=QJKGIGHJJGCBL</w:t>
       </w:r>
       <w:r>
         <w:t>” this is one of the spam emails that have this within the dataset.</w:t>
@@ -4526,15 +4441,7 @@
     <w:p>
       <w:r>
         <w:lastRenderedPageBreak/>
-        <w:t xml:space="preserve">What it does is first converts the correlation matrix into an image with plt.imshow() where it will turn every number within the correlation matrix into a coloured square. </w:t>
-      </w:r>
-      <w:proofErr w:type="spellStart"/>
-      <w:r>
-        <w:t>cmap</w:t>
-      </w:r>
-      <w:proofErr w:type="spellEnd"/>
-      <w:r>
-        <w:t xml:space="preserve"> chooses the colour scheme. Plt.colorbar() adds the colour scale. Plt.xticks &amp; plt.yticks in this case adds labels to the x-axis and the same for the y-axis. </w:t>
+        <w:t xml:space="preserve">What it does is first converts the correlation matrix into an image with plt.imshow() where it will turn every number within the correlation matrix into a coloured square. cmap chooses the colour scheme. Plt.colorbar() adds the colour scale. Plt.xticks &amp; plt.yticks in this case adds labels to the x-axis and the same for the y-axis. </w:t>
       </w:r>
     </w:p>
     <w:p>
@@ -7043,16 +6950,7 @@
     </w:p>
     <w:p>
       <w:r>
-        <w:t>For Logistic Regression, there we 106 spam emails correctly identified as spam and 43 that</w:t>
-      </w:r>
-      <w:r>
-        <w:t xml:space="preserve"> </w:t>
-      </w:r>
-      <w:r>
-        <w:t>were incorrectly classified as ham therefore, it produced 43 false negatives which is worse than Naïve Bayes as it means this particular model had a spam recall percentage of 71.</w:t>
-      </w:r>
-      <w:r>
-        <w:t xml:space="preserve"> </w:t>
+        <w:t xml:space="preserve">For Logistic Regression, there we 106 spam emails correctly identified as spam and 43 that were incorrectly classified as ham therefore, it produced 43 false negatives which is worse than Naïve Bayes as it means this particular model had a spam recall percentage of 71. </w:t>
       </w:r>
     </w:p>
     <w:p>
@@ -7112,6 +7010,9 @@
         <w:keepNext/>
       </w:pPr>
       <w:r>
+        <w:rPr>
+          <w:noProof/>
+        </w:rPr>
         <w:drawing>
           <wp:inline distT="0" distB="0" distL="0" distR="0" wp14:anchorId="25F35687" wp14:editId="0B2BA809">
             <wp:extent cx="3114721" cy="660400"/>
@@ -7174,41 +7075,193 @@
     </w:p>
     <w:p>
       <w:r>
+        <w:t xml:space="preserve"> C = 0.01</w:t>
+      </w:r>
+    </w:p>
+    <w:p>
+      <w:r>
+        <w:t>C = 0.1</w:t>
+      </w:r>
+    </w:p>
+    <w:p>
+      <w:r>
+        <w:t>C = 1</w:t>
+      </w:r>
+    </w:p>
+    <w:p>
+      <w:r>
+        <w:t>C = 10</w:t>
+      </w:r>
+    </w:p>
+    <w:p>
+      <w:r>
+        <w:t>C = 100.</w:t>
+      </w:r>
+    </w:p>
+    <w:p>
+      <w:r>
+        <w:t>The original SVM (default model) effectively used C = 1.</w:t>
+      </w:r>
+    </w:p>
+    <w:p/>
+    <w:p>
+      <w:pPr>
+        <w:keepNext/>
+      </w:pPr>
+      <w:r>
+        <w:drawing>
+          <wp:inline distT="0" distB="0" distL="0" distR="0" wp14:anchorId="28709D17" wp14:editId="114B479A">
+            <wp:extent cx="3314700" cy="2551313"/>
+            <wp:effectExtent l="0" t="0" r="0" b="1905"/>
+            <wp:docPr id="258029459" name="Picture 1"/>
+            <wp:cNvGraphicFramePr>
+              <a:graphicFrameLocks xmlns:a="http://schemas.openxmlformats.org/drawingml/2006/main" noChangeAspect="1"/>
+            </wp:cNvGraphicFramePr>
+            <a:graphic xmlns:a="http://schemas.openxmlformats.org/drawingml/2006/main">
+              <a:graphicData uri="http://schemas.openxmlformats.org/drawingml/2006/picture">
+                <pic:pic xmlns:pic="http://schemas.openxmlformats.org/drawingml/2006/picture">
+                  <pic:nvPicPr>
+                    <pic:cNvPr id="258029459" name=""/>
+                    <pic:cNvPicPr/>
+                  </pic:nvPicPr>
+                  <pic:blipFill>
+                    <a:blip r:embed="rId79"/>
+                    <a:stretch>
+                      <a:fillRect/>
+                    </a:stretch>
+                  </pic:blipFill>
+                  <pic:spPr>
+                    <a:xfrm>
+                      <a:off x="0" y="0"/>
+                      <a:ext cx="3316523" cy="2552716"/>
+                    </a:xfrm>
+                    <a:prstGeom prst="rect">
+                      <a:avLst/>
+                    </a:prstGeom>
+                  </pic:spPr>
+                </pic:pic>
+              </a:graphicData>
+            </a:graphic>
+          </wp:inline>
+        </w:drawing>
+      </w:r>
+    </w:p>
+    <w:p>
+      <w:pPr>
+        <w:pStyle w:val="Caption"/>
+      </w:pPr>
+      <w:r>
+        <w:t>Figure 79 Hyperparameter tuning code</w:t>
+      </w:r>
+    </w:p>
+    <w:p>
+      <w:r>
+        <w:lastRenderedPageBreak/>
+        <w:t xml:space="preserve">So within this code, its tests the five Cs mentioned earlier and then the scores from each are averaged, which gives a more reliable estimate of how each C value performs. GridSearchCV is a scikit-learn function that is used to perform hyperparameter tuning by training and evaluating a machine learning model using different combinations of hyperparameters. </w:t>
+      </w:r>
+      <w:r>
+        <w:t>(Verma, 2023)</w:t>
+      </w:r>
+      <w:r>
+        <w:t>.</w:t>
+      </w:r>
+    </w:p>
+    <w:p/>
+    <w:p>
+      <w:pPr>
+        <w:keepNext/>
+      </w:pPr>
+      <w:r>
+        <w:drawing>
+          <wp:inline distT="0" distB="0" distL="0" distR="0" wp14:anchorId="6F60A177" wp14:editId="7C1A9C8A">
+            <wp:extent cx="5071441" cy="495300"/>
+            <wp:effectExtent l="0" t="0" r="0" b="0"/>
+            <wp:docPr id="20077259" name="Picture 1"/>
+            <wp:cNvGraphicFramePr>
+              <a:graphicFrameLocks xmlns:a="http://schemas.openxmlformats.org/drawingml/2006/main" noChangeAspect="1"/>
+            </wp:cNvGraphicFramePr>
+            <a:graphic xmlns:a="http://schemas.openxmlformats.org/drawingml/2006/main">
+              <a:graphicData uri="http://schemas.openxmlformats.org/drawingml/2006/picture">
+                <pic:pic xmlns:pic="http://schemas.openxmlformats.org/drawingml/2006/picture">
+                  <pic:nvPicPr>
+                    <pic:cNvPr id="20077259" name=""/>
+                    <pic:cNvPicPr/>
+                  </pic:nvPicPr>
+                  <pic:blipFill>
+                    <a:blip r:embed="rId80"/>
+                    <a:stretch>
+                      <a:fillRect/>
+                    </a:stretch>
+                  </pic:blipFill>
+                  <pic:spPr>
+                    <a:xfrm>
+                      <a:off x="0" y="0"/>
+                      <a:ext cx="5078251" cy="495965"/>
+                    </a:xfrm>
+                    <a:prstGeom prst="rect">
+                      <a:avLst/>
+                    </a:prstGeom>
+                  </pic:spPr>
+                </pic:pic>
+              </a:graphicData>
+            </a:graphic>
+          </wp:inline>
+        </w:drawing>
+      </w:r>
+    </w:p>
+    <w:p>
+      <w:pPr>
+        <w:pStyle w:val="Caption"/>
+      </w:pPr>
+      <w:r>
+        <w:t>Figure 80 printing the best C value and best F1 score</w:t>
+      </w:r>
+    </w:p>
+    <w:p/>
+    <w:p>
+      <w:r>
+        <w:drawing>
+          <wp:inline distT="0" distB="0" distL="0" distR="0" wp14:anchorId="5C304789" wp14:editId="14C4374F">
+            <wp:extent cx="4080510" cy="628650"/>
+            <wp:effectExtent l="0" t="0" r="0" b="0"/>
+            <wp:docPr id="1940027437" name="Picture 1"/>
+            <wp:cNvGraphicFramePr>
+              <a:graphicFrameLocks xmlns:a="http://schemas.openxmlformats.org/drawingml/2006/main" noChangeAspect="1"/>
+            </wp:cNvGraphicFramePr>
+            <a:graphic xmlns:a="http://schemas.openxmlformats.org/drawingml/2006/main">
+              <a:graphicData uri="http://schemas.openxmlformats.org/drawingml/2006/picture">
+                <pic:pic xmlns:pic="http://schemas.openxmlformats.org/drawingml/2006/picture">
+                  <pic:nvPicPr>
+                    <pic:cNvPr id="1940027437" name=""/>
+                    <pic:cNvPicPr/>
+                  </pic:nvPicPr>
+                  <pic:blipFill>
+                    <a:blip r:embed="rId81"/>
+                    <a:stretch>
+                      <a:fillRect/>
+                    </a:stretch>
+                  </pic:blipFill>
+                  <pic:spPr>
+                    <a:xfrm>
+                      <a:off x="0" y="0"/>
+                      <a:ext cx="4085796" cy="629464"/>
+                    </a:xfrm>
+                    <a:prstGeom prst="rect">
+                      <a:avLst/>
+                    </a:prstGeom>
+                  </pic:spPr>
+                </pic:pic>
+              </a:graphicData>
+            </a:graphic>
+          </wp:inline>
+        </w:drawing>
+      </w:r>
+    </w:p>
+    <w:p>
+      <w:r>
         <w:t xml:space="preserve"> </w:t>
       </w:r>
-      <w:r>
-        <w:t>C = 0.01</w:t>
-      </w:r>
-    </w:p>
-    <w:p>
-      <w:r>
-        <w:t>C = 0.1</w:t>
-      </w:r>
-    </w:p>
-    <w:p>
-      <w:r>
-        <w:t>C = 1</w:t>
-      </w:r>
-    </w:p>
-    <w:p>
-      <w:r>
-        <w:t>C = 10</w:t>
-      </w:r>
-    </w:p>
-    <w:p>
-      <w:r>
-        <w:t>C = 100</w:t>
-      </w:r>
-      <w:r>
-        <w:t>.</w:t>
-      </w:r>
-    </w:p>
-    <w:p>
-      <w:r>
-        <w:t>The original SVM (default model) effectively used C = 1.</w:t>
-      </w:r>
-    </w:p>
-    <w:p/>
+    </w:p>
     <w:sectPr>
       <w:pgSz w:w="11906" w:h="16838"/>
       <w:pgMar w:top="1440" w:right="1440" w:bottom="1440" w:left="1440" w:header="708" w:footer="708" w:gutter="0"/>

</xml_diff>

<commit_message>
done evaluation of hyperparameter tuning and now moved on to manually creating emails to see if detector works
</commit_message>
<xml_diff>
--- a/Project Spam Email Detector.docx
+++ b/Project Spam Email Detector.docx
@@ -7219,6 +7219,9 @@
     </w:p>
     <w:p/>
     <w:p>
+      <w:pPr>
+        <w:keepNext/>
+      </w:pPr>
       <w:r>
         <w:drawing>
           <wp:inline distT="0" distB="0" distL="0" distR="0" wp14:anchorId="5C304789" wp14:editId="14C4374F">
@@ -7258,8 +7261,163 @@
       </w:r>
     </w:p>
     <w:p>
+      <w:pPr>
+        <w:pStyle w:val="Caption"/>
+      </w:pPr>
+      <w:r>
+        <w:t>Figure 81 Best C and F1 score output</w:t>
+      </w:r>
+    </w:p>
+    <w:p>
+      <w:r>
+        <w:t>From the grid search where it tested the C values, it result in C = 1 producing the best average F1 score with approximately 93.58%. This is a very interesting result because the original SVM model used the default C value with 1.</w:t>
+      </w:r>
+    </w:p>
+    <w:p>
+      <w:r>
+        <w:t>In terms of what can be gathered</w:t>
+      </w:r>
+      <w:r>
+        <w:t xml:space="preserve"> from this, the tuning did not discover a better C value and essentially confirmed that the default C was already the best among the values.</w:t>
+      </w:r>
+    </w:p>
+    <w:p>
+      <w:r>
+        <w:t>This is not the end result however as this score that was just obtained was only using the training data (X_train, y_train) and not the test data. So with this result it will be used on another function of GridSearchCV which is best_estimator and implement it on X_test to see if hyperparameter tuning has improved the original svm model accuracy.</w:t>
+      </w:r>
+    </w:p>
+    <w:p>
+      <w:pPr>
+        <w:keepNext/>
+      </w:pPr>
+      <w:r>
+        <w:drawing>
+          <wp:inline distT="0" distB="0" distL="0" distR="0" wp14:anchorId="00E72466" wp14:editId="3E6C1DCB">
+            <wp:extent cx="3187864" cy="1473276"/>
+            <wp:effectExtent l="0" t="0" r="0" b="0"/>
+            <wp:docPr id="70808034" name="Picture 1"/>
+            <wp:cNvGraphicFramePr>
+              <a:graphicFrameLocks xmlns:a="http://schemas.openxmlformats.org/drawingml/2006/main" noChangeAspect="1"/>
+            </wp:cNvGraphicFramePr>
+            <a:graphic xmlns:a="http://schemas.openxmlformats.org/drawingml/2006/main">
+              <a:graphicData uri="http://schemas.openxmlformats.org/drawingml/2006/picture">
+                <pic:pic xmlns:pic="http://schemas.openxmlformats.org/drawingml/2006/picture">
+                  <pic:nvPicPr>
+                    <pic:cNvPr id="70808034" name=""/>
+                    <pic:cNvPicPr/>
+                  </pic:nvPicPr>
+                  <pic:blipFill>
+                    <a:blip r:embed="rId82"/>
+                    <a:stretch>
+                      <a:fillRect/>
+                    </a:stretch>
+                  </pic:blipFill>
+                  <pic:spPr>
+                    <a:xfrm>
+                      <a:off x="0" y="0"/>
+                      <a:ext cx="3187864" cy="1473276"/>
+                    </a:xfrm>
+                    <a:prstGeom prst="rect">
+                      <a:avLst/>
+                    </a:prstGeom>
+                  </pic:spPr>
+                </pic:pic>
+              </a:graphicData>
+            </a:graphic>
+          </wp:inline>
+        </w:drawing>
+      </w:r>
+    </w:p>
+    <w:p>
+      <w:pPr>
+        <w:pStyle w:val="Caption"/>
+      </w:pPr>
+      <w:r>
+        <w:t>Figure 82</w:t>
+      </w:r>
+      <w:r>
+        <w:t xml:space="preserve"> evaluating tuned model on test data</w:t>
+      </w:r>
+    </w:p>
+    <w:p>
+      <w:r>
+        <w:t>Again, this is being done because GridSearchCV has only used the training data of the spam and ham emails</w:t>
+      </w:r>
+      <w:r>
+        <w:t>.</w:t>
+      </w:r>
+    </w:p>
+    <w:p/>
+    <w:p>
+      <w:pPr>
+        <w:keepNext/>
+      </w:pPr>
+      <w:r>
+        <w:lastRenderedPageBreak/>
+        <w:drawing>
+          <wp:inline distT="0" distB="0" distL="0" distR="0" wp14:anchorId="27F4E59F" wp14:editId="42B63DE5">
+            <wp:extent cx="4359082" cy="1581150"/>
+            <wp:effectExtent l="0" t="0" r="3810" b="0"/>
+            <wp:docPr id="2010662123" name="Picture 1"/>
+            <wp:cNvGraphicFramePr>
+              <a:graphicFrameLocks xmlns:a="http://schemas.openxmlformats.org/drawingml/2006/main" noChangeAspect="1"/>
+            </wp:cNvGraphicFramePr>
+            <a:graphic xmlns:a="http://schemas.openxmlformats.org/drawingml/2006/main">
+              <a:graphicData uri="http://schemas.openxmlformats.org/drawingml/2006/picture">
+                <pic:pic xmlns:pic="http://schemas.openxmlformats.org/drawingml/2006/picture">
+                  <pic:nvPicPr>
+                    <pic:cNvPr id="2010662123" name=""/>
+                    <pic:cNvPicPr/>
+                  </pic:nvPicPr>
+                  <pic:blipFill>
+                    <a:blip r:embed="rId83"/>
+                    <a:stretch>
+                      <a:fillRect/>
+                    </a:stretch>
+                  </pic:blipFill>
+                  <pic:spPr>
+                    <a:xfrm>
+                      <a:off x="0" y="0"/>
+                      <a:ext cx="4374265" cy="1586657"/>
+                    </a:xfrm>
+                    <a:prstGeom prst="rect">
+                      <a:avLst/>
+                    </a:prstGeom>
+                  </pic:spPr>
+                </pic:pic>
+              </a:graphicData>
+            </a:graphic>
+          </wp:inline>
+        </w:drawing>
+      </w:r>
+    </w:p>
+    <w:p>
+      <w:pPr>
+        <w:pStyle w:val="Caption"/>
+      </w:pPr>
+      <w:r>
+        <w:t>Figure 83 tuned model results</w:t>
+      </w:r>
+    </w:p>
+    <w:p>
+      <w:r>
+        <w:t xml:space="preserve">  </w:t>
+      </w:r>
+    </w:p>
+    <w:p>
       <w:r>
         <w:t xml:space="preserve"> </w:t>
+      </w:r>
+      <w:r>
+        <w:t>Hyperparameter tuning was performed on the SVM classifier to investigate whether adjusting the C parameter could improve classification performance. Values of 0.01, 0.1, 1, 10, and 100 were evaluated using five-fold cross validation, with F1 score used as the optimisation metric to measure precision, recall and due to the imbalance between the amount of spam and ham emails with ham having more emails than spam. The most optimal configuration was found to be C=1, providing an F1 score of 0.936. this was the default value used by the initial SVM model, when evaluated against the unseen test dataset, the tuned model achieved an accuracy of 98.21% , with a spam recall of 0.87, and an F1 score of 0.93. These results were the same as the SVM model that was trained and configured earlier.</w:t>
+      </w:r>
+    </w:p>
+    <w:p>
+      <w:r>
+        <w:t xml:space="preserve">Therefore hyperparameter tuning of C did not </w:t>
+      </w:r>
+      <w:r>
+        <w:t>provide an improvement this time, suggesting that the default SVM configuration was already well suited to the dataset</w:t>
       </w:r>
     </w:p>
     <w:sectPr>

</xml_diff>

<commit_message>
made new emails and tested them against the svm model and was successful. then talked about it on word doc. Now I will make the test more fair and realistic by adding more emails to test
</commit_message>
<xml_diff>
--- a/Project Spam Email Detector.docx
+++ b/Project Spam Email Detector.docx
@@ -2037,7 +2037,15 @@
         <w:t>Punctuation analysis is important for this report as spam emails often use punctuation differently from legitimate emails. It is common practice within spam emails to use excessive punctuation to garner attention, create urgency, and encourage the recipient to take action immediately. For example, “</w:t>
       </w:r>
       <w:r>
-        <w:t>WINNER!! As a valued network customer you have been selected to receivea Â£900 prize reward! To claim call 09061701461. Claim code KL341. Valid 12 hours only.</w:t>
+        <w:t xml:space="preserve">WINNER!! As a valued network customer you have been selected to </w:t>
+      </w:r>
+      <w:proofErr w:type="spellStart"/>
+      <w:r>
+        <w:t>receivea</w:t>
+      </w:r>
+      <w:proofErr w:type="spellEnd"/>
+      <w:r>
+        <w:t xml:space="preserve"> Â£900 prize reward! To claim call 09061701461. Claim code KL341. Valid 12 hours only.</w:t>
       </w:r>
       <w:r>
         <w:t>” This is an example of a spam email within the dataset.</w:t>
@@ -2531,7 +2539,31 @@
         <w:t>Another way they are used within spam emails is in a more “direct” manner making a direct statement as such. For example, “</w:t>
       </w:r>
       <w:r>
-        <w:t xml:space="preserve">Want 2 get laid tonight? Want real Dogging locations sent direct 2 ur mob? Join the UK's largest Dogging Network bt Txting GRAVEL to 69888! Nt. ec2a. </w:t>
+        <w:t xml:space="preserve">Want 2 get laid tonight? Want real Dogging locations sent direct 2 </w:t>
+      </w:r>
+      <w:proofErr w:type="spellStart"/>
+      <w:r>
+        <w:t>ur</w:t>
+      </w:r>
+      <w:proofErr w:type="spellEnd"/>
+      <w:r>
+        <w:t xml:space="preserve"> mob? Join the UK's largest Dogging Network </w:t>
+      </w:r>
+      <w:proofErr w:type="spellStart"/>
+      <w:r>
+        <w:t>bt</w:t>
+      </w:r>
+      <w:proofErr w:type="spellEnd"/>
+      <w:r>
+        <w:t xml:space="preserve"> </w:t>
+      </w:r>
+      <w:proofErr w:type="spellStart"/>
+      <w:r>
+        <w:t>Txting</w:t>
+      </w:r>
+      <w:proofErr w:type="spellEnd"/>
+      <w:r>
+        <w:t xml:space="preserve"> GRAVEL to 69888! Nt. ec2a. </w:t>
       </w:r>
       <w:hyperlink r:id="rId29" w:history="1">
         <w:r>
@@ -2590,13 +2622,42 @@
         <w:t>“</w:t>
       </w:r>
       <w:r>
-        <w:t>Sunshine Quiz Wkly Q! Win a top Sony DVD player if u know which country the Algarve is in? Txt ansr to 82277. Â£1.50 SP:Tyrone</w:t>
-      </w:r>
+        <w:t xml:space="preserve">Sunshine Quiz </w:t>
+      </w:r>
+      <w:proofErr w:type="spellStart"/>
+      <w:r>
+        <w:t>Wkly</w:t>
+      </w:r>
+      <w:proofErr w:type="spellEnd"/>
+      <w:r>
+        <w:t xml:space="preserve"> Q! Win a top Sony DVD player if u know which country the Algarve is in? Txt </w:t>
+      </w:r>
+      <w:proofErr w:type="spellStart"/>
+      <w:r>
+        <w:t>ansr</w:t>
+      </w:r>
+      <w:proofErr w:type="spellEnd"/>
+      <w:r>
+        <w:t xml:space="preserve"> to 82277. Â£1.50 </w:t>
+      </w:r>
+      <w:proofErr w:type="spellStart"/>
+      <w:r>
+        <w:t>SP:Tyrone</w:t>
+      </w:r>
+      <w:proofErr w:type="spellEnd"/>
       <w:r>
         <w:t>”, “</w:t>
       </w:r>
       <w:r>
-        <w:t>You are a winner U have been specially selected 2 receive Â£1000 cash or a 4* holiday (flights inc) speak to a live operator 2 claim 0871277810810</w:t>
+        <w:t xml:space="preserve">You are a winner U have been specially selected 2 receive Â£1000 cash or a 4* holiday (flights </w:t>
+      </w:r>
+      <w:proofErr w:type="spellStart"/>
+      <w:r>
+        <w:t>inc</w:t>
+      </w:r>
+      <w:proofErr w:type="spellEnd"/>
+      <w:r>
+        <w:t>) speak to a live operator 2 claim 0871277810810</w:t>
       </w:r>
       <w:r>
         <w:t>”</w:t>
@@ -3041,7 +3102,15 @@
         <w:t>and a max of 40</w:t>
       </w:r>
       <w:r>
-        <w:t>. This shows that spam emails tend to be packed with numbers within its emails due to the content of it including prices, phone numbers, “you won £xxxx”, etc.</w:t>
+        <w:t>. This shows that spam emails tend to be packed with numbers within its emails due to the content of it including prices, phone numbers, “you won £</w:t>
+      </w:r>
+      <w:proofErr w:type="spellStart"/>
+      <w:r>
+        <w:t>xxxx</w:t>
+      </w:r>
+      <w:proofErr w:type="spellEnd"/>
+      <w:r>
+        <w:t>”, etc.</w:t>
       </w:r>
     </w:p>
     <w:p/>
@@ -3237,7 +3306,15 @@
         <w:pStyle w:val="Caption"/>
       </w:pPr>
       <w:r>
-        <w:t>Figure 30 output of the longest_number_length and comparison code block</w:t>
+        <w:t xml:space="preserve">Figure 30 output of the </w:t>
+      </w:r>
+      <w:proofErr w:type="spellStart"/>
+      <w:r>
+        <w:t>longest_number_length</w:t>
+      </w:r>
+      <w:proofErr w:type="spellEnd"/>
+      <w:r>
+        <w:t xml:space="preserve"> and comparison code block</w:t>
       </w:r>
     </w:p>
     <w:p>
@@ -3810,7 +3887,15 @@
         <w:t>What this code does is that it uses the regex module to be able to find specific text content within an email using re.findall(). First it find https text using https?. The question mark is added to mean that the s is optional. It then look for :// as that is an essential part of a link. Then I added \S+ which means to match every non-space character until a space appears, which means to combine https:// together alongside the potential site name as just one URL. For example: “</w:t>
       </w:r>
       <w:r>
-        <w:t>http://wap. xxxmobilemovieclub.com?n=QJKGIGHJJGCBL</w:t>
+        <w:t xml:space="preserve">http://wap. </w:t>
+      </w:r>
+      <w:proofErr w:type="spellStart"/>
+      <w:r>
+        <w:t>xxxmobilemovieclub.com?n</w:t>
+      </w:r>
+      <w:proofErr w:type="spellEnd"/>
+      <w:r>
+        <w:t>=QJKGIGHJJGCBL</w:t>
       </w:r>
       <w:r>
         <w:t>” this is one of the spam emails that have this within the dataset.</w:t>
@@ -4441,7 +4526,15 @@
     <w:p>
       <w:r>
         <w:lastRenderedPageBreak/>
-        <w:t xml:space="preserve">What it does is first converts the correlation matrix into an image with plt.imshow() where it will turn every number within the correlation matrix into a coloured square. cmap chooses the colour scheme. Plt.colorbar() adds the colour scale. Plt.xticks &amp; plt.yticks in this case adds labels to the x-axis and the same for the y-axis. </w:t>
+        <w:t xml:space="preserve">What it does is first converts the correlation matrix into an image with plt.imshow() where it will turn every number within the correlation matrix into a coloured square. </w:t>
+      </w:r>
+      <w:proofErr w:type="spellStart"/>
+      <w:r>
+        <w:t>cmap</w:t>
+      </w:r>
+      <w:proofErr w:type="spellEnd"/>
+      <w:r>
+        <w:t xml:space="preserve"> chooses the colour scheme. Plt.colorbar() adds the colour scale. Plt.xticks &amp; plt.yticks in this case adds labels to the x-axis and the same for the y-axis. </w:t>
       </w:r>
     </w:p>
     <w:p>
@@ -7109,6 +7202,9 @@
         <w:keepNext/>
       </w:pPr>
       <w:r>
+        <w:rPr>
+          <w:noProof/>
+        </w:rPr>
         <w:drawing>
           <wp:inline distT="0" distB="0" distL="0" distR="0" wp14:anchorId="28709D17" wp14:editId="114B479A">
             <wp:extent cx="3314700" cy="2551313"/>
@@ -7172,6 +7268,9 @@
         <w:keepNext/>
       </w:pPr>
       <w:r>
+        <w:rPr>
+          <w:noProof/>
+        </w:rPr>
         <w:drawing>
           <wp:inline distT="0" distB="0" distL="0" distR="0" wp14:anchorId="6F60A177" wp14:editId="7C1A9C8A">
             <wp:extent cx="5071441" cy="495300"/>
@@ -7223,6 +7322,9 @@
         <w:keepNext/>
       </w:pPr>
       <w:r>
+        <w:rPr>
+          <w:noProof/>
+        </w:rPr>
         <w:drawing>
           <wp:inline distT="0" distB="0" distL="0" distR="0" wp14:anchorId="5C304789" wp14:editId="14C4374F">
             <wp:extent cx="4080510" cy="628650"/>
@@ -7291,6 +7393,9 @@
         <w:keepNext/>
       </w:pPr>
       <w:r>
+        <w:rPr>
+          <w:noProof/>
+        </w:rPr>
         <w:drawing>
           <wp:inline distT="0" distB="0" distL="0" distR="0" wp14:anchorId="00E72466" wp14:editId="3E6C1DCB">
             <wp:extent cx="3187864" cy="1473276"/>
@@ -7353,6 +7458,9 @@
         <w:keepNext/>
       </w:pPr>
       <w:r>
+        <w:rPr>
+          <w:noProof/>
+        </w:rPr>
         <w:lastRenderedPageBreak/>
         <w:drawing>
           <wp:inline distT="0" distB="0" distL="0" distR="0" wp14:anchorId="27F4E59F" wp14:editId="42B63DE5">
@@ -7418,6 +7526,215 @@
       </w:r>
       <w:r>
         <w:t>provide an improvement this time, suggesting that the default SVM configuration was already well suited to the dataset</w:t>
+      </w:r>
+      <w:r>
+        <w:t>.</w:t>
+      </w:r>
+    </w:p>
+    <w:p/>
+    <w:p>
+      <w:pPr>
+        <w:rPr>
+          <w:u w:val="single"/>
+        </w:rPr>
+      </w:pPr>
+      <w:r>
+        <w:rPr>
+          <w:u w:val="single"/>
+        </w:rPr>
+        <w:t>Testing the SVM model on manually made new emails:</w:t>
+      </w:r>
+    </w:p>
+    <w:p>
+      <w:r>
+        <w:t>Next, the SVM model will be tested on emails that were not originally on the Kaggle dataset to see whether the model can generalise and detect spam activity or legitimate activity on realistic, and unseen messages.</w:t>
+      </w:r>
+    </w:p>
+    <w:p/>
+    <w:p>
+      <w:pPr>
+        <w:keepNext/>
+      </w:pPr>
+      <w:r>
+        <w:drawing>
+          <wp:inline distT="0" distB="0" distL="0" distR="0" wp14:anchorId="43F72900" wp14:editId="09A8EF63">
+            <wp:extent cx="5731510" cy="1978660"/>
+            <wp:effectExtent l="0" t="0" r="2540" b="2540"/>
+            <wp:docPr id="1130897375" name="Picture 1"/>
+            <wp:cNvGraphicFramePr>
+              <a:graphicFrameLocks xmlns:a="http://schemas.openxmlformats.org/drawingml/2006/main" noChangeAspect="1"/>
+            </wp:cNvGraphicFramePr>
+            <a:graphic xmlns:a="http://schemas.openxmlformats.org/drawingml/2006/main">
+              <a:graphicData uri="http://schemas.openxmlformats.org/drawingml/2006/picture">
+                <pic:pic xmlns:pic="http://schemas.openxmlformats.org/drawingml/2006/picture">
+                  <pic:nvPicPr>
+                    <pic:cNvPr id="1130897375" name=""/>
+                    <pic:cNvPicPr/>
+                  </pic:nvPicPr>
+                  <pic:blipFill>
+                    <a:blip r:embed="rId84"/>
+                    <a:stretch>
+                      <a:fillRect/>
+                    </a:stretch>
+                  </pic:blipFill>
+                  <pic:spPr>
+                    <a:xfrm>
+                      <a:off x="0" y="0"/>
+                      <a:ext cx="5731510" cy="1978660"/>
+                    </a:xfrm>
+                    <a:prstGeom prst="rect">
+                      <a:avLst/>
+                    </a:prstGeom>
+                  </pic:spPr>
+                </pic:pic>
+              </a:graphicData>
+            </a:graphic>
+          </wp:inline>
+        </w:drawing>
+      </w:r>
+    </w:p>
+    <w:p>
+      <w:pPr>
+        <w:pStyle w:val="Caption"/>
+      </w:pPr>
+      <w:r>
+        <w:t>Figure 84 new emails created plus converting emails and predictions</w:t>
+      </w:r>
+    </w:p>
+    <w:p>
+      <w:r>
+        <w:t>Within this figure above, it displays the emails I created to test whether the model functions on unseen emails.</w:t>
+      </w:r>
+    </w:p>
+    <w:p>
+      <w:r>
+        <w:lastRenderedPageBreak/>
+        <w:t>What was also implemented was the code that converts emails via TF-IDF. Instead of earlier in the project where fit_transform() was used to learn the vocabulary from the original dataset (X = tfidf.fit_transform(</w:t>
+      </w:r>
+      <w:r>
+        <w:t>x). so it learned words such as free, winner, claim etc... thar are all predominantly included within the text content of a spam email. So the new emails need to be converted using the same vocabulary therefore, the code means to take these new emails and represent them using the vocabulary and TF-IDF rules that were already learned.</w:t>
+      </w:r>
+    </w:p>
+    <w:p>
+      <w:r>
+        <w:t>Below that line of code, is the predictions for new emails being made using the best SVM model.</w:t>
+      </w:r>
+    </w:p>
+    <w:p>
+      <w:pPr>
+        <w:keepNext/>
+      </w:pPr>
+      <w:r>
+        <w:drawing>
+          <wp:inline distT="0" distB="0" distL="0" distR="0" wp14:anchorId="52E0B345" wp14:editId="428A1D20">
+            <wp:extent cx="4041255" cy="1352550"/>
+            <wp:effectExtent l="0" t="0" r="0" b="0"/>
+            <wp:docPr id="908327723" name="Picture 1"/>
+            <wp:cNvGraphicFramePr>
+              <a:graphicFrameLocks xmlns:a="http://schemas.openxmlformats.org/drawingml/2006/main" noChangeAspect="1"/>
+            </wp:cNvGraphicFramePr>
+            <a:graphic xmlns:a="http://schemas.openxmlformats.org/drawingml/2006/main">
+              <a:graphicData uri="http://schemas.openxmlformats.org/drawingml/2006/picture">
+                <pic:pic xmlns:pic="http://schemas.openxmlformats.org/drawingml/2006/picture">
+                  <pic:nvPicPr>
+                    <pic:cNvPr id="908327723" name=""/>
+                    <pic:cNvPicPr/>
+                  </pic:nvPicPr>
+                  <pic:blipFill>
+                    <a:blip r:embed="rId85"/>
+                    <a:stretch>
+                      <a:fillRect/>
+                    </a:stretch>
+                  </pic:blipFill>
+                  <pic:spPr>
+                    <a:xfrm>
+                      <a:off x="0" y="0"/>
+                      <a:ext cx="4046759" cy="1354392"/>
+                    </a:xfrm>
+                    <a:prstGeom prst="rect">
+                      <a:avLst/>
+                    </a:prstGeom>
+                  </pic:spPr>
+                </pic:pic>
+              </a:graphicData>
+            </a:graphic>
+          </wp:inline>
+        </w:drawing>
+      </w:r>
+    </w:p>
+    <w:p>
+      <w:pPr>
+        <w:pStyle w:val="Caption"/>
+      </w:pPr>
+      <w:r>
+        <w:t>Figure 85 for loop that will label whether a email is spam or ham using svm model</w:t>
+      </w:r>
+    </w:p>
+    <w:p/>
+    <w:p>
+      <w:pPr>
+        <w:keepNext/>
+      </w:pPr>
+      <w:r>
+        <w:drawing>
+          <wp:inline distT="0" distB="0" distL="0" distR="0" wp14:anchorId="1E625663" wp14:editId="45F70BD3">
+            <wp:extent cx="5731510" cy="1125220"/>
+            <wp:effectExtent l="0" t="0" r="2540" b="0"/>
+            <wp:docPr id="1302394738" name="Picture 1"/>
+            <wp:cNvGraphicFramePr>
+              <a:graphicFrameLocks xmlns:a="http://schemas.openxmlformats.org/drawingml/2006/main" noChangeAspect="1"/>
+            </wp:cNvGraphicFramePr>
+            <a:graphic xmlns:a="http://schemas.openxmlformats.org/drawingml/2006/main">
+              <a:graphicData uri="http://schemas.openxmlformats.org/drawingml/2006/picture">
+                <pic:pic xmlns:pic="http://schemas.openxmlformats.org/drawingml/2006/picture">
+                  <pic:nvPicPr>
+                    <pic:cNvPr id="1302394738" name=""/>
+                    <pic:cNvPicPr/>
+                  </pic:nvPicPr>
+                  <pic:blipFill>
+                    <a:blip r:embed="rId86"/>
+                    <a:stretch>
+                      <a:fillRect/>
+                    </a:stretch>
+                  </pic:blipFill>
+                  <pic:spPr>
+                    <a:xfrm>
+                      <a:off x="0" y="0"/>
+                      <a:ext cx="5735035" cy="1125912"/>
+                    </a:xfrm>
+                    <a:prstGeom prst="rect">
+                      <a:avLst/>
+                    </a:prstGeom>
+                  </pic:spPr>
+                </pic:pic>
+              </a:graphicData>
+            </a:graphic>
+          </wp:inline>
+        </w:drawing>
+      </w:r>
+    </w:p>
+    <w:p>
+      <w:pPr>
+        <w:pStyle w:val="Caption"/>
+      </w:pPr>
+      <w:r>
+        <w:t>Figure 86 code output</w:t>
+      </w:r>
+    </w:p>
+    <w:p>
+      <w:r>
+        <w:t>The output shows that every email that was originally predicted as spam or ham was correctly classified. This does not mean that the model has 100% accuracy however as eight emails is to small of a sample to make such a claim, which is why for now it is just a small external test.</w:t>
+      </w:r>
+    </w:p>
+    <w:p>
+      <w:r>
+        <w:t xml:space="preserve">To </w:t>
+      </w:r>
+      <w:r>
+        <w:t xml:space="preserve">Summarise this section; to </w:t>
+      </w:r>
+      <w:r>
+        <w:t>further assess the generalisation of the final SVM model, a small external test was conducted using eight manually created email messages that were not included in either the training or testing datasets. The emails represented a mixture of spam and legitimate communication, including promotional messages, meeting arrangements, personal communication and work-related messages. The model correctly classified all eight messages, resulting in 100% accuracy for this small test. Although the sample size is too small to draw statistically significant conclusions, the results provide an initial indication that the model can generalise to previously unseen email content.</w:t>
       </w:r>
     </w:p>
     <w:sectPr>

</xml_diff>

<commit_message>
done a sample test with 30 emails (15 spam 15 ham) and evaluated results
</commit_message>
<xml_diff>
--- a/Project Spam Email Detector.docx
+++ b/Project Spam Email Detector.docx
@@ -651,14 +651,27 @@
       <w:r>
         <w:t xml:space="preserve">Figure </w:t>
       </w:r>
-      <w:fldSimple w:instr=" SEQ Figure \* ARABIC ">
-        <w:r>
-          <w:rPr>
-            <w:noProof/>
-          </w:rPr>
-          <w:t>1</w:t>
-        </w:r>
-      </w:fldSimple>
+      <w:r>
+        <w:fldChar w:fldCharType="begin"/>
+      </w:r>
+      <w:r>
+        <w:instrText xml:space="preserve"> SEQ Figure \* ARABIC </w:instrText>
+      </w:r>
+      <w:r>
+        <w:fldChar w:fldCharType="separate"/>
+      </w:r>
+      <w:r>
+        <w:rPr>
+          <w:noProof/>
+        </w:rPr>
+        <w:t>1</w:t>
+      </w:r>
+      <w:r>
+        <w:rPr>
+          <w:noProof/>
+        </w:rPr>
+        <w:fldChar w:fldCharType="end"/>
+      </w:r>
       <w:r>
         <w:t xml:space="preserve"> containing number of emails vs spam emails sent</w:t>
       </w:r>
@@ -734,14 +747,27 @@
       <w:r>
         <w:t xml:space="preserve">Figure </w:t>
       </w:r>
-      <w:fldSimple w:instr=" SEQ Figure \* ARABIC ">
-        <w:r>
-          <w:rPr>
-            <w:noProof/>
-          </w:rPr>
-          <w:t>2</w:t>
-        </w:r>
-      </w:fldSimple>
+      <w:r>
+        <w:fldChar w:fldCharType="begin"/>
+      </w:r>
+      <w:r>
+        <w:instrText xml:space="preserve"> SEQ Figure \* ARABIC </w:instrText>
+      </w:r>
+      <w:r>
+        <w:fldChar w:fldCharType="separate"/>
+      </w:r>
+      <w:r>
+        <w:rPr>
+          <w:noProof/>
+        </w:rPr>
+        <w:t>2</w:t>
+      </w:r>
+      <w:r>
+        <w:rPr>
+          <w:noProof/>
+        </w:rPr>
+        <w:fldChar w:fldCharType="end"/>
+      </w:r>
       <w:r>
         <w:t xml:space="preserve"> the most common topics people see in spam emails they receive</w:t>
       </w:r>
@@ -805,14 +831,27 @@
       <w:r>
         <w:t xml:space="preserve">Figure </w:t>
       </w:r>
-      <w:fldSimple w:instr=" SEQ Figure \* ARABIC ">
-        <w:r>
-          <w:rPr>
-            <w:noProof/>
-          </w:rPr>
-          <w:t>3</w:t>
-        </w:r>
-      </w:fldSimple>
+      <w:r>
+        <w:fldChar w:fldCharType="begin"/>
+      </w:r>
+      <w:r>
+        <w:instrText xml:space="preserve"> SEQ Figure \* ARABIC </w:instrText>
+      </w:r>
+      <w:r>
+        <w:fldChar w:fldCharType="separate"/>
+      </w:r>
+      <w:r>
+        <w:rPr>
+          <w:noProof/>
+        </w:rPr>
+        <w:t>3</w:t>
+      </w:r>
+      <w:r>
+        <w:rPr>
+          <w:noProof/>
+        </w:rPr>
+        <w:fldChar w:fldCharType="end"/>
+      </w:r>
       <w:r>
         <w:t xml:space="preserve"> Average monthly spam call received by age and gender</w:t>
       </w:r>
@@ -919,14 +958,27 @@
       <w:r>
         <w:t xml:space="preserve">Figure </w:t>
       </w:r>
-      <w:fldSimple w:instr=" SEQ Figure \* ARABIC ">
-        <w:r>
-          <w:rPr>
-            <w:noProof/>
-          </w:rPr>
-          <w:t>4</w:t>
-        </w:r>
-      </w:fldSimple>
+      <w:r>
+        <w:fldChar w:fldCharType="begin"/>
+      </w:r>
+      <w:r>
+        <w:instrText xml:space="preserve"> SEQ Figure \* ARABIC </w:instrText>
+      </w:r>
+      <w:r>
+        <w:fldChar w:fldCharType="separate"/>
+      </w:r>
+      <w:r>
+        <w:rPr>
+          <w:noProof/>
+        </w:rPr>
+        <w:t>4</w:t>
+      </w:r>
+      <w:r>
+        <w:rPr>
+          <w:noProof/>
+        </w:rPr>
+        <w:fldChar w:fldCharType="end"/>
+      </w:r>
       <w:r>
         <w:t xml:space="preserve"> loading spam email dataset into my python file</w:t>
       </w:r>
@@ -1161,14 +1213,27 @@
       <w:r>
         <w:t xml:space="preserve">Figure </w:t>
       </w:r>
-      <w:fldSimple w:instr=" SEQ Figure \* ARABIC ">
-        <w:r>
-          <w:rPr>
-            <w:noProof/>
-          </w:rPr>
-          <w:t>5</w:t>
-        </w:r>
-      </w:fldSimple>
+      <w:r>
+        <w:fldChar w:fldCharType="begin"/>
+      </w:r>
+      <w:r>
+        <w:instrText xml:space="preserve"> SEQ Figure \* ARABIC </w:instrText>
+      </w:r>
+      <w:r>
+        <w:fldChar w:fldCharType="separate"/>
+      </w:r>
+      <w:r>
+        <w:rPr>
+          <w:noProof/>
+        </w:rPr>
+        <w:t>5</w:t>
+      </w:r>
+      <w:r>
+        <w:rPr>
+          <w:noProof/>
+        </w:rPr>
+        <w:fldChar w:fldCharType="end"/>
+      </w:r>
       <w:r>
         <w:t xml:space="preserve"> Bar chart showcasing the number of spam and ham emails</w:t>
       </w:r>
@@ -7048,7 +7113,13 @@
     </w:p>
     <w:p>
       <w:r>
-        <w:t>With the third and final model that was trained (SVM), there were 130 spam emails correctly identified and19 that were incorrectly classified as legitimate emails. This means that SVM had 19 false negatives and compared with the other models, it clearly showcases how SVM is currently the best and strongest model in terms of accuracy and efficiency</w:t>
+        <w:t>With the third and final model that was trained (SVM), there were 130 spam emails correctly identified and</w:t>
+      </w:r>
+      <w:r>
+        <w:t xml:space="preserve"> </w:t>
+      </w:r>
+      <w:r>
+        <w:t>19 that were incorrectly classified as legitimate emails. This means that SVM had 19 false negatives and compared with the other models, it clearly showcases how SVM is currently the best and strongest model in terms of accuracy and efficiency</w:t>
       </w:r>
       <w:r>
         <w:t>.</w:t>
@@ -7737,6 +7808,551 @@
         <w:t>further assess the generalisation of the final SVM model, a small external test was conducted using eight manually created email messages that were not included in either the training or testing datasets. The emails represented a mixture of spam and legitimate communication, including promotional messages, meeting arrangements, personal communication and work-related messages. The model correctly classified all eight messages, resulting in 100% accuracy for this small test. Although the sample size is too small to draw statistically significant conclusions, the results provide an initial indication that the model can generalise to previously unseen email content.</w:t>
       </w:r>
     </w:p>
+    <w:p/>
+    <w:p>
+      <w:pPr>
+        <w:rPr>
+          <w:u w:val="single"/>
+        </w:rPr>
+      </w:pPr>
+      <w:r>
+        <w:rPr>
+          <w:u w:val="single"/>
+        </w:rPr>
+        <w:t>Bigger Sample Test</w:t>
+      </w:r>
+      <w:r>
+        <w:rPr>
+          <w:u w:val="single"/>
+        </w:rPr>
+        <w:t>:</w:t>
+      </w:r>
+    </w:p>
+    <w:p>
+      <w:r>
+        <w:t>30 emails were made and added to make it a fairer test and to see if this model is still accurate and efficient when dealing with a larger amount of unseen emails.</w:t>
+      </w:r>
+    </w:p>
+    <w:p>
+      <w:pPr>
+        <w:keepNext/>
+      </w:pPr>
+      <w:r>
+        <w:lastRenderedPageBreak/>
+        <w:drawing>
+          <wp:inline distT="0" distB="0" distL="0" distR="0" wp14:anchorId="5BB23C41" wp14:editId="2E5B57BA">
+            <wp:extent cx="5731510" cy="2879725"/>
+            <wp:effectExtent l="0" t="0" r="2540" b="0"/>
+            <wp:docPr id="993620393" name="Picture 1"/>
+            <wp:cNvGraphicFramePr>
+              <a:graphicFrameLocks xmlns:a="http://schemas.openxmlformats.org/drawingml/2006/main" noChangeAspect="1"/>
+            </wp:cNvGraphicFramePr>
+            <a:graphic xmlns:a="http://schemas.openxmlformats.org/drawingml/2006/main">
+              <a:graphicData uri="http://schemas.openxmlformats.org/drawingml/2006/picture">
+                <pic:pic xmlns:pic="http://schemas.openxmlformats.org/drawingml/2006/picture">
+                  <pic:nvPicPr>
+                    <pic:cNvPr id="993620393" name=""/>
+                    <pic:cNvPicPr/>
+                  </pic:nvPicPr>
+                  <pic:blipFill>
+                    <a:blip r:embed="rId87"/>
+                    <a:stretch>
+                      <a:fillRect/>
+                    </a:stretch>
+                  </pic:blipFill>
+                  <pic:spPr>
+                    <a:xfrm>
+                      <a:off x="0" y="0"/>
+                      <a:ext cx="5731510" cy="2879725"/>
+                    </a:xfrm>
+                    <a:prstGeom prst="rect">
+                      <a:avLst/>
+                    </a:prstGeom>
+                  </pic:spPr>
+                </pic:pic>
+              </a:graphicData>
+            </a:graphic>
+          </wp:inline>
+        </w:drawing>
+      </w:r>
+    </w:p>
+    <w:p>
+      <w:pPr>
+        <w:pStyle w:val="Caption"/>
+      </w:pPr>
+      <w:r>
+        <w:t>Figure 87 15 spam and 15 ham emails were added</w:t>
+      </w:r>
+    </w:p>
+    <w:p/>
+    <w:p>
+      <w:pPr>
+        <w:keepNext/>
+      </w:pPr>
+      <w:r>
+        <w:drawing>
+          <wp:inline distT="0" distB="0" distL="0" distR="0" wp14:anchorId="122AD60A" wp14:editId="106202B9">
+            <wp:extent cx="1549480" cy="1606633"/>
+            <wp:effectExtent l="0" t="0" r="0" b="0"/>
+            <wp:docPr id="1347098204" name="Picture 1"/>
+            <wp:cNvGraphicFramePr>
+              <a:graphicFrameLocks xmlns:a="http://schemas.openxmlformats.org/drawingml/2006/main" noChangeAspect="1"/>
+            </wp:cNvGraphicFramePr>
+            <a:graphic xmlns:a="http://schemas.openxmlformats.org/drawingml/2006/main">
+              <a:graphicData uri="http://schemas.openxmlformats.org/drawingml/2006/picture">
+                <pic:pic xmlns:pic="http://schemas.openxmlformats.org/drawingml/2006/picture">
+                  <pic:nvPicPr>
+                    <pic:cNvPr id="1347098204" name=""/>
+                    <pic:cNvPicPr/>
+                  </pic:nvPicPr>
+                  <pic:blipFill>
+                    <a:blip r:embed="rId88"/>
+                    <a:stretch>
+                      <a:fillRect/>
+                    </a:stretch>
+                  </pic:blipFill>
+                  <pic:spPr>
+                    <a:xfrm>
+                      <a:off x="0" y="0"/>
+                      <a:ext cx="1549480" cy="1606633"/>
+                    </a:xfrm>
+                    <a:prstGeom prst="rect">
+                      <a:avLst/>
+                    </a:prstGeom>
+                  </pic:spPr>
+                </pic:pic>
+              </a:graphicData>
+            </a:graphic>
+          </wp:inline>
+        </w:drawing>
+      </w:r>
+    </w:p>
+    <w:p>
+      <w:pPr>
+        <w:pStyle w:val="Caption"/>
+      </w:pPr>
+      <w:r>
+        <w:t>Figure 88 labels that show which emails are spam and ham before testing to see if predicted results are the same</w:t>
+      </w:r>
+    </w:p>
+    <w:p/>
+    <w:p>
+      <w:pPr>
+        <w:keepNext/>
+      </w:pPr>
+      <w:r>
+        <w:drawing>
+          <wp:inline distT="0" distB="0" distL="0" distR="0" wp14:anchorId="473D2A1F" wp14:editId="1085BA23">
+            <wp:extent cx="3797495" cy="1714588"/>
+            <wp:effectExtent l="0" t="0" r="0" b="0"/>
+            <wp:docPr id="2077971313" name="Picture 1"/>
+            <wp:cNvGraphicFramePr>
+              <a:graphicFrameLocks xmlns:a="http://schemas.openxmlformats.org/drawingml/2006/main" noChangeAspect="1"/>
+            </wp:cNvGraphicFramePr>
+            <a:graphic xmlns:a="http://schemas.openxmlformats.org/drawingml/2006/main">
+              <a:graphicData uri="http://schemas.openxmlformats.org/drawingml/2006/picture">
+                <pic:pic xmlns:pic="http://schemas.openxmlformats.org/drawingml/2006/picture">
+                  <pic:nvPicPr>
+                    <pic:cNvPr id="2077971313" name=""/>
+                    <pic:cNvPicPr/>
+                  </pic:nvPicPr>
+                  <pic:blipFill>
+                    <a:blip r:embed="rId89"/>
+                    <a:stretch>
+                      <a:fillRect/>
+                    </a:stretch>
+                  </pic:blipFill>
+                  <pic:spPr>
+                    <a:xfrm>
+                      <a:off x="0" y="0"/>
+                      <a:ext cx="3797495" cy="1714588"/>
+                    </a:xfrm>
+                    <a:prstGeom prst="rect">
+                      <a:avLst/>
+                    </a:prstGeom>
+                  </pic:spPr>
+                </pic:pic>
+              </a:graphicData>
+            </a:graphic>
+          </wp:inline>
+        </w:drawing>
+      </w:r>
+    </w:p>
+    <w:p>
+      <w:pPr>
+        <w:pStyle w:val="Caption"/>
+      </w:pPr>
+      <w:r>
+        <w:t>Figure 89 code that displays the actual category and predicted if it is spam or ham</w:t>
+      </w:r>
+    </w:p>
+    <w:p>
+      <w:r>
+        <w:t>With this code it actually shows the actual category under the predicted category to give a better visualisation if the prediction was correct.</w:t>
+      </w:r>
+    </w:p>
+    <w:p>
+      <w:pPr>
+        <w:keepNext/>
+      </w:pPr>
+      <w:r>
+        <w:lastRenderedPageBreak/>
+        <w:drawing>
+          <wp:inline distT="0" distB="0" distL="0" distR="0" wp14:anchorId="17E10DA5" wp14:editId="2FD527C4">
+            <wp:extent cx="2673487" cy="1797142"/>
+            <wp:effectExtent l="0" t="0" r="0" b="0"/>
+            <wp:docPr id="1001931467" name="Picture 1"/>
+            <wp:cNvGraphicFramePr>
+              <a:graphicFrameLocks xmlns:a="http://schemas.openxmlformats.org/drawingml/2006/main" noChangeAspect="1"/>
+            </wp:cNvGraphicFramePr>
+            <a:graphic xmlns:a="http://schemas.openxmlformats.org/drawingml/2006/main">
+              <a:graphicData uri="http://schemas.openxmlformats.org/drawingml/2006/picture">
+                <pic:pic xmlns:pic="http://schemas.openxmlformats.org/drawingml/2006/picture">
+                  <pic:nvPicPr>
+                    <pic:cNvPr id="1001931467" name=""/>
+                    <pic:cNvPicPr/>
+                  </pic:nvPicPr>
+                  <pic:blipFill>
+                    <a:blip r:embed="rId90"/>
+                    <a:stretch>
+                      <a:fillRect/>
+                    </a:stretch>
+                  </pic:blipFill>
+                  <pic:spPr>
+                    <a:xfrm>
+                      <a:off x="0" y="0"/>
+                      <a:ext cx="2673487" cy="1797142"/>
+                    </a:xfrm>
+                    <a:prstGeom prst="rect">
+                      <a:avLst/>
+                    </a:prstGeom>
+                  </pic:spPr>
+                </pic:pic>
+              </a:graphicData>
+            </a:graphic>
+          </wp:inline>
+        </w:drawing>
+      </w:r>
+    </w:p>
+    <w:p>
+      <w:pPr>
+        <w:pStyle w:val="Caption"/>
+      </w:pPr>
+      <w:r>
+        <w:t>Figure 90 accuracy score check and classification report</w:t>
+      </w:r>
+    </w:p>
+    <w:p/>
+    <w:p>
+      <w:r>
+        <w:t>Out of the 30 emails made, 4 were incorrect giving it a 86.67% accuracy score.</w:t>
+      </w:r>
+    </w:p>
+    <w:p>
+      <w:r>
+        <w:t>The 4 emails that were incorrectly predicted:</w:t>
+      </w:r>
+    </w:p>
+    <w:p>
+      <w:pPr>
+        <w:keepNext/>
+      </w:pPr>
+      <w:r>
+        <w:drawing>
+          <wp:inline distT="0" distB="0" distL="0" distR="0" wp14:anchorId="6362AE42" wp14:editId="0C84F1D1">
+            <wp:extent cx="6094693" cy="514350"/>
+            <wp:effectExtent l="0" t="0" r="1905" b="0"/>
+            <wp:docPr id="536454919" name="Picture 1"/>
+            <wp:cNvGraphicFramePr>
+              <a:graphicFrameLocks xmlns:a="http://schemas.openxmlformats.org/drawingml/2006/main" noChangeAspect="1"/>
+            </wp:cNvGraphicFramePr>
+            <a:graphic xmlns:a="http://schemas.openxmlformats.org/drawingml/2006/main">
+              <a:graphicData uri="http://schemas.openxmlformats.org/drawingml/2006/picture">
+                <pic:pic xmlns:pic="http://schemas.openxmlformats.org/drawingml/2006/picture">
+                  <pic:nvPicPr>
+                    <pic:cNvPr id="536454919" name=""/>
+                    <pic:cNvPicPr/>
+                  </pic:nvPicPr>
+                  <pic:blipFill>
+                    <a:blip r:embed="rId91"/>
+                    <a:stretch>
+                      <a:fillRect/>
+                    </a:stretch>
+                  </pic:blipFill>
+                  <pic:spPr>
+                    <a:xfrm>
+                      <a:off x="0" y="0"/>
+                      <a:ext cx="6103785" cy="515117"/>
+                    </a:xfrm>
+                    <a:prstGeom prst="rect">
+                      <a:avLst/>
+                    </a:prstGeom>
+                  </pic:spPr>
+                </pic:pic>
+              </a:graphicData>
+            </a:graphic>
+          </wp:inline>
+        </w:drawing>
+      </w:r>
+    </w:p>
+    <w:p>
+      <w:pPr>
+        <w:pStyle w:val="Caption"/>
+      </w:pPr>
+      <w:r>
+        <w:t>Figure 91 incorrect email 1</w:t>
+      </w:r>
+    </w:p>
+    <w:p>
+      <w:r>
+        <w:t xml:space="preserve">Although this is clearly spam to a human, it may contain words that also appear in legitimate emails within </w:t>
+      </w:r>
+      <w:r>
+        <w:t>the</w:t>
+      </w:r>
+      <w:r>
+        <w:t xml:space="preserve"> training data.</w:t>
+      </w:r>
+    </w:p>
+    <w:p/>
+    <w:p>
+      <w:pPr>
+        <w:keepNext/>
+      </w:pPr>
+      <w:r>
+        <w:drawing>
+          <wp:inline distT="0" distB="0" distL="0" distR="0" wp14:anchorId="35A85534" wp14:editId="3DB9012B">
+            <wp:extent cx="5731510" cy="457200"/>
+            <wp:effectExtent l="0" t="0" r="2540" b="0"/>
+            <wp:docPr id="1374676193" name="Picture 1"/>
+            <wp:cNvGraphicFramePr>
+              <a:graphicFrameLocks xmlns:a="http://schemas.openxmlformats.org/drawingml/2006/main" noChangeAspect="1"/>
+            </wp:cNvGraphicFramePr>
+            <a:graphic xmlns:a="http://schemas.openxmlformats.org/drawingml/2006/main">
+              <a:graphicData uri="http://schemas.openxmlformats.org/drawingml/2006/picture">
+                <pic:pic xmlns:pic="http://schemas.openxmlformats.org/drawingml/2006/picture">
+                  <pic:nvPicPr>
+                    <pic:cNvPr id="1374676193" name=""/>
+                    <pic:cNvPicPr/>
+                  </pic:nvPicPr>
+                  <pic:blipFill>
+                    <a:blip r:embed="rId92"/>
+                    <a:stretch>
+                      <a:fillRect/>
+                    </a:stretch>
+                  </pic:blipFill>
+                  <pic:spPr>
+                    <a:xfrm>
+                      <a:off x="0" y="0"/>
+                      <a:ext cx="5731510" cy="457200"/>
+                    </a:xfrm>
+                    <a:prstGeom prst="rect">
+                      <a:avLst/>
+                    </a:prstGeom>
+                  </pic:spPr>
+                </pic:pic>
+              </a:graphicData>
+            </a:graphic>
+          </wp:inline>
+        </w:drawing>
+      </w:r>
+    </w:p>
+    <w:p>
+      <w:pPr>
+        <w:pStyle w:val="Caption"/>
+      </w:pPr>
+      <w:r>
+        <w:t>Figure 92 Incorrect email 2</w:t>
+      </w:r>
+    </w:p>
+    <w:p>
+      <w:r>
+        <w:t>This is another example of financial/investment spam that may not have enough distinctive vocabulary for the model to confidently classify it as spam.</w:t>
+      </w:r>
+    </w:p>
+    <w:p>
+      <w:pPr>
+        <w:keepNext/>
+      </w:pPr>
+      <w:r>
+        <w:drawing>
+          <wp:inline distT="0" distB="0" distL="0" distR="0" wp14:anchorId="62319B3A" wp14:editId="6878B283">
+            <wp:extent cx="6115941" cy="444500"/>
+            <wp:effectExtent l="0" t="0" r="0" b="0"/>
+            <wp:docPr id="88257789" name="Picture 1"/>
+            <wp:cNvGraphicFramePr>
+              <a:graphicFrameLocks xmlns:a="http://schemas.openxmlformats.org/drawingml/2006/main" noChangeAspect="1"/>
+            </wp:cNvGraphicFramePr>
+            <a:graphic xmlns:a="http://schemas.openxmlformats.org/drawingml/2006/main">
+              <a:graphicData uri="http://schemas.openxmlformats.org/drawingml/2006/picture">
+                <pic:pic xmlns:pic="http://schemas.openxmlformats.org/drawingml/2006/picture">
+                  <pic:nvPicPr>
+                    <pic:cNvPr id="88257789" name=""/>
+                    <pic:cNvPicPr/>
+                  </pic:nvPicPr>
+                  <pic:blipFill>
+                    <a:blip r:embed="rId93"/>
+                    <a:stretch>
+                      <a:fillRect/>
+                    </a:stretch>
+                  </pic:blipFill>
+                  <pic:spPr>
+                    <a:xfrm>
+                      <a:off x="0" y="0"/>
+                      <a:ext cx="6120764" cy="444851"/>
+                    </a:xfrm>
+                    <a:prstGeom prst="rect">
+                      <a:avLst/>
+                    </a:prstGeom>
+                  </pic:spPr>
+                </pic:pic>
+              </a:graphicData>
+            </a:graphic>
+          </wp:inline>
+        </w:drawing>
+      </w:r>
+    </w:p>
+    <w:p>
+      <w:pPr>
+        <w:pStyle w:val="Caption"/>
+      </w:pPr>
+      <w:r>
+        <w:t>Figure 93 Incorrect email 3</w:t>
+      </w:r>
+    </w:p>
+    <w:p>
+      <w:r>
+        <w:t xml:space="preserve">This email has common phishing, scam vocabulary patterns so the fact is was distinguished as ham is surprising. </w:t>
+      </w:r>
+    </w:p>
+    <w:p>
+      <w:pPr>
+        <w:keepNext/>
+      </w:pPr>
+      <w:r>
+        <w:drawing>
+          <wp:inline distT="0" distB="0" distL="0" distR="0" wp14:anchorId="6BA9AA6B" wp14:editId="0E3BAFB5">
+            <wp:extent cx="5731510" cy="425450"/>
+            <wp:effectExtent l="0" t="0" r="2540" b="0"/>
+            <wp:docPr id="1893218811" name="Picture 1"/>
+            <wp:cNvGraphicFramePr>
+              <a:graphicFrameLocks xmlns:a="http://schemas.openxmlformats.org/drawingml/2006/main" noChangeAspect="1"/>
+            </wp:cNvGraphicFramePr>
+            <a:graphic xmlns:a="http://schemas.openxmlformats.org/drawingml/2006/main">
+              <a:graphicData uri="http://schemas.openxmlformats.org/drawingml/2006/picture">
+                <pic:pic xmlns:pic="http://schemas.openxmlformats.org/drawingml/2006/picture">
+                  <pic:nvPicPr>
+                    <pic:cNvPr id="1893218811" name=""/>
+                    <pic:cNvPicPr/>
+                  </pic:nvPicPr>
+                  <pic:blipFill>
+                    <a:blip r:embed="rId94"/>
+                    <a:stretch>
+                      <a:fillRect/>
+                    </a:stretch>
+                  </pic:blipFill>
+                  <pic:spPr>
+                    <a:xfrm>
+                      <a:off x="0" y="0"/>
+                      <a:ext cx="5731510" cy="425450"/>
+                    </a:xfrm>
+                    <a:prstGeom prst="rect">
+                      <a:avLst/>
+                    </a:prstGeom>
+                  </pic:spPr>
+                </pic:pic>
+              </a:graphicData>
+            </a:graphic>
+          </wp:inline>
+        </w:drawing>
+      </w:r>
+    </w:p>
+    <w:p>
+      <w:pPr>
+        <w:pStyle w:val="Caption"/>
+      </w:pPr>
+      <w:r>
+        <w:t>Figure 94 Incorrect email 4</w:t>
+      </w:r>
+    </w:p>
+    <w:p/>
+    <w:p>
+      <w:r>
+        <w:t>This can be seen as a limitation when compared with the original test result.</w:t>
+      </w:r>
+    </w:p>
+    <w:p>
+      <w:r>
+        <w:lastRenderedPageBreak/>
+        <w:t>The original test result was 98.21% whereas with this external test, it has an accuracy of 86.67%.</w:t>
+      </w:r>
+    </w:p>
+    <w:p>
+      <w:r>
+        <w:t>What can be interpreted from this is that the model performs well when classifying emails that follow the patterns found in the Kaggle dataset, but its performance decreases when presented with manually created emails containing different vocabulary and phrasing. However, when presented with more data more emails the same amount as the original test data, the accuracy can increase.</w:t>
+      </w:r>
+    </w:p>
+    <w:p>
+      <w:pPr>
+        <w:keepNext/>
+      </w:pPr>
+      <w:r>
+        <w:drawing>
+          <wp:inline distT="0" distB="0" distL="0" distR="0" wp14:anchorId="6D77B75B" wp14:editId="24C21978">
+            <wp:extent cx="3257717" cy="1244664"/>
+            <wp:effectExtent l="0" t="0" r="0" b="0"/>
+            <wp:docPr id="177964186" name="Picture 1"/>
+            <wp:cNvGraphicFramePr>
+              <a:graphicFrameLocks xmlns:a="http://schemas.openxmlformats.org/drawingml/2006/main" noChangeAspect="1"/>
+            </wp:cNvGraphicFramePr>
+            <a:graphic xmlns:a="http://schemas.openxmlformats.org/drawingml/2006/main">
+              <a:graphicData uri="http://schemas.openxmlformats.org/drawingml/2006/picture">
+                <pic:pic xmlns:pic="http://schemas.openxmlformats.org/drawingml/2006/picture">
+                  <pic:nvPicPr>
+                    <pic:cNvPr id="177964186" name=""/>
+                    <pic:cNvPicPr/>
+                  </pic:nvPicPr>
+                  <pic:blipFill>
+                    <a:blip r:embed="rId95"/>
+                    <a:stretch>
+                      <a:fillRect/>
+                    </a:stretch>
+                  </pic:blipFill>
+                  <pic:spPr>
+                    <a:xfrm>
+                      <a:off x="0" y="0"/>
+                      <a:ext cx="3257717" cy="1244664"/>
+                    </a:xfrm>
+                    <a:prstGeom prst="rect">
+                      <a:avLst/>
+                    </a:prstGeom>
+                  </pic:spPr>
+                </pic:pic>
+              </a:graphicData>
+            </a:graphic>
+          </wp:inline>
+        </w:drawing>
+      </w:r>
+    </w:p>
+    <w:p>
+      <w:pPr>
+        <w:pStyle w:val="Caption"/>
+      </w:pPr>
+      <w:r>
+        <w:t>Figure 95 classification report for created emails</w:t>
+      </w:r>
+    </w:p>
+    <w:p>
+      <w:r>
+        <w:t>With the spam recall in the original SVM, it was 0.87. In the external test, it is only 0.73 a 0.14 decrease. This is important because this is a spam detector project so false negatives is key. The positives of the classification report is the spam precision as it had a perfect score of 1.00, which means that every email the model classified as spam was actually spam plus the ham recall was also 1.00.</w:t>
+      </w:r>
+    </w:p>
+    <w:p>
+      <w:r>
+        <w:t>The final SVM classifier was additionally evaluated using 30 manually created emails that were completely independent from the original dataset. The model achieved an accuracy of 86.67%, which was lower than the 98.21% achieved on the original test set. Spam recall also decreased from 0.87 to 0.73. Four spam emails were incorrectly classified as legitimate, while no legitimate emails were incorrectly classified as spam. This suggests that although the classifier performs strongly on data following the patterns present within the original dataset, its performance decreases when exposed to different wording and potentially unseen patterns. The results highlight a limitation of relying on a single dataset and demonstrate the importance of evaluating machine-learning models on independent data.</w:t>
+      </w:r>
+    </w:p>
+    <w:p/>
     <w:sectPr>
       <w:pgSz w:w="11906" w:h="16838"/>
       <w:pgMar w:top="1440" w:right="1440" w:bottom="1440" w:left="1440" w:header="708" w:footer="708" w:gutter="0"/>

</xml_diff>